<commit_message>
start to write EDA-data distribution
</commit_message>
<xml_diff>
--- a/Part3/Report_JingshuTang.docx
+++ b/Part3/Report_JingshuTang.docx
@@ -2315,25 +2315,16 @@
       <w:pPr>
         <w:pStyle w:val="7"/>
         <w:rPr>
-          <w:lang w:val="en-US"/>
-        </w:rPr>
-      </w:pPr>
-      <w:r>
-        <w:t xml:space="preserve">Before you begin to format your paper, first write and save the content as a separate text file. </w:t>
-      </w:r>
-      <w:r>
-        <w:rPr>
-          <w:lang w:val="en-US"/>
-        </w:rPr>
-        <w:t>Complete all content and organizational editing before formatting. Please note sections A-D below for more information on proofreading, spelling and grammar.</w:t>
-      </w:r>
-    </w:p>
-    <w:p>
-      <w:pPr>
-        <w:pStyle w:val="7"/>
-      </w:pPr>
-      <w:r>
-        <w:t>Keep your text and graphic files separate until after the text has been formatted and styled. Do not use hard tabs, and limit use of hard returns to only one return at the end of a paragraph. Do not add any kind of pagination anywhere in the paper. Do not number text heads-the template will do that for you.</w:t>
+          <w:rFonts w:hint="default"/>
+          <w:lang w:val="en-NZ"/>
+        </w:rPr>
+      </w:pPr>
+      <w:r>
+        <w:rPr>
+          <w:rFonts w:hint="default"/>
+          <w:lang w:val="en-NZ"/>
+        </w:rPr>
+        <w:t xml:space="preserve">An overview on data distribution </w:t>
       </w:r>
     </w:p>
     <w:p>
@@ -2345,20 +2336,119 @@
           <w:rFonts w:hint="eastAsia"/>
           <w:lang w:val="en-US" w:eastAsia="zh-CN"/>
         </w:rPr>
-        <w:t>Sales Trend</w:t>
+        <w:t>Sales Distribution and Data Characteristics</w:t>
       </w:r>
     </w:p>
     <w:p>
       <w:pPr>
         <w:pStyle w:val="7"/>
-      </w:pPr>
-      <w:r>
-        <w:t>Define abbreviations and acronyms the first time they are used in the text, even after they have been defined in the abstract. Abbreviation</w:t>
-      </w:r>
-      <w:bookmarkStart w:id="0" w:name="_GoBack"/>
-      <w:bookmarkEnd w:id="0"/>
-      <w:r>
-        <w:t>s such as IEEE, SI, MKS, CGS, sc, dc, and rms do not have to be defined. Do not use abbreviations in the title or heads unless they are unavoidable.</w:t>
+        <w:rPr>
+          <w:rFonts w:hint="default"/>
+          <w:lang w:val="en-NZ"/>
+        </w:rPr>
+      </w:pPr>
+      <w:r>
+        <w:rPr>
+          <w:rFonts w:hint="default"/>
+          <w:lang w:val="en-NZ"/>
+        </w:rPr>
+        <w:t xml:space="preserve">An overview on distribution and statistics of the numeric variables of the dataset was investigated by boxplots and statistical description.  </w:t>
+      </w:r>
+      <w:r>
+        <w:rPr>
+          <w:rFonts w:hint="default"/>
+          <w:i/>
+          <w:iCs/>
+          <w:lang w:val="en-NZ"/>
+        </w:rPr>
+        <w:t xml:space="preserve">Month </w:t>
+      </w:r>
+      <w:r>
+        <w:rPr>
+          <w:rFonts w:hint="default"/>
+          <w:lang w:val="en-NZ"/>
+        </w:rPr>
+        <w:t xml:space="preserve">and </w:t>
+      </w:r>
+      <w:r>
+        <w:rPr>
+          <w:rFonts w:hint="default"/>
+          <w:i/>
+          <w:iCs/>
+          <w:lang w:val="en-NZ"/>
+        </w:rPr>
+        <w:t xml:space="preserve">Hour </w:t>
+      </w:r>
+      <w:r>
+        <w:rPr>
+          <w:rFonts w:hint="default"/>
+          <w:lang w:val="en-NZ"/>
+        </w:rPr>
+        <w:t>were excluded as they are temporal cyclical.</w:t>
+      </w:r>
+    </w:p>
+    <w:p>
+      <w:pPr>
+        <w:pStyle w:val="7"/>
+        <w:rPr>
+          <w:rFonts w:hint="default" w:eastAsia="SimSun"/>
+          <w:lang w:val="en-US" w:eastAsia="zh-CN"/>
+        </w:rPr>
+      </w:pPr>
+      <w:r>
+        <w:rPr>
+          <w:rFonts w:hint="default"/>
+          <w:i/>
+          <w:iCs/>
+          <w:lang w:val="en-NZ"/>
+        </w:rPr>
+        <w:t>Price Each</w:t>
+      </w:r>
+      <w:r>
+        <w:rPr>
+          <w:rFonts w:hint="default"/>
+          <w:lang w:val="en-NZ"/>
+        </w:rPr>
+        <w:t xml:space="preserve"> and </w:t>
+      </w:r>
+      <w:r>
+        <w:rPr>
+          <w:rFonts w:hint="default"/>
+          <w:i/>
+          <w:iCs/>
+          <w:lang w:val="en-NZ"/>
+        </w:rPr>
+        <w:t>Sales</w:t>
+      </w:r>
+      <w:r>
+        <w:rPr>
+          <w:rFonts w:hint="default"/>
+          <w:lang w:val="en-NZ"/>
+        </w:rPr>
+        <w:t xml:space="preserve"> are severely right skewed according to Fig. 1, while </w:t>
+      </w:r>
+      <w:r>
+        <w:rPr>
+          <w:rFonts w:hint="default"/>
+          <w:i/>
+          <w:iCs/>
+          <w:lang w:val="en-NZ"/>
+        </w:rPr>
+        <w:t>Quantity Ordered</w:t>
+      </w:r>
+      <w:r>
+        <w:rPr>
+          <w:rFonts w:hint="default"/>
+          <w:lang w:val="en-NZ"/>
+        </w:rPr>
+        <w:t xml:space="preserve"> mainly concentrated at 1. </w:t>
+      </w:r>
+      <w:r>
+        <w:rPr>
+          <w:rFonts w:hint="eastAsia"/>
+          <w:lang w:val="en-US" w:eastAsia="zh-CN"/>
+        </w:rPr>
+        <w:t>This means most customers purchase single product per order at lower prices.</w:t>
       </w:r>
     </w:p>
     <w:p>
@@ -2366,26 +2456,55 @@
         <w:pStyle w:val="20"/>
       </w:pPr>
       <w:r>
+        <w:rPr>
+          <w:rFonts w:hint="default"/>
+          <w:lang w:val="en-NZ"/>
+        </w:rPr>
+        <w:t>Boxplots</w:t>
+      </w:r>
+      <w:r>
+        <w:rPr>
+          <w:rFonts w:hint="eastAsia"/>
+          <w:iCs/>
+          <w:lang w:val="en-US" w:eastAsia="zh-CN"/>
+        </w:rPr>
+        <w:t xml:space="preserve"> of Numerical Features in the Dataset</w:t>
+      </w:r>
+    </w:p>
+    <w:p>
+      <w:pPr>
+        <w:pStyle w:val="7"/>
+        <w:ind w:left="0" w:leftChars="0" w:firstLine="0" w:firstLineChars="0"/>
+        <w:rPr>
+          <w:rFonts w:hint="default"/>
+          <w:lang w:val="en-US"/>
+        </w:rPr>
+      </w:pPr>
+      <w:r>
+        <w:rPr>
+          <w:rFonts w:hint="default"/>
+          <w:lang w:val="en-US"/>
+        </w:rPr>
         <mc:AlternateContent>
           <mc:Choice Requires="wps">
             <w:drawing>
               <wp:anchor distT="0" distB="0" distL="114300" distR="114300" simplePos="0" relativeHeight="251660288" behindDoc="1" locked="0" layoutInCell="1" allowOverlap="1">
                 <wp:simplePos x="0" y="0"/>
                 <wp:positionH relativeFrom="margin">
-                  <wp:posOffset>-111125</wp:posOffset>
+                  <wp:posOffset>-128270</wp:posOffset>
                 </wp:positionH>
                 <wp:positionV relativeFrom="paragraph">
-                  <wp:posOffset>180340</wp:posOffset>
+                  <wp:posOffset>3175</wp:posOffset>
                 </wp:positionV>
-                <wp:extent cx="3200400" cy="1143000"/>
-                <wp:effectExtent l="5080" t="4445" r="5715" b="8255"/>
+                <wp:extent cx="3265805" cy="1299845"/>
+                <wp:effectExtent l="4445" t="4445" r="6985" b="33020"/>
                 <wp:wrapTight wrapText="bothSides">
                   <wp:wrapPolygon>
-                    <wp:start x="-34" y="-84"/>
-                    <wp:lineTo x="-34" y="20976"/>
-                    <wp:lineTo x="21026" y="20976"/>
-                    <wp:lineTo x="21026" y="-84"/>
-                    <wp:lineTo x="-34" y="-84"/>
+                    <wp:start x="-29" y="-74"/>
+                    <wp:lineTo x="-29" y="21051"/>
+                    <wp:lineTo x="21046" y="21051"/>
+                    <wp:lineTo x="21046" y="-74"/>
+                    <wp:lineTo x="-29" y="-74"/>
                   </wp:wrapPolygon>
                 </wp:wrapTight>
                 <wp:docPr id="2" name="Text Box 8"/>
@@ -2399,7 +2518,7 @@
                       <wps:spPr>
                         <a:xfrm>
                           <a:off x="0" y="0"/>
-                          <a:ext cx="3200400" cy="1143000"/>
+                          <a:ext cx="3265805" cy="1299845"/>
                         </a:xfrm>
                         <a:prstGeom prst="rect">
                           <a:avLst/>
@@ -2409,7 +2528,10 @@
                         </a:solidFill>
                         <a:ln w="9525">
                           <a:solidFill>
-                            <a:srgbClr val="000000"/>
+                            <a:schemeClr val="tx1">
+                              <a:lumMod val="50000"/>
+                              <a:lumOff val="50000"/>
+                            </a:schemeClr>
                           </a:solidFill>
                           <a:miter lim="800000"/>
                         </a:ln>
@@ -2419,17 +2541,72 @@
                           <w:p>
                             <w:pPr>
                               <w:pStyle w:val="7"/>
+                              <w:ind w:left="0" w:leftChars="0" w:firstLine="0" w:firstLineChars="0"/>
+                              <w:rPr>
+                                <w:rFonts w:hint="default" w:eastAsia="SimSun"/>
+                                <w:color w:val="FFFFFF" w:themeColor="background1"/>
+                                <w:lang w:val="en-NZ" w:eastAsia="zh-CN"/>
+                                <w14:textOutline w14:w="9525">
+                                  <w14:round/>
+                                </w14:textOutline>
+                                <w14:textFill>
+                                  <w14:solidFill>
+                                    <w14:schemeClr w14:val="bg1"/>
+                                  </w14:solidFill>
+                                </w14:textFill>
+                              </w:rPr>
                             </w:pPr>
                             <w:r>
-                              <w:t>We suggest that you use a text box to insert a graphic (which is ideally a 300 dpi TIFF or EPS file, with all fonts embedded) because, in an MSW document, this method is somewhat more stable than directly inserting a picture.</w:t>
-                            </w:r>
-                          </w:p>
-                          <w:p>
-                            <w:pPr>
-                              <w:pStyle w:val="7"/>
-                            </w:pPr>
-                            <w:r>
-                              <w:t>To have non-visible rules on your frame, use the MSWord “Format” pull-down menu, select Text Box &gt; Colors and Lines to choose No Fill and No Line.</w:t>
+                              <w:rPr>
+                                <w:rFonts w:hint="default" w:eastAsia="SimSun"/>
+                                <w:color w:val="FFFFFF" w:themeColor="background1"/>
+                                <w:lang w:val="en-NZ" w:eastAsia="zh-CN"/>
+                                <w14:textOutline w14:w="9525">
+                                  <w14:round/>
+                                </w14:textOutline>
+                                <w14:textFill>
+                                  <w14:solidFill>
+                                    <w14:schemeClr w14:val="bg1"/>
+                                  </w14:solidFill>
+                                </w14:textFill>
+                              </w:rPr>
+                              <w:drawing>
+                                <wp:inline distT="0" distB="0" distL="114300" distR="114300">
+                                  <wp:extent cx="3105150" cy="1177290"/>
+                                  <wp:effectExtent l="0" t="0" r="6985" b="3175"/>
+                                  <wp:docPr id="9" name="图片 9" descr="Figure1_Boxplots of Numerical Features             in the Dataset"/>
+                                  <wp:cNvGraphicFramePr>
+                                    <a:graphicFrameLocks xmlns:a="http://schemas.openxmlformats.org/drawingml/2006/main" noChangeAspect="1"/>
+                                  </wp:cNvGraphicFramePr>
+                                  <a:graphic xmlns:a="http://schemas.openxmlformats.org/drawingml/2006/main">
+                                    <a:graphicData uri="http://schemas.openxmlformats.org/drawingml/2006/picture">
+                                      <pic:pic xmlns:pic="http://schemas.openxmlformats.org/drawingml/2006/picture">
+                                        <pic:nvPicPr>
+                                          <pic:cNvPr id="9" name="图片 9" descr="Figure1_Boxplots of Numerical Features             in the Dataset"/>
+                                          <pic:cNvPicPr>
+                                            <a:picLocks noChangeAspect="1"/>
+                                          </pic:cNvPicPr>
+                                        </pic:nvPicPr>
+                                        <pic:blipFill>
+                                          <a:blip r:embed="rId5"/>
+                                          <a:stretch>
+                                            <a:fillRect/>
+                                          </a:stretch>
+                                        </pic:blipFill>
+                                        <pic:spPr>
+                                          <a:xfrm>
+                                            <a:off x="0" y="0"/>
+                                            <a:ext cx="3105150" cy="1177290"/>
+                                          </a:xfrm>
+                                          <a:prstGeom prst="rect">
+                                            <a:avLst/>
+                                          </a:prstGeom>
+                                        </pic:spPr>
+                                      </pic:pic>
+                                    </a:graphicData>
+                                  </a:graphic>
+                                </wp:inline>
+                              </w:drawing>
                             </w:r>
                           </w:p>
                         </w:txbxContent>
@@ -2445,9 +2622,9 @@
           </mc:Choice>
           <mc:Fallback>
             <w:pict>
-              <v:rect id="Text Box 8" o:spid="_x0000_s1026" o:spt="1" style="position:absolute;left:0pt;margin-left:-8.75pt;margin-top:14.2pt;height:90pt;width:252pt;mso-position-horizontal-relative:margin;mso-wrap-distance-left:9pt;mso-wrap-distance-right:9pt;z-index:-251656192;mso-width-relative:page;mso-height-relative:page;" fillcolor="#FFFFFF" filled="t" stroked="t" coordsize="21600,21600" wrapcoords="-34 -84 -34 20976 21026 20976 21026 -84 -34 -84" o:gfxdata="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">
+              <v:rect id="Text Box 8" o:spid="_x0000_s1026" o:spt="1" style="position:absolute;left:0pt;margin-left:-10.1pt;margin-top:0.25pt;height:102.35pt;width:257.15pt;mso-position-horizontal-relative:margin;mso-wrap-distance-left:9pt;mso-wrap-distance-right:9pt;z-index:-251656192;mso-width-relative:page;mso-height-relative:page;" fillcolor="#FFFFFF" filled="t" stroked="t" coordsize="21600,21600" wrapcoords="-29 -74 -29 21051 21046 21051 21046 -74 -29 -74" o:gfxdata="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">
                 <v:fill on="t" focussize="0,0"/>
-                <v:stroke color="#000000" miterlimit="8" joinstyle="miter"/>
+                <v:stroke color="#808080 [1629]" miterlimit="8" joinstyle="miter"/>
                 <v:imagedata o:title=""/>
                 <o:lock v:ext="edit" aspectratio="f"/>
                 <v:textbox>
@@ -2455,17 +2632,72 @@
                     <w:p>
                       <w:pPr>
                         <w:pStyle w:val="7"/>
+                        <w:ind w:left="0" w:leftChars="0" w:firstLine="0" w:firstLineChars="0"/>
+                        <w:rPr>
+                          <w:rFonts w:hint="default" w:eastAsia="SimSun"/>
+                          <w:color w:val="FFFFFF" w:themeColor="background1"/>
+                          <w:lang w:val="en-NZ" w:eastAsia="zh-CN"/>
+                          <w14:textOutline w14:w="9525">
+                            <w14:round/>
+                          </w14:textOutline>
+                          <w14:textFill>
+                            <w14:solidFill>
+                              <w14:schemeClr w14:val="bg1"/>
+                            </w14:solidFill>
+                          </w14:textFill>
+                        </w:rPr>
                       </w:pPr>
                       <w:r>
-                        <w:t>We suggest that you use a text box to insert a graphic (which is ideally a 300 dpi TIFF or EPS file, with all fonts embedded) because, in an MSW document, this method is somewhat more stable than directly inserting a picture.</w:t>
-                      </w:r>
-                    </w:p>
-                    <w:p>
-                      <w:pPr>
-                        <w:pStyle w:val="7"/>
-                      </w:pPr>
-                      <w:r>
-                        <w:t>To have non-visible rules on your frame, use the MSWord “Format” pull-down menu, select Text Box &gt; Colors and Lines to choose No Fill and No Line.</w:t>
+                        <w:rPr>
+                          <w:rFonts w:hint="default" w:eastAsia="SimSun"/>
+                          <w:color w:val="FFFFFF" w:themeColor="background1"/>
+                          <w:lang w:val="en-NZ" w:eastAsia="zh-CN"/>
+                          <w14:textOutline w14:w="9525">
+                            <w14:round/>
+                          </w14:textOutline>
+                          <w14:textFill>
+                            <w14:solidFill>
+                              <w14:schemeClr w14:val="bg1"/>
+                            </w14:solidFill>
+                          </w14:textFill>
+                        </w:rPr>
+                        <w:drawing>
+                          <wp:inline distT="0" distB="0" distL="114300" distR="114300">
+                            <wp:extent cx="3105150" cy="1177290"/>
+                            <wp:effectExtent l="0" t="0" r="6985" b="3175"/>
+                            <wp:docPr id="9" name="图片 9" descr="Figure1_Boxplots of Numerical Features             in the Dataset"/>
+                            <wp:cNvGraphicFramePr>
+                              <a:graphicFrameLocks xmlns:a="http://schemas.openxmlformats.org/drawingml/2006/main" noChangeAspect="1"/>
+                            </wp:cNvGraphicFramePr>
+                            <a:graphic xmlns:a="http://schemas.openxmlformats.org/drawingml/2006/main">
+                              <a:graphicData uri="http://schemas.openxmlformats.org/drawingml/2006/picture">
+                                <pic:pic xmlns:pic="http://schemas.openxmlformats.org/drawingml/2006/picture">
+                                  <pic:nvPicPr>
+                                    <pic:cNvPr id="9" name="图片 9" descr="Figure1_Boxplots of Numerical Features             in the Dataset"/>
+                                    <pic:cNvPicPr>
+                                      <a:picLocks noChangeAspect="1"/>
+                                    </pic:cNvPicPr>
+                                  </pic:nvPicPr>
+                                  <pic:blipFill>
+                                    <a:blip r:embed="rId5"/>
+                                    <a:stretch>
+                                      <a:fillRect/>
+                                    </a:stretch>
+                                  </pic:blipFill>
+                                  <pic:spPr>
+                                    <a:xfrm>
+                                      <a:off x="0" y="0"/>
+                                      <a:ext cx="3105150" cy="1177290"/>
+                                    </a:xfrm>
+                                    <a:prstGeom prst="rect">
+                                      <a:avLst/>
+                                    </a:prstGeom>
+                                  </pic:spPr>
+                                </pic:pic>
+                              </a:graphicData>
+                            </a:graphic>
+                          </wp:inline>
+                        </w:drawing>
                       </w:r>
                     </w:p>
                   </w:txbxContent>
@@ -2479,20 +2711,1129 @@
       <w:r>
         <w:rPr>
           <w:rFonts w:hint="eastAsia"/>
-          <w:iCs/>
           <w:lang w:val="en-US" w:eastAsia="zh-CN"/>
         </w:rPr>
-        <w:t>Data Distribution of Numerical Features in the Dataset</w:t>
-      </w:r>
-    </w:p>
+        <w:t>With details shown in Table II, 75% of the products were priced less than $150. Several extremely high-valued (e.g. $1700 per each) products contributed as outliers. These observations correspond to genuine purchases of expensive products rather than data quality issues and were therefore retained for subsequent analysis.</w:t>
+      </w:r>
+      <w:bookmarkStart w:id="0" w:name="_GoBack"/>
+      <w:bookmarkEnd w:id="0"/>
+    </w:p>
+    <w:p>
+      <w:pPr>
+        <w:pStyle w:val="30"/>
+      </w:pPr>
+      <w:r>
+        <w:rPr>
+          <w:rFonts w:hint="default"/>
+          <w:lang w:val="en-NZ" w:eastAsia="zh-CN"/>
+        </w:rPr>
+        <w:t>Statistics</w:t>
+      </w:r>
+      <w:r>
+        <w:rPr>
+          <w:rFonts w:hint="eastAsia"/>
+          <w:lang w:val="en-US" w:eastAsia="zh-CN"/>
+        </w:rPr>
+        <w:t xml:space="preserve"> of Numerical Features in the Dataset</w:t>
+      </w:r>
+    </w:p>
+    <w:tbl>
+      <w:tblPr>
+        <w:tblStyle w:val="11"/>
+        <w:tblW w:w="4860" w:type="dxa"/>
+        <w:jc w:val="center"/>
+        <w:tblBorders>
+          <w:top w:val="single" w:color="auto" w:sz="2" w:space="0"/>
+          <w:left w:val="single" w:color="auto" w:sz="2" w:space="0"/>
+          <w:bottom w:val="single" w:color="auto" w:sz="2" w:space="0"/>
+          <w:right w:val="single" w:color="auto" w:sz="2" w:space="0"/>
+          <w:insideH w:val="single" w:color="auto" w:sz="2" w:space="0"/>
+          <w:insideV w:val="single" w:color="auto" w:sz="2" w:space="0"/>
+        </w:tblBorders>
+        <w:tblLayout w:type="fixed"/>
+        <w:tblCellMar>
+          <w:top w:w="0" w:type="dxa"/>
+          <w:left w:w="108" w:type="dxa"/>
+          <w:bottom w:w="0" w:type="dxa"/>
+          <w:right w:w="108" w:type="dxa"/>
+        </w:tblCellMar>
+      </w:tblPr>
+      <w:tblGrid>
+        <w:gridCol w:w="875"/>
+        <w:gridCol w:w="1618"/>
+        <w:gridCol w:w="1240"/>
+        <w:gridCol w:w="1127"/>
+      </w:tblGrid>
+      <w:tr>
+        <w:tblPrEx>
+          <w:tblBorders>
+            <w:top w:val="single" w:color="auto" w:sz="2" w:space="0"/>
+            <w:left w:val="single" w:color="auto" w:sz="2" w:space="0"/>
+            <w:bottom w:val="single" w:color="auto" w:sz="2" w:space="0"/>
+            <w:right w:val="single" w:color="auto" w:sz="2" w:space="0"/>
+            <w:insideH w:val="single" w:color="auto" w:sz="2" w:space="0"/>
+            <w:insideV w:val="single" w:color="auto" w:sz="2" w:space="0"/>
+          </w:tblBorders>
+          <w:tblCellMar>
+            <w:top w:w="0" w:type="dxa"/>
+            <w:left w:w="108" w:type="dxa"/>
+            <w:bottom w:w="0" w:type="dxa"/>
+            <w:right w:w="108" w:type="dxa"/>
+          </w:tblCellMar>
+        </w:tblPrEx>
+        <w:trPr>
+          <w:cantSplit/>
+          <w:trHeight w:val="240" w:hRule="atLeast"/>
+          <w:tblHeader/>
+          <w:jc w:val="center"/>
+        </w:trPr>
+        <w:tc>
+          <w:tcPr>
+            <w:tcW w:w="875" w:type="dxa"/>
+            <w:vMerge w:val="restart"/>
+            <w:vAlign w:val="center"/>
+          </w:tcPr>
+          <w:p>
+            <w:pPr>
+              <w:pStyle w:val="26"/>
+              <w:rPr>
+                <w:rFonts w:hint="default"/>
+                <w:lang w:val="en-NZ"/>
+              </w:rPr>
+            </w:pPr>
+            <w:r>
+              <w:rPr>
+                <w:rFonts w:hint="default"/>
+                <w:lang w:val="en-NZ"/>
+              </w:rPr>
+              <w:t>Statistics</w:t>
+            </w:r>
+          </w:p>
+        </w:tc>
+        <w:tc>
+          <w:tcPr>
+            <w:tcW w:w="3985" w:type="dxa"/>
+            <w:gridSpan w:val="3"/>
+            <w:vAlign w:val="center"/>
+          </w:tcPr>
+          <w:p>
+            <w:pPr>
+              <w:pStyle w:val="26"/>
+              <w:rPr>
+                <w:rFonts w:hint="default"/>
+                <w:lang w:val="en-NZ"/>
+              </w:rPr>
+            </w:pPr>
+            <w:r>
+              <w:rPr>
+                <w:rFonts w:hint="default"/>
+                <w:lang w:val="en-NZ"/>
+              </w:rPr>
+              <w:t>Variables</w:t>
+            </w:r>
+          </w:p>
+        </w:tc>
+      </w:tr>
+      <w:tr>
+        <w:tblPrEx>
+          <w:tblBorders>
+            <w:top w:val="single" w:color="auto" w:sz="2" w:space="0"/>
+            <w:left w:val="single" w:color="auto" w:sz="2" w:space="0"/>
+            <w:bottom w:val="single" w:color="auto" w:sz="2" w:space="0"/>
+            <w:right w:val="single" w:color="auto" w:sz="2" w:space="0"/>
+            <w:insideH w:val="single" w:color="auto" w:sz="2" w:space="0"/>
+            <w:insideV w:val="single" w:color="auto" w:sz="2" w:space="0"/>
+          </w:tblBorders>
+          <w:tblCellMar>
+            <w:top w:w="0" w:type="dxa"/>
+            <w:left w:w="108" w:type="dxa"/>
+            <w:bottom w:w="0" w:type="dxa"/>
+            <w:right w:w="108" w:type="dxa"/>
+          </w:tblCellMar>
+        </w:tblPrEx>
+        <w:trPr>
+          <w:cantSplit/>
+          <w:trHeight w:val="240" w:hRule="atLeast"/>
+          <w:tblHeader/>
+          <w:jc w:val="center"/>
+        </w:trPr>
+        <w:tc>
+          <w:tcPr>
+            <w:tcW w:w="875" w:type="dxa"/>
+            <w:vMerge w:val="continue"/>
+          </w:tcPr>
+          <w:p>
+            <w:pPr>
+              <w:rPr>
+                <w:sz w:val="16"/>
+                <w:szCs w:val="16"/>
+              </w:rPr>
+            </w:pPr>
+          </w:p>
+        </w:tc>
+        <w:tc>
+          <w:tcPr>
+            <w:tcW w:w="1618" w:type="dxa"/>
+            <w:vAlign w:val="center"/>
+          </w:tcPr>
+          <w:p>
+            <w:pPr>
+              <w:pStyle w:val="27"/>
+              <w:rPr>
+                <w:rFonts w:hint="default" w:eastAsia="SimSun"/>
+                <w:lang w:val="en-NZ" w:eastAsia="zh-CN"/>
+              </w:rPr>
+            </w:pPr>
+            <w:r>
+              <w:rPr>
+                <w:rFonts w:hint="default"/>
+                <w:lang w:val="en-NZ" w:eastAsia="zh-CN"/>
+              </w:rPr>
+              <w:t>Quantity Ordered</w:t>
+            </w:r>
+          </w:p>
+        </w:tc>
+        <w:tc>
+          <w:tcPr>
+            <w:tcW w:w="1240" w:type="dxa"/>
+            <w:vAlign w:val="center"/>
+          </w:tcPr>
+          <w:p>
+            <w:pPr>
+              <w:pStyle w:val="27"/>
+              <w:rPr>
+                <w:rFonts w:hint="default" w:eastAsia="SimSun"/>
+                <w:lang w:val="en-NZ" w:eastAsia="zh-CN"/>
+              </w:rPr>
+            </w:pPr>
+            <w:r>
+              <w:rPr>
+                <w:rFonts w:hint="default"/>
+                <w:lang w:val="en-NZ" w:eastAsia="zh-CN"/>
+              </w:rPr>
+              <w:t>Price Each</w:t>
+            </w:r>
+          </w:p>
+        </w:tc>
+        <w:tc>
+          <w:tcPr>
+            <w:tcW w:w="1127" w:type="dxa"/>
+            <w:vAlign w:val="center"/>
+          </w:tcPr>
+          <w:p>
+            <w:pPr>
+              <w:pStyle w:val="27"/>
+              <w:rPr>
+                <w:rFonts w:hint="default" w:eastAsia="SimSun"/>
+                <w:lang w:val="en-NZ" w:eastAsia="zh-CN"/>
+              </w:rPr>
+            </w:pPr>
+            <w:r>
+              <w:rPr>
+                <w:rFonts w:hint="default"/>
+                <w:lang w:val="en-NZ" w:eastAsia="zh-CN"/>
+              </w:rPr>
+              <w:t>Sales</w:t>
+            </w:r>
+          </w:p>
+        </w:tc>
+      </w:tr>
+      <w:tr>
+        <w:tblPrEx>
+          <w:tblBorders>
+            <w:top w:val="single" w:color="auto" w:sz="2" w:space="0"/>
+            <w:left w:val="single" w:color="auto" w:sz="2" w:space="0"/>
+            <w:bottom w:val="single" w:color="auto" w:sz="2" w:space="0"/>
+            <w:right w:val="single" w:color="auto" w:sz="2" w:space="0"/>
+            <w:insideH w:val="single" w:color="auto" w:sz="2" w:space="0"/>
+            <w:insideV w:val="single" w:color="auto" w:sz="2" w:space="0"/>
+          </w:tblBorders>
+          <w:tblCellMar>
+            <w:top w:w="0" w:type="dxa"/>
+            <w:left w:w="108" w:type="dxa"/>
+            <w:bottom w:w="0" w:type="dxa"/>
+            <w:right w:w="108" w:type="dxa"/>
+          </w:tblCellMar>
+        </w:tblPrEx>
+        <w:trPr>
+          <w:trHeight w:val="320" w:hRule="atLeast"/>
+          <w:jc w:val="center"/>
+        </w:trPr>
+        <w:tc>
+          <w:tcPr>
+            <w:tcW w:w="875" w:type="dxa"/>
+            <w:vAlign w:val="center"/>
+          </w:tcPr>
+          <w:p>
+            <w:pPr>
+              <w:pStyle w:val="28"/>
+              <w:rPr>
+                <w:rFonts w:hint="default"/>
+                <w:sz w:val="8"/>
+                <w:szCs w:val="8"/>
+                <w:lang w:val="en-NZ"/>
+              </w:rPr>
+            </w:pPr>
+            <w:r>
+              <w:rPr>
+                <w:rFonts w:hint="default"/>
+                <w:lang w:val="en-NZ"/>
+              </w:rPr>
+              <w:t>Count</w:t>
+            </w:r>
+          </w:p>
+        </w:tc>
+        <w:tc>
+          <w:tcPr>
+            <w:tcW w:w="1618" w:type="dxa"/>
+            <w:vAlign w:val="center"/>
+          </w:tcPr>
+          <w:p>
+            <w:pPr>
+              <w:pStyle w:val="28"/>
+              <w:rPr>
+                <w:rFonts w:hint="default"/>
+                <w:lang w:val="en-NZ"/>
+              </w:rPr>
+            </w:pPr>
+            <w:r>
+              <w:rPr>
+                <w:rFonts w:hint="default"/>
+                <w:lang w:val="en-NZ"/>
+              </w:rPr>
+              <w:t>185950.00</w:t>
+            </w:r>
+          </w:p>
+        </w:tc>
+        <w:tc>
+          <w:tcPr>
+            <w:tcW w:w="1240" w:type="dxa"/>
+            <w:vAlign w:val="center"/>
+          </w:tcPr>
+          <w:p>
+            <w:pPr>
+              <w:pStyle w:val="28"/>
+              <w:rPr>
+                <w:rFonts w:hint="default"/>
+                <w:lang w:val="en-NZ"/>
+              </w:rPr>
+            </w:pPr>
+            <w:r>
+              <w:rPr>
+                <w:rFonts w:hint="default"/>
+                <w:lang w:val="en-NZ"/>
+              </w:rPr>
+              <w:t>185950.00</w:t>
+            </w:r>
+          </w:p>
+        </w:tc>
+        <w:tc>
+          <w:tcPr>
+            <w:tcW w:w="1127" w:type="dxa"/>
+            <w:vAlign w:val="center"/>
+          </w:tcPr>
+          <w:p>
+            <w:pPr>
+              <w:pStyle w:val="28"/>
+              <w:rPr>
+                <w:rFonts w:hint="default"/>
+                <w:lang w:val="en-NZ"/>
+              </w:rPr>
+            </w:pPr>
+            <w:r>
+              <w:rPr>
+                <w:rFonts w:hint="default"/>
+                <w:lang w:val="en-NZ"/>
+              </w:rPr>
+              <w:t>185950.00</w:t>
+            </w:r>
+          </w:p>
+        </w:tc>
+      </w:tr>
+      <w:tr>
+        <w:tblPrEx>
+          <w:tblBorders>
+            <w:top w:val="single" w:color="auto" w:sz="2" w:space="0"/>
+            <w:left w:val="single" w:color="auto" w:sz="2" w:space="0"/>
+            <w:bottom w:val="single" w:color="auto" w:sz="2" w:space="0"/>
+            <w:right w:val="single" w:color="auto" w:sz="2" w:space="0"/>
+            <w:insideH w:val="single" w:color="auto" w:sz="2" w:space="0"/>
+            <w:insideV w:val="single" w:color="auto" w:sz="2" w:space="0"/>
+          </w:tblBorders>
+          <w:tblCellMar>
+            <w:top w:w="0" w:type="dxa"/>
+            <w:left w:w="108" w:type="dxa"/>
+            <w:bottom w:w="0" w:type="dxa"/>
+            <w:right w:w="108" w:type="dxa"/>
+          </w:tblCellMar>
+        </w:tblPrEx>
+        <w:trPr>
+          <w:trHeight w:val="320" w:hRule="atLeast"/>
+          <w:jc w:val="center"/>
+        </w:trPr>
+        <w:tc>
+          <w:tcPr>
+            <w:tcW w:w="875" w:type="dxa"/>
+            <w:vAlign w:val="center"/>
+          </w:tcPr>
+          <w:p>
+            <w:pPr>
+              <w:pStyle w:val="28"/>
+              <w:rPr>
+                <w:rFonts w:hint="default"/>
+                <w:lang w:val="en-NZ"/>
+              </w:rPr>
+            </w:pPr>
+            <w:r>
+              <w:rPr>
+                <w:rFonts w:hint="default"/>
+                <w:lang w:val="en-NZ"/>
+              </w:rPr>
+              <w:t>Mean</w:t>
+            </w:r>
+          </w:p>
+        </w:tc>
+        <w:tc>
+          <w:tcPr>
+            <w:tcW w:w="1618" w:type="dxa"/>
+            <w:vAlign w:val="center"/>
+          </w:tcPr>
+          <w:p>
+            <w:pPr>
+              <w:pStyle w:val="28"/>
+              <w:rPr>
+                <w:rFonts w:hint="default"/>
+                <w:lang w:val="en-NZ"/>
+              </w:rPr>
+            </w:pPr>
+            <w:r>
+              <w:rPr>
+                <w:rFonts w:hint="default"/>
+                <w:lang w:val="en-NZ"/>
+              </w:rPr>
+              <w:t>1.124</w:t>
+            </w:r>
+          </w:p>
+        </w:tc>
+        <w:tc>
+          <w:tcPr>
+            <w:tcW w:w="1240" w:type="dxa"/>
+            <w:vAlign w:val="center"/>
+          </w:tcPr>
+          <w:p>
+            <w:pPr>
+              <w:pStyle w:val="28"/>
+              <w:rPr>
+                <w:rFonts w:hint="default"/>
+                <w:lang w:val="en-NZ"/>
+              </w:rPr>
+            </w:pPr>
+            <w:r>
+              <w:rPr>
+                <w:rFonts w:hint="default"/>
+                <w:lang w:val="en-NZ"/>
+              </w:rPr>
+              <w:t>184.40</w:t>
+            </w:r>
+          </w:p>
+        </w:tc>
+        <w:tc>
+          <w:tcPr>
+            <w:tcW w:w="1127" w:type="dxa"/>
+            <w:vAlign w:val="center"/>
+          </w:tcPr>
+          <w:p>
+            <w:pPr>
+              <w:pStyle w:val="28"/>
+              <w:rPr>
+                <w:rFonts w:hint="default"/>
+                <w:lang w:val="en-NZ"/>
+              </w:rPr>
+            </w:pPr>
+            <w:r>
+              <w:rPr>
+                <w:rFonts w:hint="default"/>
+                <w:lang w:val="en-NZ"/>
+              </w:rPr>
+              <w:t>185.49</w:t>
+            </w:r>
+          </w:p>
+        </w:tc>
+      </w:tr>
+      <w:tr>
+        <w:tblPrEx>
+          <w:tblBorders>
+            <w:top w:val="single" w:color="auto" w:sz="2" w:space="0"/>
+            <w:left w:val="single" w:color="auto" w:sz="2" w:space="0"/>
+            <w:bottom w:val="single" w:color="auto" w:sz="2" w:space="0"/>
+            <w:right w:val="single" w:color="auto" w:sz="2" w:space="0"/>
+            <w:insideH w:val="single" w:color="auto" w:sz="2" w:space="0"/>
+            <w:insideV w:val="single" w:color="auto" w:sz="2" w:space="0"/>
+          </w:tblBorders>
+          <w:tblCellMar>
+            <w:top w:w="0" w:type="dxa"/>
+            <w:left w:w="108" w:type="dxa"/>
+            <w:bottom w:w="0" w:type="dxa"/>
+            <w:right w:w="108" w:type="dxa"/>
+          </w:tblCellMar>
+        </w:tblPrEx>
+        <w:trPr>
+          <w:trHeight w:val="320" w:hRule="atLeast"/>
+          <w:jc w:val="center"/>
+        </w:trPr>
+        <w:tc>
+          <w:tcPr>
+            <w:tcW w:w="875" w:type="dxa"/>
+            <w:vAlign w:val="center"/>
+          </w:tcPr>
+          <w:p>
+            <w:pPr>
+              <w:pStyle w:val="28"/>
+              <w:rPr>
+                <w:rFonts w:hint="default"/>
+                <w:lang w:val="en-NZ"/>
+              </w:rPr>
+            </w:pPr>
+            <w:r>
+              <w:rPr>
+                <w:rFonts w:hint="default"/>
+                <w:lang w:val="en-NZ"/>
+              </w:rPr>
+              <w:t>Min</w:t>
+            </w:r>
+          </w:p>
+        </w:tc>
+        <w:tc>
+          <w:tcPr>
+            <w:tcW w:w="1618" w:type="dxa"/>
+            <w:vAlign w:val="center"/>
+          </w:tcPr>
+          <w:p>
+            <w:pPr>
+              <w:pStyle w:val="28"/>
+              <w:rPr>
+                <w:rFonts w:hint="default"/>
+                <w:lang w:val="en-NZ"/>
+              </w:rPr>
+            </w:pPr>
+            <w:r>
+              <w:rPr>
+                <w:rFonts w:hint="default"/>
+                <w:lang w:val="en-NZ"/>
+              </w:rPr>
+              <w:t>1.00</w:t>
+            </w:r>
+          </w:p>
+        </w:tc>
+        <w:tc>
+          <w:tcPr>
+            <w:tcW w:w="1240" w:type="dxa"/>
+            <w:vAlign w:val="center"/>
+          </w:tcPr>
+          <w:p>
+            <w:pPr>
+              <w:pStyle w:val="28"/>
+              <w:rPr>
+                <w:rFonts w:hint="default"/>
+                <w:lang w:val="en-NZ"/>
+              </w:rPr>
+            </w:pPr>
+            <w:r>
+              <w:rPr>
+                <w:rFonts w:hint="default"/>
+                <w:lang w:val="en-NZ"/>
+              </w:rPr>
+              <w:t>2.99</w:t>
+            </w:r>
+          </w:p>
+        </w:tc>
+        <w:tc>
+          <w:tcPr>
+            <w:tcW w:w="1127" w:type="dxa"/>
+            <w:vAlign w:val="center"/>
+          </w:tcPr>
+          <w:p>
+            <w:pPr>
+              <w:pStyle w:val="28"/>
+              <w:rPr>
+                <w:rFonts w:hint="default"/>
+                <w:lang w:val="en-NZ"/>
+              </w:rPr>
+            </w:pPr>
+            <w:r>
+              <w:rPr>
+                <w:rFonts w:hint="default"/>
+                <w:lang w:val="en-NZ"/>
+              </w:rPr>
+              <w:t>2.99</w:t>
+            </w:r>
+          </w:p>
+        </w:tc>
+      </w:tr>
+      <w:tr>
+        <w:tblPrEx>
+          <w:tblBorders>
+            <w:top w:val="single" w:color="auto" w:sz="2" w:space="0"/>
+            <w:left w:val="single" w:color="auto" w:sz="2" w:space="0"/>
+            <w:bottom w:val="single" w:color="auto" w:sz="2" w:space="0"/>
+            <w:right w:val="single" w:color="auto" w:sz="2" w:space="0"/>
+            <w:insideH w:val="single" w:color="auto" w:sz="2" w:space="0"/>
+            <w:insideV w:val="single" w:color="auto" w:sz="2" w:space="0"/>
+          </w:tblBorders>
+          <w:tblCellMar>
+            <w:top w:w="0" w:type="dxa"/>
+            <w:left w:w="108" w:type="dxa"/>
+            <w:bottom w:w="0" w:type="dxa"/>
+            <w:right w:w="108" w:type="dxa"/>
+          </w:tblCellMar>
+        </w:tblPrEx>
+        <w:trPr>
+          <w:trHeight w:val="320" w:hRule="atLeast"/>
+          <w:jc w:val="center"/>
+        </w:trPr>
+        <w:tc>
+          <w:tcPr>
+            <w:tcW w:w="875" w:type="dxa"/>
+            <w:vAlign w:val="center"/>
+          </w:tcPr>
+          <w:p>
+            <w:pPr>
+              <w:pStyle w:val="28"/>
+              <w:rPr>
+                <w:rFonts w:hint="default"/>
+                <w:lang w:val="en-NZ"/>
+              </w:rPr>
+            </w:pPr>
+            <w:r>
+              <w:rPr>
+                <w:rFonts w:hint="default"/>
+                <w:lang w:val="en-NZ"/>
+              </w:rPr>
+              <w:t>25%</w:t>
+            </w:r>
+          </w:p>
+        </w:tc>
+        <w:tc>
+          <w:tcPr>
+            <w:tcW w:w="1618" w:type="dxa"/>
+            <w:vAlign w:val="center"/>
+          </w:tcPr>
+          <w:p>
+            <w:pPr>
+              <w:pStyle w:val="28"/>
+              <w:rPr>
+                <w:rFonts w:hint="default"/>
+                <w:lang w:val="en-NZ"/>
+              </w:rPr>
+            </w:pPr>
+            <w:r>
+              <w:rPr>
+                <w:rFonts w:hint="default"/>
+                <w:lang w:val="en-NZ"/>
+              </w:rPr>
+              <w:t>1.00</w:t>
+            </w:r>
+          </w:p>
+        </w:tc>
+        <w:tc>
+          <w:tcPr>
+            <w:tcW w:w="1240" w:type="dxa"/>
+            <w:vAlign w:val="center"/>
+          </w:tcPr>
+          <w:p>
+            <w:pPr>
+              <w:pStyle w:val="28"/>
+              <w:rPr>
+                <w:rFonts w:hint="default"/>
+                <w:lang w:val="en-NZ"/>
+              </w:rPr>
+            </w:pPr>
+            <w:r>
+              <w:rPr>
+                <w:rFonts w:hint="default"/>
+                <w:lang w:val="en-NZ"/>
+              </w:rPr>
+              <w:t>11.95</w:t>
+            </w:r>
+          </w:p>
+        </w:tc>
+        <w:tc>
+          <w:tcPr>
+            <w:tcW w:w="1127" w:type="dxa"/>
+            <w:vAlign w:val="center"/>
+          </w:tcPr>
+          <w:p>
+            <w:pPr>
+              <w:pStyle w:val="28"/>
+              <w:rPr>
+                <w:rFonts w:hint="default"/>
+                <w:lang w:val="en-NZ"/>
+              </w:rPr>
+            </w:pPr>
+            <w:r>
+              <w:rPr>
+                <w:rFonts w:hint="default"/>
+                <w:lang w:val="en-NZ"/>
+              </w:rPr>
+              <w:t>11.95</w:t>
+            </w:r>
+          </w:p>
+        </w:tc>
+      </w:tr>
+      <w:tr>
+        <w:tblPrEx>
+          <w:tblBorders>
+            <w:top w:val="single" w:color="auto" w:sz="2" w:space="0"/>
+            <w:left w:val="single" w:color="auto" w:sz="2" w:space="0"/>
+            <w:bottom w:val="single" w:color="auto" w:sz="2" w:space="0"/>
+            <w:right w:val="single" w:color="auto" w:sz="2" w:space="0"/>
+            <w:insideH w:val="single" w:color="auto" w:sz="2" w:space="0"/>
+            <w:insideV w:val="single" w:color="auto" w:sz="2" w:space="0"/>
+          </w:tblBorders>
+          <w:tblCellMar>
+            <w:top w:w="0" w:type="dxa"/>
+            <w:left w:w="108" w:type="dxa"/>
+            <w:bottom w:w="0" w:type="dxa"/>
+            <w:right w:w="108" w:type="dxa"/>
+          </w:tblCellMar>
+        </w:tblPrEx>
+        <w:trPr>
+          <w:trHeight w:val="320" w:hRule="atLeast"/>
+          <w:jc w:val="center"/>
+        </w:trPr>
+        <w:tc>
+          <w:tcPr>
+            <w:tcW w:w="875" w:type="dxa"/>
+            <w:vAlign w:val="center"/>
+          </w:tcPr>
+          <w:p>
+            <w:pPr>
+              <w:pStyle w:val="28"/>
+              <w:rPr>
+                <w:rFonts w:hint="default"/>
+                <w:lang w:val="en-NZ"/>
+              </w:rPr>
+            </w:pPr>
+            <w:r>
+              <w:rPr>
+                <w:rFonts w:hint="default"/>
+                <w:lang w:val="en-NZ"/>
+              </w:rPr>
+              <w:t>Median</w:t>
+            </w:r>
+          </w:p>
+        </w:tc>
+        <w:tc>
+          <w:tcPr>
+            <w:tcW w:w="1618" w:type="dxa"/>
+            <w:vAlign w:val="center"/>
+          </w:tcPr>
+          <w:p>
+            <w:pPr>
+              <w:pStyle w:val="28"/>
+              <w:rPr>
+                <w:rFonts w:hint="default"/>
+                <w:lang w:val="en-NZ"/>
+              </w:rPr>
+            </w:pPr>
+            <w:r>
+              <w:rPr>
+                <w:rFonts w:hint="default"/>
+                <w:lang w:val="en-NZ"/>
+              </w:rPr>
+              <w:t>1.00</w:t>
+            </w:r>
+          </w:p>
+        </w:tc>
+        <w:tc>
+          <w:tcPr>
+            <w:tcW w:w="1240" w:type="dxa"/>
+            <w:vAlign w:val="center"/>
+          </w:tcPr>
+          <w:p>
+            <w:pPr>
+              <w:pStyle w:val="28"/>
+              <w:rPr>
+                <w:rFonts w:hint="default"/>
+                <w:lang w:val="en-NZ"/>
+              </w:rPr>
+            </w:pPr>
+            <w:r>
+              <w:rPr>
+                <w:rFonts w:hint="default"/>
+                <w:lang w:val="en-NZ"/>
+              </w:rPr>
+              <w:t>14.95</w:t>
+            </w:r>
+          </w:p>
+        </w:tc>
+        <w:tc>
+          <w:tcPr>
+            <w:tcW w:w="1127" w:type="dxa"/>
+            <w:vAlign w:val="center"/>
+          </w:tcPr>
+          <w:p>
+            <w:pPr>
+              <w:pStyle w:val="28"/>
+              <w:rPr>
+                <w:rFonts w:hint="default"/>
+                <w:lang w:val="en-NZ"/>
+              </w:rPr>
+            </w:pPr>
+            <w:r>
+              <w:rPr>
+                <w:rFonts w:hint="default"/>
+                <w:lang w:val="en-NZ"/>
+              </w:rPr>
+              <w:t>4.95</w:t>
+            </w:r>
+          </w:p>
+        </w:tc>
+      </w:tr>
+      <w:tr>
+        <w:tblPrEx>
+          <w:tblBorders>
+            <w:top w:val="single" w:color="auto" w:sz="2" w:space="0"/>
+            <w:left w:val="single" w:color="auto" w:sz="2" w:space="0"/>
+            <w:bottom w:val="single" w:color="auto" w:sz="2" w:space="0"/>
+            <w:right w:val="single" w:color="auto" w:sz="2" w:space="0"/>
+            <w:insideH w:val="single" w:color="auto" w:sz="2" w:space="0"/>
+            <w:insideV w:val="single" w:color="auto" w:sz="2" w:space="0"/>
+          </w:tblBorders>
+          <w:tblCellMar>
+            <w:top w:w="0" w:type="dxa"/>
+            <w:left w:w="108" w:type="dxa"/>
+            <w:bottom w:w="0" w:type="dxa"/>
+            <w:right w:w="108" w:type="dxa"/>
+          </w:tblCellMar>
+        </w:tblPrEx>
+        <w:trPr>
+          <w:trHeight w:val="320" w:hRule="atLeast"/>
+          <w:jc w:val="center"/>
+        </w:trPr>
+        <w:tc>
+          <w:tcPr>
+            <w:tcW w:w="875" w:type="dxa"/>
+            <w:vAlign w:val="center"/>
+          </w:tcPr>
+          <w:p>
+            <w:pPr>
+              <w:pStyle w:val="28"/>
+              <w:rPr>
+                <w:rFonts w:hint="default"/>
+                <w:lang w:val="en-NZ"/>
+              </w:rPr>
+            </w:pPr>
+            <w:r>
+              <w:rPr>
+                <w:rFonts w:hint="default"/>
+                <w:lang w:val="en-NZ"/>
+              </w:rPr>
+              <w:t>75%</w:t>
+            </w:r>
+          </w:p>
+        </w:tc>
+        <w:tc>
+          <w:tcPr>
+            <w:tcW w:w="1618" w:type="dxa"/>
+            <w:vAlign w:val="center"/>
+          </w:tcPr>
+          <w:p>
+            <w:pPr>
+              <w:pStyle w:val="28"/>
+              <w:rPr>
+                <w:rFonts w:hint="default"/>
+                <w:lang w:val="en-NZ"/>
+              </w:rPr>
+            </w:pPr>
+            <w:r>
+              <w:rPr>
+                <w:rFonts w:hint="default"/>
+                <w:lang w:val="en-NZ"/>
+              </w:rPr>
+              <w:t>1.00</w:t>
+            </w:r>
+          </w:p>
+        </w:tc>
+        <w:tc>
+          <w:tcPr>
+            <w:tcW w:w="1240" w:type="dxa"/>
+            <w:vAlign w:val="center"/>
+          </w:tcPr>
+          <w:p>
+            <w:pPr>
+              <w:pStyle w:val="28"/>
+              <w:rPr>
+                <w:rFonts w:hint="default"/>
+                <w:lang w:val="en-NZ"/>
+              </w:rPr>
+            </w:pPr>
+            <w:r>
+              <w:rPr>
+                <w:rFonts w:hint="default"/>
+                <w:lang w:val="en-NZ"/>
+              </w:rPr>
+              <w:t>150.00</w:t>
+            </w:r>
+          </w:p>
+        </w:tc>
+        <w:tc>
+          <w:tcPr>
+            <w:tcW w:w="1127" w:type="dxa"/>
+            <w:vAlign w:val="center"/>
+          </w:tcPr>
+          <w:p>
+            <w:pPr>
+              <w:pStyle w:val="28"/>
+              <w:rPr>
+                <w:rFonts w:hint="default"/>
+                <w:lang w:val="en-NZ"/>
+              </w:rPr>
+            </w:pPr>
+            <w:r>
+              <w:rPr>
+                <w:rFonts w:hint="default"/>
+                <w:lang w:val="en-NZ"/>
+              </w:rPr>
+              <w:t>150.00</w:t>
+            </w:r>
+          </w:p>
+        </w:tc>
+      </w:tr>
+      <w:tr>
+        <w:tblPrEx>
+          <w:tblBorders>
+            <w:top w:val="single" w:color="auto" w:sz="2" w:space="0"/>
+            <w:left w:val="single" w:color="auto" w:sz="2" w:space="0"/>
+            <w:bottom w:val="single" w:color="auto" w:sz="2" w:space="0"/>
+            <w:right w:val="single" w:color="auto" w:sz="2" w:space="0"/>
+            <w:insideH w:val="single" w:color="auto" w:sz="2" w:space="0"/>
+            <w:insideV w:val="single" w:color="auto" w:sz="2" w:space="0"/>
+          </w:tblBorders>
+          <w:tblCellMar>
+            <w:top w:w="0" w:type="dxa"/>
+            <w:left w:w="108" w:type="dxa"/>
+            <w:bottom w:w="0" w:type="dxa"/>
+            <w:right w:w="108" w:type="dxa"/>
+          </w:tblCellMar>
+        </w:tblPrEx>
+        <w:trPr>
+          <w:trHeight w:val="320" w:hRule="atLeast"/>
+          <w:jc w:val="center"/>
+        </w:trPr>
+        <w:tc>
+          <w:tcPr>
+            <w:tcW w:w="875" w:type="dxa"/>
+            <w:vAlign w:val="center"/>
+          </w:tcPr>
+          <w:p>
+            <w:pPr>
+              <w:pStyle w:val="28"/>
+              <w:rPr>
+                <w:rFonts w:hint="default"/>
+                <w:lang w:val="en-NZ"/>
+              </w:rPr>
+            </w:pPr>
+            <w:r>
+              <w:rPr>
+                <w:rFonts w:hint="default"/>
+                <w:lang w:val="en-NZ"/>
+              </w:rPr>
+              <w:t>Max</w:t>
+            </w:r>
+          </w:p>
+        </w:tc>
+        <w:tc>
+          <w:tcPr>
+            <w:tcW w:w="1618" w:type="dxa"/>
+            <w:vAlign w:val="center"/>
+          </w:tcPr>
+          <w:p>
+            <w:pPr>
+              <w:pStyle w:val="28"/>
+              <w:rPr>
+                <w:rFonts w:hint="default"/>
+                <w:lang w:val="en-NZ"/>
+              </w:rPr>
+            </w:pPr>
+            <w:r>
+              <w:rPr>
+                <w:rFonts w:hint="default"/>
+                <w:lang w:val="en-NZ"/>
+              </w:rPr>
+              <w:t>9.00</w:t>
+            </w:r>
+          </w:p>
+        </w:tc>
+        <w:tc>
+          <w:tcPr>
+            <w:tcW w:w="1240" w:type="dxa"/>
+            <w:vAlign w:val="center"/>
+          </w:tcPr>
+          <w:p>
+            <w:pPr>
+              <w:pStyle w:val="28"/>
+              <w:rPr>
+                <w:rFonts w:hint="default"/>
+                <w:lang w:val="en-NZ"/>
+              </w:rPr>
+            </w:pPr>
+            <w:r>
+              <w:rPr>
+                <w:rFonts w:hint="default"/>
+                <w:lang w:val="en-NZ"/>
+              </w:rPr>
+              <w:t>1700.00</w:t>
+            </w:r>
+          </w:p>
+        </w:tc>
+        <w:tc>
+          <w:tcPr>
+            <w:tcW w:w="1127" w:type="dxa"/>
+            <w:vAlign w:val="center"/>
+          </w:tcPr>
+          <w:p>
+            <w:pPr>
+              <w:pStyle w:val="28"/>
+              <w:rPr>
+                <w:rFonts w:hint="default"/>
+                <w:lang w:val="en-NZ"/>
+              </w:rPr>
+            </w:pPr>
+            <w:r>
+              <w:rPr>
+                <w:rFonts w:hint="default"/>
+                <w:lang w:val="en-NZ"/>
+              </w:rPr>
+              <w:t>3400.00</w:t>
+            </w:r>
+          </w:p>
+        </w:tc>
+      </w:tr>
+      <w:tr>
+        <w:tblPrEx>
+          <w:tblBorders>
+            <w:top w:val="single" w:color="auto" w:sz="2" w:space="0"/>
+            <w:left w:val="single" w:color="auto" w:sz="2" w:space="0"/>
+            <w:bottom w:val="single" w:color="auto" w:sz="2" w:space="0"/>
+            <w:right w:val="single" w:color="auto" w:sz="2" w:space="0"/>
+            <w:insideH w:val="single" w:color="auto" w:sz="2" w:space="0"/>
+            <w:insideV w:val="single" w:color="auto" w:sz="2" w:space="0"/>
+          </w:tblBorders>
+          <w:tblCellMar>
+            <w:top w:w="0" w:type="dxa"/>
+            <w:left w:w="108" w:type="dxa"/>
+            <w:bottom w:w="0" w:type="dxa"/>
+            <w:right w:w="108" w:type="dxa"/>
+          </w:tblCellMar>
+        </w:tblPrEx>
+        <w:trPr>
+          <w:trHeight w:val="320" w:hRule="atLeast"/>
+          <w:jc w:val="center"/>
+        </w:trPr>
+        <w:tc>
+          <w:tcPr>
+            <w:tcW w:w="875" w:type="dxa"/>
+            <w:vAlign w:val="center"/>
+          </w:tcPr>
+          <w:p>
+            <w:pPr>
+              <w:pStyle w:val="28"/>
+              <w:rPr>
+                <w:rFonts w:hint="default"/>
+                <w:lang w:val="en-NZ"/>
+              </w:rPr>
+            </w:pPr>
+            <w:r>
+              <w:rPr>
+                <w:rFonts w:hint="default"/>
+                <w:lang w:val="en-NZ"/>
+              </w:rPr>
+              <w:t>Std</w:t>
+            </w:r>
+          </w:p>
+        </w:tc>
+        <w:tc>
+          <w:tcPr>
+            <w:tcW w:w="1618" w:type="dxa"/>
+            <w:vAlign w:val="center"/>
+          </w:tcPr>
+          <w:p>
+            <w:pPr>
+              <w:pStyle w:val="28"/>
+              <w:rPr>
+                <w:rFonts w:hint="default"/>
+                <w:lang w:val="en-NZ"/>
+              </w:rPr>
+            </w:pPr>
+            <w:r>
+              <w:rPr>
+                <w:rFonts w:hint="default"/>
+                <w:lang w:val="en-NZ"/>
+              </w:rPr>
+              <w:t>0.44</w:t>
+            </w:r>
+          </w:p>
+        </w:tc>
+        <w:tc>
+          <w:tcPr>
+            <w:tcW w:w="1240" w:type="dxa"/>
+            <w:vAlign w:val="center"/>
+          </w:tcPr>
+          <w:p>
+            <w:pPr>
+              <w:pStyle w:val="28"/>
+              <w:rPr>
+                <w:rFonts w:hint="default"/>
+                <w:lang w:val="en-NZ"/>
+              </w:rPr>
+            </w:pPr>
+            <w:r>
+              <w:rPr>
+                <w:rFonts w:hint="default"/>
+                <w:lang w:val="en-NZ"/>
+              </w:rPr>
+              <w:t>332.73</w:t>
+            </w:r>
+          </w:p>
+        </w:tc>
+        <w:tc>
+          <w:tcPr>
+            <w:tcW w:w="1127" w:type="dxa"/>
+            <w:vAlign w:val="center"/>
+          </w:tcPr>
+          <w:p>
+            <w:pPr>
+              <w:pStyle w:val="28"/>
+              <w:rPr>
+                <w:rFonts w:hint="default"/>
+                <w:lang w:val="en-NZ"/>
+              </w:rPr>
+            </w:pPr>
+            <w:r>
+              <w:rPr>
+                <w:rFonts w:hint="default"/>
+                <w:lang w:val="en-NZ"/>
+              </w:rPr>
+              <w:t>332.92</w:t>
+            </w:r>
+          </w:p>
+        </w:tc>
+      </w:tr>
+    </w:tbl>
     <w:p>
       <w:pPr>
         <w:pStyle w:val="7"/>
+        <w:ind w:left="0" w:leftChars="0" w:firstLine="0" w:firstLineChars="0"/>
       </w:pPr>
     </w:p>
     <w:p>
       <w:pPr>
         <w:pStyle w:val="7"/>
+        <w:rPr>
+          <w:rFonts w:hint="default"/>
+          <w:lang w:val="en-NZ"/>
+        </w:rPr>
       </w:pPr>
     </w:p>
     <w:p>
@@ -2500,7 +3841,11 @@
         <w:pStyle w:val="3"/>
       </w:pPr>
       <w:r>
-        <w:t>Units</w:t>
+        <w:rPr>
+          <w:rFonts w:hint="default"/>
+          <w:lang w:val="en-NZ"/>
+        </w:rPr>
+        <w:t>Sales Patterns</w:t>
       </w:r>
     </w:p>
     <w:p>
@@ -4570,7 +5915,7 @@
     <w:lsdException w:qFormat="1" w:unhideWhenUsed="0" w:uiPriority="0" w:semiHidden="0" w:name="Title"/>
     <w:lsdException w:unhideWhenUsed="0" w:uiPriority="0" w:semiHidden="0" w:name="Closing"/>
     <w:lsdException w:unhideWhenUsed="0" w:uiPriority="0" w:semiHidden="0" w:name="Signature"/>
-    <w:lsdException w:uiPriority="1" w:name="Default Paragraph Font"/>
+    <w:lsdException w:qFormat="1" w:uiPriority="1" w:name="Default Paragraph Font"/>
     <w:lsdException w:qFormat="1" w:unhideWhenUsed="0" w:uiPriority="0" w:semiHidden="0" w:name="Body Text"/>
     <w:lsdException w:unhideWhenUsed="0" w:uiPriority="0" w:semiHidden="0" w:name="Body Text Indent"/>
     <w:lsdException w:unhideWhenUsed="0" w:uiPriority="0" w:semiHidden="0" w:name="List Continue"/>
@@ -4883,6 +6228,7 @@
     <w:name w:val="Default Paragraph Font"/>
     <w:semiHidden/>
     <w:unhideWhenUsed/>
+    <w:qFormat/>
     <w:uiPriority w:val="1"/>
   </w:style>
   <w:style w:type="table" w:default="1" w:styleId="11">
@@ -4987,6 +6333,7 @@
   </w:style>
   <w:style w:type="paragraph" w:customStyle="1" w:styleId="15">
     <w:name w:val="Affiliation"/>
+    <w:qFormat/>
     <w:uiPriority w:val="0"/>
     <w:pPr>
       <w:jc w:val="center"/>
@@ -5199,6 +6546,7 @@
   </w:style>
   <w:style w:type="paragraph" w:customStyle="1" w:styleId="29">
     <w:name w:val="table footnote"/>
+    <w:qFormat/>
     <w:uiPriority w:val="0"/>
     <w:pPr>
       <w:numPr>
@@ -5218,6 +6566,7 @@
   </w:style>
   <w:style w:type="paragraph" w:customStyle="1" w:styleId="30">
     <w:name w:val="table head"/>
+    <w:qFormat/>
     <w:uiPriority w:val="0"/>
     <w:pPr>
       <w:numPr>

</xml_diff>

<commit_message>
wrote EDA part and finished sales pattern & product performance
</commit_message>
<xml_diff>
--- a/Part3/Report_JingshuTang.docx
+++ b/Part3/Report_JingshuTang.docx
@@ -2477,7 +2477,7 @@
         <w:ind w:left="0" w:leftChars="0" w:firstLine="0" w:firstLineChars="0"/>
         <w:rPr>
           <w:rFonts w:hint="default"/>
-          <w:lang w:val="en-US"/>
+          <w:lang w:val="en-NZ"/>
         </w:rPr>
       </w:pPr>
       <w:r>
@@ -2497,14 +2497,14 @@
                   <wp:posOffset>3175</wp:posOffset>
                 </wp:positionV>
                 <wp:extent cx="3265805" cy="1299845"/>
-                <wp:effectExtent l="4445" t="4445" r="6985" b="33020"/>
+                <wp:effectExtent l="0" t="0" r="3175" b="4445"/>
                 <wp:wrapTight wrapText="bothSides">
                   <wp:wrapPolygon>
-                    <wp:start x="-29" y="-74"/>
-                    <wp:lineTo x="-29" y="21051"/>
-                    <wp:lineTo x="21046" y="21051"/>
-                    <wp:lineTo x="21046" y="-74"/>
-                    <wp:lineTo x="-29" y="-74"/>
+                    <wp:start x="0" y="0"/>
+                    <wp:lineTo x="0" y="20988"/>
+                    <wp:lineTo x="21020" y="20988"/>
+                    <wp:lineTo x="21020" y="0"/>
+                    <wp:lineTo x="0" y="0"/>
                   </wp:wrapPolygon>
                 </wp:wrapTight>
                 <wp:docPr id="2" name="Text Box 8"/>
@@ -2527,12 +2527,7 @@
                           <a:srgbClr val="FFFFFF"/>
                         </a:solidFill>
                         <a:ln w="9525">
-                          <a:solidFill>
-                            <a:schemeClr val="tx1">
-                              <a:lumMod val="50000"/>
-                              <a:lumOff val="50000"/>
-                            </a:schemeClr>
-                          </a:solidFill>
+                          <a:noFill/>
                           <a:miter lim="800000"/>
                         </a:ln>
                       </wps:spPr>
@@ -2573,7 +2568,7 @@
                               <w:drawing>
                                 <wp:inline distT="0" distB="0" distL="114300" distR="114300">
                                   <wp:extent cx="3105150" cy="1177290"/>
-                                  <wp:effectExtent l="0" t="0" r="6985" b="3175"/>
+                                  <wp:effectExtent l="9525" t="9525" r="13970" b="10160"/>
                                   <wp:docPr id="9" name="图片 9" descr="Figure1_Boxplots of Numerical Features             in the Dataset"/>
                                   <wp:cNvGraphicFramePr>
                                     <a:graphicFrameLocks xmlns:a="http://schemas.openxmlformats.org/drawingml/2006/main" noChangeAspect="1"/>
@@ -2601,6 +2596,14 @@
                                           <a:prstGeom prst="rect">
                                             <a:avLst/>
                                           </a:prstGeom>
+                                          <a:ln w="6350">
+                                            <a:solidFill>
+                                              <a:schemeClr val="tx1">
+                                                <a:lumMod val="50000"/>
+                                                <a:lumOff val="50000"/>
+                                              </a:schemeClr>
+                                            </a:solidFill>
+                                          </a:ln>
                                         </pic:spPr>
                                       </pic:pic>
                                     </a:graphicData>
@@ -2622,9 +2625,9 @@
           </mc:Choice>
           <mc:Fallback>
             <w:pict>
-              <v:rect id="Text Box 8" o:spid="_x0000_s1026" o:spt="1" style="position:absolute;left:0pt;margin-left:-10.1pt;margin-top:0.25pt;height:102.35pt;width:257.15pt;mso-position-horizontal-relative:margin;mso-wrap-distance-left:9pt;mso-wrap-distance-right:9pt;z-index:-251656192;mso-width-relative:page;mso-height-relative:page;" fillcolor="#FFFFFF" filled="t" stroked="t" coordsize="21600,21600" wrapcoords="-29 -74 -29 21051 21046 21051 21046 -74 -29 -74" o:gfxdata="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">
+              <v:rect id="Text Box 8" o:spid="_x0000_s1026" o:spt="1" style="position:absolute;left:0pt;margin-left:-10.1pt;margin-top:0.25pt;height:102.35pt;width:257.15pt;mso-position-horizontal-relative:margin;mso-wrap-distance-left:9pt;mso-wrap-distance-right:9pt;z-index:-251656192;mso-width-relative:page;mso-height-relative:page;" fillcolor="#FFFFFF" filled="t" stroked="f" coordsize="21600,21600" wrapcoords="0 0 0 20988 21020 20988 21020 0 0 0" o:gfxdata="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">
                 <v:fill on="t" focussize="0,0"/>
-                <v:stroke color="#808080 [1629]" miterlimit="8" joinstyle="miter"/>
+                <v:stroke on="f" miterlimit="8" joinstyle="miter"/>
                 <v:imagedata o:title=""/>
                 <o:lock v:ext="edit" aspectratio="f"/>
                 <v:textbox>
@@ -2664,7 +2667,7 @@
                         <w:drawing>
                           <wp:inline distT="0" distB="0" distL="114300" distR="114300">
                             <wp:extent cx="3105150" cy="1177290"/>
-                            <wp:effectExtent l="0" t="0" r="6985" b="3175"/>
+                            <wp:effectExtent l="9525" t="9525" r="13970" b="10160"/>
                             <wp:docPr id="9" name="图片 9" descr="Figure1_Boxplots of Numerical Features             in the Dataset"/>
                             <wp:cNvGraphicFramePr>
                               <a:graphicFrameLocks xmlns:a="http://schemas.openxmlformats.org/drawingml/2006/main" noChangeAspect="1"/>
@@ -2692,6 +2695,14 @@
                                     <a:prstGeom prst="rect">
                                       <a:avLst/>
                                     </a:prstGeom>
+                                    <a:ln w="6350">
+                                      <a:solidFill>
+                                        <a:schemeClr val="tx1">
+                                          <a:lumMod val="50000"/>
+                                          <a:lumOff val="50000"/>
+                                        </a:schemeClr>
+                                      </a:solidFill>
+                                    </a:ln>
                                   </pic:spPr>
                                 </pic:pic>
                               </a:graphicData>
@@ -2713,10 +2724,22 @@
           <w:rFonts w:hint="eastAsia"/>
           <w:lang w:val="en-US" w:eastAsia="zh-CN"/>
         </w:rPr>
-        <w:t>With details shown in Table II, 75% of the products were priced less than $150. Several extremely high-valued (e.g. $1700 per each) products contributed as outliers. These observations correspond to genuine purchases of expensive products rather than data quality issues and were therefore retained for subsequent analysis.</w:t>
-      </w:r>
-      <w:bookmarkStart w:id="0" w:name="_GoBack"/>
-      <w:bookmarkEnd w:id="0"/>
+        <w:t xml:space="preserve">With details shown in Table II, 75% of the products were priced less than $150. Several extremely high-valued (e.g. $1700 per each) products contributed as outliers. These observations </w:t>
+      </w:r>
+      <w:r>
+        <w:rPr>
+          <w:rFonts w:hint="default"/>
+          <w:lang w:val="en-NZ" w:eastAsia="zh-CN"/>
+        </w:rPr>
+        <w:t xml:space="preserve">were considered as </w:t>
+      </w:r>
+      <w:r>
+        <w:rPr>
+          <w:rFonts w:hint="eastAsia"/>
+          <w:lang w:val="en-US" w:eastAsia="zh-CN"/>
+        </w:rPr>
+        <w:t>genuine purchases of expensive products rather than data quality issues and were therefore retained for subsequent analysis.</w:t>
+      </w:r>
     </w:p>
     <w:p>
       <w:pPr>
@@ -3825,35 +3848,683 @@
       <w:pPr>
         <w:pStyle w:val="7"/>
         <w:ind w:left="0" w:leftChars="0" w:firstLine="0" w:firstLineChars="0"/>
-      </w:pPr>
-    </w:p>
-    <w:p>
-      <w:pPr>
-        <w:pStyle w:val="7"/>
+        <w:rPr>
+          <w:rFonts w:hint="eastAsia" w:eastAsia="SimSun"/>
+          <w:lang w:val="en-NZ" w:eastAsia="zh-CN"/>
+        </w:rPr>
+      </w:pPr>
+    </w:p>
+    <w:p>
+      <w:pPr>
+        <w:pStyle w:val="3"/>
+      </w:pPr>
+      <w:r>
         <w:rPr>
           <w:rFonts w:hint="default"/>
           <w:lang w:val="en-NZ"/>
         </w:rPr>
-      </w:pPr>
-    </w:p>
-    <w:p>
-      <w:pPr>
-        <w:pStyle w:val="3"/>
-      </w:pPr>
+        <w:t>Sales Patterns</w:t>
+      </w:r>
+    </w:p>
+    <w:p>
+      <w:pPr>
+        <w:pStyle w:val="18"/>
+      </w:pPr>
+      <w:r>
+        <w:rPr>
+          <w:rFonts w:hint="default"/>
+          <w:lang w:val="en-US"/>
+        </w:rPr>
+        <mc:AlternateContent>
+          <mc:Choice Requires="wps">
+            <w:drawing>
+              <wp:anchor distT="0" distB="0" distL="114300" distR="114300" simplePos="0" relativeHeight="251661312" behindDoc="1" locked="0" layoutInCell="1" allowOverlap="1">
+                <wp:simplePos x="0" y="0"/>
+                <wp:positionH relativeFrom="margin">
+                  <wp:posOffset>-74295</wp:posOffset>
+                </wp:positionH>
+                <wp:positionV relativeFrom="paragraph">
+                  <wp:posOffset>640080</wp:posOffset>
+                </wp:positionV>
+                <wp:extent cx="3265805" cy="1299845"/>
+                <wp:effectExtent l="0" t="0" r="3175" b="4445"/>
+                <wp:wrapTight wrapText="bothSides">
+                  <wp:wrapPolygon>
+                    <wp:start x="0" y="0"/>
+                    <wp:lineTo x="0" y="20988"/>
+                    <wp:lineTo x="21020" y="20988"/>
+                    <wp:lineTo x="21020" y="0"/>
+                    <wp:lineTo x="0" y="0"/>
+                  </wp:wrapPolygon>
+                </wp:wrapTight>
+                <wp:docPr id="10" name="Text Box 8"/>
+                <wp:cNvGraphicFramePr/>
+                <a:graphic xmlns:a="http://schemas.openxmlformats.org/drawingml/2006/main">
+                  <a:graphicData uri="http://schemas.microsoft.com/office/word/2010/wordprocessingShape">
+                    <wps:wsp>
+                      <wps:cNvSpPr>
+                        <a:spLocks noChangeArrowheads="1"/>
+                      </wps:cNvSpPr>
+                      <wps:spPr>
+                        <a:xfrm>
+                          <a:off x="0" y="0"/>
+                          <a:ext cx="3265805" cy="1299845"/>
+                        </a:xfrm>
+                        <a:prstGeom prst="rect">
+                          <a:avLst/>
+                        </a:prstGeom>
+                        <a:solidFill>
+                          <a:srgbClr val="FFFFFF"/>
+                        </a:solidFill>
+                        <a:ln w="9525">
+                          <a:noFill/>
+                          <a:miter lim="800000"/>
+                        </a:ln>
+                      </wps:spPr>
+                      <wps:txbx>
+                        <w:txbxContent>
+                          <w:p>
+                            <w:pPr>
+                              <w:pStyle w:val="7"/>
+                              <w:ind w:left="0" w:leftChars="0" w:firstLine="0" w:firstLineChars="0"/>
+                              <w:rPr>
+                                <w:rFonts w:hint="default" w:eastAsia="SimSun"/>
+                                <w:color w:val="FFFFFF" w:themeColor="background1"/>
+                                <w:lang w:val="en-NZ" w:eastAsia="zh-CN"/>
+                                <w14:textOutline w14:w="9525">
+                                  <w14:round/>
+                                </w14:textOutline>
+                                <w14:textFill>
+                                  <w14:solidFill>
+                                    <w14:schemeClr w14:val="bg1"/>
+                                  </w14:solidFill>
+                                </w14:textFill>
+                              </w:rPr>
+                            </w:pPr>
+                            <w:r>
+                              <w:rPr>
+                                <w:rFonts w:hint="default" w:eastAsia="SimSun"/>
+                                <w:color w:val="FFFFFF" w:themeColor="background1"/>
+                                <w:lang w:val="en-NZ" w:eastAsia="zh-CN"/>
+                                <w14:textOutline w14:w="9525">
+                                  <w14:round/>
+                                </w14:textOutline>
+                                <w14:textFill>
+                                  <w14:solidFill>
+                                    <w14:schemeClr w14:val="bg1"/>
+                                  </w14:solidFill>
+                                </w14:textFill>
+                              </w:rPr>
+                              <w:drawing>
+                                <wp:inline distT="0" distB="0" distL="114300" distR="114300">
+                                  <wp:extent cx="3067685" cy="1137920"/>
+                                  <wp:effectExtent l="9525" t="9525" r="10160" b="16510"/>
+                                  <wp:docPr id="16" name="图片 16" descr="Figure2_Monthly Sales"/>
+                                  <wp:cNvGraphicFramePr>
+                                    <a:graphicFrameLocks xmlns:a="http://schemas.openxmlformats.org/drawingml/2006/main" noChangeAspect="1"/>
+                                  </wp:cNvGraphicFramePr>
+                                  <a:graphic xmlns:a="http://schemas.openxmlformats.org/drawingml/2006/main">
+                                    <a:graphicData uri="http://schemas.openxmlformats.org/drawingml/2006/picture">
+                                      <pic:pic xmlns:pic="http://schemas.openxmlformats.org/drawingml/2006/picture">
+                                        <pic:nvPicPr>
+                                          <pic:cNvPr id="16" name="图片 16" descr="Figure2_Monthly Sales"/>
+                                          <pic:cNvPicPr>
+                                            <a:picLocks noChangeAspect="1"/>
+                                          </pic:cNvPicPr>
+                                        </pic:nvPicPr>
+                                        <pic:blipFill>
+                                          <a:blip r:embed="rId6"/>
+                                          <a:stretch>
+                                            <a:fillRect/>
+                                          </a:stretch>
+                                        </pic:blipFill>
+                                        <pic:spPr>
+                                          <a:xfrm>
+                                            <a:off x="0" y="0"/>
+                                            <a:ext cx="3067685" cy="1137920"/>
+                                          </a:xfrm>
+                                          <a:prstGeom prst="rect">
+                                            <a:avLst/>
+                                          </a:prstGeom>
+                                          <a:ln w="6350">
+                                            <a:solidFill>
+                                              <a:schemeClr val="tx1">
+                                                <a:lumMod val="50000"/>
+                                                <a:lumOff val="50000"/>
+                                              </a:schemeClr>
+                                            </a:solidFill>
+                                          </a:ln>
+                                        </pic:spPr>
+                                      </pic:pic>
+                                    </a:graphicData>
+                                  </a:graphic>
+                                </wp:inline>
+                              </w:drawing>
+                            </w:r>
+                          </w:p>
+                        </w:txbxContent>
+                      </wps:txbx>
+                      <wps:bodyPr rot="0" vert="horz" wrap="square" lIns="91440" tIns="45720" rIns="91440" bIns="45720" anchor="t" anchorCtr="0" upright="1">
+                        <a:noAutofit/>
+                      </wps:bodyPr>
+                    </wps:wsp>
+                  </a:graphicData>
+                </a:graphic>
+              </wp:anchor>
+            </w:drawing>
+          </mc:Choice>
+          <mc:Fallback>
+            <w:pict>
+              <v:rect id="Text Box 8" o:spid="_x0000_s1026" o:spt="1" style="position:absolute;left:0pt;margin-left:-5.85pt;margin-top:50.4pt;height:102.35pt;width:257.15pt;mso-position-horizontal-relative:margin;mso-wrap-distance-left:9pt;mso-wrap-distance-right:9pt;z-index:-251655168;mso-width-relative:page;mso-height-relative:page;" fillcolor="#FFFFFF" filled="t" stroked="f" coordsize="21600,21600" wrapcoords="0 0 0 20988 21020 20988 21020 0 0 0" o:gfxdata="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">
+                <v:fill on="t" focussize="0,0"/>
+                <v:stroke on="f" miterlimit="8" joinstyle="miter"/>
+                <v:imagedata o:title=""/>
+                <o:lock v:ext="edit" aspectratio="f"/>
+                <v:textbox>
+                  <w:txbxContent>
+                    <w:p>
+                      <w:pPr>
+                        <w:pStyle w:val="7"/>
+                        <w:ind w:left="0" w:leftChars="0" w:firstLine="0" w:firstLineChars="0"/>
+                        <w:rPr>
+                          <w:rFonts w:hint="default" w:eastAsia="SimSun"/>
+                          <w:color w:val="FFFFFF" w:themeColor="background1"/>
+                          <w:lang w:val="en-NZ" w:eastAsia="zh-CN"/>
+                          <w14:textOutline w14:w="9525">
+                            <w14:round/>
+                          </w14:textOutline>
+                          <w14:textFill>
+                            <w14:solidFill>
+                              <w14:schemeClr w14:val="bg1"/>
+                            </w14:solidFill>
+                          </w14:textFill>
+                        </w:rPr>
+                      </w:pPr>
+                      <w:r>
+                        <w:rPr>
+                          <w:rFonts w:hint="default" w:eastAsia="SimSun"/>
+                          <w:color w:val="FFFFFF" w:themeColor="background1"/>
+                          <w:lang w:val="en-NZ" w:eastAsia="zh-CN"/>
+                          <w14:textOutline w14:w="9525">
+                            <w14:round/>
+                          </w14:textOutline>
+                          <w14:textFill>
+                            <w14:solidFill>
+                              <w14:schemeClr w14:val="bg1"/>
+                            </w14:solidFill>
+                          </w14:textFill>
+                        </w:rPr>
+                        <w:drawing>
+                          <wp:inline distT="0" distB="0" distL="114300" distR="114300">
+                            <wp:extent cx="3067685" cy="1137920"/>
+                            <wp:effectExtent l="9525" t="9525" r="10160" b="16510"/>
+                            <wp:docPr id="16" name="图片 16" descr="Figure2_Monthly Sales"/>
+                            <wp:cNvGraphicFramePr>
+                              <a:graphicFrameLocks xmlns:a="http://schemas.openxmlformats.org/drawingml/2006/main" noChangeAspect="1"/>
+                            </wp:cNvGraphicFramePr>
+                            <a:graphic xmlns:a="http://schemas.openxmlformats.org/drawingml/2006/main">
+                              <a:graphicData uri="http://schemas.openxmlformats.org/drawingml/2006/picture">
+                                <pic:pic xmlns:pic="http://schemas.openxmlformats.org/drawingml/2006/picture">
+                                  <pic:nvPicPr>
+                                    <pic:cNvPr id="16" name="图片 16" descr="Figure2_Monthly Sales"/>
+                                    <pic:cNvPicPr>
+                                      <a:picLocks noChangeAspect="1"/>
+                                    </pic:cNvPicPr>
+                                  </pic:nvPicPr>
+                                  <pic:blipFill>
+                                    <a:blip r:embed="rId6"/>
+                                    <a:stretch>
+                                      <a:fillRect/>
+                                    </a:stretch>
+                                  </pic:blipFill>
+                                  <pic:spPr>
+                                    <a:xfrm>
+                                      <a:off x="0" y="0"/>
+                                      <a:ext cx="3067685" cy="1137920"/>
+                                    </a:xfrm>
+                                    <a:prstGeom prst="rect">
+                                      <a:avLst/>
+                                    </a:prstGeom>
+                                    <a:ln w="6350">
+                                      <a:solidFill>
+                                        <a:schemeClr val="tx1">
+                                          <a:lumMod val="50000"/>
+                                          <a:lumOff val="50000"/>
+                                        </a:schemeClr>
+                                      </a:solidFill>
+                                    </a:ln>
+                                  </pic:spPr>
+                                </pic:pic>
+                              </a:graphicData>
+                            </a:graphic>
+                          </wp:inline>
+                        </w:drawing>
+                      </w:r>
+                    </w:p>
+                  </w:txbxContent>
+                </v:textbox>
+                <w10:wrap type="tight"/>
+              </v:rect>
+            </w:pict>
+          </mc:Fallback>
+        </mc:AlternateContent>
+      </w:r>
       <w:r>
         <w:rPr>
           <w:rFonts w:hint="default"/>
           <w:lang w:val="en-NZ"/>
         </w:rPr>
-        <w:t>Sales Patterns</w:t>
+        <w:t xml:space="preserve">Monthly revenue: </w:t>
+      </w:r>
+      <w:r>
+        <w:rPr>
+          <w:rFonts w:hint="default"/>
+        </w:rPr>
+        <w:t>Fig</w:t>
+      </w:r>
+      <w:r>
+        <w:rPr>
+          <w:rFonts w:hint="default"/>
+          <w:lang w:val="en-NZ" w:eastAsia="zh-CN"/>
+        </w:rPr>
+        <w:t>. 2</w:t>
+      </w:r>
+      <w:r>
+        <w:rPr>
+          <w:rFonts w:hint="default"/>
+        </w:rPr>
+        <w:t xml:space="preserve"> </w:t>
+      </w:r>
+      <w:r>
+        <w:rPr>
+          <w:rFonts w:hint="default"/>
+          <w:lang w:val="en-NZ"/>
+        </w:rPr>
+        <w:t>indicates</w:t>
+      </w:r>
+      <w:r>
+        <w:rPr>
+          <w:rFonts w:hint="default"/>
+        </w:rPr>
+        <w:t xml:space="preserve"> that sales revenue </w:t>
+      </w:r>
+      <w:r>
+        <w:rPr>
+          <w:rFonts w:hint="default"/>
+          <w:lang w:val="en-NZ"/>
+        </w:rPr>
+        <w:t xml:space="preserve">fluctuated across </w:t>
+      </w:r>
+      <w:r>
+        <w:rPr>
+          <w:rFonts w:hint="default"/>
+        </w:rPr>
+        <w:t>the year, with</w:t>
+      </w:r>
+      <w:r>
+        <w:rPr>
+          <w:rFonts w:hint="default"/>
+          <w:b/>
+          <w:bCs/>
+        </w:rPr>
+        <w:t xml:space="preserve"> December generating the highest </w:t>
+      </w:r>
+      <w:r>
+        <w:rPr>
+          <w:rFonts w:hint="default"/>
+          <w:b/>
+          <w:bCs/>
+          <w:lang w:val="en-NZ"/>
+        </w:rPr>
+        <w:t xml:space="preserve">sales </w:t>
+      </w:r>
+      <w:r>
+        <w:rPr>
+          <w:rFonts w:hint="default"/>
+          <w:b/>
+          <w:bCs/>
+        </w:rPr>
+        <w:t>(USD 4.61 million)</w:t>
+      </w:r>
+      <w:r>
+        <w:rPr>
+          <w:rFonts w:hint="default"/>
+        </w:rPr>
+        <w:t>.</w:t>
+      </w:r>
+    </w:p>
+    <w:p>
+      <w:pPr>
+        <w:pStyle w:val="20"/>
+      </w:pPr>
+      <w:r>
+        <w:rPr>
+          <w:rFonts w:hint="eastAsia"/>
+          <w:iCs/>
+          <w:lang w:val="en-US" w:eastAsia="zh-CN"/>
+        </w:rPr>
+        <w:t>Monthly Sales</w:t>
       </w:r>
     </w:p>
     <w:p>
       <w:pPr>
         <w:pStyle w:val="18"/>
-      </w:pPr>
-      <w:r>
-        <w:t>Use either SI (MKS) or CGS as primary units. (SI units are encouraged.) English units may be used as secondary units (in parentheses). An exception would be the use of English units as identifiers in trade, such as “3.5-inch disk drive”.</w:t>
+        <w:rPr>
+          <w:b w:val="0"/>
+          <w:bCs w:val="0"/>
+        </w:rPr>
+      </w:pPr>
+      <w:r>
+        <w:rPr>
+          <w:rFonts w:hint="default"/>
+          <w:lang w:val="en-NZ"/>
+        </w:rPr>
+        <w:t xml:space="preserve">Sales by city: </w:t>
+      </w:r>
+      <w:r>
+        <w:rPr>
+          <w:rFonts w:hint="eastAsia"/>
+          <w:lang w:val="en-US" w:eastAsia="zh-CN"/>
+        </w:rPr>
+        <w:t xml:space="preserve">Overall, </w:t>
+      </w:r>
+      <w:r>
+        <w:rPr>
+          <w:rFonts w:hint="eastAsia"/>
+          <w:b/>
+          <w:bCs/>
+          <w:lang w:val="en-US" w:eastAsia="zh-CN"/>
+        </w:rPr>
+        <w:t>San Francisco contributed the most sales revenue,</w:t>
+      </w:r>
+      <w:r>
+        <w:rPr>
+          <w:rFonts w:hint="eastAsia"/>
+          <w:lang w:val="en-US" w:eastAsia="zh-CN"/>
+        </w:rPr>
+        <w:t xml:space="preserve"> with around </w:t>
+      </w:r>
+      <w:r>
+        <w:rPr>
+          <w:rFonts w:hint="default"/>
+          <w:b w:val="0"/>
+          <w:bCs w:val="0"/>
+        </w:rPr>
+        <w:t xml:space="preserve">USD </w:t>
+      </w:r>
+      <w:r>
+        <w:rPr>
+          <w:rFonts w:hint="eastAsia"/>
+          <w:b w:val="0"/>
+          <w:bCs w:val="0"/>
+          <w:lang w:val="en-US" w:eastAsia="zh-CN"/>
+        </w:rPr>
+        <w:t>8.26</w:t>
+      </w:r>
+      <w:r>
+        <w:rPr>
+          <w:rFonts w:hint="default"/>
+          <w:b w:val="0"/>
+          <w:bCs w:val="0"/>
+        </w:rPr>
+        <w:t xml:space="preserve"> million</w:t>
+      </w:r>
+      <w:r>
+        <w:rPr>
+          <w:rFonts w:hint="eastAsia"/>
+          <w:b w:val="0"/>
+          <w:bCs w:val="0"/>
+          <w:lang w:val="en-US" w:eastAsia="zh-CN"/>
+        </w:rPr>
+        <w:t xml:space="preserve"> as shown in Fig. 3.</w:t>
+      </w:r>
+    </w:p>
+    <w:p>
+      <w:pPr>
+        <w:pStyle w:val="20"/>
+      </w:pPr>
+      <w:r>
+        <w:rPr>
+          <w:rFonts w:hint="default"/>
+          <w:lang w:val="en-US"/>
+        </w:rPr>
+        <mc:AlternateContent>
+          <mc:Choice Requires="wps">
+            <w:drawing>
+              <wp:anchor distT="0" distB="0" distL="114300" distR="114300" simplePos="0" relativeHeight="251662336" behindDoc="1" locked="0" layoutInCell="1" allowOverlap="1">
+                <wp:simplePos x="0" y="0"/>
+                <wp:positionH relativeFrom="margin">
+                  <wp:posOffset>3379470</wp:posOffset>
+                </wp:positionH>
+                <wp:positionV relativeFrom="paragraph">
+                  <wp:posOffset>143510</wp:posOffset>
+                </wp:positionV>
+                <wp:extent cx="3265805" cy="1299845"/>
+                <wp:effectExtent l="0" t="0" r="3175" b="4445"/>
+                <wp:wrapTight wrapText="bothSides">
+                  <wp:wrapPolygon>
+                    <wp:start x="0" y="0"/>
+                    <wp:lineTo x="0" y="20988"/>
+                    <wp:lineTo x="21020" y="20988"/>
+                    <wp:lineTo x="21020" y="0"/>
+                    <wp:lineTo x="0" y="0"/>
+                  </wp:wrapPolygon>
+                </wp:wrapTight>
+                <wp:docPr id="17" name="Text Box 8"/>
+                <wp:cNvGraphicFramePr/>
+                <a:graphic xmlns:a="http://schemas.openxmlformats.org/drawingml/2006/main">
+                  <a:graphicData uri="http://schemas.microsoft.com/office/word/2010/wordprocessingShape">
+                    <wps:wsp>
+                      <wps:cNvSpPr>
+                        <a:spLocks noChangeArrowheads="1"/>
+                      </wps:cNvSpPr>
+                      <wps:spPr>
+                        <a:xfrm>
+                          <a:off x="0" y="0"/>
+                          <a:ext cx="3265805" cy="1299845"/>
+                        </a:xfrm>
+                        <a:prstGeom prst="rect">
+                          <a:avLst/>
+                        </a:prstGeom>
+                        <a:solidFill>
+                          <a:srgbClr val="FFFFFF"/>
+                        </a:solidFill>
+                        <a:ln w="9525">
+                          <a:noFill/>
+                          <a:miter lim="800000"/>
+                        </a:ln>
+                      </wps:spPr>
+                      <wps:txbx>
+                        <w:txbxContent>
+                          <w:p>
+                            <w:pPr>
+                              <w:pStyle w:val="7"/>
+                              <w:ind w:left="0" w:leftChars="0" w:firstLine="0" w:firstLineChars="0"/>
+                              <w:rPr>
+                                <w:rFonts w:hint="default" w:eastAsia="SimSun"/>
+                                <w:color w:val="FFFFFF" w:themeColor="background1"/>
+                                <w:lang w:val="en-NZ" w:eastAsia="zh-CN"/>
+                                <w14:textFill>
+                                  <w14:solidFill>
+                                    <w14:schemeClr w14:val="bg1"/>
+                                  </w14:solidFill>
+                                </w14:textFill>
+                              </w:rPr>
+                            </w:pPr>
+                            <w:r>
+                              <w:rPr>
+                                <w:rFonts w:hint="default" w:eastAsia="SimSun"/>
+                                <w:color w:val="FFFFFF" w:themeColor="background1"/>
+                                <w:lang w:val="en-NZ" w:eastAsia="zh-CN"/>
+                                <w14:textFill>
+                                  <w14:solidFill>
+                                    <w14:schemeClr w14:val="bg1"/>
+                                  </w14:solidFill>
+                                </w14:textFill>
+                              </w:rPr>
+                              <w:drawing>
+                                <wp:inline distT="0" distB="0" distL="114300" distR="114300">
+                                  <wp:extent cx="3067685" cy="1137920"/>
+                                  <wp:effectExtent l="9525" t="9525" r="10160" b="16510"/>
+                                  <wp:docPr id="19" name="图片 19" descr="Figure3_SalesByCity"/>
+                                  <wp:cNvGraphicFramePr>
+                                    <a:graphicFrameLocks xmlns:a="http://schemas.openxmlformats.org/drawingml/2006/main" noChangeAspect="1"/>
+                                  </wp:cNvGraphicFramePr>
+                                  <a:graphic xmlns:a="http://schemas.openxmlformats.org/drawingml/2006/main">
+                                    <a:graphicData uri="http://schemas.openxmlformats.org/drawingml/2006/picture">
+                                      <pic:pic xmlns:pic="http://schemas.openxmlformats.org/drawingml/2006/picture">
+                                        <pic:nvPicPr>
+                                          <pic:cNvPr id="19" name="图片 19" descr="Figure3_SalesByCity"/>
+                                          <pic:cNvPicPr>
+                                            <a:picLocks noChangeAspect="1"/>
+                                          </pic:cNvPicPr>
+                                        </pic:nvPicPr>
+                                        <pic:blipFill>
+                                          <a:blip r:embed="rId7"/>
+                                          <a:stretch>
+                                            <a:fillRect/>
+                                          </a:stretch>
+                                        </pic:blipFill>
+                                        <pic:spPr>
+                                          <a:xfrm>
+                                            <a:off x="0" y="0"/>
+                                            <a:ext cx="3067685" cy="1137920"/>
+                                          </a:xfrm>
+                                          <a:prstGeom prst="rect">
+                                            <a:avLst/>
+                                          </a:prstGeom>
+                                          <a:ln w="6350">
+                                            <a:solidFill>
+                                              <a:schemeClr val="tx1">
+                                                <a:lumMod val="50000"/>
+                                                <a:lumOff val="50000"/>
+                                              </a:schemeClr>
+                                            </a:solidFill>
+                                          </a:ln>
+                                        </pic:spPr>
+                                      </pic:pic>
+                                    </a:graphicData>
+                                  </a:graphic>
+                                </wp:inline>
+                              </w:drawing>
+                            </w:r>
+                          </w:p>
+                        </w:txbxContent>
+                      </wps:txbx>
+                      <wps:bodyPr rot="0" vert="horz" wrap="square" lIns="91440" tIns="45720" rIns="91440" bIns="45720" anchor="t" anchorCtr="0" upright="1">
+                        <a:noAutofit/>
+                      </wps:bodyPr>
+                    </wps:wsp>
+                  </a:graphicData>
+                </a:graphic>
+              </wp:anchor>
+            </w:drawing>
+          </mc:Choice>
+          <mc:Fallback>
+            <w:pict>
+              <v:rect id="Text Box 8" o:spid="_x0000_s1026" o:spt="1" style="position:absolute;left:0pt;margin-left:266.1pt;margin-top:11.3pt;height:102.35pt;width:257.15pt;mso-position-horizontal-relative:margin;mso-wrap-distance-left:9pt;mso-wrap-distance-right:9pt;z-index:-251654144;mso-width-relative:page;mso-height-relative:page;" fillcolor="#FFFFFF" filled="t" stroked="f" coordsize="21600,21600" wrapcoords="0 0 0 20988 21020 20988 21020 0 0 0" o:gfxdata="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">
+                <v:fill on="t" focussize="0,0"/>
+                <v:stroke on="f" miterlimit="8" joinstyle="miter"/>
+                <v:imagedata o:title=""/>
+                <o:lock v:ext="edit" aspectratio="f"/>
+                <v:textbox>
+                  <w:txbxContent>
+                    <w:p>
+                      <w:pPr>
+                        <w:pStyle w:val="7"/>
+                        <w:ind w:left="0" w:leftChars="0" w:firstLine="0" w:firstLineChars="0"/>
+                        <w:rPr>
+                          <w:rFonts w:hint="default" w:eastAsia="SimSun"/>
+                          <w:color w:val="FFFFFF" w:themeColor="background1"/>
+                          <w:lang w:val="en-NZ" w:eastAsia="zh-CN"/>
+                          <w14:textFill>
+                            <w14:solidFill>
+                              <w14:schemeClr w14:val="bg1"/>
+                            </w14:solidFill>
+                          </w14:textFill>
+                        </w:rPr>
+                      </w:pPr>
+                      <w:r>
+                        <w:rPr>
+                          <w:rFonts w:hint="default" w:eastAsia="SimSun"/>
+                          <w:color w:val="FFFFFF" w:themeColor="background1"/>
+                          <w:lang w:val="en-NZ" w:eastAsia="zh-CN"/>
+                          <w14:textFill>
+                            <w14:solidFill>
+                              <w14:schemeClr w14:val="bg1"/>
+                            </w14:solidFill>
+                          </w14:textFill>
+                        </w:rPr>
+                        <w:drawing>
+                          <wp:inline distT="0" distB="0" distL="114300" distR="114300">
+                            <wp:extent cx="3067685" cy="1137920"/>
+                            <wp:effectExtent l="9525" t="9525" r="10160" b="16510"/>
+                            <wp:docPr id="19" name="图片 19" descr="Figure3_SalesByCity"/>
+                            <wp:cNvGraphicFramePr>
+                              <a:graphicFrameLocks xmlns:a="http://schemas.openxmlformats.org/drawingml/2006/main" noChangeAspect="1"/>
+                            </wp:cNvGraphicFramePr>
+                            <a:graphic xmlns:a="http://schemas.openxmlformats.org/drawingml/2006/main">
+                              <a:graphicData uri="http://schemas.openxmlformats.org/drawingml/2006/picture">
+                                <pic:pic xmlns:pic="http://schemas.openxmlformats.org/drawingml/2006/picture">
+                                  <pic:nvPicPr>
+                                    <pic:cNvPr id="19" name="图片 19" descr="Figure3_SalesByCity"/>
+                                    <pic:cNvPicPr>
+                                      <a:picLocks noChangeAspect="1"/>
+                                    </pic:cNvPicPr>
+                                  </pic:nvPicPr>
+                                  <pic:blipFill>
+                                    <a:blip r:embed="rId7"/>
+                                    <a:stretch>
+                                      <a:fillRect/>
+                                    </a:stretch>
+                                  </pic:blipFill>
+                                  <pic:spPr>
+                                    <a:xfrm>
+                                      <a:off x="0" y="0"/>
+                                      <a:ext cx="3067685" cy="1137920"/>
+                                    </a:xfrm>
+                                    <a:prstGeom prst="rect">
+                                      <a:avLst/>
+                                    </a:prstGeom>
+                                    <a:ln w="6350">
+                                      <a:solidFill>
+                                        <a:schemeClr val="tx1">
+                                          <a:lumMod val="50000"/>
+                                          <a:lumOff val="50000"/>
+                                        </a:schemeClr>
+                                      </a:solidFill>
+                                    </a:ln>
+                                  </pic:spPr>
+                                </pic:pic>
+                              </a:graphicData>
+                            </a:graphic>
+                          </wp:inline>
+                        </w:drawing>
+                      </w:r>
+                    </w:p>
+                  </w:txbxContent>
+                </v:textbox>
+                <w10:wrap type="tight"/>
+              </v:rect>
+            </w:pict>
+          </mc:Fallback>
+        </mc:AlternateContent>
+      </w:r>
+      <w:r>
+        <w:rPr>
+          <w:rFonts w:hint="eastAsia"/>
+          <w:iCs/>
+          <w:lang w:val="en-US" w:eastAsia="zh-CN"/>
+        </w:rPr>
+        <w:t>Sales</w:t>
+      </w:r>
+      <w:r>
+        <w:rPr>
+          <w:rFonts w:hint="default"/>
+          <w:iCs/>
+          <w:lang w:val="en-NZ" w:eastAsia="zh-CN"/>
+        </w:rPr>
+        <w:t xml:space="preserve"> by City</w:t>
       </w:r>
     </w:p>
     <w:p>
@@ -3861,31 +4532,297 @@
         <w:pStyle w:val="18"/>
       </w:pPr>
       <w:r>
-        <w:t>Avoid combining SI and CGS units, such as current in amperes and magnetic field in oersteds. This often leads to confusion because equations do not balance dimensionally. If you must use mixed units, clearly state the units for each quantity that you use in an equation.</w:t>
-      </w:r>
-    </w:p>
-    <w:p>
-      <w:pPr>
-        <w:pStyle w:val="18"/>
-      </w:pPr>
-      <w:r>
-        <w:t>Do not mix complete spellings and abbreviations of units: “Wb/m2” or “webers per square meter”, not “webers/m2”.  Spell out units when they appear in text: “. . . a few henries”, not “. . . a few H”.</w:t>
-      </w:r>
-    </w:p>
-    <w:p>
-      <w:pPr>
-        <w:pStyle w:val="25"/>
-        <w:framePr w:vAnchor="page" w:hAnchor="page" w:x="918" w:y="15121"/>
-        <w:ind w:firstLine="289"/>
-      </w:pPr>
-      <w:r>
-        <w:t xml:space="preserve">Identify applicable funding agency here. </w:t>
-      </w:r>
-      <w:r>
-        <w:rPr>
+        <w:rPr>
+          <w:rFonts w:hint="eastAsia"/>
+          <w:lang w:val="en-US" w:eastAsia="zh-CN"/>
+        </w:rPr>
+        <w:t>Order</w:t>
+      </w:r>
+      <w:r>
+        <w:rPr>
+          <w:rFonts w:hint="default"/>
+          <w:lang w:val="en-NZ" w:eastAsia="zh-CN"/>
+        </w:rPr>
+        <w:t xml:space="preserve"> activity:</w:t>
+      </w:r>
+      <w:r>
+        <w:rPr>
+          <w:rFonts w:hint="eastAsia"/>
+          <w:lang w:val="en-US" w:eastAsia="zh-CN"/>
+        </w:rPr>
+        <w:t xml:space="preserve"> </w:t>
+      </w:r>
+      <w:r>
+        <w:rPr>
+          <w:rFonts w:hint="default"/>
+          <w:lang w:val="en-NZ" w:eastAsia="zh-CN"/>
+        </w:rPr>
+        <w:t xml:space="preserve">As presented by Fig. 4, order activity gradually increased throughout the morning time. </w:t>
+      </w:r>
+      <w:r>
+        <w:rPr>
+          <w:rFonts w:hint="eastAsia"/>
+          <w:b/>
+          <w:bCs/>
+          <w:lang w:val="en-US" w:eastAsia="zh-CN"/>
+        </w:rPr>
+        <w:t>The most purchase happened at 19:00</w:t>
+      </w:r>
+      <w:r>
+        <w:rPr>
+          <w:rFonts w:hint="default"/>
+          <w:b/>
+          <w:bCs/>
+          <w:lang w:val="en-NZ" w:eastAsia="zh-CN"/>
+        </w:rPr>
+        <w:t>, reaching 12,377 orders</w:t>
+      </w:r>
+      <w:r>
+        <w:rPr>
+          <w:b/>
+          <w:bCs/>
+        </w:rPr>
+        <w:t>.</w:t>
+      </w:r>
+    </w:p>
+    <w:p>
+      <w:pPr>
+        <w:pStyle w:val="20"/>
+      </w:pPr>
+      <w:r>
+        <w:rPr>
+          <w:rFonts w:hint="default"/>
+          <w:lang w:val="en-US"/>
+        </w:rPr>
+        <mc:AlternateContent>
+          <mc:Choice Requires="wps">
+            <w:drawing>
+              <wp:anchor distT="0" distB="0" distL="114300" distR="114300" simplePos="0" relativeHeight="251663360" behindDoc="1" locked="0" layoutInCell="1" allowOverlap="1">
+                <wp:simplePos x="0" y="0"/>
+                <wp:positionH relativeFrom="margin">
+                  <wp:posOffset>3379470</wp:posOffset>
+                </wp:positionH>
+                <wp:positionV relativeFrom="paragraph">
+                  <wp:posOffset>143510</wp:posOffset>
+                </wp:positionV>
+                <wp:extent cx="3265805" cy="1299845"/>
+                <wp:effectExtent l="0" t="0" r="3175" b="4445"/>
+                <wp:wrapTight wrapText="bothSides">
+                  <wp:wrapPolygon>
+                    <wp:start x="0" y="0"/>
+                    <wp:lineTo x="0" y="20988"/>
+                    <wp:lineTo x="21020" y="20988"/>
+                    <wp:lineTo x="21020" y="0"/>
+                    <wp:lineTo x="0" y="0"/>
+                  </wp:wrapPolygon>
+                </wp:wrapTight>
+                <wp:docPr id="20" name="Text Box 8"/>
+                <wp:cNvGraphicFramePr/>
+                <a:graphic xmlns:a="http://schemas.openxmlformats.org/drawingml/2006/main">
+                  <a:graphicData uri="http://schemas.microsoft.com/office/word/2010/wordprocessingShape">
+                    <wps:wsp>
+                      <wps:cNvSpPr>
+                        <a:spLocks noChangeArrowheads="1"/>
+                      </wps:cNvSpPr>
+                      <wps:spPr>
+                        <a:xfrm>
+                          <a:off x="0" y="0"/>
+                          <a:ext cx="3265805" cy="1299845"/>
+                        </a:xfrm>
+                        <a:prstGeom prst="rect">
+                          <a:avLst/>
+                        </a:prstGeom>
+                        <a:solidFill>
+                          <a:srgbClr val="FFFFFF"/>
+                        </a:solidFill>
+                        <a:ln w="9525">
+                          <a:noFill/>
+                          <a:miter lim="800000"/>
+                        </a:ln>
+                      </wps:spPr>
+                      <wps:txbx>
+                        <w:txbxContent>
+                          <w:p>
+                            <w:pPr>
+                              <w:pStyle w:val="7"/>
+                              <w:ind w:left="0" w:leftChars="0" w:firstLine="0" w:firstLineChars="0"/>
+                              <w:rPr>
+                                <w:rFonts w:hint="default" w:eastAsia="SimSun"/>
+                                <w:color w:val="FFFFFF" w:themeColor="background1"/>
+                                <w:lang w:val="en-NZ" w:eastAsia="zh-CN"/>
+                                <w14:textFill>
+                                  <w14:solidFill>
+                                    <w14:schemeClr w14:val="bg1"/>
+                                  </w14:solidFill>
+                                </w14:textFill>
+                              </w:rPr>
+                            </w:pPr>
+                            <w:r>
+                              <w:rPr>
+                                <w:rFonts w:hint="default" w:eastAsia="SimSun"/>
+                                <w:color w:val="FFFFFF" w:themeColor="background1"/>
+                                <w:lang w:val="en-NZ" w:eastAsia="zh-CN"/>
+                                <w14:textFill>
+                                  <w14:solidFill>
+                                    <w14:schemeClr w14:val="bg1"/>
+                                  </w14:solidFill>
+                                </w14:textFill>
+                              </w:rPr>
+                              <w:drawing>
+                                <wp:inline distT="0" distB="0" distL="114300" distR="114300">
+                                  <wp:extent cx="3067050" cy="1137920"/>
+                                  <wp:effectExtent l="9525" t="9525" r="10795" b="16510"/>
+                                  <wp:docPr id="22" name="图片 22" descr="Figure4_HourlyOrderActivity"/>
+                                  <wp:cNvGraphicFramePr>
+                                    <a:graphicFrameLocks xmlns:a="http://schemas.openxmlformats.org/drawingml/2006/main" noChangeAspect="1"/>
+                                  </wp:cNvGraphicFramePr>
+                                  <a:graphic xmlns:a="http://schemas.openxmlformats.org/drawingml/2006/main">
+                                    <a:graphicData uri="http://schemas.openxmlformats.org/drawingml/2006/picture">
+                                      <pic:pic xmlns:pic="http://schemas.openxmlformats.org/drawingml/2006/picture">
+                                        <pic:nvPicPr>
+                                          <pic:cNvPr id="22" name="图片 22" descr="Figure4_HourlyOrderActivity"/>
+                                          <pic:cNvPicPr>
+                                            <a:picLocks noChangeAspect="1"/>
+                                          </pic:cNvPicPr>
+                                        </pic:nvPicPr>
+                                        <pic:blipFill>
+                                          <a:blip r:embed="rId8"/>
+                                          <a:stretch>
+                                            <a:fillRect/>
+                                          </a:stretch>
+                                        </pic:blipFill>
+                                        <pic:spPr>
+                                          <a:xfrm>
+                                            <a:off x="0" y="0"/>
+                                            <a:ext cx="3067050" cy="1137920"/>
+                                          </a:xfrm>
+                                          <a:prstGeom prst="rect">
+                                            <a:avLst/>
+                                          </a:prstGeom>
+                                          <a:ln w="6350">
+                                            <a:solidFill>
+                                              <a:schemeClr val="tx1">
+                                                <a:lumMod val="50000"/>
+                                                <a:lumOff val="50000"/>
+                                              </a:schemeClr>
+                                            </a:solidFill>
+                                          </a:ln>
+                                        </pic:spPr>
+                                      </pic:pic>
+                                    </a:graphicData>
+                                  </a:graphic>
+                                </wp:inline>
+                              </w:drawing>
+                            </w:r>
+                          </w:p>
+                        </w:txbxContent>
+                      </wps:txbx>
+                      <wps:bodyPr rot="0" vert="horz" wrap="square" lIns="91440" tIns="45720" rIns="91440" bIns="45720" anchor="t" anchorCtr="0" upright="1">
+                        <a:noAutofit/>
+                      </wps:bodyPr>
+                    </wps:wsp>
+                  </a:graphicData>
+                </a:graphic>
+              </wp:anchor>
+            </w:drawing>
+          </mc:Choice>
+          <mc:Fallback>
+            <w:pict>
+              <v:rect id="Text Box 8" o:spid="_x0000_s1026" o:spt="1" style="position:absolute;left:0pt;margin-left:266.1pt;margin-top:11.3pt;height:102.35pt;width:257.15pt;mso-position-horizontal-relative:margin;mso-wrap-distance-left:9pt;mso-wrap-distance-right:9pt;z-index:-251653120;mso-width-relative:page;mso-height-relative:page;" fillcolor="#FFFFFF" filled="t" stroked="f" coordsize="21600,21600" wrapcoords="0 0 0 20988 21020 20988 21020 0 0 0" o:gfxdata="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">
+                <v:fill on="t" focussize="0,0"/>
+                <v:stroke on="f" miterlimit="8" joinstyle="miter"/>
+                <v:imagedata o:title=""/>
+                <o:lock v:ext="edit" aspectratio="f"/>
+                <v:textbox>
+                  <w:txbxContent>
+                    <w:p>
+                      <w:pPr>
+                        <w:pStyle w:val="7"/>
+                        <w:ind w:left="0" w:leftChars="0" w:firstLine="0" w:firstLineChars="0"/>
+                        <w:rPr>
+                          <w:rFonts w:hint="default" w:eastAsia="SimSun"/>
+                          <w:color w:val="FFFFFF" w:themeColor="background1"/>
+                          <w:lang w:val="en-NZ" w:eastAsia="zh-CN"/>
+                          <w14:textFill>
+                            <w14:solidFill>
+                              <w14:schemeClr w14:val="bg1"/>
+                            </w14:solidFill>
+                          </w14:textFill>
+                        </w:rPr>
+                      </w:pPr>
+                      <w:r>
+                        <w:rPr>
+                          <w:rFonts w:hint="default" w:eastAsia="SimSun"/>
+                          <w:color w:val="FFFFFF" w:themeColor="background1"/>
+                          <w:lang w:val="en-NZ" w:eastAsia="zh-CN"/>
+                          <w14:textFill>
+                            <w14:solidFill>
+                              <w14:schemeClr w14:val="bg1"/>
+                            </w14:solidFill>
+                          </w14:textFill>
+                        </w:rPr>
+                        <w:drawing>
+                          <wp:inline distT="0" distB="0" distL="114300" distR="114300">
+                            <wp:extent cx="3067050" cy="1137920"/>
+                            <wp:effectExtent l="9525" t="9525" r="10795" b="16510"/>
+                            <wp:docPr id="22" name="图片 22" descr="Figure4_HourlyOrderActivity"/>
+                            <wp:cNvGraphicFramePr>
+                              <a:graphicFrameLocks xmlns:a="http://schemas.openxmlformats.org/drawingml/2006/main" noChangeAspect="1"/>
+                            </wp:cNvGraphicFramePr>
+                            <a:graphic xmlns:a="http://schemas.openxmlformats.org/drawingml/2006/main">
+                              <a:graphicData uri="http://schemas.openxmlformats.org/drawingml/2006/picture">
+                                <pic:pic xmlns:pic="http://schemas.openxmlformats.org/drawingml/2006/picture">
+                                  <pic:nvPicPr>
+                                    <pic:cNvPr id="22" name="图片 22" descr="Figure4_HourlyOrderActivity"/>
+                                    <pic:cNvPicPr>
+                                      <a:picLocks noChangeAspect="1"/>
+                                    </pic:cNvPicPr>
+                                  </pic:nvPicPr>
+                                  <pic:blipFill>
+                                    <a:blip r:embed="rId8"/>
+                                    <a:stretch>
+                                      <a:fillRect/>
+                                    </a:stretch>
+                                  </pic:blipFill>
+                                  <pic:spPr>
+                                    <a:xfrm>
+                                      <a:off x="0" y="0"/>
+                                      <a:ext cx="3067050" cy="1137920"/>
+                                    </a:xfrm>
+                                    <a:prstGeom prst="rect">
+                                      <a:avLst/>
+                                    </a:prstGeom>
+                                    <a:ln w="6350">
+                                      <a:solidFill>
+                                        <a:schemeClr val="tx1">
+                                          <a:lumMod val="50000"/>
+                                          <a:lumOff val="50000"/>
+                                        </a:schemeClr>
+                                      </a:solidFill>
+                                    </a:ln>
+                                  </pic:spPr>
+                                </pic:pic>
+                              </a:graphicData>
+                            </a:graphic>
+                          </wp:inline>
+                        </w:drawing>
+                      </w:r>
+                    </w:p>
+                  </w:txbxContent>
+                </v:textbox>
+                <w10:wrap type="tight"/>
+              </v:rect>
+            </w:pict>
+          </mc:Fallback>
+        </mc:AlternateContent>
+      </w:r>
+      <w:r>
+        <w:rPr>
+          <w:rFonts w:hint="default"/>
           <w:iCs/>
-        </w:rPr>
-        <w:t>If none, delete this text box.</w:t>
+          <w:lang w:val="en-NZ" w:eastAsia="zh-CN"/>
+        </w:rPr>
+        <w:t>Hourly Order Activity</w:t>
       </w:r>
     </w:p>
     <w:p>
@@ -3911,7 +4848,7 @@
         <w:pStyle w:val="3"/>
       </w:pPr>
       <w:r>
-        <w:t>Equations</w:t>
+        <w:t>Product Performance</w:t>
       </w:r>
     </w:p>
     <w:p>
@@ -3919,7 +4856,12 @@
         <w:pStyle w:val="7"/>
       </w:pPr>
       <w:r>
-        <w:t>The equations are an exception to the prescribed specifications of this template. You will need to determine whether or not your equation should be typed using either the Times New Roman or the Symbol font (please no other font). To create multileveled equations, it may be necessary to treat the equation as a graphic and insert it into the text after your paper is styled.</w:t>
+        <w:t>The equations are an exception to the prescribed specifications of this template. You will need to determine whether or not your</w:t>
+      </w:r>
+      <w:bookmarkStart w:id="0" w:name="_GoBack"/>
+      <w:bookmarkEnd w:id="0"/>
+      <w:r>
+        <w:t xml:space="preserve"> equation should be typed using either the Times New Roman or the Symbol font (please no other font). To create multileveled equations, it may be necessary to treat the equation as a graphic and insert it into the text after your paper is styled.</w:t>
       </w:r>
     </w:p>
     <w:p>

</xml_diff>

<commit_message>
add plots;finished report draft
</commit_message>
<xml_diff>
--- a/Part3/Report_JingshuTang.docx
+++ b/Part3/Report_JingshuTang.docx
@@ -153,202 +153,19 @@
       </w:pPr>
       <w:r>
         <w:rPr>
-          <w:i/>
           <w:iCs/>
         </w:rPr>
-        <w:t>Abstract</w:t>
-      </w:r>
-      <w:r>
-        <w:t xml:space="preserve">—This electronic document is a “live” template and already defines the components of your paper [title, text, heads, etc.] in its style sheet.  </w:t>
-      </w:r>
-      <w:r>
-        <w:rPr>
-          <w:i/>
-        </w:rPr>
-        <w:t>*CRITICAL:  Do</w:t>
-      </w:r>
-      <w:r>
-        <w:rPr>
-          <w:rFonts w:eastAsia="Times New Roman"/>
-          <w:i/>
-        </w:rPr>
-        <w:t xml:space="preserve"> </w:t>
-      </w:r>
-      <w:r>
-        <w:rPr>
-          <w:i/>
-        </w:rPr>
-        <w:t>Not</w:t>
-      </w:r>
-      <w:r>
-        <w:rPr>
-          <w:rFonts w:eastAsia="Times New Roman"/>
-          <w:i/>
-        </w:rPr>
-        <w:t xml:space="preserve"> </w:t>
-      </w:r>
-      <w:r>
-        <w:rPr>
-          <w:i/>
-        </w:rPr>
-        <w:t>Use</w:t>
-      </w:r>
-      <w:r>
-        <w:rPr>
-          <w:rFonts w:eastAsia="Times New Roman"/>
-          <w:i/>
-        </w:rPr>
-        <w:t xml:space="preserve"> </w:t>
-      </w:r>
-      <w:r>
-        <w:rPr>
-          <w:i/>
-        </w:rPr>
-        <w:t>Symbols,</w:t>
-      </w:r>
-      <w:r>
-        <w:rPr>
-          <w:rFonts w:eastAsia="Times New Roman"/>
-          <w:i/>
-        </w:rPr>
-        <w:t xml:space="preserve"> </w:t>
-      </w:r>
-      <w:r>
-        <w:rPr>
-          <w:i/>
-        </w:rPr>
-        <w:t>Special</w:t>
-      </w:r>
-      <w:r>
-        <w:rPr>
-          <w:rFonts w:eastAsia="Times New Roman"/>
-          <w:i/>
-        </w:rPr>
-        <w:t xml:space="preserve"> </w:t>
-      </w:r>
-      <w:r>
-        <w:rPr>
-          <w:i/>
-        </w:rPr>
-        <w:t>Characters,</w:t>
-      </w:r>
-      <w:r>
-        <w:rPr>
-          <w:rFonts w:eastAsia="Times New Roman"/>
-          <w:i/>
-        </w:rPr>
-        <w:t xml:space="preserve"> Footnotes, </w:t>
-      </w:r>
-      <w:r>
-        <w:rPr>
-          <w:i/>
-        </w:rPr>
-        <w:t>or</w:t>
-      </w:r>
-      <w:r>
-        <w:rPr>
-          <w:rFonts w:eastAsia="Times New Roman"/>
-          <w:i/>
-        </w:rPr>
-        <w:t xml:space="preserve"> </w:t>
-      </w:r>
-      <w:r>
-        <w:rPr>
-          <w:i/>
-        </w:rPr>
-        <w:t>Math</w:t>
-      </w:r>
-      <w:r>
-        <w:rPr>
-          <w:rFonts w:eastAsia="Times New Roman"/>
-          <w:i/>
-        </w:rPr>
-        <w:t xml:space="preserve"> </w:t>
-      </w:r>
-      <w:r>
-        <w:rPr>
-          <w:i/>
-        </w:rPr>
-        <w:t>in</w:t>
-      </w:r>
-      <w:r>
-        <w:rPr>
-          <w:rFonts w:eastAsia="Times New Roman"/>
-          <w:i/>
-        </w:rPr>
-        <w:t xml:space="preserve"> Paper </w:t>
-      </w:r>
-      <w:r>
-        <w:rPr>
-          <w:i/>
-        </w:rPr>
-        <w:t>Title</w:t>
-      </w:r>
-      <w:r>
-        <w:rPr>
-          <w:rFonts w:eastAsia="Times New Roman"/>
-          <w:i/>
-        </w:rPr>
-        <w:t xml:space="preserve"> o</w:t>
-      </w:r>
-      <w:r>
-        <w:rPr>
-          <w:i/>
-        </w:rPr>
-        <w:t>r</w:t>
-      </w:r>
-      <w:r>
-        <w:rPr>
-          <w:rFonts w:eastAsia="Times New Roman"/>
-          <w:i/>
-        </w:rPr>
-        <w:t xml:space="preserve"> </w:t>
-      </w:r>
-      <w:r>
-        <w:rPr>
-          <w:i/>
-        </w:rPr>
-        <w:t>Abstract</w:t>
-      </w:r>
-      <w:r>
-        <w:t xml:space="preserve">. </w:t>
-      </w:r>
-      <w:r>
-        <w:rPr>
-          <w:iCs/>
-        </w:rPr>
-        <w:t>(</w:t>
-      </w:r>
-      <w:r>
-        <w:rPr>
-          <w:b w:val="0"/>
-          <w:i/>
-          <w:iCs/>
-        </w:rPr>
-        <w:t>Abstract</w:t>
-      </w:r>
-      <w:r>
-        <w:rPr>
-          <w:iCs/>
-        </w:rPr>
-        <w:t>)</w:t>
-      </w:r>
+        <w:t>Retail sales transaction data provides valuable insights into customer purchasing behaviour and supports data-driven business decision-making. This study analyses a retail sales dataset containing 185,950 transactions recorded throughout 2019 to investigate sales patterns, identify frequently co-purchased products, and evaluate machine learning models for sales prediction. The analysis combines exploratory data analysis, Pearson correlation analysis, association rule mining using the Apriori algorithm, and three supervised machine learning models, including Linear Regression, Random Forest, and Extreme Gradient Boosting (XGBoost). Exploratory analysis revealed clear temporal purchasing patterns, substantial differences between sales volume and revenue contribution across products, and a negative relationship between product price and purchase frequency. Association rule mining identified strong purchasing relationships between smartphones and their compatible charging accessories, highlighting potential cross-selling opportunities. Among the predictive models evaluated, XGBoost achieved the best overall performance by providing the lowest prediction error while maintaining high computational efficiency. Feature importance analysis further demonstrated that product-related variables were the dominant predictors of sales revenue. Overall, the findings illustrate how integrating descriptive analytics, market basket analysis, and machine learning can transform retail transaction data into actionable business insights for inventory management, product recommendation, marketing strategy, and sales forecasting.</w:t>
+      </w:r>
+      <w:bookmarkStart w:id="0" w:name="_GoBack"/>
+      <w:bookmarkEnd w:id="0"/>
     </w:p>
     <w:p>
       <w:pPr>
         <w:pStyle w:val="31"/>
       </w:pPr>
       <w:r>
-        <w:t>Keywords—component, formatting, style, styling, insert (</w:t>
-      </w:r>
-      <w:r>
-        <w:rPr>
-          <w:b w:val="0"/>
-        </w:rPr>
-        <w:t>key words</w:t>
-      </w:r>
-      <w:r>
-        <w:t>)</w:t>
+        <w:t>Keywords—Retail sales analytics, exploratory data analysis, association rule mining, Apriori algorithm, machine learning, XGBoost, sales prediction</w:t>
       </w:r>
     </w:p>
     <w:p>
@@ -2329,12 +2146,14 @@
         <w:pStyle w:val="7"/>
         <w:rPr>
           <w:rFonts w:hint="default"/>
+          <w:highlight w:val="yellow"/>
           <w:lang w:val="en-NZ"/>
         </w:rPr>
       </w:pPr>
       <w:r>
         <w:rPr>
           <w:rFonts w:hint="default"/>
+          <w:highlight w:val="yellow"/>
           <w:lang w:val="en-NZ"/>
         </w:rPr>
         <w:t xml:space="preserve">An overview on data distribution </w:t>
@@ -5009,8 +4828,8 @@
                               </w:rPr>
                               <w:drawing>
                                 <wp:inline distT="0" distB="0" distL="114300" distR="114300">
-                                  <wp:extent cx="3061970" cy="1133475"/>
-                                  <wp:effectExtent l="9525" t="9525" r="15875" b="12700"/>
+                                  <wp:extent cx="3114675" cy="1153160"/>
+                                  <wp:effectExtent l="9525" t="9525" r="12700" b="9525"/>
                                   <wp:docPr id="6" name="图片 6" descr="Figure5_ProductPerformance"/>
                                   <wp:cNvGraphicFramePr>
                                     <a:graphicFrameLocks xmlns:a="http://schemas.openxmlformats.org/drawingml/2006/main" noChangeAspect="1"/>
@@ -5033,7 +4852,7 @@
                                         <pic:spPr>
                                           <a:xfrm>
                                             <a:off x="0" y="0"/>
-                                            <a:ext cx="3061970" cy="1133475"/>
+                                            <a:ext cx="3114675" cy="1153160"/>
                                           </a:xfrm>
                                           <a:prstGeom prst="rect">
                                             <a:avLst/>
@@ -5102,8 +4921,8 @@
                         </w:rPr>
                         <w:drawing>
                           <wp:inline distT="0" distB="0" distL="114300" distR="114300">
-                            <wp:extent cx="3061970" cy="1133475"/>
-                            <wp:effectExtent l="9525" t="9525" r="15875" b="12700"/>
+                            <wp:extent cx="3114675" cy="1153160"/>
+                            <wp:effectExtent l="9525" t="9525" r="12700" b="9525"/>
                             <wp:docPr id="6" name="图片 6" descr="Figure5_ProductPerformance"/>
                             <wp:cNvGraphicFramePr>
                               <a:graphicFrameLocks xmlns:a="http://schemas.openxmlformats.org/drawingml/2006/main" noChangeAspect="1"/>
@@ -5126,7 +4945,7 @@
                                   <pic:spPr>
                                     <a:xfrm>
                                       <a:off x="0" y="0"/>
-                                      <a:ext cx="3061970" cy="1133475"/>
+                                      <a:ext cx="3114675" cy="1153160"/>
                                     </a:xfrm>
                                     <a:prstGeom prst="rect">
                                       <a:avLst/>
@@ -5184,6 +5003,7 @@
       <w:pPr>
         <w:pStyle w:val="20"/>
         <w:numPr>
+          <w:ilvl w:val="0"/>
           <w:numId w:val="0"/>
         </w:numPr>
         <w:ind w:leftChars="0"/>
@@ -6726,7 +6546,6 @@
     <w:p>
       <w:pPr>
         <w:pStyle w:val="3"/>
-        <w:rPr/>
       </w:pPr>
       <w:r>
         <w:t>Frequent Itemset Mining</w:t>
@@ -8031,12 +7850,16 @@
       <w:r>
         <w:rPr>
           <w:rFonts w:hint="default"/>
+          <w:b/>
+          <w:bCs/>
         </w:rPr>
         <w:t>support,</w:t>
       </w:r>
       <w:r>
         <w:rPr>
           <w:rFonts w:hint="default"/>
+          <w:b/>
+          <w:bCs/>
           <w:lang w:val="en-NZ"/>
         </w:rPr>
         <w:t xml:space="preserve"> </w:t>
@@ -8044,15 +7867,26 @@
       <w:r>
         <w:rPr>
           <w:rFonts w:hint="default"/>
+          <w:b/>
+          <w:bCs/>
         </w:rPr>
         <w:t>confidence and lift</w:t>
       </w:r>
       <w:r>
         <w:rPr>
           <w:rFonts w:hint="default"/>
+          <w:b/>
+          <w:bCs/>
           <w:lang w:val="en-NZ"/>
         </w:rPr>
-        <w:t>, were applied to evaluate the rules.</w:t>
+        <w:t xml:space="preserve">, </w:t>
+      </w:r>
+      <w:r>
+        <w:rPr>
+          <w:rFonts w:hint="default"/>
+          <w:lang w:val="en-NZ"/>
+        </w:rPr>
+        <w:t>were applied to evaluate the rules.</w:t>
       </w:r>
       <w:r>
         <w:rPr>
@@ -8144,12 +7978,6 @@
             <w:insideH w:val="single" w:color="auto" w:sz="2" w:space="0"/>
             <w:insideV w:val="single" w:color="auto" w:sz="2" w:space="0"/>
           </w:tblBorders>
-          <w:tblCellMar>
-            <w:top w:w="0" w:type="dxa"/>
-            <w:left w:w="108" w:type="dxa"/>
-            <w:bottom w:w="0" w:type="dxa"/>
-            <w:right w:w="108" w:type="dxa"/>
-          </w:tblCellMar>
         </w:tblPrEx>
         <w:trPr>
           <w:cantSplit/>
@@ -9123,7 +8951,8 @@
       <w:pPr>
         <w:pStyle w:val="7"/>
         <w:rPr>
-          <w:rFonts w:hint="default"/>
+          <w:rFonts w:hint="eastAsia" w:eastAsia="SimSun"/>
+          <w:lang w:eastAsia="zh-CN"/>
         </w:rPr>
       </w:pPr>
       <w:r>
@@ -9150,7 +8979,62 @@
         <w:pStyle w:val="7"/>
       </w:pPr>
       <w:r>
-        <w:t>After the text edit has been completed, the paper is ready for the template. Duplicate the template file by using the Save As command, and use the naming convention prescribed by your conference for the name of your paper. In this newly created file, highlight all of the contents and import your prepared text file. You are now ready to style your paper; use the scroll down window on the left of the MS Word Formatting toolbar.</w:t>
+        <w:rPr>
+          <w:rFonts w:hint="default"/>
+        </w:rPr>
+        <w:t>Machine learning algorithms were employed to forecast sales revenues and extract</w:t>
+      </w:r>
+      <w:r>
+        <w:rPr>
+          <w:rFonts w:hint="default"/>
+          <w:lang w:val="en-NZ"/>
+        </w:rPr>
+        <w:t xml:space="preserve"> the</w:t>
+      </w:r>
+      <w:r>
+        <w:rPr>
+          <w:rFonts w:hint="default"/>
+        </w:rPr>
+        <w:t xml:space="preserve"> most influential in making the prediction. </w:t>
+      </w:r>
+      <w:r>
+        <w:rPr>
+          <w:rFonts w:hint="default"/>
+          <w:lang w:val="en-NZ"/>
+        </w:rPr>
+        <w:t xml:space="preserve">The </w:t>
+      </w:r>
+      <w:r>
+        <w:rPr>
+          <w:rFonts w:hint="default"/>
+        </w:rPr>
+        <w:t xml:space="preserve">dataset was </w:t>
+      </w:r>
+      <w:r>
+        <w:rPr>
+          <w:rFonts w:hint="default"/>
+          <w:lang w:val="en-NZ"/>
+        </w:rPr>
+        <w:t xml:space="preserve">first </w:t>
+      </w:r>
+      <w:r>
+        <w:rPr>
+          <w:rFonts w:hint="default"/>
+        </w:rPr>
+        <w:t>converted into a modelling dataset after selecting and processing the features.</w:t>
+      </w:r>
+      <w:r>
+        <w:rPr>
+          <w:rFonts w:hint="default"/>
+          <w:lang w:val="en-NZ"/>
+        </w:rPr>
+        <w:t xml:space="preserve"> T</w:t>
+      </w:r>
+      <w:r>
+        <w:rPr>
+          <w:rFonts w:hint="default"/>
+        </w:rPr>
+        <w:t>hree supervised machine learning models, Linear Regression, Random Forest, and XGBoost, were built and evaluated  using standard regression metrics. Lastly, feature importance analysis was performed to interpret the contribution of individual predictors and provide insights into the factors influencing sales prediction.</w:t>
       </w:r>
     </w:p>
     <w:p>
@@ -9158,208 +9042,98 @@
         <w:pStyle w:val="3"/>
       </w:pPr>
       <w:r>
-        <w:t>Data Preparation</w:t>
+        <w:rPr>
+          <w:rFonts w:hint="eastAsia"/>
+          <w:lang w:val="en-US" w:eastAsia="zh-CN"/>
+        </w:rPr>
+        <w:t>Feature Selection and data preparation</w:t>
       </w:r>
     </w:p>
     <w:p>
       <w:pPr>
         <w:pStyle w:val="7"/>
-      </w:pPr>
-      <w:r>
-        <w:rPr>
-          <w:b/>
-        </w:rPr>
-        <w:t>The template is designed</w:t>
-      </w:r>
-      <w:r>
-        <w:rPr>
-          <w:b/>
-          <w:lang w:val="en-US"/>
-        </w:rPr>
-        <w:t xml:space="preserve"> for,</w:t>
-      </w:r>
-      <w:r>
-        <w:rPr>
-          <w:b/>
-        </w:rPr>
-        <w:t xml:space="preserve"> but not limited to</w:t>
-      </w:r>
-      <w:r>
-        <w:rPr>
-          <w:b/>
-          <w:lang w:val="en-US"/>
-        </w:rPr>
-        <w:t>, six authors.</w:t>
-      </w:r>
-      <w:r>
-        <w:rPr>
-          <w:lang w:val="en-US"/>
-        </w:rPr>
-        <w:t xml:space="preserve"> A minimum of one author is required for all conference articles. </w:t>
-      </w:r>
-      <w:r>
-        <w:t>Author names should be listed starting from left to right and then moving down to the next line. This is the author sequence that will be used in future citations and by indexing services. Names should not be listed in columns nor group by affiliation.</w:t>
-      </w:r>
-      <w:r>
-        <w:rPr>
-          <w:lang w:val="en-US"/>
-        </w:rPr>
-        <w:t xml:space="preserve"> </w:t>
-      </w:r>
-      <w:r>
-        <w:t>Please keep your affiliations as succinct as possible (for example, do not differentiate among departments of the same organization).</w:t>
+        <w:rPr>
+          <w:rFonts w:hint="default"/>
+        </w:rPr>
+      </w:pPr>
+      <w:r>
+        <w:rPr>
+          <w:rFonts w:hint="default"/>
+        </w:rPr>
+        <w:t>As explained in Section II, the cleaned dataset was used for modelling after feature engineering and preprocessing. The final feature set consisted of three numerical variables (</w:t>
+      </w:r>
+      <w:r>
+        <w:rPr>
+          <w:rFonts w:hint="default"/>
+          <w:i/>
+          <w:iCs/>
+        </w:rPr>
+        <w:t>Quantity Ordered, Month, and Hour)</w:t>
+      </w:r>
+      <w:r>
+        <w:rPr>
+          <w:rFonts w:hint="default"/>
+        </w:rPr>
+        <w:t xml:space="preserve"> and two categorical variables (</w:t>
+      </w:r>
+      <w:r>
+        <w:rPr>
+          <w:rFonts w:hint="default"/>
+          <w:i/>
+          <w:iCs/>
+        </w:rPr>
+        <w:t>Product and City</w:t>
+      </w:r>
+      <w:r>
+        <w:rPr>
+          <w:rFonts w:hint="default"/>
+        </w:rPr>
+        <w:t xml:space="preserve">), which were encoded using one-hot encoding. </w:t>
+      </w:r>
+      <w:r>
+        <w:rPr>
+          <w:rFonts w:hint="default"/>
+          <w:i/>
+          <w:iCs/>
+        </w:rPr>
+        <w:t xml:space="preserve">Sales </w:t>
+      </w:r>
+      <w:r>
+        <w:rPr>
+          <w:rFonts w:hint="default"/>
+        </w:rPr>
+        <w:t>was used as the prediction target</w:t>
+      </w:r>
+      <w:r>
+        <w:rPr>
+          <w:rFonts w:hint="eastAsia"/>
+          <w:lang w:val="en-US" w:eastAsia="zh-CN"/>
+        </w:rPr>
+        <w:t xml:space="preserve"> (see Table VI.)</w:t>
+      </w:r>
+      <w:r>
+        <w:rPr>
+          <w:rFonts w:hint="default"/>
+        </w:rPr>
+        <w:t>.</w:t>
       </w:r>
     </w:p>
     <w:p>
       <w:pPr>
-        <w:pStyle w:val="4"/>
-      </w:pPr>
-      <w:r>
-        <w:t xml:space="preserve">For papers with more than six authors: </w:t>
-      </w:r>
-      <w:r>
-        <w:rPr>
-          <w:i w:val="0"/>
-        </w:rPr>
-        <w:t>Add author names horizontally, moving to a third row if needed for more than 8 authors.</w:t>
-      </w:r>
-    </w:p>
-    <w:p>
-      <w:pPr>
-        <w:pStyle w:val="4"/>
-      </w:pPr>
-      <w:r>
-        <w:t xml:space="preserve">For papers with less than six authors: </w:t>
-      </w:r>
-      <w:r>
-        <w:rPr>
-          <w:i w:val="0"/>
-        </w:rPr>
-        <w:t>To change the default, adjust the template as follows.</w:t>
-      </w:r>
-    </w:p>
-    <w:p>
-      <w:pPr>
-        <w:pStyle w:val="5"/>
-      </w:pPr>
-      <w:r>
-        <w:t xml:space="preserve">Selection: </w:t>
-      </w:r>
-      <w:r>
-        <w:rPr>
-          <w:i w:val="0"/>
-        </w:rPr>
-        <w:t>Highlight all author and affiliation lines.</w:t>
-      </w:r>
-    </w:p>
-    <w:p>
-      <w:pPr>
-        <w:pStyle w:val="5"/>
-      </w:pPr>
-      <w:r>
-        <w:t xml:space="preserve">Change number of columns: </w:t>
-      </w:r>
-      <w:r>
-        <w:rPr>
-          <w:i w:val="0"/>
-        </w:rPr>
-        <w:t>Select the Columns icon from the MS Word Standard toolbar and then select the correct number of columns from the selection palette.</w:t>
-      </w:r>
-    </w:p>
-    <w:p>
-      <w:pPr>
-        <w:pStyle w:val="5"/>
-        <w:rPr>
-          <w:i w:val="0"/>
-        </w:rPr>
-      </w:pPr>
-      <w:r>
-        <w:t xml:space="preserve">Deletion: </w:t>
-      </w:r>
-      <w:r>
-        <w:rPr>
-          <w:i w:val="0"/>
-        </w:rPr>
-        <w:t>Delete the author and affiliation lines for the extra authors.</w:t>
-      </w:r>
-    </w:p>
-    <w:p>
-      <w:pPr>
-        <w:jc w:val="left"/>
-        <w:rPr>
-          <w:i/>
-          <w:iCs/>
-        </w:rPr>
-      </w:pPr>
-    </w:p>
-    <w:p>
-      <w:pPr>
-        <w:pStyle w:val="3"/>
-      </w:pPr>
-      <w:r>
-        <w:t>Model Performance Comparison</w:t>
-      </w:r>
-    </w:p>
-    <w:p>
-      <w:pPr>
-        <w:pStyle w:val="7"/>
-      </w:pPr>
-      <w:r>
-        <w:t>Headings, or heads, are organizational devices that guide the reader through your paper. There are two types: component heads and text heads.</w:t>
-      </w:r>
-    </w:p>
-    <w:p>
-      <w:pPr>
-        <w:pStyle w:val="7"/>
-      </w:pPr>
-      <w:r>
-        <w:t>Component heads identify the different components of your paper and are not topically subordinate to each other. Examples include Acknowledgments and References and, for these, the correct style to use is “Heading 5”. Use “figure caption” for your Figure captions, and “table head” for your table title. Run-in heads, such as “Abstract”, will require you to apply a style (in this case, italic) in addition to the style provided by the drop down menu to differentiate the head from the text.</w:t>
-      </w:r>
-    </w:p>
-    <w:p>
-      <w:pPr>
-        <w:pStyle w:val="7"/>
-      </w:pPr>
-      <w:r>
-        <w:t>Text heads organize the topics on a relational, hierarchical basis. For example, the paper title is the primary text head because all subsequent material relates and elaborates on this one topic. If there are two or more sub-topics, the next level head (uppercase Roman numerals) should be used and, conversely, if there are not at least two sub-topics, then no subheads should be introduced. Styles named “Heading 1”, “Heading 2”, “Heading 3”, and “Heading 4” are prescribed.</w:t>
-      </w:r>
-    </w:p>
-    <w:p>
-      <w:pPr>
-        <w:pStyle w:val="3"/>
-      </w:pPr>
-      <w:bookmarkStart w:id="0" w:name="_GoBack"/>
-      <w:bookmarkEnd w:id="0"/>
-      <w:r>
-        <w:t>Feature Importance Analysis</w:t>
-      </w:r>
-    </w:p>
-    <w:p>
-      <w:pPr>
-        <w:pStyle w:val="5"/>
-      </w:pPr>
-      <w:r>
-        <w:t xml:space="preserve"> Positioning Figures and Tables: </w:t>
-      </w:r>
-      <w:r>
-        <w:rPr>
-          <w:i w:val="0"/>
-        </w:rPr>
-        <w:t>Place figures and tables at the top and bottom of columns. Avoid placing them in the middle of columns. Large figures and tables may span across both columns. Figure captions should be below the figures; table heads should appear above the tables. Insert figures and tables after they are cited in the text. Use the abbreviation “Fig. 1”, even at the beginning of a sentence.</w:t>
-      </w:r>
-    </w:p>
-    <w:p>
-      <w:pPr>
         <w:pStyle w:val="30"/>
       </w:pPr>
       <w:r>
-        <w:t>Table Type Styles</w:t>
+        <w:rPr>
+          <w:rFonts w:hint="default"/>
+          <w:lang w:val="en-NZ" w:eastAsia="zh-CN"/>
+        </w:rPr>
+        <w:t>Features Used for Machine Learning Models</w:t>
       </w:r>
     </w:p>
     <w:tbl>
       <w:tblPr>
         <w:tblStyle w:val="11"/>
-        <w:tblW w:w="0" w:type="dxa"/>
+        <w:tblW w:w="4838" w:type="dxa"/>
         <w:jc w:val="center"/>
         <w:tblBorders>
           <w:top w:val="single" w:color="auto" w:sz="2" w:space="0"/>
@@ -9378,10 +9152,10 @@
         </w:tblCellMar>
       </w:tblPr>
       <w:tblGrid>
-        <w:gridCol w:w="720"/>
-        <w:gridCol w:w="2340"/>
-        <w:gridCol w:w="900"/>
-        <w:gridCol w:w="900"/>
+        <w:gridCol w:w="823"/>
+        <w:gridCol w:w="959"/>
+        <w:gridCol w:w="1372"/>
+        <w:gridCol w:w="1684"/>
       </w:tblGrid>
       <w:tr>
         <w:tblPrEx>
@@ -9402,37 +9176,95 @@
         </w:tblPrEx>
         <w:trPr>
           <w:cantSplit/>
-          <w:trHeight w:val="240" w:hRule="atLeast"/>
+          <w:trHeight w:val="599" w:hRule="atLeast"/>
           <w:tblHeader/>
           <w:jc w:val="center"/>
         </w:trPr>
         <w:tc>
           <w:tcPr>
-            <w:tcW w:w="720" w:type="dxa"/>
-            <w:vMerge w:val="restart"/>
-            <w:vAlign w:val="center"/>
-          </w:tcPr>
-          <w:p>
-            <w:pPr>
-              <w:pStyle w:val="26"/>
-            </w:pPr>
-            <w:r>
-              <w:t>Table Head</w:t>
-            </w:r>
-          </w:p>
-        </w:tc>
-        <w:tc>
-          <w:tcPr>
-            <w:tcW w:w="4140" w:type="dxa"/>
-            <w:gridSpan w:val="3"/>
-            <w:vAlign w:val="center"/>
-          </w:tcPr>
-          <w:p>
-            <w:pPr>
-              <w:pStyle w:val="26"/>
-            </w:pPr>
-            <w:r>
-              <w:t>Table Column Head</w:t>
+            <w:tcW w:w="823" w:type="dxa"/>
+            <w:vAlign w:val="center"/>
+          </w:tcPr>
+          <w:p>
+            <w:pPr>
+              <w:pStyle w:val="27"/>
+              <w:rPr>
+                <w:rFonts w:hint="default" w:eastAsia="SimSun"/>
+                <w:lang w:val="en-US" w:eastAsia="zh-CN"/>
+              </w:rPr>
+            </w:pPr>
+            <w:r>
+              <w:rPr>
+                <w:rFonts w:hint="eastAsia"/>
+                <w:lang w:val="en-US" w:eastAsia="zh-CN"/>
+              </w:rPr>
+              <w:t>Target Variable</w:t>
+            </w:r>
+          </w:p>
+        </w:tc>
+        <w:tc>
+          <w:tcPr>
+            <w:tcW w:w="959" w:type="dxa"/>
+            <w:vAlign w:val="center"/>
+          </w:tcPr>
+          <w:p>
+            <w:pPr>
+              <w:pStyle w:val="27"/>
+              <w:rPr>
+                <w:rFonts w:hint="default" w:eastAsia="SimSun"/>
+                <w:lang w:val="en-US" w:eastAsia="zh-CN"/>
+              </w:rPr>
+            </w:pPr>
+            <w:r>
+              <w:rPr>
+                <w:rFonts w:hint="eastAsia"/>
+                <w:lang w:val="en-US" w:eastAsia="zh-CN"/>
+              </w:rPr>
+              <w:t>Predictors</w:t>
+            </w:r>
+          </w:p>
+        </w:tc>
+        <w:tc>
+          <w:tcPr>
+            <w:tcW w:w="1372" w:type="dxa"/>
+            <w:vAlign w:val="center"/>
+          </w:tcPr>
+          <w:p>
+            <w:pPr>
+              <w:pStyle w:val="27"/>
+              <w:rPr>
+                <w:rFonts w:hint="default" w:eastAsia="SimSun"/>
+                <w:lang w:val="en-US" w:eastAsia="zh-CN"/>
+              </w:rPr>
+            </w:pPr>
+            <w:r>
+              <w:rPr>
+                <w:rFonts w:hint="eastAsia"/>
+                <w:lang w:val="en-US" w:eastAsia="zh-CN"/>
+              </w:rPr>
+              <w:t>Type</w:t>
+            </w:r>
+          </w:p>
+        </w:tc>
+        <w:tc>
+          <w:tcPr>
+            <w:tcW w:w="1684" w:type="dxa"/>
+            <w:vAlign w:val="center"/>
+          </w:tcPr>
+          <w:p>
+            <w:pPr>
+              <w:pStyle w:val="27"/>
+              <w:rPr>
+                <w:rFonts w:hint="default"/>
+                <w:lang w:val="en-US" w:eastAsia="zh-CN"/>
+              </w:rPr>
+            </w:pPr>
+            <w:r>
+              <w:rPr>
+                <w:rFonts w:hint="eastAsia"/>
+                <w:lang w:val="en-US" w:eastAsia="zh-CN"/>
+              </w:rPr>
+              <w:t>Standardisation</w:t>
             </w:r>
           </w:p>
         </w:tc>
@@ -9455,35 +9287,20 @@
           </w:tblCellMar>
         </w:tblPrEx>
         <w:trPr>
-          <w:cantSplit/>
-          <w:trHeight w:val="240" w:hRule="atLeast"/>
-          <w:tblHeader/>
+          <w:trHeight w:val="599" w:hRule="atLeast"/>
           <w:jc w:val="center"/>
         </w:trPr>
         <w:tc>
           <w:tcPr>
-            <w:tcW w:w="720" w:type="dxa"/>
-            <w:vMerge w:val="continue"/>
-          </w:tcPr>
-          <w:p>
-            <w:pPr>
-              <w:rPr>
-                <w:sz w:val="16"/>
-                <w:szCs w:val="16"/>
-              </w:rPr>
-            </w:pPr>
-          </w:p>
-        </w:tc>
-        <w:tc>
-          <w:tcPr>
-            <w:tcW w:w="2340" w:type="dxa"/>
-            <w:vAlign w:val="center"/>
-          </w:tcPr>
-          <w:p>
-            <w:pPr>
-              <w:pStyle w:val="27"/>
-              <w:rPr>
-                <w:rFonts w:hint="default" w:eastAsia="SimSun"/>
+            <w:tcW w:w="823" w:type="dxa"/>
+            <w:vMerge w:val="restart"/>
+            <w:vAlign w:val="center"/>
+          </w:tcPr>
+          <w:p>
+            <w:pPr>
+              <w:pStyle w:val="28"/>
+              <w:rPr>
+                <w:rFonts w:hint="default"/>
                 <w:lang w:val="en-US" w:eastAsia="zh-CN"/>
               </w:rPr>
             </w:pPr>
@@ -9492,20 +9309,42 @@
                 <w:rFonts w:hint="eastAsia"/>
                 <w:lang w:val="en-US" w:eastAsia="zh-CN"/>
               </w:rPr>
-              <w:t>Variables</w:t>
-            </w:r>
-          </w:p>
-        </w:tc>
-        <w:tc>
-          <w:tcPr>
-            <w:tcW w:w="900" w:type="dxa"/>
-            <w:vAlign w:val="center"/>
-          </w:tcPr>
-          <w:p>
-            <w:pPr>
-              <w:pStyle w:val="27"/>
-              <w:rPr>
-                <w:rFonts w:hint="default" w:eastAsia="SimSun"/>
+              <w:t>Sales</w:t>
+            </w:r>
+          </w:p>
+        </w:tc>
+        <w:tc>
+          <w:tcPr>
+            <w:tcW w:w="959" w:type="dxa"/>
+            <w:vAlign w:val="center"/>
+          </w:tcPr>
+          <w:p>
+            <w:pPr>
+              <w:pStyle w:val="28"/>
+              <w:rPr>
+                <w:rFonts w:hint="default"/>
+                <w:lang w:val="en-NZ" w:eastAsia="zh-CN"/>
+              </w:rPr>
+            </w:pPr>
+            <w:r>
+              <w:rPr>
+                <w:rFonts w:hint="default"/>
+                <w:lang w:val="en-NZ" w:eastAsia="zh-CN"/>
+              </w:rPr>
+              <w:t>Quantity Ordered</w:t>
+            </w:r>
+          </w:p>
+        </w:tc>
+        <w:tc>
+          <w:tcPr>
+            <w:tcW w:w="1372" w:type="dxa"/>
+            <w:vAlign w:val="center"/>
+          </w:tcPr>
+          <w:p>
+            <w:pPr>
+              <w:pStyle w:val="28"/>
+              <w:rPr>
+                <w:rFonts w:hint="default"/>
                 <w:lang w:val="en-US" w:eastAsia="zh-CN"/>
               </w:rPr>
             </w:pPr>
@@ -9514,20 +9353,20 @@
                 <w:rFonts w:hint="eastAsia"/>
                 <w:lang w:val="en-US" w:eastAsia="zh-CN"/>
               </w:rPr>
-              <w:t>Null Value</w:t>
-            </w:r>
-          </w:p>
-        </w:tc>
-        <w:tc>
-          <w:tcPr>
-            <w:tcW w:w="900" w:type="dxa"/>
-            <w:vAlign w:val="center"/>
-          </w:tcPr>
-          <w:p>
-            <w:pPr>
-              <w:pStyle w:val="27"/>
-              <w:rPr>
-                <w:rFonts w:hint="default" w:eastAsia="SimSun"/>
+              <w:t>Numeric</w:t>
+            </w:r>
+          </w:p>
+        </w:tc>
+        <w:tc>
+          <w:tcPr>
+            <w:tcW w:w="1684" w:type="dxa"/>
+            <w:vAlign w:val="center"/>
+          </w:tcPr>
+          <w:p>
+            <w:pPr>
+              <w:pStyle w:val="28"/>
+              <w:rPr>
+                <w:rFonts w:hint="default"/>
                 <w:lang w:val="en-US" w:eastAsia="zh-CN"/>
               </w:rPr>
             </w:pPr>
@@ -9536,7 +9375,7 @@
                 <w:rFonts w:hint="eastAsia"/>
                 <w:lang w:val="en-US" w:eastAsia="zh-CN"/>
               </w:rPr>
-              <w:t>Datatype</w:t>
+              <w:t>Yes for Linear Regression model</w:t>
             </w:r>
           </w:p>
         </w:tc>
@@ -9559,128 +9398,2883 @@
           </w:tblCellMar>
         </w:tblPrEx>
         <w:trPr>
-          <w:trHeight w:val="320" w:hRule="atLeast"/>
+          <w:trHeight w:val="599" w:hRule="atLeast"/>
           <w:jc w:val="center"/>
         </w:trPr>
         <w:tc>
           <w:tcPr>
-            <w:tcW w:w="720" w:type="dxa"/>
-            <w:vAlign w:val="center"/>
-          </w:tcPr>
-          <w:p>
-            <w:pPr>
-              <w:pStyle w:val="28"/>
-              <w:rPr>
-                <w:sz w:val="8"/>
-                <w:szCs w:val="8"/>
-              </w:rPr>
-            </w:pPr>
-            <w:r>
-              <w:t>copy</w:t>
-            </w:r>
-          </w:p>
-        </w:tc>
-        <w:tc>
-          <w:tcPr>
-            <w:tcW w:w="2340" w:type="dxa"/>
-            <w:vAlign w:val="center"/>
-          </w:tcPr>
-          <w:p>
-            <w:pPr>
-              <w:pStyle w:val="28"/>
-            </w:pPr>
-            <w:r>
-              <w:t>More table copy</w:t>
-            </w:r>
-            <w:r>
-              <w:rPr>
-                <w:vertAlign w:val="superscript"/>
-              </w:rPr>
-              <w:t>a</w:t>
-            </w:r>
-          </w:p>
-        </w:tc>
-        <w:tc>
-          <w:tcPr>
-            <w:tcW w:w="900" w:type="dxa"/>
-            <w:vAlign w:val="center"/>
-          </w:tcPr>
-          <w:p>
-            <w:pPr>
-              <w:rPr>
+            <w:tcW w:w="823" w:type="dxa"/>
+            <w:vMerge w:val="continue"/>
+            <w:tcBorders/>
+            <w:vAlign w:val="center"/>
+          </w:tcPr>
+          <w:p>
+            <w:pPr>
+              <w:pStyle w:val="28"/>
+              <w:rPr>
+                <w:rFonts w:hint="default"/>
+                <w:lang w:val="en-NZ" w:eastAsia="zh-CN"/>
+              </w:rPr>
+            </w:pPr>
+          </w:p>
+        </w:tc>
+        <w:tc>
+          <w:tcPr>
+            <w:tcW w:w="959" w:type="dxa"/>
+            <w:vAlign w:val="center"/>
+          </w:tcPr>
+          <w:p>
+            <w:pPr>
+              <w:pStyle w:val="28"/>
+              <w:rPr>
+                <w:rFonts w:hint="default"/>
+                <w:lang w:val="en-US" w:eastAsia="zh-CN"/>
+              </w:rPr>
+            </w:pPr>
+            <w:r>
+              <w:rPr>
+                <w:rFonts w:hint="eastAsia"/>
+                <w:lang w:val="en-US" w:eastAsia="zh-CN"/>
+              </w:rPr>
+              <w:t>Month</w:t>
+            </w:r>
+          </w:p>
+        </w:tc>
+        <w:tc>
+          <w:tcPr>
+            <w:tcW w:w="1372" w:type="dxa"/>
+            <w:vAlign w:val="center"/>
+          </w:tcPr>
+          <w:p>
+            <w:pPr>
+              <w:pStyle w:val="28"/>
+              <w:rPr>
+                <w:rFonts w:hint="default"/>
+                <w:lang w:val="en-NZ" w:eastAsia="zh-CN"/>
+              </w:rPr>
+            </w:pPr>
+            <w:r>
+              <w:rPr>
+                <w:rFonts w:hint="eastAsia"/>
+                <w:lang w:val="en-US" w:eastAsia="zh-CN"/>
+              </w:rPr>
+              <w:t>Numeric</w:t>
+            </w:r>
+          </w:p>
+        </w:tc>
+        <w:tc>
+          <w:tcPr>
+            <w:tcW w:w="1684" w:type="dxa"/>
+            <w:vAlign w:val="center"/>
+          </w:tcPr>
+          <w:p>
+            <w:pPr>
+              <w:jc w:val="both"/>
+              <w:rPr>
+                <w:rFonts w:hint="default" w:ascii="Times New Roman" w:hAnsi="Times New Roman" w:eastAsia="SimSun" w:cs="Times New Roman"/>
                 <w:sz w:val="16"/>
                 <w:szCs w:val="16"/>
-              </w:rPr>
-            </w:pPr>
-          </w:p>
-        </w:tc>
-        <w:tc>
-          <w:tcPr>
-            <w:tcW w:w="900" w:type="dxa"/>
-            <w:vAlign w:val="center"/>
-          </w:tcPr>
-          <w:p>
-            <w:pPr>
-              <w:rPr>
+                <w:lang w:val="en-US" w:eastAsia="zh-CN" w:bidi="ar-SA"/>
+              </w:rPr>
+            </w:pPr>
+            <w:r>
+              <w:rPr>
+                <w:rFonts w:hint="eastAsia" w:ascii="Times New Roman" w:hAnsi="Times New Roman" w:eastAsia="SimSun" w:cs="Times New Roman"/>
                 <w:sz w:val="16"/>
                 <w:szCs w:val="16"/>
-              </w:rPr>
-            </w:pPr>
+                <w:lang w:val="en-US" w:eastAsia="zh-CN" w:bidi="ar-SA"/>
+              </w:rPr>
+              <w:t>Yes for Linear Regression model</w:t>
+            </w:r>
+          </w:p>
+        </w:tc>
+      </w:tr>
+      <w:tr>
+        <w:tblPrEx>
+          <w:tblBorders>
+            <w:top w:val="single" w:color="auto" w:sz="2" w:space="0"/>
+            <w:left w:val="single" w:color="auto" w:sz="2" w:space="0"/>
+            <w:bottom w:val="single" w:color="auto" w:sz="2" w:space="0"/>
+            <w:right w:val="single" w:color="auto" w:sz="2" w:space="0"/>
+            <w:insideH w:val="single" w:color="auto" w:sz="2" w:space="0"/>
+            <w:insideV w:val="single" w:color="auto" w:sz="2" w:space="0"/>
+          </w:tblBorders>
+          <w:tblCellMar>
+            <w:top w:w="0" w:type="dxa"/>
+            <w:left w:w="108" w:type="dxa"/>
+            <w:bottom w:w="0" w:type="dxa"/>
+            <w:right w:w="108" w:type="dxa"/>
+          </w:tblCellMar>
+        </w:tblPrEx>
+        <w:trPr>
+          <w:trHeight w:val="599" w:hRule="atLeast"/>
+          <w:jc w:val="center"/>
+        </w:trPr>
+        <w:tc>
+          <w:tcPr>
+            <w:tcW w:w="823" w:type="dxa"/>
+            <w:vMerge w:val="continue"/>
+            <w:tcBorders/>
+            <w:vAlign w:val="center"/>
+          </w:tcPr>
+          <w:p>
+            <w:pPr>
+              <w:pStyle w:val="28"/>
+              <w:rPr>
+                <w:rFonts w:hint="default"/>
+                <w:lang w:val="en-NZ" w:eastAsia="zh-CN"/>
+              </w:rPr>
+            </w:pPr>
+          </w:p>
+        </w:tc>
+        <w:tc>
+          <w:tcPr>
+            <w:tcW w:w="959" w:type="dxa"/>
+            <w:vAlign w:val="center"/>
+          </w:tcPr>
+          <w:p>
+            <w:pPr>
+              <w:pStyle w:val="28"/>
+              <w:rPr>
+                <w:rFonts w:hint="default"/>
+                <w:lang w:val="en-US" w:eastAsia="zh-CN"/>
+              </w:rPr>
+            </w:pPr>
+            <w:r>
+              <w:rPr>
+                <w:rFonts w:hint="eastAsia"/>
+                <w:lang w:val="en-US" w:eastAsia="zh-CN"/>
+              </w:rPr>
+              <w:t>Hour</w:t>
+            </w:r>
+          </w:p>
+        </w:tc>
+        <w:tc>
+          <w:tcPr>
+            <w:tcW w:w="1372" w:type="dxa"/>
+            <w:vAlign w:val="center"/>
+          </w:tcPr>
+          <w:p>
+            <w:pPr>
+              <w:pStyle w:val="28"/>
+              <w:rPr>
+                <w:rFonts w:hint="default"/>
+                <w:lang w:val="en-NZ" w:eastAsia="zh-CN"/>
+              </w:rPr>
+            </w:pPr>
+            <w:r>
+              <w:rPr>
+                <w:rFonts w:hint="eastAsia"/>
+                <w:lang w:val="en-US" w:eastAsia="zh-CN"/>
+              </w:rPr>
+              <w:t>Numeric</w:t>
+            </w:r>
+          </w:p>
+        </w:tc>
+        <w:tc>
+          <w:tcPr>
+            <w:tcW w:w="1684" w:type="dxa"/>
+            <w:vAlign w:val="center"/>
+          </w:tcPr>
+          <w:p>
+            <w:pPr>
+              <w:jc w:val="both"/>
+              <w:rPr>
+                <w:rFonts w:hint="default" w:ascii="Times New Roman" w:hAnsi="Times New Roman" w:eastAsia="SimSun" w:cs="Times New Roman"/>
+                <w:sz w:val="16"/>
+                <w:szCs w:val="16"/>
+                <w:lang w:val="en-US" w:eastAsia="zh-CN" w:bidi="ar-SA"/>
+              </w:rPr>
+            </w:pPr>
+            <w:r>
+              <w:rPr>
+                <w:rFonts w:hint="eastAsia" w:ascii="Times New Roman" w:hAnsi="Times New Roman" w:eastAsia="SimSun" w:cs="Times New Roman"/>
+                <w:sz w:val="16"/>
+                <w:szCs w:val="16"/>
+                <w:lang w:val="en-US" w:eastAsia="zh-CN" w:bidi="ar-SA"/>
+              </w:rPr>
+              <w:t>Yes for Linear Regression model</w:t>
+            </w:r>
+          </w:p>
+        </w:tc>
+      </w:tr>
+      <w:tr>
+        <w:tblPrEx>
+          <w:tblBorders>
+            <w:top w:val="single" w:color="auto" w:sz="2" w:space="0"/>
+            <w:left w:val="single" w:color="auto" w:sz="2" w:space="0"/>
+            <w:bottom w:val="single" w:color="auto" w:sz="2" w:space="0"/>
+            <w:right w:val="single" w:color="auto" w:sz="2" w:space="0"/>
+            <w:insideH w:val="single" w:color="auto" w:sz="2" w:space="0"/>
+            <w:insideV w:val="single" w:color="auto" w:sz="2" w:space="0"/>
+          </w:tblBorders>
+          <w:tblCellMar>
+            <w:top w:w="0" w:type="dxa"/>
+            <w:left w:w="108" w:type="dxa"/>
+            <w:bottom w:w="0" w:type="dxa"/>
+            <w:right w:w="108" w:type="dxa"/>
+          </w:tblCellMar>
+        </w:tblPrEx>
+        <w:trPr>
+          <w:trHeight w:val="359" w:hRule="atLeast"/>
+          <w:jc w:val="center"/>
+        </w:trPr>
+        <w:tc>
+          <w:tcPr>
+            <w:tcW w:w="823" w:type="dxa"/>
+            <w:vMerge w:val="continue"/>
+            <w:tcBorders/>
+            <w:vAlign w:val="center"/>
+          </w:tcPr>
+          <w:p>
+            <w:pPr>
+              <w:pStyle w:val="28"/>
+              <w:rPr>
+                <w:rFonts w:hint="default"/>
+                <w:lang w:val="en-NZ" w:eastAsia="zh-CN"/>
+              </w:rPr>
+            </w:pPr>
+          </w:p>
+        </w:tc>
+        <w:tc>
+          <w:tcPr>
+            <w:tcW w:w="959" w:type="dxa"/>
+            <w:vAlign w:val="center"/>
+          </w:tcPr>
+          <w:p>
+            <w:pPr>
+              <w:pStyle w:val="28"/>
+              <w:rPr>
+                <w:rFonts w:hint="default"/>
+                <w:lang w:val="en-US" w:eastAsia="zh-CN"/>
+              </w:rPr>
+            </w:pPr>
+            <w:r>
+              <w:rPr>
+                <w:rFonts w:hint="eastAsia"/>
+                <w:lang w:val="en-US" w:eastAsia="zh-CN"/>
+              </w:rPr>
+              <w:t>Product</w:t>
+            </w:r>
+          </w:p>
+        </w:tc>
+        <w:tc>
+          <w:tcPr>
+            <w:tcW w:w="1372" w:type="dxa"/>
+            <w:vAlign w:val="center"/>
+          </w:tcPr>
+          <w:p>
+            <w:pPr>
+              <w:pStyle w:val="28"/>
+              <w:rPr>
+                <w:rFonts w:hint="eastAsia"/>
+                <w:lang w:val="en-US" w:eastAsia="zh-CN"/>
+              </w:rPr>
+            </w:pPr>
+            <w:r>
+              <w:rPr>
+                <w:rFonts w:hint="eastAsia"/>
+                <w:lang w:val="en-US" w:eastAsia="zh-CN"/>
+              </w:rPr>
+              <w:t>Categorical</w:t>
+            </w:r>
+          </w:p>
+          <w:p>
+            <w:pPr>
+              <w:pStyle w:val="28"/>
+              <w:rPr>
+                <w:rFonts w:hint="default"/>
+                <w:lang w:val="en-US" w:eastAsia="zh-CN"/>
+              </w:rPr>
+            </w:pPr>
+            <w:r>
+              <w:rPr>
+                <w:rFonts w:hint="eastAsia"/>
+                <w:lang w:val="en-US" w:eastAsia="zh-CN"/>
+              </w:rPr>
+              <w:t>(One-hot)</w:t>
+            </w:r>
+          </w:p>
+        </w:tc>
+        <w:tc>
+          <w:tcPr>
+            <w:tcW w:w="1684" w:type="dxa"/>
+            <w:vAlign w:val="center"/>
+          </w:tcPr>
+          <w:p>
+            <w:pPr>
+              <w:pStyle w:val="28"/>
+              <w:rPr>
+                <w:rFonts w:hint="default"/>
+                <w:lang w:val="en-US" w:eastAsia="zh-CN"/>
+              </w:rPr>
+            </w:pPr>
+            <w:r>
+              <w:rPr>
+                <w:rFonts w:hint="eastAsia"/>
+                <w:lang w:val="en-US" w:eastAsia="zh-CN"/>
+              </w:rPr>
+              <w:t>/</w:t>
+            </w:r>
+          </w:p>
+        </w:tc>
+      </w:tr>
+      <w:tr>
+        <w:tblPrEx>
+          <w:tblBorders>
+            <w:top w:val="single" w:color="auto" w:sz="2" w:space="0"/>
+            <w:left w:val="single" w:color="auto" w:sz="2" w:space="0"/>
+            <w:bottom w:val="single" w:color="auto" w:sz="2" w:space="0"/>
+            <w:right w:val="single" w:color="auto" w:sz="2" w:space="0"/>
+            <w:insideH w:val="single" w:color="auto" w:sz="2" w:space="0"/>
+            <w:insideV w:val="single" w:color="auto" w:sz="2" w:space="0"/>
+          </w:tblBorders>
+          <w:tblCellMar>
+            <w:top w:w="0" w:type="dxa"/>
+            <w:left w:w="108" w:type="dxa"/>
+            <w:bottom w:w="0" w:type="dxa"/>
+            <w:right w:w="108" w:type="dxa"/>
+          </w:tblCellMar>
+        </w:tblPrEx>
+        <w:trPr>
+          <w:trHeight w:val="365" w:hRule="atLeast"/>
+          <w:jc w:val="center"/>
+        </w:trPr>
+        <w:tc>
+          <w:tcPr>
+            <w:tcW w:w="823" w:type="dxa"/>
+            <w:vMerge w:val="continue"/>
+            <w:tcBorders/>
+            <w:vAlign w:val="center"/>
+          </w:tcPr>
+          <w:p>
+            <w:pPr>
+              <w:pStyle w:val="28"/>
+              <w:rPr>
+                <w:rFonts w:hint="default"/>
+                <w:lang w:val="en-NZ" w:eastAsia="zh-CN"/>
+              </w:rPr>
+            </w:pPr>
+          </w:p>
+        </w:tc>
+        <w:tc>
+          <w:tcPr>
+            <w:tcW w:w="959" w:type="dxa"/>
+            <w:vAlign w:val="center"/>
+          </w:tcPr>
+          <w:p>
+            <w:pPr>
+              <w:pStyle w:val="28"/>
+              <w:rPr>
+                <w:rFonts w:hint="default"/>
+                <w:lang w:val="en-US" w:eastAsia="zh-CN"/>
+              </w:rPr>
+            </w:pPr>
+            <w:r>
+              <w:rPr>
+                <w:rFonts w:hint="eastAsia"/>
+                <w:lang w:val="en-US" w:eastAsia="zh-CN"/>
+              </w:rPr>
+              <w:t>City</w:t>
+            </w:r>
+          </w:p>
+        </w:tc>
+        <w:tc>
+          <w:tcPr>
+            <w:tcW w:w="1372" w:type="dxa"/>
+            <w:vAlign w:val="center"/>
+          </w:tcPr>
+          <w:p>
+            <w:pPr>
+              <w:pStyle w:val="28"/>
+              <w:rPr>
+                <w:rFonts w:hint="eastAsia"/>
+                <w:lang w:val="en-US" w:eastAsia="zh-CN"/>
+              </w:rPr>
+            </w:pPr>
+            <w:r>
+              <w:rPr>
+                <w:rFonts w:hint="eastAsia"/>
+                <w:lang w:val="en-US" w:eastAsia="zh-CN"/>
+              </w:rPr>
+              <w:t xml:space="preserve">Categorical </w:t>
+            </w:r>
+          </w:p>
+          <w:p>
+            <w:pPr>
+              <w:pStyle w:val="28"/>
+              <w:rPr>
+                <w:rFonts w:hint="default"/>
+                <w:lang w:val="en-NZ" w:eastAsia="zh-CN"/>
+              </w:rPr>
+            </w:pPr>
+            <w:r>
+              <w:rPr>
+                <w:rFonts w:hint="eastAsia"/>
+                <w:lang w:val="en-US" w:eastAsia="zh-CN"/>
+              </w:rPr>
+              <w:t>(One-hot)</w:t>
+            </w:r>
+          </w:p>
+        </w:tc>
+        <w:tc>
+          <w:tcPr>
+            <w:tcW w:w="1684" w:type="dxa"/>
+            <w:vAlign w:val="center"/>
+          </w:tcPr>
+          <w:p>
+            <w:pPr>
+              <w:pStyle w:val="28"/>
+              <w:rPr>
+                <w:rFonts w:hint="default"/>
+                <w:lang w:val="en-US" w:eastAsia="zh-CN"/>
+              </w:rPr>
+            </w:pPr>
+            <w:r>
+              <w:rPr>
+                <w:rFonts w:hint="eastAsia"/>
+                <w:lang w:val="en-US" w:eastAsia="zh-CN"/>
+              </w:rPr>
+              <w:t>/</w:t>
+            </w:r>
           </w:p>
         </w:tc>
       </w:tr>
     </w:tbl>
     <w:p>
       <w:pPr>
-        <w:pStyle w:val="29"/>
-      </w:pPr>
-      <w:r>
-        <w:t>Sample of a Table footnote. (</w:t>
-      </w:r>
-      <w:r>
-        <w:rPr>
-          <w:i/>
-        </w:rPr>
-        <w:t>Table footnote</w:t>
-      </w:r>
-      <w:r>
-        <w:t>)</w:t>
-      </w:r>
+        <w:pStyle w:val="7"/>
+        <w:ind w:left="0" w:leftChars="0" w:firstLine="0" w:firstLineChars="0"/>
+        <w:rPr>
+          <w:rFonts w:hint="eastAsia"/>
+          <w:lang w:val="en-US" w:eastAsia="zh-CN"/>
+        </w:rPr>
+      </w:pPr>
     </w:p>
     <w:p>
       <w:pPr>
-        <w:pStyle w:val="20"/>
-      </w:pPr>
-      <w:r>
-        <w:t xml:space="preserve">Example of a figure caption. </w:t>
-      </w:r>
-      <w:r>
-        <w:rPr>
-          <w:iCs/>
-        </w:rPr>
-        <w:t>(</w:t>
-      </w:r>
-      <w:r>
-        <w:rPr>
+        <w:pStyle w:val="7"/>
+        <w:rPr>
+          <w:rFonts w:hint="default"/>
+        </w:rPr>
+      </w:pPr>
+      <w:r>
+        <w:rPr>
+          <w:rFonts w:hint="default"/>
+        </w:rPr>
+        <w:t>The dataset was randomly split into 70% training and 30% testing sets using a fixed random seed to ensure reproducibility.</w:t>
+      </w:r>
+    </w:p>
+    <w:p>
+      <w:pPr>
+        <w:pStyle w:val="7"/>
+        <w:rPr>
+          <w:rFonts w:hint="default"/>
+        </w:rPr>
+      </w:pPr>
+      <w:r>
+        <w:rPr>
+          <w:rFonts w:hint="default"/>
+        </w:rPr>
+        <w:t>For Linear Regression</w:t>
+      </w:r>
+      <w:r>
+        <w:rPr>
+          <w:rFonts w:hint="eastAsia"/>
+          <w:lang w:val="en-US" w:eastAsia="zh-CN"/>
+        </w:rPr>
+        <w:t xml:space="preserve"> model</w:t>
+      </w:r>
+      <w:r>
+        <w:rPr>
+          <w:rFonts w:hint="default"/>
+        </w:rPr>
+        <w:t>, numerical variables were standardised prior to model fitting because the algorithm is sensitive to differences in feature scales</w:t>
+      </w:r>
+      <w:r>
+        <w:rPr>
+          <w:rFonts w:hint="eastAsia"/>
+          <w:highlight w:val="yellow"/>
+          <w:lang w:val="en-US" w:eastAsia="zh-CN"/>
+        </w:rPr>
+        <w:t xml:space="preserve"> (ref)</w:t>
+      </w:r>
+      <w:r>
+        <w:rPr>
+          <w:rFonts w:hint="default"/>
+        </w:rPr>
+        <w:t>. In contrast, Random Forest and XGBoost were trained using the original feature values, as tree-based models are insensitive to feature scaling</w:t>
+      </w:r>
+      <w:r>
+        <w:rPr>
+          <w:rFonts w:hint="eastAsia"/>
+          <w:highlight w:val="yellow"/>
+          <w:lang w:val="en-US" w:eastAsia="zh-CN"/>
+        </w:rPr>
+        <w:t xml:space="preserve"> (ref)</w:t>
+      </w:r>
+      <w:r>
+        <w:rPr>
+          <w:rFonts w:hint="default"/>
+          <w:highlight w:val="yellow"/>
+        </w:rPr>
+        <w:t>.</w:t>
+      </w:r>
+    </w:p>
+    <w:p>
+      <w:pPr>
+        <w:pStyle w:val="3"/>
+      </w:pPr>
+      <w:r>
+        <w:t>Model</w:t>
+      </w:r>
+      <w:r>
+        <w:rPr>
+          <w:rFonts w:hint="eastAsia"/>
+          <w:lang w:val="en-US" w:eastAsia="zh-CN"/>
+        </w:rPr>
+        <w:t xml:space="preserve"> Development and</w:t>
+      </w:r>
+      <w:r>
+        <w:t xml:space="preserve"> Performance </w:t>
+      </w:r>
+      <w:r>
+        <w:rPr>
+          <w:rFonts w:hint="eastAsia"/>
+          <w:lang w:val="en-US" w:eastAsia="zh-CN"/>
+        </w:rPr>
+        <w:t>Evaluation</w:t>
+      </w:r>
+      <w:r>
+        <w:rPr>
+          <w:rFonts w:hint="eastAsia"/>
+          <w:lang w:val="en-US" w:eastAsia="zh-CN"/>
+        </w:rPr>
+        <w:tab/>
+      </w:r>
+    </w:p>
+    <w:p>
+      <w:pPr>
+        <w:pStyle w:val="7"/>
+        <w:rPr>
+          <w:rFonts w:hint="default"/>
+        </w:rPr>
+      </w:pPr>
+      <w:r>
+        <w:rPr>
+          <w:rFonts w:hint="default"/>
+        </w:rPr>
+        <w:t xml:space="preserve">Three regression algorithms have been </w:t>
+      </w:r>
+      <w:r>
+        <w:rPr>
+          <w:rFonts w:hint="default"/>
+          <w:u w:val="dotted"/>
+          <w:lang w:val="en-NZ" w:eastAsia="zh-CN"/>
+        </w:rPr>
+        <w:t xml:space="preserve">implemented </w:t>
+      </w:r>
+      <w:r>
+        <w:rPr>
+          <w:rFonts w:hint="default"/>
+        </w:rPr>
+        <w:t>to illustrate various modelling techniques used in prediction of sales revenue. Linear Regression was chosen as an easily understandable baseline model. The Random Forest algorithm has been used as an example of bagging technique for modelling nonlinear relationships, while XGBoost was selected as a gradient boosting algorithm due to its strong predictive performance and widespread use in structured tabular data</w:t>
+      </w:r>
+      <w:r>
+        <w:rPr>
+          <w:rFonts w:hint="default"/>
+          <w:highlight w:val="yellow"/>
+          <w:lang w:val="en-NZ"/>
+        </w:rPr>
+        <w:t xml:space="preserve"> (ref)</w:t>
+      </w:r>
+      <w:r>
+        <w:rPr>
+          <w:rFonts w:hint="default"/>
+          <w:highlight w:val="yellow"/>
+        </w:rPr>
+        <w:t>.</w:t>
+      </w:r>
+      <w:r>
+        <w:rPr>
+          <w:rFonts w:hint="default"/>
+        </w:rPr>
+        <w:t xml:space="preserve"> Comparison of these models allows estimating</w:t>
+      </w:r>
+      <w:r>
+        <w:rPr>
+          <w:rFonts w:hint="default"/>
+          <w:lang w:val="en-NZ"/>
+        </w:rPr>
+        <w:t xml:space="preserve"> both</w:t>
+      </w:r>
+      <w:r>
+        <w:rPr>
+          <w:rFonts w:hint="default"/>
+        </w:rPr>
+        <w:t xml:space="preserve"> their prediction accuracy and</w:t>
+      </w:r>
+      <w:r>
+        <w:rPr>
+          <w:rFonts w:hint="default"/>
+          <w:lang w:val="en-NZ"/>
+        </w:rPr>
+        <w:t xml:space="preserve"> computational</w:t>
+      </w:r>
+      <w:r>
+        <w:rPr>
+          <w:rFonts w:hint="default"/>
+        </w:rPr>
+        <w:t xml:space="preserve"> efficiency.</w:t>
+      </w:r>
+    </w:p>
+    <w:p>
+      <w:pPr>
+        <w:pStyle w:val="7"/>
+      </w:pPr>
+      <w:r>
+        <w:rPr>
+          <w:rFonts w:hint="default"/>
+        </w:rPr>
+        <w:t xml:space="preserve"> All three models have been</w:t>
+      </w:r>
+      <w:r>
+        <w:rPr>
+          <w:rFonts w:hint="default"/>
+          <w:lang w:val="en-NZ"/>
+        </w:rPr>
+        <w:t xml:space="preserve"> measured </w:t>
+      </w:r>
+      <w:r>
+        <w:rPr>
+          <w:rFonts w:hint="default"/>
+        </w:rPr>
+        <w:t xml:space="preserve">with </w:t>
+      </w:r>
+      <w:r>
+        <w:rPr>
+          <w:rFonts w:hint="default"/>
           <w:i/>
           <w:iCs/>
         </w:rPr>
-        <w:t>figure caption</w:t>
-      </w:r>
-      <w:r>
-        <w:rPr>
-          <w:iCs/>
-        </w:rPr>
-        <w:t>)</w:t>
+        <w:t>RMSE, R²</w:t>
+      </w:r>
+      <w:r>
+        <w:rPr>
+          <w:rFonts w:hint="default"/>
+        </w:rPr>
+        <w:t>, and runtime metrics.</w:t>
       </w:r>
     </w:p>
     <w:p>
       <w:pPr>
+        <w:pStyle w:val="30"/>
+      </w:pPr>
+      <w:r>
+        <w:rPr>
+          <w:rFonts w:hint="eastAsia"/>
+          <w:lang w:val="en-US" w:eastAsia="zh-CN"/>
+        </w:rPr>
+        <w:t>Model Performance Comparison</w:t>
+      </w:r>
+    </w:p>
+    <w:tbl>
+      <w:tblPr>
+        <w:tblStyle w:val="11"/>
+        <w:tblW w:w="4998" w:type="pct"/>
+        <w:jc w:val="center"/>
+        <w:tblBorders>
+          <w:top w:val="single" w:color="auto" w:sz="2" w:space="0"/>
+          <w:left w:val="single" w:color="auto" w:sz="2" w:space="0"/>
+          <w:bottom w:val="single" w:color="auto" w:sz="2" w:space="0"/>
+          <w:right w:val="single" w:color="auto" w:sz="2" w:space="0"/>
+          <w:insideH w:val="single" w:color="auto" w:sz="2" w:space="0"/>
+          <w:insideV w:val="single" w:color="auto" w:sz="2" w:space="0"/>
+        </w:tblBorders>
+        <w:tblLayout w:type="autofit"/>
+        <w:tblCellMar>
+          <w:top w:w="0" w:type="dxa"/>
+          <w:left w:w="108" w:type="dxa"/>
+          <w:bottom w:w="0" w:type="dxa"/>
+          <w:right w:w="108" w:type="dxa"/>
+        </w:tblCellMar>
+      </w:tblPr>
+      <w:tblGrid>
+        <w:gridCol w:w="1781"/>
+        <w:gridCol w:w="843"/>
+        <w:gridCol w:w="741"/>
+        <w:gridCol w:w="1715"/>
+      </w:tblGrid>
+      <w:tr>
+        <w:tblPrEx>
+          <w:tblBorders>
+            <w:top w:val="single" w:color="auto" w:sz="2" w:space="0"/>
+            <w:left w:val="single" w:color="auto" w:sz="2" w:space="0"/>
+            <w:bottom w:val="single" w:color="auto" w:sz="2" w:space="0"/>
+            <w:right w:val="single" w:color="auto" w:sz="2" w:space="0"/>
+            <w:insideH w:val="single" w:color="auto" w:sz="2" w:space="0"/>
+            <w:insideV w:val="single" w:color="auto" w:sz="2" w:space="0"/>
+          </w:tblBorders>
+          <w:tblCellMar>
+            <w:top w:w="0" w:type="dxa"/>
+            <w:left w:w="108" w:type="dxa"/>
+            <w:bottom w:w="0" w:type="dxa"/>
+            <w:right w:w="108" w:type="dxa"/>
+          </w:tblCellMar>
+        </w:tblPrEx>
+        <w:trPr>
+          <w:cantSplit/>
+          <w:trHeight w:val="510" w:hRule="atLeast"/>
+          <w:tblHeader/>
+          <w:jc w:val="center"/>
+        </w:trPr>
+        <w:tc>
+          <w:tcPr>
+            <w:tcW w:w="1752" w:type="pct"/>
+            <w:vAlign w:val="center"/>
+          </w:tcPr>
+          <w:p>
+            <w:pPr>
+              <w:pStyle w:val="27"/>
+              <w:ind w:left="0" w:leftChars="0" w:right="0" w:rightChars="0" w:firstLine="0" w:firstLineChars="0"/>
+              <w:rPr>
+                <w:rFonts w:hint="default" w:eastAsia="SimSun"/>
+                <w:lang w:val="en-US" w:eastAsia="zh-CN"/>
+              </w:rPr>
+            </w:pPr>
+            <w:r>
+              <w:rPr>
+                <w:rFonts w:hint="eastAsia"/>
+                <w:lang w:val="en-US" w:eastAsia="zh-CN"/>
+              </w:rPr>
+              <w:t>Model</w:t>
+            </w:r>
+          </w:p>
+        </w:tc>
+        <w:tc>
+          <w:tcPr>
+            <w:tcW w:w="829" w:type="pct"/>
+            <w:vAlign w:val="center"/>
+          </w:tcPr>
+          <w:p>
+            <w:pPr>
+              <w:pStyle w:val="27"/>
+              <w:ind w:left="0" w:leftChars="0" w:right="0" w:rightChars="0" w:firstLine="0" w:firstLineChars="0"/>
+              <w:rPr>
+                <w:rFonts w:hint="default" w:eastAsia="SimSun"/>
+                <w:lang w:val="en-US" w:eastAsia="zh-CN"/>
+              </w:rPr>
+            </w:pPr>
+            <w:r>
+              <w:rPr>
+                <w:rFonts w:hint="eastAsia"/>
+                <w:lang w:val="en-US" w:eastAsia="zh-CN"/>
+              </w:rPr>
+              <w:t>RMSE</w:t>
+            </w:r>
+          </w:p>
+        </w:tc>
+        <w:tc>
+          <w:tcPr>
+            <w:tcW w:w="729" w:type="pct"/>
+            <w:vAlign w:val="center"/>
+          </w:tcPr>
+          <w:p>
+            <w:pPr>
+              <w:pStyle w:val="27"/>
+              <w:ind w:left="0" w:leftChars="0" w:right="0" w:rightChars="0" w:firstLine="0" w:firstLineChars="0"/>
+              <w:rPr>
+                <w:rFonts w:hint="default"/>
+                <w:lang w:val="en-NZ" w:eastAsia="zh-CN"/>
+              </w:rPr>
+            </w:pPr>
+            <w:r>
+              <w:rPr>
+                <w:rFonts w:hint="default"/>
+                <w:lang w:val="en-NZ" w:eastAsia="zh-CN"/>
+              </w:rPr>
+              <w:t>R</w:t>
+            </w:r>
+            <w:r>
+              <w:rPr>
+                <w:rFonts w:hint="default"/>
+                <w:vertAlign w:val="superscript"/>
+                <w:lang w:val="en-NZ" w:eastAsia="zh-CN"/>
+              </w:rPr>
+              <w:t>2</w:t>
+            </w:r>
+          </w:p>
+        </w:tc>
+        <w:tc>
+          <w:tcPr>
+            <w:tcW w:w="1687" w:type="pct"/>
+            <w:vAlign w:val="center"/>
+          </w:tcPr>
+          <w:p>
+            <w:pPr>
+              <w:pStyle w:val="27"/>
+              <w:ind w:left="0" w:leftChars="0" w:right="0" w:rightChars="0" w:firstLine="0" w:firstLineChars="0"/>
+              <w:rPr>
+                <w:rFonts w:hint="default"/>
+                <w:lang w:val="en-US" w:eastAsia="zh-CN"/>
+              </w:rPr>
+            </w:pPr>
+            <w:r>
+              <w:rPr>
+                <w:rFonts w:hint="eastAsia" w:eastAsia="SimSun"/>
+                <w:lang w:val="en-US" w:eastAsia="zh-CN"/>
+              </w:rPr>
+              <w:t>Runtime(seconds)</w:t>
+            </w:r>
+          </w:p>
+        </w:tc>
+      </w:tr>
+      <w:tr>
+        <w:tblPrEx>
+          <w:tblBorders>
+            <w:top w:val="single" w:color="auto" w:sz="2" w:space="0"/>
+            <w:left w:val="single" w:color="auto" w:sz="2" w:space="0"/>
+            <w:bottom w:val="single" w:color="auto" w:sz="2" w:space="0"/>
+            <w:right w:val="single" w:color="auto" w:sz="2" w:space="0"/>
+            <w:insideH w:val="single" w:color="auto" w:sz="2" w:space="0"/>
+            <w:insideV w:val="single" w:color="auto" w:sz="2" w:space="0"/>
+          </w:tblBorders>
+          <w:tblCellMar>
+            <w:top w:w="0" w:type="dxa"/>
+            <w:left w:w="108" w:type="dxa"/>
+            <w:bottom w:w="0" w:type="dxa"/>
+            <w:right w:w="108" w:type="dxa"/>
+          </w:tblCellMar>
+        </w:tblPrEx>
+        <w:trPr>
+          <w:trHeight w:val="448" w:hRule="atLeast"/>
+          <w:jc w:val="center"/>
+        </w:trPr>
+        <w:tc>
+          <w:tcPr>
+            <w:tcW w:w="1752" w:type="pct"/>
+            <w:vAlign w:val="center"/>
+          </w:tcPr>
+          <w:p>
+            <w:pPr>
+              <w:pStyle w:val="28"/>
+              <w:ind w:left="0" w:leftChars="0" w:right="0" w:rightChars="0" w:firstLine="0" w:firstLineChars="0"/>
+              <w:rPr>
+                <w:rFonts w:hint="default"/>
+                <w:lang w:val="en-NZ" w:eastAsia="zh-CN"/>
+              </w:rPr>
+            </w:pPr>
+            <w:r>
+              <w:rPr>
+                <w:rFonts w:hint="default"/>
+                <w:lang w:val="en-NZ" w:eastAsia="zh-CN"/>
+              </w:rPr>
+              <w:t>Linear Regression</w:t>
+            </w:r>
+          </w:p>
+        </w:tc>
+        <w:tc>
+          <w:tcPr>
+            <w:tcW w:w="829" w:type="pct"/>
+            <w:vAlign w:val="center"/>
+          </w:tcPr>
+          <w:p>
+            <w:pPr>
+              <w:pStyle w:val="28"/>
+              <w:ind w:left="0" w:leftChars="0" w:right="0" w:rightChars="0" w:firstLine="0" w:firstLineChars="0"/>
+              <w:rPr>
+                <w:rFonts w:hint="default"/>
+                <w:lang w:val="en-NZ" w:eastAsia="zh-CN"/>
+              </w:rPr>
+            </w:pPr>
+            <w:r>
+              <w:rPr>
+                <w:rFonts w:hint="default"/>
+                <w:lang w:val="en-NZ" w:eastAsia="zh-CN"/>
+              </w:rPr>
+              <w:t>12.054</w:t>
+            </w:r>
+          </w:p>
+        </w:tc>
+        <w:tc>
+          <w:tcPr>
+            <w:tcW w:w="729" w:type="pct"/>
+            <w:vAlign w:val="center"/>
+          </w:tcPr>
+          <w:p>
+            <w:pPr>
+              <w:pStyle w:val="28"/>
+              <w:ind w:left="0" w:leftChars="0" w:right="0" w:rightChars="0" w:firstLine="0" w:firstLineChars="0"/>
+              <w:rPr>
+                <w:rFonts w:hint="default"/>
+                <w:lang w:val="en-US" w:eastAsia="zh-CN"/>
+              </w:rPr>
+            </w:pPr>
+            <w:r>
+              <w:rPr>
+                <w:rFonts w:hint="default"/>
+                <w:lang w:val="en-US" w:eastAsia="zh-CN"/>
+              </w:rPr>
+              <w:t>0.999</w:t>
+            </w:r>
+          </w:p>
+        </w:tc>
+        <w:tc>
+          <w:tcPr>
+            <w:tcW w:w="1687" w:type="pct"/>
+            <w:vAlign w:val="center"/>
+          </w:tcPr>
+          <w:p>
+            <w:pPr>
+              <w:pStyle w:val="28"/>
+              <w:ind w:left="0" w:leftChars="0" w:right="0" w:rightChars="0" w:firstLine="0" w:firstLineChars="0"/>
+              <w:rPr>
+                <w:rFonts w:hint="default"/>
+                <w:lang w:val="en-US" w:eastAsia="zh-CN"/>
+              </w:rPr>
+            </w:pPr>
+            <w:r>
+              <w:rPr>
+                <w:rFonts w:hint="eastAsia"/>
+                <w:lang w:val="en-US" w:eastAsia="zh-CN"/>
+              </w:rPr>
+              <w:t>0.2037</w:t>
+            </w:r>
+          </w:p>
+        </w:tc>
+      </w:tr>
+      <w:tr>
+        <w:tblPrEx>
+          <w:tblBorders>
+            <w:top w:val="single" w:color="auto" w:sz="2" w:space="0"/>
+            <w:left w:val="single" w:color="auto" w:sz="2" w:space="0"/>
+            <w:bottom w:val="single" w:color="auto" w:sz="2" w:space="0"/>
+            <w:right w:val="single" w:color="auto" w:sz="2" w:space="0"/>
+            <w:insideH w:val="single" w:color="auto" w:sz="2" w:space="0"/>
+            <w:insideV w:val="single" w:color="auto" w:sz="2" w:space="0"/>
+          </w:tblBorders>
+          <w:tblCellMar>
+            <w:top w:w="0" w:type="dxa"/>
+            <w:left w:w="108" w:type="dxa"/>
+            <w:bottom w:w="0" w:type="dxa"/>
+            <w:right w:w="108" w:type="dxa"/>
+          </w:tblCellMar>
+        </w:tblPrEx>
+        <w:trPr>
+          <w:trHeight w:val="509" w:hRule="atLeast"/>
+          <w:jc w:val="center"/>
+        </w:trPr>
+        <w:tc>
+          <w:tcPr>
+            <w:tcW w:w="1752" w:type="pct"/>
+            <w:vAlign w:val="center"/>
+          </w:tcPr>
+          <w:p>
+            <w:pPr>
+              <w:pStyle w:val="28"/>
+              <w:ind w:left="0" w:leftChars="0" w:right="0" w:rightChars="0" w:firstLine="0" w:firstLineChars="0"/>
+              <w:rPr>
+                <w:rFonts w:hint="default"/>
+                <w:lang w:val="en-NZ" w:eastAsia="zh-CN"/>
+              </w:rPr>
+            </w:pPr>
+            <w:r>
+              <w:rPr>
+                <w:rFonts w:hint="default"/>
+                <w:lang w:val="en-NZ" w:eastAsia="zh-CN"/>
+              </w:rPr>
+              <w:t>Random Forest</w:t>
+            </w:r>
+          </w:p>
+        </w:tc>
+        <w:tc>
+          <w:tcPr>
+            <w:tcW w:w="829" w:type="pct"/>
+            <w:vAlign w:val="center"/>
+          </w:tcPr>
+          <w:p>
+            <w:pPr>
+              <w:pStyle w:val="28"/>
+              <w:ind w:left="0" w:leftChars="0" w:right="0" w:rightChars="0" w:firstLine="0" w:firstLineChars="0"/>
+              <w:rPr>
+                <w:rFonts w:hint="default"/>
+                <w:lang w:val="en-NZ" w:eastAsia="zh-CN"/>
+              </w:rPr>
+            </w:pPr>
+            <w:r>
+              <w:rPr>
+                <w:rFonts w:hint="default"/>
+                <w:lang w:val="en-NZ" w:eastAsia="zh-CN"/>
+              </w:rPr>
+              <w:t>1.795</w:t>
+            </w:r>
+          </w:p>
+        </w:tc>
+        <w:tc>
+          <w:tcPr>
+            <w:tcW w:w="729" w:type="pct"/>
+            <w:vAlign w:val="center"/>
+          </w:tcPr>
+          <w:p>
+            <w:pPr>
+              <w:ind w:left="0" w:leftChars="0" w:right="0" w:rightChars="0" w:firstLine="0" w:firstLineChars="0"/>
+              <w:jc w:val="both"/>
+              <w:rPr>
+                <w:rFonts w:hint="default" w:ascii="Times New Roman" w:hAnsi="Times New Roman" w:eastAsia="SimSun" w:cs="Times New Roman"/>
+                <w:sz w:val="16"/>
+                <w:szCs w:val="16"/>
+                <w:lang w:val="en-NZ" w:eastAsia="zh-CN" w:bidi="ar-SA"/>
+              </w:rPr>
+            </w:pPr>
+            <w:r>
+              <w:rPr>
+                <w:rFonts w:hint="default" w:cs="Times New Roman"/>
+                <w:sz w:val="16"/>
+                <w:szCs w:val="16"/>
+                <w:lang w:val="en-NZ" w:eastAsia="zh-CN" w:bidi="ar-SA"/>
+              </w:rPr>
+              <w:t>1.000</w:t>
+            </w:r>
+          </w:p>
+        </w:tc>
+        <w:tc>
+          <w:tcPr>
+            <w:tcW w:w="1687" w:type="pct"/>
+            <w:vAlign w:val="center"/>
+          </w:tcPr>
+          <w:p>
+            <w:pPr>
+              <w:ind w:left="0" w:leftChars="0" w:right="0" w:rightChars="0" w:firstLine="0" w:firstLineChars="0"/>
+              <w:jc w:val="both"/>
+              <w:rPr>
+                <w:rFonts w:hint="default" w:cs="Times New Roman"/>
+                <w:sz w:val="16"/>
+                <w:szCs w:val="16"/>
+                <w:lang w:val="en-NZ" w:eastAsia="zh-CN" w:bidi="ar-SA"/>
+              </w:rPr>
+            </w:pPr>
+            <w:r>
+              <w:rPr>
+                <w:rFonts w:hint="default" w:cs="Times New Roman"/>
+                <w:sz w:val="16"/>
+                <w:szCs w:val="16"/>
+                <w:lang w:val="en-NZ" w:eastAsia="zh-CN" w:bidi="ar-SA"/>
+              </w:rPr>
+              <w:t>41.9235</w:t>
+            </w:r>
+          </w:p>
+        </w:tc>
+      </w:tr>
+      <w:tr>
+        <w:tblPrEx>
+          <w:tblBorders>
+            <w:top w:val="single" w:color="auto" w:sz="2" w:space="0"/>
+            <w:left w:val="single" w:color="auto" w:sz="2" w:space="0"/>
+            <w:bottom w:val="single" w:color="auto" w:sz="2" w:space="0"/>
+            <w:right w:val="single" w:color="auto" w:sz="2" w:space="0"/>
+            <w:insideH w:val="single" w:color="auto" w:sz="2" w:space="0"/>
+            <w:insideV w:val="single" w:color="auto" w:sz="2" w:space="0"/>
+          </w:tblBorders>
+          <w:tblCellMar>
+            <w:top w:w="0" w:type="dxa"/>
+            <w:left w:w="108" w:type="dxa"/>
+            <w:bottom w:w="0" w:type="dxa"/>
+            <w:right w:w="108" w:type="dxa"/>
+          </w:tblCellMar>
+        </w:tblPrEx>
+        <w:trPr>
+          <w:trHeight w:val="513" w:hRule="atLeast"/>
+          <w:jc w:val="center"/>
+        </w:trPr>
+        <w:tc>
+          <w:tcPr>
+            <w:tcW w:w="1752" w:type="pct"/>
+            <w:vAlign w:val="center"/>
+          </w:tcPr>
+          <w:p>
+            <w:pPr>
+              <w:pStyle w:val="28"/>
+              <w:ind w:left="0" w:leftChars="0" w:right="0" w:rightChars="0" w:firstLine="0" w:firstLineChars="0"/>
+              <w:rPr>
+                <w:rFonts w:hint="default"/>
+                <w:lang w:val="en-NZ" w:eastAsia="zh-CN"/>
+              </w:rPr>
+            </w:pPr>
+            <w:r>
+              <w:rPr>
+                <w:rFonts w:hint="default"/>
+                <w:lang w:val="en-NZ" w:eastAsia="zh-CN"/>
+              </w:rPr>
+              <w:t>XGBoost</w:t>
+            </w:r>
+          </w:p>
+        </w:tc>
+        <w:tc>
+          <w:tcPr>
+            <w:tcW w:w="829" w:type="pct"/>
+            <w:vAlign w:val="center"/>
+          </w:tcPr>
+          <w:p>
+            <w:pPr>
+              <w:pStyle w:val="28"/>
+              <w:ind w:left="0" w:leftChars="0" w:right="0" w:rightChars="0" w:firstLine="0" w:firstLineChars="0"/>
+              <w:rPr>
+                <w:rFonts w:hint="default"/>
+                <w:lang w:val="en-NZ" w:eastAsia="zh-CN"/>
+              </w:rPr>
+            </w:pPr>
+            <w:r>
+              <w:rPr>
+                <w:rFonts w:hint="default"/>
+                <w:lang w:val="en-NZ" w:eastAsia="zh-CN"/>
+              </w:rPr>
+              <w:t>1.342</w:t>
+            </w:r>
+          </w:p>
+        </w:tc>
+        <w:tc>
+          <w:tcPr>
+            <w:tcW w:w="729" w:type="pct"/>
+            <w:vAlign w:val="center"/>
+          </w:tcPr>
+          <w:p>
+            <w:pPr>
+              <w:ind w:left="0" w:leftChars="0" w:right="0" w:rightChars="0" w:firstLine="0" w:firstLineChars="0"/>
+              <w:jc w:val="both"/>
+              <w:rPr>
+                <w:rFonts w:hint="default" w:ascii="Times New Roman" w:hAnsi="Times New Roman" w:eastAsia="SimSun" w:cs="Times New Roman"/>
+                <w:sz w:val="16"/>
+                <w:szCs w:val="16"/>
+                <w:lang w:val="en-NZ" w:eastAsia="zh-CN" w:bidi="ar-SA"/>
+              </w:rPr>
+            </w:pPr>
+            <w:r>
+              <w:rPr>
+                <w:rFonts w:hint="default" w:cs="Times New Roman"/>
+                <w:sz w:val="16"/>
+                <w:szCs w:val="16"/>
+                <w:lang w:val="en-NZ" w:eastAsia="zh-CN" w:bidi="ar-SA"/>
+              </w:rPr>
+              <w:t>1.000</w:t>
+            </w:r>
+          </w:p>
+        </w:tc>
+        <w:tc>
+          <w:tcPr>
+            <w:tcW w:w="1687" w:type="pct"/>
+            <w:vAlign w:val="center"/>
+          </w:tcPr>
+          <w:p>
+            <w:pPr>
+              <w:ind w:left="0" w:leftChars="0" w:right="0" w:rightChars="0" w:firstLine="0" w:firstLineChars="0"/>
+              <w:jc w:val="both"/>
+              <w:rPr>
+                <w:rFonts w:hint="default" w:cs="Times New Roman"/>
+                <w:sz w:val="16"/>
+                <w:szCs w:val="16"/>
+                <w:lang w:val="en-NZ" w:eastAsia="zh-CN" w:bidi="ar-SA"/>
+              </w:rPr>
+            </w:pPr>
+            <w:r>
+              <w:rPr>
+                <w:rFonts w:hint="default" w:cs="Times New Roman"/>
+                <w:sz w:val="16"/>
+                <w:szCs w:val="16"/>
+                <w:lang w:val="en-NZ" w:eastAsia="zh-CN" w:bidi="ar-SA"/>
+              </w:rPr>
+              <w:t>4.3725</w:t>
+            </w:r>
+          </w:p>
+        </w:tc>
+      </w:tr>
+    </w:tbl>
+    <w:p>
+      <w:pPr>
         <w:pStyle w:val="7"/>
-      </w:pPr>
-      <w:r>
-        <w:t>Figure Labels: Use 8 point Times New Roman for Figure labels. Use words rather than symbols or abbreviations when writing Figure axis labels to avoid confusing the reader. As an example, write the quantity “Magnetization”, or “Magnetization, M”, not just “M”. If including units in the label, present them within parentheses. Do not label axes only with units. In the example, write “Magnetization (A/m)” or “Magnetization {A[m(1)]}”, not just “A/m”. Do not label axes with a ratio of quantities and units. For example, write “Temperature (K)”, not “Temperature/K”.</w:t>
-      </w:r>
+        <w:rPr>
+          <w:rFonts w:hint="eastAsia" w:eastAsia="SimSun"/>
+          <w:lang w:eastAsia="zh-CN"/>
+        </w:rPr>
+      </w:pPr>
+    </w:p>
+    <w:p>
+      <w:pPr>
+        <w:pStyle w:val="7"/>
+        <w:rPr>
+          <w:b/>
+          <w:bCs/>
+        </w:rPr>
+      </w:pPr>
+      <w:r>
+        <w:t xml:space="preserve">As </w:t>
+      </w:r>
+      <w:r>
+        <w:rPr>
+          <w:rFonts w:hint="eastAsia"/>
+          <w:lang w:val="en-US" w:eastAsia="zh-CN"/>
+        </w:rPr>
+        <w:t>illustrated</w:t>
+      </w:r>
+      <w:r>
+        <w:t xml:space="preserve"> in Table VII, </w:t>
+      </w:r>
+      <w:r>
+        <w:rPr>
+          <w:b/>
+          <w:bCs/>
+        </w:rPr>
+        <w:t>all three regression models achieved excellent predictive performance,</w:t>
+      </w:r>
+      <w:r>
+        <w:t xml:space="preserve"> with R² values close to 1.0</w:t>
+      </w:r>
+      <w:r>
+        <w:rPr>
+          <w:rFonts w:hint="eastAsia"/>
+          <w:lang w:val="en-US" w:eastAsia="zh-CN"/>
+        </w:rPr>
+        <w:t>. This means that</w:t>
+      </w:r>
+      <w:r>
+        <w:t xml:space="preserve"> the selected features explained almost all of the variation in sales revenue. </w:t>
+      </w:r>
+      <w:r>
+        <w:rPr>
+          <w:rFonts w:hint="eastAsia"/>
+          <w:lang w:val="en-US" w:eastAsia="zh-CN"/>
+        </w:rPr>
+        <w:t>Nevertheless</w:t>
+      </w:r>
+      <w:r>
+        <w:t xml:space="preserve">, differences in prediction accuracy and computational efficiency were observed across the models. Linear Regression served as a strong baseline (R² = 0.999), but produced the highest prediction error (RMSE = 12.054). In contrast, the two tree-based ensemble models substantially reduced prediction errors, with Random Forest achieving an RMSE of 1.795 and XGBoost further reducing the RMSE to 1.342, the lowest among all models. In terms of computational </w:t>
+      </w:r>
+      <w:r>
+        <w:rPr>
+          <w:rFonts w:hint="eastAsia"/>
+          <w:lang w:val="en-US" w:eastAsia="zh-CN"/>
+        </w:rPr>
+        <w:t>efficiency</w:t>
+      </w:r>
+      <w:r>
+        <w:t xml:space="preserve">, Random Forest </w:t>
+      </w:r>
+      <w:r>
+        <w:rPr>
+          <w:rFonts w:hint="eastAsia"/>
+          <w:lang w:val="en-US" w:eastAsia="zh-CN"/>
+        </w:rPr>
+        <w:t xml:space="preserve">spent </w:t>
+      </w:r>
+      <w:r>
+        <w:t>the longest training time (41.92 seconds), whereas XGBoost completed training in only 4.37 seconds while maintaining the best predictive accuracy. These results suggest that</w:t>
+      </w:r>
+      <w:r>
+        <w:rPr>
+          <w:b/>
+          <w:bCs/>
+        </w:rPr>
+        <w:t xml:space="preserve"> XGBoost provided the best balance between prediction accuracy and computational efficiency.</w:t>
+      </w:r>
+    </w:p>
+    <w:p>
+      <w:pPr>
+        <w:pStyle w:val="20"/>
+      </w:pPr>
+      <w:r>
+        <w:rPr>
+          <w:rFonts w:hint="default"/>
+          <w:lang w:val="en-NZ"/>
+        </w:rPr>
+        <w:t>Model Performance Comparison - Predicted v.s. Actual</w:t>
+      </w:r>
+      <w:r>
+        <w:rPr>
+          <w:rFonts w:hint="default"/>
+          <w:lang w:val="en-US"/>
+        </w:rPr>
+        <mc:AlternateContent>
+          <mc:Choice Requires="wps">
+            <w:drawing>
+              <wp:anchor distT="0" distB="0" distL="114300" distR="114300" simplePos="0" relativeHeight="251666432" behindDoc="1" locked="0" layoutInCell="1" allowOverlap="1">
+                <wp:simplePos x="0" y="0"/>
+                <wp:positionH relativeFrom="margin">
+                  <wp:posOffset>-61595</wp:posOffset>
+                </wp:positionH>
+                <wp:positionV relativeFrom="paragraph">
+                  <wp:posOffset>280670</wp:posOffset>
+                </wp:positionV>
+                <wp:extent cx="3265805" cy="1299845"/>
+                <wp:effectExtent l="0" t="0" r="3175" b="4445"/>
+                <wp:wrapTight wrapText="bothSides">
+                  <wp:wrapPolygon>
+                    <wp:start x="0" y="0"/>
+                    <wp:lineTo x="0" y="20988"/>
+                    <wp:lineTo x="21020" y="20988"/>
+                    <wp:lineTo x="21020" y="0"/>
+                    <wp:lineTo x="0" y="0"/>
+                  </wp:wrapPolygon>
+                </wp:wrapTight>
+                <wp:docPr id="14" name="Text Box 8"/>
+                <wp:cNvGraphicFramePr/>
+                <a:graphic xmlns:a="http://schemas.openxmlformats.org/drawingml/2006/main">
+                  <a:graphicData uri="http://schemas.microsoft.com/office/word/2010/wordprocessingShape">
+                    <wps:wsp>
+                      <wps:cNvSpPr>
+                        <a:spLocks noChangeArrowheads="1"/>
+                      </wps:cNvSpPr>
+                      <wps:spPr>
+                        <a:xfrm>
+                          <a:off x="0" y="0"/>
+                          <a:ext cx="3265805" cy="1299845"/>
+                        </a:xfrm>
+                        <a:prstGeom prst="rect">
+                          <a:avLst/>
+                        </a:prstGeom>
+                        <a:solidFill>
+                          <a:srgbClr val="FFFFFF"/>
+                        </a:solidFill>
+                        <a:ln w="9525">
+                          <a:noFill/>
+                          <a:miter lim="800000"/>
+                        </a:ln>
+                      </wps:spPr>
+                      <wps:txbx>
+                        <w:txbxContent>
+                          <w:p>
+                            <w:pPr>
+                              <w:pStyle w:val="7"/>
+                              <w:ind w:left="0" w:leftChars="0" w:firstLine="0" w:firstLineChars="0"/>
+                              <w:rPr>
+                                <w:rFonts w:hint="default" w:eastAsia="SimSun"/>
+                                <w:color w:val="FFFFFF" w:themeColor="background1"/>
+                                <w:lang w:val="en-NZ" w:eastAsia="zh-CN"/>
+                                <w14:textFill>
+                                  <w14:solidFill>
+                                    <w14:schemeClr w14:val="bg1"/>
+                                  </w14:solidFill>
+                                </w14:textFill>
+                              </w:rPr>
+                            </w:pPr>
+                            <w:r>
+                              <w:rPr>
+                                <w:rFonts w:hint="default" w:eastAsia="SimSun"/>
+                                <w:color w:val="FFFFFF" w:themeColor="background1"/>
+                                <w:lang w:val="en-NZ" w:eastAsia="zh-CN"/>
+                                <w14:textFill>
+                                  <w14:solidFill>
+                                    <w14:schemeClr w14:val="bg1"/>
+                                  </w14:solidFill>
+                                </w14:textFill>
+                              </w:rPr>
+                              <w:drawing>
+                                <wp:inline distT="0" distB="0" distL="114300" distR="114300">
+                                  <wp:extent cx="3095625" cy="1110615"/>
+                                  <wp:effectExtent l="0" t="0" r="0" b="3810"/>
+                                  <wp:docPr id="24" name="图片 24" descr="Figure8_predicted_vs_actual_model_comparison"/>
+                                  <wp:cNvGraphicFramePr>
+                                    <a:graphicFrameLocks xmlns:a="http://schemas.openxmlformats.org/drawingml/2006/main" noChangeAspect="1"/>
+                                  </wp:cNvGraphicFramePr>
+                                  <a:graphic xmlns:a="http://schemas.openxmlformats.org/drawingml/2006/main">
+                                    <a:graphicData uri="http://schemas.openxmlformats.org/drawingml/2006/picture">
+                                      <pic:pic xmlns:pic="http://schemas.openxmlformats.org/drawingml/2006/picture">
+                                        <pic:nvPicPr>
+                                          <pic:cNvPr id="24" name="图片 24" descr="Figure8_predicted_vs_actual_model_comparison"/>
+                                          <pic:cNvPicPr>
+                                            <a:picLocks noChangeAspect="1"/>
+                                          </pic:cNvPicPr>
+                                        </pic:nvPicPr>
+                                        <pic:blipFill>
+                                          <a:blip r:embed="rId12"/>
+                                          <a:stretch>
+                                            <a:fillRect/>
+                                          </a:stretch>
+                                        </pic:blipFill>
+                                        <pic:spPr>
+                                          <a:xfrm>
+                                            <a:off x="0" y="0"/>
+                                            <a:ext cx="3095625" cy="1110615"/>
+                                          </a:xfrm>
+                                          <a:prstGeom prst="rect">
+                                            <a:avLst/>
+                                          </a:prstGeom>
+                                        </pic:spPr>
+                                      </pic:pic>
+                                    </a:graphicData>
+                                  </a:graphic>
+                                </wp:inline>
+                              </w:drawing>
+                            </w:r>
+                          </w:p>
+                        </w:txbxContent>
+                      </wps:txbx>
+                      <wps:bodyPr rot="0" vert="horz" wrap="square" lIns="91440" tIns="45720" rIns="91440" bIns="45720" anchor="t" anchorCtr="0" upright="1">
+                        <a:noAutofit/>
+                      </wps:bodyPr>
+                    </wps:wsp>
+                  </a:graphicData>
+                </a:graphic>
+              </wp:anchor>
+            </w:drawing>
+          </mc:Choice>
+          <mc:Fallback>
+            <w:pict>
+              <v:rect id="Text Box 8" o:spid="_x0000_s1026" o:spt="1" style="position:absolute;left:0pt;margin-left:-4.85pt;margin-top:22.1pt;height:102.35pt;width:257.15pt;mso-position-horizontal-relative:margin;mso-wrap-distance-left:9pt;mso-wrap-distance-right:9pt;z-index:-251650048;mso-width-relative:page;mso-height-relative:page;" fillcolor="#FFFFFF" filled="t" stroked="f" coordsize="21600,21600" wrapcoords="0 0 0 20988 21020 20988 21020 0 0 0" o:gfxdata="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">
+                <v:fill on="t" focussize="0,0"/>
+                <v:stroke on="f" miterlimit="8" joinstyle="miter"/>
+                <v:imagedata o:title=""/>
+                <o:lock v:ext="edit" aspectratio="f"/>
+                <v:textbox>
+                  <w:txbxContent>
+                    <w:p>
+                      <w:pPr>
+                        <w:pStyle w:val="7"/>
+                        <w:ind w:left="0" w:leftChars="0" w:firstLine="0" w:firstLineChars="0"/>
+                        <w:rPr>
+                          <w:rFonts w:hint="default" w:eastAsia="SimSun"/>
+                          <w:color w:val="FFFFFF" w:themeColor="background1"/>
+                          <w:lang w:val="en-NZ" w:eastAsia="zh-CN"/>
+                          <w14:textFill>
+                            <w14:solidFill>
+                              <w14:schemeClr w14:val="bg1"/>
+                            </w14:solidFill>
+                          </w14:textFill>
+                        </w:rPr>
+                      </w:pPr>
+                      <w:r>
+                        <w:rPr>
+                          <w:rFonts w:hint="default" w:eastAsia="SimSun"/>
+                          <w:color w:val="FFFFFF" w:themeColor="background1"/>
+                          <w:lang w:val="en-NZ" w:eastAsia="zh-CN"/>
+                          <w14:textFill>
+                            <w14:solidFill>
+                              <w14:schemeClr w14:val="bg1"/>
+                            </w14:solidFill>
+                          </w14:textFill>
+                        </w:rPr>
+                        <w:drawing>
+                          <wp:inline distT="0" distB="0" distL="114300" distR="114300">
+                            <wp:extent cx="3095625" cy="1110615"/>
+                            <wp:effectExtent l="0" t="0" r="0" b="3810"/>
+                            <wp:docPr id="24" name="图片 24" descr="Figure8_predicted_vs_actual_model_comparison"/>
+                            <wp:cNvGraphicFramePr>
+                              <a:graphicFrameLocks xmlns:a="http://schemas.openxmlformats.org/drawingml/2006/main" noChangeAspect="1"/>
+                            </wp:cNvGraphicFramePr>
+                            <a:graphic xmlns:a="http://schemas.openxmlformats.org/drawingml/2006/main">
+                              <a:graphicData uri="http://schemas.openxmlformats.org/drawingml/2006/picture">
+                                <pic:pic xmlns:pic="http://schemas.openxmlformats.org/drawingml/2006/picture">
+                                  <pic:nvPicPr>
+                                    <pic:cNvPr id="24" name="图片 24" descr="Figure8_predicted_vs_actual_model_comparison"/>
+                                    <pic:cNvPicPr>
+                                      <a:picLocks noChangeAspect="1"/>
+                                    </pic:cNvPicPr>
+                                  </pic:nvPicPr>
+                                  <pic:blipFill>
+                                    <a:blip r:embed="rId12"/>
+                                    <a:stretch>
+                                      <a:fillRect/>
+                                    </a:stretch>
+                                  </pic:blipFill>
+                                  <pic:spPr>
+                                    <a:xfrm>
+                                      <a:off x="0" y="0"/>
+                                      <a:ext cx="3095625" cy="1110615"/>
+                                    </a:xfrm>
+                                    <a:prstGeom prst="rect">
+                                      <a:avLst/>
+                                    </a:prstGeom>
+                                  </pic:spPr>
+                                </pic:pic>
+                              </a:graphicData>
+                            </a:graphic>
+                          </wp:inline>
+                        </w:drawing>
+                      </w:r>
+                    </w:p>
+                  </w:txbxContent>
+                </v:textbox>
+                <w10:wrap type="tight"/>
+              </v:rect>
+            </w:pict>
+          </mc:Fallback>
+        </mc:AlternateContent>
+      </w:r>
+    </w:p>
+    <w:p>
+      <w:pPr>
+        <w:pStyle w:val="7"/>
+      </w:pPr>
+      <w:r>
+        <w:t>Fig</w:t>
+      </w:r>
+      <w:r>
+        <w:rPr>
+          <w:rFonts w:hint="default"/>
+          <w:lang w:val="en-NZ" w:eastAsia="zh-CN"/>
+        </w:rPr>
+        <w:t>.</w:t>
+      </w:r>
+      <w:r>
+        <w:t xml:space="preserve"> 8 further supports these findings by comparing the predicted and actual sales values for the three models. The predictions generated by Linear Regression generally followed the 45-degree reference line but exhibited noticeably larger deviations for several high-sales observations, indicating reduced accuracy at the upper end of the sales range. Random Forest produced predictions that clustered much more closely around the reference line, reflecting a substantial improvement in prediction accuracy. Among the three models, XGBoost demonstrated the closest agreement between predicted and actual values, with almost all observations lying on or very near the ideal prediction line. </w:t>
+      </w:r>
+      <w:r>
+        <w:rPr>
+          <w:rFonts w:hint="default" w:ascii="Times New Roman" w:hAnsi="Times New Roman" w:eastAsia="SimSun" w:cs="Times New Roman"/>
+          <w:spacing w:val="-1"/>
+          <w:lang w:val="zh-CN" w:eastAsia="zh-CN" w:bidi="ar-SA"/>
+        </w:rPr>
+        <w:t xml:space="preserve">This visual evidence is consistent with the evaluation metrics in Table VII, confirming that </w:t>
+      </w:r>
+      <w:r>
+        <w:rPr>
+          <w:rFonts w:hint="default" w:ascii="Times New Roman" w:hAnsi="Times New Roman" w:eastAsia="SimSun" w:cs="Times New Roman"/>
+          <w:b/>
+          <w:bCs/>
+          <w:spacing w:val="-1"/>
+          <w:lang w:val="zh-CN" w:eastAsia="zh-CN" w:bidi="ar-SA"/>
+        </w:rPr>
+        <w:t>XGBoost generalised most effectively to the testing data and therefore provided the most reliable sales predictions.</w:t>
+      </w:r>
+    </w:p>
+    <w:p>
+      <w:pPr>
+        <w:pStyle w:val="3"/>
+      </w:pPr>
+      <w:r>
+        <w:t>Feature Importance Analysis</w:t>
+      </w:r>
+    </w:p>
+    <w:p>
+      <w:pPr>
+        <w:pStyle w:val="7"/>
+        <w:rPr>
+          <w:rFonts w:hint="default"/>
+          <w:lang w:val="zh-CN" w:eastAsia="zh-CN"/>
+        </w:rPr>
+      </w:pPr>
+      <w:r>
+        <w:rPr>
+          <w:rFonts w:hint="default"/>
+          <w:lang w:val="zh-CN" w:eastAsia="zh-CN"/>
+        </w:rPr>
+        <w:t>Since XGBoost achieved the best predictive performance among the three models, its feature importance was used as the primary basis for interpreting which variables contributed most to sales prediction. Feature importance from Linear Regression and Random Forest is presented for comparison to evaluate the consistency of the findings across different modelling approaches.</w:t>
+      </w:r>
+    </w:p>
+    <w:p>
+      <w:pPr>
+        <w:pStyle w:val="7"/>
+        <w:rPr>
+          <w:i w:val="0"/>
+        </w:rPr>
+      </w:pPr>
+      <w:r>
+        <w:rPr>
+          <w:rFonts w:hint="default"/>
+          <w:lang w:val="en-NZ" w:eastAsia="zh-CN"/>
+        </w:rPr>
+        <w:t>Although there were differences in the algorithms, all three models consistently identified product-related variables as the dominant predictors of sales revenue</w:t>
+      </w:r>
+      <w:r>
+        <w:rPr>
+          <w:rFonts w:hint="eastAsia"/>
+          <w:lang w:val="en-US" w:eastAsia="zh-CN"/>
+        </w:rPr>
+        <w:t xml:space="preserve"> as demonstrated by Fig. 9, Fig. 10 and Fig. 11</w:t>
+      </w:r>
+      <w:r>
+        <w:rPr>
+          <w:rFonts w:hint="default"/>
+          <w:lang w:val="en-NZ" w:eastAsia="zh-CN"/>
+        </w:rPr>
+        <w:t>.</w:t>
+      </w:r>
+    </w:p>
+    <w:p>
+      <w:pPr>
+        <w:pStyle w:val="20"/>
+      </w:pPr>
+      <w:r>
+        <w:rPr>
+          <w:rFonts w:hint="default"/>
+          <w:lang w:val="en-US"/>
+        </w:rPr>
+        <mc:AlternateContent>
+          <mc:Choice Requires="wps">
+            <w:drawing>
+              <wp:anchor distT="0" distB="0" distL="114300" distR="114300" simplePos="0" relativeHeight="251667456" behindDoc="1" locked="0" layoutInCell="1" allowOverlap="1">
+                <wp:simplePos x="0" y="0"/>
+                <wp:positionH relativeFrom="margin">
+                  <wp:posOffset>-61595</wp:posOffset>
+                </wp:positionH>
+                <wp:positionV relativeFrom="paragraph">
+                  <wp:posOffset>280670</wp:posOffset>
+                </wp:positionV>
+                <wp:extent cx="3265805" cy="1299845"/>
+                <wp:effectExtent l="0" t="0" r="3175" b="4445"/>
+                <wp:wrapTight wrapText="bothSides">
+                  <wp:wrapPolygon>
+                    <wp:start x="0" y="0"/>
+                    <wp:lineTo x="0" y="20988"/>
+                    <wp:lineTo x="21020" y="20988"/>
+                    <wp:lineTo x="21020" y="0"/>
+                    <wp:lineTo x="0" y="0"/>
+                  </wp:wrapPolygon>
+                </wp:wrapTight>
+                <wp:docPr id="25" name="Text Box 8"/>
+                <wp:cNvGraphicFramePr/>
+                <a:graphic xmlns:a="http://schemas.openxmlformats.org/drawingml/2006/main">
+                  <a:graphicData uri="http://schemas.microsoft.com/office/word/2010/wordprocessingShape">
+                    <wps:wsp>
+                      <wps:cNvSpPr>
+                        <a:spLocks noChangeArrowheads="1"/>
+                      </wps:cNvSpPr>
+                      <wps:spPr>
+                        <a:xfrm>
+                          <a:off x="0" y="0"/>
+                          <a:ext cx="3265805" cy="1299845"/>
+                        </a:xfrm>
+                        <a:prstGeom prst="rect">
+                          <a:avLst/>
+                        </a:prstGeom>
+                        <a:solidFill>
+                          <a:srgbClr val="FFFFFF"/>
+                        </a:solidFill>
+                        <a:ln w="9525">
+                          <a:noFill/>
+                          <a:miter lim="800000"/>
+                        </a:ln>
+                      </wps:spPr>
+                      <wps:txbx>
+                        <w:txbxContent>
+                          <w:p>
+                            <w:pPr>
+                              <w:pStyle w:val="7"/>
+                              <w:ind w:left="0" w:leftChars="0" w:firstLine="0" w:firstLineChars="0"/>
+                              <w:rPr>
+                                <w:rFonts w:hint="default" w:eastAsia="SimSun"/>
+                                <w:color w:val="FFFFFF" w:themeColor="background1"/>
+                                <w:lang w:val="en-NZ" w:eastAsia="zh-CN"/>
+                                <w14:textFill>
+                                  <w14:solidFill>
+                                    <w14:schemeClr w14:val="bg1"/>
+                                  </w14:solidFill>
+                                </w14:textFill>
+                              </w:rPr>
+                            </w:pPr>
+                            <w:r>
+                              <w:rPr>
+                                <w:rFonts w:hint="default" w:eastAsia="SimSun"/>
+                                <w:color w:val="FFFFFF" w:themeColor="background1"/>
+                                <w:lang w:val="en-NZ" w:eastAsia="zh-CN"/>
+                                <w14:textFill>
+                                  <w14:solidFill>
+                                    <w14:schemeClr w14:val="bg1"/>
+                                  </w14:solidFill>
+                                </w14:textFill>
+                              </w:rPr>
+                              <w:drawing>
+                                <wp:inline distT="0" distB="0" distL="114300" distR="114300">
+                                  <wp:extent cx="3060700" cy="1207770"/>
+                                  <wp:effectExtent l="0" t="0" r="1905" b="5715"/>
+                                  <wp:docPr id="27" name="图片 27" descr="Figure9_Top10LinearRegressionCoeefficients"/>
+                                  <wp:cNvGraphicFramePr>
+                                    <a:graphicFrameLocks xmlns:a="http://schemas.openxmlformats.org/drawingml/2006/main" noChangeAspect="1"/>
+                                  </wp:cNvGraphicFramePr>
+                                  <a:graphic xmlns:a="http://schemas.openxmlformats.org/drawingml/2006/main">
+                                    <a:graphicData uri="http://schemas.openxmlformats.org/drawingml/2006/picture">
+                                      <pic:pic xmlns:pic="http://schemas.openxmlformats.org/drawingml/2006/picture">
+                                        <pic:nvPicPr>
+                                          <pic:cNvPr id="27" name="图片 27" descr="Figure9_Top10LinearRegressionCoeefficients"/>
+                                          <pic:cNvPicPr>
+                                            <a:picLocks noChangeAspect="1"/>
+                                          </pic:cNvPicPr>
+                                        </pic:nvPicPr>
+                                        <pic:blipFill>
+                                          <a:blip r:embed="rId13"/>
+                                          <a:stretch>
+                                            <a:fillRect/>
+                                          </a:stretch>
+                                        </pic:blipFill>
+                                        <pic:spPr>
+                                          <a:xfrm>
+                                            <a:off x="0" y="0"/>
+                                            <a:ext cx="3060700" cy="1207770"/>
+                                          </a:xfrm>
+                                          <a:prstGeom prst="rect">
+                                            <a:avLst/>
+                                          </a:prstGeom>
+                                        </pic:spPr>
+                                      </pic:pic>
+                                    </a:graphicData>
+                                  </a:graphic>
+                                </wp:inline>
+                              </w:drawing>
+                            </w:r>
+                          </w:p>
+                        </w:txbxContent>
+                      </wps:txbx>
+                      <wps:bodyPr rot="0" vert="horz" wrap="square" lIns="91440" tIns="45720" rIns="91440" bIns="45720" anchor="t" anchorCtr="0" upright="1">
+                        <a:noAutofit/>
+                      </wps:bodyPr>
+                    </wps:wsp>
+                  </a:graphicData>
+                </a:graphic>
+              </wp:anchor>
+            </w:drawing>
+          </mc:Choice>
+          <mc:Fallback>
+            <w:pict>
+              <v:rect id="Text Box 8" o:spid="_x0000_s1026" o:spt="1" style="position:absolute;left:0pt;margin-left:-4.85pt;margin-top:22.1pt;height:102.35pt;width:257.15pt;mso-position-horizontal-relative:margin;mso-wrap-distance-left:9pt;mso-wrap-distance-right:9pt;z-index:-251649024;mso-width-relative:page;mso-height-relative:page;" fillcolor="#FFFFFF" filled="t" stroked="f" coordsize="21600,21600" wrapcoords="0 0 0 20988 21020 20988 21020 0 0 0" o:gfxdata="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">
+                <v:fill on="t" focussize="0,0"/>
+                <v:stroke on="f" miterlimit="8" joinstyle="miter"/>
+                <v:imagedata o:title=""/>
+                <o:lock v:ext="edit" aspectratio="f"/>
+                <v:textbox>
+                  <w:txbxContent>
+                    <w:p>
+                      <w:pPr>
+                        <w:pStyle w:val="7"/>
+                        <w:ind w:left="0" w:leftChars="0" w:firstLine="0" w:firstLineChars="0"/>
+                        <w:rPr>
+                          <w:rFonts w:hint="default" w:eastAsia="SimSun"/>
+                          <w:color w:val="FFFFFF" w:themeColor="background1"/>
+                          <w:lang w:val="en-NZ" w:eastAsia="zh-CN"/>
+                          <w14:textFill>
+                            <w14:solidFill>
+                              <w14:schemeClr w14:val="bg1"/>
+                            </w14:solidFill>
+                          </w14:textFill>
+                        </w:rPr>
+                      </w:pPr>
+                      <w:r>
+                        <w:rPr>
+                          <w:rFonts w:hint="default" w:eastAsia="SimSun"/>
+                          <w:color w:val="FFFFFF" w:themeColor="background1"/>
+                          <w:lang w:val="en-NZ" w:eastAsia="zh-CN"/>
+                          <w14:textFill>
+                            <w14:solidFill>
+                              <w14:schemeClr w14:val="bg1"/>
+                            </w14:solidFill>
+                          </w14:textFill>
+                        </w:rPr>
+                        <w:drawing>
+                          <wp:inline distT="0" distB="0" distL="114300" distR="114300">
+                            <wp:extent cx="3060700" cy="1207770"/>
+                            <wp:effectExtent l="0" t="0" r="1905" b="5715"/>
+                            <wp:docPr id="27" name="图片 27" descr="Figure9_Top10LinearRegressionCoeefficients"/>
+                            <wp:cNvGraphicFramePr>
+                              <a:graphicFrameLocks xmlns:a="http://schemas.openxmlformats.org/drawingml/2006/main" noChangeAspect="1"/>
+                            </wp:cNvGraphicFramePr>
+                            <a:graphic xmlns:a="http://schemas.openxmlformats.org/drawingml/2006/main">
+                              <a:graphicData uri="http://schemas.openxmlformats.org/drawingml/2006/picture">
+                                <pic:pic xmlns:pic="http://schemas.openxmlformats.org/drawingml/2006/picture">
+                                  <pic:nvPicPr>
+                                    <pic:cNvPr id="27" name="图片 27" descr="Figure9_Top10LinearRegressionCoeefficients"/>
+                                    <pic:cNvPicPr>
+                                      <a:picLocks noChangeAspect="1"/>
+                                    </pic:cNvPicPr>
+                                  </pic:nvPicPr>
+                                  <pic:blipFill>
+                                    <a:blip r:embed="rId13"/>
+                                    <a:stretch>
+                                      <a:fillRect/>
+                                    </a:stretch>
+                                  </pic:blipFill>
+                                  <pic:spPr>
+                                    <a:xfrm>
+                                      <a:off x="0" y="0"/>
+                                      <a:ext cx="3060700" cy="1207770"/>
+                                    </a:xfrm>
+                                    <a:prstGeom prst="rect">
+                                      <a:avLst/>
+                                    </a:prstGeom>
+                                  </pic:spPr>
+                                </pic:pic>
+                              </a:graphicData>
+                            </a:graphic>
+                          </wp:inline>
+                        </w:drawing>
+                      </w:r>
+                    </w:p>
+                  </w:txbxContent>
+                </v:textbox>
+                <w10:wrap type="tight"/>
+              </v:rect>
+            </w:pict>
+          </mc:Fallback>
+        </mc:AlternateContent>
+      </w:r>
+      <w:r>
+        <w:rPr>
+          <w:rFonts w:hint="default"/>
+          <w:lang w:val="en-NZ"/>
+        </w:rPr>
+        <w:t>Top10 Linear Regression Coefficients</w:t>
+      </w:r>
+    </w:p>
+    <w:p>
+      <w:pPr>
+        <w:pStyle w:val="7"/>
+      </w:pPr>
+      <w:r>
+        <w:rPr>
+          <w:rFonts w:hint="default"/>
+          <w:lang w:val="zh-CN" w:eastAsia="zh-CN"/>
+        </w:rPr>
+        <w:t>As shown in Fig</w:t>
+      </w:r>
+      <w:r>
+        <w:rPr>
+          <w:rFonts w:hint="eastAsia"/>
+          <w:lang w:val="en-US" w:eastAsia="zh-CN"/>
+        </w:rPr>
+        <w:t xml:space="preserve">. </w:t>
+      </w:r>
+      <w:r>
+        <w:rPr>
+          <w:rFonts w:hint="default"/>
+          <w:lang w:val="zh-CN" w:eastAsia="zh-CN"/>
+        </w:rPr>
+        <w:t xml:space="preserve">11, </w:t>
+      </w:r>
+      <w:r>
+        <w:rPr>
+          <w:rFonts w:hint="default"/>
+          <w:i/>
+          <w:iCs/>
+          <w:lang w:val="zh-CN" w:eastAsia="zh-CN"/>
+        </w:rPr>
+        <w:t>MacBook Pro Laptop</w:t>
+      </w:r>
+      <w:r>
+        <w:rPr>
+          <w:rFonts w:hint="default"/>
+          <w:lang w:val="zh-CN" w:eastAsia="zh-CN"/>
+        </w:rPr>
+        <w:t xml:space="preserve"> was the most important variable, then came </w:t>
+      </w:r>
+      <w:r>
+        <w:rPr>
+          <w:rFonts w:hint="default"/>
+          <w:i/>
+          <w:iCs/>
+          <w:lang w:val="zh-CN" w:eastAsia="zh-CN"/>
+        </w:rPr>
+        <w:t>ThinkPad Laptop</w:t>
+      </w:r>
+      <w:r>
+        <w:rPr>
+          <w:rFonts w:hint="default"/>
+          <w:lang w:val="zh-CN" w:eastAsia="zh-CN"/>
+        </w:rPr>
+        <w:t xml:space="preserve">, </w:t>
+      </w:r>
+      <w:r>
+        <w:rPr>
+          <w:rFonts w:hint="default"/>
+          <w:i/>
+          <w:iCs/>
+          <w:lang w:val="zh-CN" w:eastAsia="zh-CN"/>
+        </w:rPr>
+        <w:t>iPhone,</w:t>
+      </w:r>
+      <w:r>
+        <w:rPr>
+          <w:rFonts w:hint="default"/>
+          <w:lang w:val="zh-CN" w:eastAsia="zh-CN"/>
+        </w:rPr>
+        <w:t xml:space="preserve"> and </w:t>
+      </w:r>
+      <w:r>
+        <w:rPr>
+          <w:rFonts w:hint="default"/>
+          <w:i/>
+          <w:iCs/>
+          <w:lang w:val="zh-CN" w:eastAsia="zh-CN"/>
+        </w:rPr>
+        <w:t>Google Phone.</w:t>
+      </w:r>
+      <w:r>
+        <w:rPr>
+          <w:rFonts w:hint="default"/>
+          <w:lang w:val="zh-CN" w:eastAsia="zh-CN"/>
+        </w:rPr>
+        <w:t xml:space="preserve"> The abrupt drop in importance after the first four products </w:t>
+      </w:r>
+      <w:r>
+        <w:rPr>
+          <w:rFonts w:hint="eastAsia"/>
+          <w:lang w:val="en-US" w:eastAsia="zh-CN"/>
+        </w:rPr>
+        <w:t>implied</w:t>
+      </w:r>
+      <w:r>
+        <w:rPr>
+          <w:rFonts w:hint="default"/>
+          <w:lang w:val="zh-CN" w:eastAsia="zh-CN"/>
+        </w:rPr>
+        <w:t xml:space="preserve"> that sales revenue prediction</w:t>
+      </w:r>
+      <w:r>
+        <w:rPr>
+          <w:rFonts w:hint="eastAsia"/>
+          <w:lang w:val="en-US" w:eastAsia="zh-CN"/>
+        </w:rPr>
+        <w:t xml:space="preserve"> is </w:t>
+      </w:r>
+      <w:r>
+        <w:rPr>
+          <w:rFonts w:hint="default"/>
+          <w:lang w:val="zh-CN" w:eastAsia="zh-CN"/>
+        </w:rPr>
+        <w:t xml:space="preserve">mainly </w:t>
+      </w:r>
+      <w:r>
+        <w:rPr>
+          <w:rFonts w:hint="eastAsia"/>
+          <w:lang w:val="en-US" w:eastAsia="zh-CN"/>
+        </w:rPr>
+        <w:t>driven by the</w:t>
+      </w:r>
+      <w:r>
+        <w:rPr>
+          <w:rFonts w:hint="default"/>
+          <w:lang w:val="zh-CN" w:eastAsia="zh-CN"/>
+        </w:rPr>
+        <w:t xml:space="preserve"> product category rather than the time </w:t>
+      </w:r>
+      <w:r>
+        <w:rPr>
+          <w:rFonts w:hint="eastAsia"/>
+          <w:lang w:val="en-US" w:eastAsia="zh-CN"/>
+        </w:rPr>
+        <w:t>(</w:t>
+      </w:r>
+      <w:r>
+        <w:rPr>
+          <w:rFonts w:hint="eastAsia"/>
+          <w:i/>
+          <w:iCs/>
+          <w:lang w:val="en-US" w:eastAsia="zh-CN"/>
+        </w:rPr>
+        <w:t>Month, Hour</w:t>
+      </w:r>
+      <w:r>
+        <w:rPr>
+          <w:rFonts w:hint="eastAsia"/>
+          <w:lang w:val="en-US" w:eastAsia="zh-CN"/>
+        </w:rPr>
+        <w:t xml:space="preserve">) </w:t>
+      </w:r>
+      <w:r>
+        <w:rPr>
+          <w:rFonts w:hint="default"/>
+          <w:lang w:val="zh-CN" w:eastAsia="zh-CN"/>
+        </w:rPr>
+        <w:t>and place</w:t>
+      </w:r>
+      <w:r>
+        <w:rPr>
+          <w:rFonts w:hint="eastAsia"/>
+          <w:lang w:val="en-US" w:eastAsia="zh-CN"/>
+        </w:rPr>
+        <w:t xml:space="preserve"> (</w:t>
+      </w:r>
+      <w:r>
+        <w:rPr>
+          <w:rFonts w:hint="eastAsia"/>
+          <w:i/>
+          <w:iCs/>
+          <w:lang w:val="en-US" w:eastAsia="zh-CN"/>
+        </w:rPr>
+        <w:t>City</w:t>
+      </w:r>
+      <w:r>
+        <w:rPr>
+          <w:rFonts w:hint="eastAsia"/>
+          <w:lang w:val="en-US" w:eastAsia="zh-CN"/>
+        </w:rPr>
+        <w:t>)</w:t>
+      </w:r>
+      <w:r>
+        <w:rPr>
+          <w:rFonts w:hint="default"/>
+          <w:lang w:val="zh-CN" w:eastAsia="zh-CN"/>
+        </w:rPr>
+        <w:t xml:space="preserve"> of sales.</w:t>
+      </w:r>
+    </w:p>
+    <w:p>
+      <w:pPr>
+        <w:pStyle w:val="20"/>
+      </w:pPr>
+      <w:r>
+        <w:rPr>
+          <w:rFonts w:hint="default"/>
+          <w:lang w:val="en-US"/>
+        </w:rPr>
+        <mc:AlternateContent>
+          <mc:Choice Requires="wps">
+            <w:drawing>
+              <wp:anchor distT="0" distB="0" distL="114300" distR="114300" simplePos="0" relativeHeight="251668480" behindDoc="1" locked="0" layoutInCell="1" allowOverlap="1">
+                <wp:simplePos x="0" y="0"/>
+                <wp:positionH relativeFrom="margin">
+                  <wp:posOffset>3376295</wp:posOffset>
+                </wp:positionH>
+                <wp:positionV relativeFrom="paragraph">
+                  <wp:posOffset>224155</wp:posOffset>
+                </wp:positionV>
+                <wp:extent cx="3265805" cy="1299845"/>
+                <wp:effectExtent l="0" t="0" r="3175" b="4445"/>
+                <wp:wrapTight wrapText="bothSides">
+                  <wp:wrapPolygon>
+                    <wp:start x="0" y="0"/>
+                    <wp:lineTo x="0" y="20988"/>
+                    <wp:lineTo x="21020" y="20988"/>
+                    <wp:lineTo x="21020" y="0"/>
+                    <wp:lineTo x="0" y="0"/>
+                  </wp:wrapPolygon>
+                </wp:wrapTight>
+                <wp:docPr id="28" name="Text Box 8"/>
+                <wp:cNvGraphicFramePr/>
+                <a:graphic xmlns:a="http://schemas.openxmlformats.org/drawingml/2006/main">
+                  <a:graphicData uri="http://schemas.microsoft.com/office/word/2010/wordprocessingShape">
+                    <wps:wsp>
+                      <wps:cNvSpPr>
+                        <a:spLocks noChangeArrowheads="1"/>
+                      </wps:cNvSpPr>
+                      <wps:spPr>
+                        <a:xfrm>
+                          <a:off x="0" y="0"/>
+                          <a:ext cx="3265805" cy="1299845"/>
+                        </a:xfrm>
+                        <a:prstGeom prst="rect">
+                          <a:avLst/>
+                        </a:prstGeom>
+                        <a:solidFill>
+                          <a:srgbClr val="FFFFFF"/>
+                        </a:solidFill>
+                        <a:ln w="9525">
+                          <a:noFill/>
+                          <a:miter lim="800000"/>
+                        </a:ln>
+                      </wps:spPr>
+                      <wps:txbx>
+                        <w:txbxContent>
+                          <w:p>
+                            <w:pPr>
+                              <w:pStyle w:val="7"/>
+                              <w:ind w:left="0" w:leftChars="0" w:firstLine="0" w:firstLineChars="0"/>
+                              <w:rPr>
+                                <w:rFonts w:hint="default" w:eastAsia="SimSun"/>
+                                <w:color w:val="FFFFFF" w:themeColor="background1"/>
+                                <w:lang w:val="en-NZ" w:eastAsia="zh-CN"/>
+                                <w14:textFill>
+                                  <w14:solidFill>
+                                    <w14:schemeClr w14:val="bg1"/>
+                                  </w14:solidFill>
+                                </w14:textFill>
+                              </w:rPr>
+                            </w:pPr>
+                            <w:r>
+                              <w:rPr>
+                                <w:rFonts w:hint="default" w:eastAsia="SimSun"/>
+                                <w:color w:val="FFFFFF" w:themeColor="background1"/>
+                                <w:lang w:val="en-NZ" w:eastAsia="zh-CN"/>
+                                <w14:textFill>
+                                  <w14:solidFill>
+                                    <w14:schemeClr w14:val="bg1"/>
+                                  </w14:solidFill>
+                                </w14:textFill>
+                              </w:rPr>
+                              <w:drawing>
+                                <wp:inline distT="0" distB="0" distL="114300" distR="114300">
+                                  <wp:extent cx="3089910" cy="1197610"/>
+                                  <wp:effectExtent l="0" t="0" r="5715" b="7620"/>
+                                  <wp:docPr id="30" name="图片 30" descr="Figure10_Top10ImportantFeatures-RF"/>
+                                  <wp:cNvGraphicFramePr>
+                                    <a:graphicFrameLocks xmlns:a="http://schemas.openxmlformats.org/drawingml/2006/main" noChangeAspect="1"/>
+                                  </wp:cNvGraphicFramePr>
+                                  <a:graphic xmlns:a="http://schemas.openxmlformats.org/drawingml/2006/main">
+                                    <a:graphicData uri="http://schemas.openxmlformats.org/drawingml/2006/picture">
+                                      <pic:pic xmlns:pic="http://schemas.openxmlformats.org/drawingml/2006/picture">
+                                        <pic:nvPicPr>
+                                          <pic:cNvPr id="30" name="图片 30" descr="Figure10_Top10ImportantFeatures-RF"/>
+                                          <pic:cNvPicPr>
+                                            <a:picLocks noChangeAspect="1"/>
+                                          </pic:cNvPicPr>
+                                        </pic:nvPicPr>
+                                        <pic:blipFill>
+                                          <a:blip r:embed="rId14"/>
+                                          <a:stretch>
+                                            <a:fillRect/>
+                                          </a:stretch>
+                                        </pic:blipFill>
+                                        <pic:spPr>
+                                          <a:xfrm>
+                                            <a:off x="0" y="0"/>
+                                            <a:ext cx="3089910" cy="1197610"/>
+                                          </a:xfrm>
+                                          <a:prstGeom prst="rect">
+                                            <a:avLst/>
+                                          </a:prstGeom>
+                                        </pic:spPr>
+                                      </pic:pic>
+                                    </a:graphicData>
+                                  </a:graphic>
+                                </wp:inline>
+                              </w:drawing>
+                            </w:r>
+                          </w:p>
+                        </w:txbxContent>
+                      </wps:txbx>
+                      <wps:bodyPr rot="0" vert="horz" wrap="square" lIns="91440" tIns="45720" rIns="91440" bIns="45720" anchor="t" anchorCtr="0" upright="1">
+                        <a:noAutofit/>
+                      </wps:bodyPr>
+                    </wps:wsp>
+                  </a:graphicData>
+                </a:graphic>
+              </wp:anchor>
+            </w:drawing>
+          </mc:Choice>
+          <mc:Fallback>
+            <w:pict>
+              <v:rect id="Text Box 8" o:spid="_x0000_s1026" o:spt="1" style="position:absolute;left:0pt;margin-left:265.85pt;margin-top:17.65pt;height:102.35pt;width:257.15pt;mso-position-horizontal-relative:margin;mso-wrap-distance-left:9pt;mso-wrap-distance-right:9pt;z-index:-251648000;mso-width-relative:page;mso-height-relative:page;" fillcolor="#FFFFFF" filled="t" stroked="f" coordsize="21600,21600" wrapcoords="0 0 0 20988 21020 20988 21020 0 0 0" o:gfxdata="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">
+                <v:fill on="t" focussize="0,0"/>
+                <v:stroke on="f" miterlimit="8" joinstyle="miter"/>
+                <v:imagedata o:title=""/>
+                <o:lock v:ext="edit" aspectratio="f"/>
+                <v:textbox>
+                  <w:txbxContent>
+                    <w:p>
+                      <w:pPr>
+                        <w:pStyle w:val="7"/>
+                        <w:ind w:left="0" w:leftChars="0" w:firstLine="0" w:firstLineChars="0"/>
+                        <w:rPr>
+                          <w:rFonts w:hint="default" w:eastAsia="SimSun"/>
+                          <w:color w:val="FFFFFF" w:themeColor="background1"/>
+                          <w:lang w:val="en-NZ" w:eastAsia="zh-CN"/>
+                          <w14:textFill>
+                            <w14:solidFill>
+                              <w14:schemeClr w14:val="bg1"/>
+                            </w14:solidFill>
+                          </w14:textFill>
+                        </w:rPr>
+                      </w:pPr>
+                      <w:r>
+                        <w:rPr>
+                          <w:rFonts w:hint="default" w:eastAsia="SimSun"/>
+                          <w:color w:val="FFFFFF" w:themeColor="background1"/>
+                          <w:lang w:val="en-NZ" w:eastAsia="zh-CN"/>
+                          <w14:textFill>
+                            <w14:solidFill>
+                              <w14:schemeClr w14:val="bg1"/>
+                            </w14:solidFill>
+                          </w14:textFill>
+                        </w:rPr>
+                        <w:drawing>
+                          <wp:inline distT="0" distB="0" distL="114300" distR="114300">
+                            <wp:extent cx="3089910" cy="1197610"/>
+                            <wp:effectExtent l="0" t="0" r="5715" b="7620"/>
+                            <wp:docPr id="30" name="图片 30" descr="Figure10_Top10ImportantFeatures-RF"/>
+                            <wp:cNvGraphicFramePr>
+                              <a:graphicFrameLocks xmlns:a="http://schemas.openxmlformats.org/drawingml/2006/main" noChangeAspect="1"/>
+                            </wp:cNvGraphicFramePr>
+                            <a:graphic xmlns:a="http://schemas.openxmlformats.org/drawingml/2006/main">
+                              <a:graphicData uri="http://schemas.openxmlformats.org/drawingml/2006/picture">
+                                <pic:pic xmlns:pic="http://schemas.openxmlformats.org/drawingml/2006/picture">
+                                  <pic:nvPicPr>
+                                    <pic:cNvPr id="30" name="图片 30" descr="Figure10_Top10ImportantFeatures-RF"/>
+                                    <pic:cNvPicPr>
+                                      <a:picLocks noChangeAspect="1"/>
+                                    </pic:cNvPicPr>
+                                  </pic:nvPicPr>
+                                  <pic:blipFill>
+                                    <a:blip r:embed="rId14"/>
+                                    <a:stretch>
+                                      <a:fillRect/>
+                                    </a:stretch>
+                                  </pic:blipFill>
+                                  <pic:spPr>
+                                    <a:xfrm>
+                                      <a:off x="0" y="0"/>
+                                      <a:ext cx="3089910" cy="1197610"/>
+                                    </a:xfrm>
+                                    <a:prstGeom prst="rect">
+                                      <a:avLst/>
+                                    </a:prstGeom>
+                                  </pic:spPr>
+                                </pic:pic>
+                              </a:graphicData>
+                            </a:graphic>
+                          </wp:inline>
+                        </w:drawing>
+                      </w:r>
+                    </w:p>
+                  </w:txbxContent>
+                </v:textbox>
+                <w10:wrap type="tight"/>
+              </v:rect>
+            </w:pict>
+          </mc:Fallback>
+        </mc:AlternateContent>
+      </w:r>
+      <w:r>
+        <w:rPr>
+          <w:rFonts w:hint="default"/>
+          <w:lang w:val="en-NZ"/>
+        </w:rPr>
+        <w:t>Top10 Important Features - Random Forest</w:t>
+      </w:r>
+    </w:p>
+    <w:p>
+      <w:pPr>
+        <w:pStyle w:val="7"/>
+      </w:pPr>
+      <w:r>
+        <w:t xml:space="preserve">Similar </w:t>
+      </w:r>
+      <w:r>
+        <w:rPr>
+          <w:rFonts w:hint="eastAsia"/>
+          <w:lang w:val="en-US" w:eastAsia="zh-CN"/>
+        </w:rPr>
+        <w:t>patterns</w:t>
+      </w:r>
+      <w:r>
+        <w:t xml:space="preserve"> were observed in both Linear Regression coefficients (Fig</w:t>
+      </w:r>
+      <w:r>
+        <w:rPr>
+          <w:rFonts w:hint="eastAsia"/>
+          <w:lang w:val="en-US" w:eastAsia="zh-CN"/>
+        </w:rPr>
+        <w:t>.</w:t>
+      </w:r>
+      <w:r>
+        <w:t xml:space="preserve"> 9) and Random Forest feature importance (Fi</w:t>
+      </w:r>
+      <w:r>
+        <w:rPr>
+          <w:rFonts w:hint="eastAsia"/>
+          <w:lang w:val="en-US" w:eastAsia="zh-CN"/>
+        </w:rPr>
+        <w:t>g.</w:t>
+      </w:r>
+      <w:r>
+        <w:t xml:space="preserve"> 10), where premium laptop and smartphone products consistently appeared among the most influential variables. This consistency increases confidence that the identified features genuinely contribute to sales prediction rather than being artefacts of a particular modelling algorithm.</w:t>
+      </w:r>
+    </w:p>
+    <w:p>
+      <w:pPr>
+        <w:pStyle w:val="20"/>
+      </w:pPr>
+      <w:r>
+        <w:rPr>
+          <w:rFonts w:hint="default"/>
+          <w:lang w:val="en-US"/>
+        </w:rPr>
+        <mc:AlternateContent>
+          <mc:Choice Requires="wps">
+            <w:drawing>
+              <wp:anchor distT="0" distB="0" distL="114300" distR="114300" simplePos="0" relativeHeight="251669504" behindDoc="1" locked="0" layoutInCell="1" allowOverlap="1">
+                <wp:simplePos x="0" y="0"/>
+                <wp:positionH relativeFrom="margin">
+                  <wp:posOffset>3376295</wp:posOffset>
+                </wp:positionH>
+                <wp:positionV relativeFrom="paragraph">
+                  <wp:posOffset>224155</wp:posOffset>
+                </wp:positionV>
+                <wp:extent cx="3265805" cy="1299845"/>
+                <wp:effectExtent l="0" t="0" r="3175" b="4445"/>
+                <wp:wrapTight wrapText="bothSides">
+                  <wp:wrapPolygon>
+                    <wp:start x="0" y="0"/>
+                    <wp:lineTo x="0" y="20988"/>
+                    <wp:lineTo x="21020" y="20988"/>
+                    <wp:lineTo x="21020" y="0"/>
+                    <wp:lineTo x="0" y="0"/>
+                  </wp:wrapPolygon>
+                </wp:wrapTight>
+                <wp:docPr id="31" name="Text Box 8"/>
+                <wp:cNvGraphicFramePr/>
+                <a:graphic xmlns:a="http://schemas.openxmlformats.org/drawingml/2006/main">
+                  <a:graphicData uri="http://schemas.microsoft.com/office/word/2010/wordprocessingShape">
+                    <wps:wsp>
+                      <wps:cNvSpPr>
+                        <a:spLocks noChangeArrowheads="1"/>
+                      </wps:cNvSpPr>
+                      <wps:spPr>
+                        <a:xfrm>
+                          <a:off x="0" y="0"/>
+                          <a:ext cx="3265805" cy="1299845"/>
+                        </a:xfrm>
+                        <a:prstGeom prst="rect">
+                          <a:avLst/>
+                        </a:prstGeom>
+                        <a:solidFill>
+                          <a:srgbClr val="FFFFFF"/>
+                        </a:solidFill>
+                        <a:ln w="9525">
+                          <a:noFill/>
+                          <a:miter lim="800000"/>
+                        </a:ln>
+                      </wps:spPr>
+                      <wps:txbx>
+                        <w:txbxContent>
+                          <w:p>
+                            <w:pPr>
+                              <w:pStyle w:val="7"/>
+                              <w:ind w:left="0" w:leftChars="0" w:firstLine="0" w:firstLineChars="0"/>
+                              <w:rPr>
+                                <w:rFonts w:hint="default" w:eastAsia="SimSun"/>
+                                <w:color w:val="FFFFFF" w:themeColor="background1"/>
+                                <w:lang w:val="en-NZ" w:eastAsia="zh-CN"/>
+                                <w14:textFill>
+                                  <w14:solidFill>
+                                    <w14:schemeClr w14:val="bg1"/>
+                                  </w14:solidFill>
+                                </w14:textFill>
+                              </w:rPr>
+                            </w:pPr>
+                            <w:r>
+                              <w:rPr>
+                                <w:rFonts w:hint="default" w:eastAsia="SimSun"/>
+                                <w:color w:val="FFFFFF" w:themeColor="background1"/>
+                                <w:lang w:val="en-NZ" w:eastAsia="zh-CN"/>
+                                <w14:textFill>
+                                  <w14:solidFill>
+                                    <w14:schemeClr w14:val="bg1"/>
+                                  </w14:solidFill>
+                                </w14:textFill>
+                              </w:rPr>
+                              <w:drawing>
+                                <wp:inline distT="0" distB="0" distL="114300" distR="114300">
+                                  <wp:extent cx="3093720" cy="1195705"/>
+                                  <wp:effectExtent l="0" t="0" r="1905" b="1270"/>
+                                  <wp:docPr id="33" name="图片 33" descr="Figure11_Top10ImportantFeatures-XGB"/>
+                                  <wp:cNvGraphicFramePr>
+                                    <a:graphicFrameLocks xmlns:a="http://schemas.openxmlformats.org/drawingml/2006/main" noChangeAspect="1"/>
+                                  </wp:cNvGraphicFramePr>
+                                  <a:graphic xmlns:a="http://schemas.openxmlformats.org/drawingml/2006/main">
+                                    <a:graphicData uri="http://schemas.openxmlformats.org/drawingml/2006/picture">
+                                      <pic:pic xmlns:pic="http://schemas.openxmlformats.org/drawingml/2006/picture">
+                                        <pic:nvPicPr>
+                                          <pic:cNvPr id="33" name="图片 33" descr="Figure11_Top10ImportantFeatures-XGB"/>
+                                          <pic:cNvPicPr>
+                                            <a:picLocks noChangeAspect="1"/>
+                                          </pic:cNvPicPr>
+                                        </pic:nvPicPr>
+                                        <pic:blipFill>
+                                          <a:blip r:embed="rId15"/>
+                                          <a:stretch>
+                                            <a:fillRect/>
+                                          </a:stretch>
+                                        </pic:blipFill>
+                                        <pic:spPr>
+                                          <a:xfrm>
+                                            <a:off x="0" y="0"/>
+                                            <a:ext cx="3093720" cy="1195705"/>
+                                          </a:xfrm>
+                                          <a:prstGeom prst="rect">
+                                            <a:avLst/>
+                                          </a:prstGeom>
+                                        </pic:spPr>
+                                      </pic:pic>
+                                    </a:graphicData>
+                                  </a:graphic>
+                                </wp:inline>
+                              </w:drawing>
+                            </w:r>
+                          </w:p>
+                        </w:txbxContent>
+                      </wps:txbx>
+                      <wps:bodyPr rot="0" vert="horz" wrap="square" lIns="91440" tIns="45720" rIns="91440" bIns="45720" anchor="t" anchorCtr="0" upright="1">
+                        <a:noAutofit/>
+                      </wps:bodyPr>
+                    </wps:wsp>
+                  </a:graphicData>
+                </a:graphic>
+              </wp:anchor>
+            </w:drawing>
+          </mc:Choice>
+          <mc:Fallback>
+            <w:pict>
+              <v:rect id="Text Box 8" o:spid="_x0000_s1026" o:spt="1" style="position:absolute;left:0pt;margin-left:265.85pt;margin-top:17.65pt;height:102.35pt;width:257.15pt;mso-position-horizontal-relative:margin;mso-wrap-distance-left:9pt;mso-wrap-distance-right:9pt;z-index:-251646976;mso-width-relative:page;mso-height-relative:page;" fillcolor="#FFFFFF" filled="t" stroked="f" coordsize="21600,21600" wrapcoords="0 0 0 20988 21020 20988 21020 0 0 0" o:gfxdata="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">
+                <v:fill on="t" focussize="0,0"/>
+                <v:stroke on="f" miterlimit="8" joinstyle="miter"/>
+                <v:imagedata o:title=""/>
+                <o:lock v:ext="edit" aspectratio="f"/>
+                <v:textbox>
+                  <w:txbxContent>
+                    <w:p>
+                      <w:pPr>
+                        <w:pStyle w:val="7"/>
+                        <w:ind w:left="0" w:leftChars="0" w:firstLine="0" w:firstLineChars="0"/>
+                        <w:rPr>
+                          <w:rFonts w:hint="default" w:eastAsia="SimSun"/>
+                          <w:color w:val="FFFFFF" w:themeColor="background1"/>
+                          <w:lang w:val="en-NZ" w:eastAsia="zh-CN"/>
+                          <w14:textFill>
+                            <w14:solidFill>
+                              <w14:schemeClr w14:val="bg1"/>
+                            </w14:solidFill>
+                          </w14:textFill>
+                        </w:rPr>
+                      </w:pPr>
+                      <w:r>
+                        <w:rPr>
+                          <w:rFonts w:hint="default" w:eastAsia="SimSun"/>
+                          <w:color w:val="FFFFFF" w:themeColor="background1"/>
+                          <w:lang w:val="en-NZ" w:eastAsia="zh-CN"/>
+                          <w14:textFill>
+                            <w14:solidFill>
+                              <w14:schemeClr w14:val="bg1"/>
+                            </w14:solidFill>
+                          </w14:textFill>
+                        </w:rPr>
+                        <w:drawing>
+                          <wp:inline distT="0" distB="0" distL="114300" distR="114300">
+                            <wp:extent cx="3093720" cy="1195705"/>
+                            <wp:effectExtent l="0" t="0" r="1905" b="1270"/>
+                            <wp:docPr id="33" name="图片 33" descr="Figure11_Top10ImportantFeatures-XGB"/>
+                            <wp:cNvGraphicFramePr>
+                              <a:graphicFrameLocks xmlns:a="http://schemas.openxmlformats.org/drawingml/2006/main" noChangeAspect="1"/>
+                            </wp:cNvGraphicFramePr>
+                            <a:graphic xmlns:a="http://schemas.openxmlformats.org/drawingml/2006/main">
+                              <a:graphicData uri="http://schemas.openxmlformats.org/drawingml/2006/picture">
+                                <pic:pic xmlns:pic="http://schemas.openxmlformats.org/drawingml/2006/picture">
+                                  <pic:nvPicPr>
+                                    <pic:cNvPr id="33" name="图片 33" descr="Figure11_Top10ImportantFeatures-XGB"/>
+                                    <pic:cNvPicPr>
+                                      <a:picLocks noChangeAspect="1"/>
+                                    </pic:cNvPicPr>
+                                  </pic:nvPicPr>
+                                  <pic:blipFill>
+                                    <a:blip r:embed="rId15"/>
+                                    <a:stretch>
+                                      <a:fillRect/>
+                                    </a:stretch>
+                                  </pic:blipFill>
+                                  <pic:spPr>
+                                    <a:xfrm>
+                                      <a:off x="0" y="0"/>
+                                      <a:ext cx="3093720" cy="1195705"/>
+                                    </a:xfrm>
+                                    <a:prstGeom prst="rect">
+                                      <a:avLst/>
+                                    </a:prstGeom>
+                                  </pic:spPr>
+                                </pic:pic>
+                              </a:graphicData>
+                            </a:graphic>
+                          </wp:inline>
+                        </w:drawing>
+                      </w:r>
+                    </w:p>
+                  </w:txbxContent>
+                </v:textbox>
+                <w10:wrap type="tight"/>
+              </v:rect>
+            </w:pict>
+          </mc:Fallback>
+        </mc:AlternateContent>
+      </w:r>
+      <w:r>
+        <w:rPr>
+          <w:rFonts w:hint="default"/>
+          <w:lang w:val="en-NZ"/>
+        </w:rPr>
+        <w:t>Top10 Important Features - Random Forest</w:t>
+      </w:r>
+    </w:p>
+    <w:p>
+      <w:pPr>
+        <w:pStyle w:val="7"/>
+      </w:pPr>
+      <w:r>
+        <w:rPr>
+          <w:rFonts w:hint="eastAsia"/>
+          <w:lang w:val="en-US" w:eastAsia="zh-CN"/>
+        </w:rPr>
+        <w:t>By referring to the EDA, t</w:t>
+      </w:r>
+      <w:r>
+        <w:t xml:space="preserve">he dominance of product-related variables is </w:t>
+      </w:r>
+      <w:r>
+        <w:rPr>
+          <w:rFonts w:hint="eastAsia"/>
+          <w:lang w:val="en-US" w:eastAsia="zh-CN"/>
+        </w:rPr>
+        <w:t xml:space="preserve">actually </w:t>
+      </w:r>
+      <w:r>
+        <w:t xml:space="preserve">expected </w:t>
+      </w:r>
+      <w:r>
+        <w:rPr>
+          <w:rFonts w:hint="eastAsia"/>
+          <w:lang w:val="en-US" w:eastAsia="zh-CN"/>
+        </w:rPr>
+        <w:t>as</w:t>
+      </w:r>
+      <w:r>
+        <w:t xml:space="preserve"> each product has a fixed selling price. Consequently, product identity implicitly captures much of the pricing information, making it the strongest predictor of sales revenue.</w:t>
+      </w:r>
+    </w:p>
+    <w:p>
+      <w:pPr>
+        <w:pStyle w:val="7"/>
+      </w:pPr>
+      <w:r>
+        <w:rPr>
+          <w:rFonts w:hint="eastAsia"/>
+          <w:lang w:val="en-US" w:eastAsia="zh-CN"/>
+        </w:rPr>
+        <w:t>Overall, t</w:t>
+      </w:r>
+      <w:r>
+        <w:rPr>
+          <w:rFonts w:hint="default"/>
+        </w:rPr>
+        <w:t>hese findings suggest that businesses should prioritise inventory planning and promotional activities for high-value products. Combined with the association rule analysis, the results also highlight opportunities for cross-selling complementary accessories with premium electronic devices.</w:t>
+      </w:r>
+    </w:p>
+    <w:p>
+      <w:pPr>
+        <w:pStyle w:val="2"/>
+      </w:pPr>
+      <w:r>
+        <w:rPr>
+          <w:rFonts w:hint="eastAsia"/>
+          <w:lang w:val="en-US" w:eastAsia="zh-CN"/>
+        </w:rPr>
+        <w:t>Discussion</w:t>
+      </w:r>
+    </w:p>
+    <w:p>
+      <w:pPr>
+        <w:pStyle w:val="7"/>
+        <w:rPr>
+          <w:rFonts w:hint="default"/>
+        </w:rPr>
+      </w:pPr>
+      <w:r>
+        <w:rPr>
+          <w:rFonts w:hint="default"/>
+        </w:rPr>
+        <w:t xml:space="preserve">This </w:t>
+      </w:r>
+      <w:r>
+        <w:rPr>
+          <w:rFonts w:hint="eastAsia"/>
+          <w:lang w:val="en-US" w:eastAsia="zh-CN"/>
+        </w:rPr>
+        <w:t>study</w:t>
+      </w:r>
+      <w:r>
+        <w:rPr>
+          <w:rFonts w:hint="default"/>
+        </w:rPr>
+        <w:t xml:space="preserve"> employed exploratory data analysis, association rule mining, and machine learning methods to analyze sales trends and make predictions for sales revenue.</w:t>
+      </w:r>
+      <w:r>
+        <w:rPr>
+          <w:rFonts w:hint="default"/>
+          <w:lang w:val="en-NZ"/>
+        </w:rPr>
+        <w:t xml:space="preserve"> </w:t>
+      </w:r>
+      <w:r>
+        <w:rPr>
+          <w:rFonts w:hint="default"/>
+        </w:rPr>
+        <w:t>The EDA revealed clear temporal purchasing patterns, product performance differences, and pricing characteristics across the dataset. Association rule analysis further identified several meaningful co-purchasing relationships, while the machine learning models demonstrated that sales revenue could be predicted with very high accuracy. Together, these findings provide a comprehensive understanding of customer purchasing behaviour and the key drivers of sales performance.</w:t>
+      </w:r>
+    </w:p>
+    <w:p>
+      <w:pPr>
+        <w:pStyle w:val="7"/>
+        <w:rPr>
+          <w:rFonts w:hint="default"/>
+        </w:rPr>
+      </w:pPr>
+      <w:r>
+        <w:rPr>
+          <w:rFonts w:hint="default"/>
+        </w:rPr>
+        <w:t xml:space="preserve">One important </w:t>
+      </w:r>
+      <w:r>
+        <w:rPr>
+          <w:rFonts w:hint="default"/>
+          <w:lang w:val="en-NZ"/>
+        </w:rPr>
+        <w:t>price-wise</w:t>
+      </w:r>
+      <w:r>
+        <w:rPr>
+          <w:rFonts w:hint="default"/>
+        </w:rPr>
+        <w:t xml:space="preserve"> </w:t>
+      </w:r>
+      <w:r>
+        <w:rPr>
+          <w:rFonts w:hint="default"/>
+          <w:lang w:val="en-NZ"/>
+        </w:rPr>
+        <w:t xml:space="preserve">insight </w:t>
+      </w:r>
+      <w:r>
+        <w:rPr>
+          <w:rFonts w:hint="default"/>
+        </w:rPr>
+        <w:t xml:space="preserve">is that high-value electronic products, particularly laptops and smartphones, contribute disproportionately to total revenue despite selling in lower quantities than inexpensive accessories. This </w:t>
+      </w:r>
+      <w:r>
+        <w:rPr>
+          <w:rFonts w:hint="default"/>
+          <w:lang w:val="en-NZ"/>
+        </w:rPr>
+        <w:t>advises</w:t>
+      </w:r>
+      <w:r>
+        <w:rPr>
+          <w:rFonts w:hint="default"/>
+        </w:rPr>
+        <w:t xml:space="preserve"> that revenue growth depends more on maintaining sales of premium products than simply increasing the volume of low-priced items.</w:t>
+      </w:r>
+    </w:p>
+    <w:p>
+      <w:pPr>
+        <w:pStyle w:val="7"/>
+        <w:rPr>
+          <w:rFonts w:hint="default"/>
+        </w:rPr>
+      </w:pPr>
+      <w:r>
+        <w:rPr>
+          <w:rFonts w:hint="default"/>
+          <w:lang w:val="en-NZ"/>
+        </w:rPr>
+        <w:t>On the other hand</w:t>
+      </w:r>
+      <w:r>
+        <w:rPr>
+          <w:rFonts w:hint="default"/>
+        </w:rPr>
+        <w:t>, inexpensive accessories such as batteries and charging cables dominate total sales volume. These products generate frequent transactions and may serve as entry-point purchases</w:t>
+      </w:r>
+      <w:r>
+        <w:rPr>
+          <w:rFonts w:hint="default"/>
+          <w:lang w:val="en-NZ"/>
+        </w:rPr>
+        <w:t xml:space="preserve"> at the entrance or </w:t>
+      </w:r>
+      <w:r>
+        <w:rPr>
+          <w:rFonts w:hint="eastAsia"/>
+          <w:lang w:val="en-US" w:eastAsia="zh-CN"/>
+        </w:rPr>
+        <w:t>check-out display</w:t>
+      </w:r>
+      <w:r>
+        <w:rPr>
+          <w:rFonts w:hint="default"/>
+        </w:rPr>
+        <w:t xml:space="preserve"> that encourage customer engagement.</w:t>
+      </w:r>
+    </w:p>
+    <w:p>
+      <w:pPr>
+        <w:pStyle w:val="7"/>
+        <w:rPr>
+          <w:rFonts w:hint="default"/>
+        </w:rPr>
+      </w:pPr>
+      <w:r>
+        <w:rPr>
+          <w:rFonts w:hint="default"/>
+          <w:lang w:val="en-NZ" w:eastAsia="zh-CN"/>
+        </w:rPr>
+        <w:t>In terms of temporal patterns, c</w:t>
+      </w:r>
+      <w:r>
+        <w:rPr>
+          <w:rFonts w:hint="default"/>
+        </w:rPr>
+        <w:t>ustomer purchasing activity</w:t>
+      </w:r>
+      <w:r>
+        <w:rPr>
+          <w:rFonts w:hint="default"/>
+          <w:lang w:val="en-NZ"/>
+        </w:rPr>
+        <w:t xml:space="preserve"> </w:t>
+      </w:r>
+      <w:r>
+        <w:rPr>
+          <w:rFonts w:hint="default"/>
+        </w:rPr>
+        <w:t>follows a clear daily</w:t>
+      </w:r>
+      <w:r>
+        <w:rPr>
+          <w:rFonts w:hint="default"/>
+          <w:lang w:val="en-NZ"/>
+        </w:rPr>
+        <w:t xml:space="preserve"> trend</w:t>
+      </w:r>
+      <w:r>
+        <w:rPr>
+          <w:rFonts w:hint="default"/>
+        </w:rPr>
+        <w:t>, with order volumes peaking during the evening. This information could assist businesses in scheduling promotional campaigns, customer support resources, and inventory replenishment more effectively.</w:t>
+      </w:r>
+    </w:p>
+    <w:p>
+      <w:pPr>
+        <w:pStyle w:val="7"/>
+        <w:rPr>
+          <w:rFonts w:hint="default"/>
+        </w:rPr>
+      </w:pPr>
+      <w:r>
+        <w:rPr>
+          <w:rFonts w:hint="default"/>
+          <w:lang w:val="en-NZ"/>
+        </w:rPr>
+        <w:t>In product dimension, t</w:t>
+      </w:r>
+      <w:r>
+        <w:rPr>
+          <w:rFonts w:hint="default"/>
+        </w:rPr>
+        <w:t xml:space="preserve">he association rule analysis further </w:t>
+      </w:r>
+      <w:r>
+        <w:rPr>
+          <w:rFonts w:hint="default"/>
+          <w:lang w:val="en-NZ"/>
+        </w:rPr>
+        <w:t xml:space="preserve">revealed </w:t>
+      </w:r>
+      <w:r>
+        <w:rPr>
+          <w:rFonts w:hint="default"/>
+        </w:rPr>
+        <w:t>that smartphones are frequently purchased together with compatible charging accessories. This confirms the existence of complementary purchasing behaviour and provides opportunities for product bundling and cross-selling strategies.</w:t>
+      </w:r>
+    </w:p>
+    <w:p>
+      <w:pPr>
+        <w:pStyle w:val="7"/>
+        <w:rPr>
+          <w:rFonts w:hint="default"/>
+          <w:lang w:val="en-NZ"/>
+        </w:rPr>
+      </w:pPr>
+      <w:r>
+        <w:rPr>
+          <w:rFonts w:hint="default"/>
+          <w:lang w:val="en-NZ"/>
+        </w:rPr>
+        <w:t>Based on the findings above, it is recommended for business to prioritise inventory management for premium products, as stock shortages of these items would have a critical impact on total revenue; bundle promotions pairing smartphones with compatible charging accessories could increase average transaction value while improving customer convenience; marketing campaigns could be scheduled during peak purchasing periods to maximise customer reach and conversion rates; for companies with sufficient computational investment, it is also suggested that machine learning could be an effective decision-support tool to help predict revenue and plan on inventory management.</w:t>
+      </w:r>
+    </w:p>
+    <w:p>
+      <w:pPr>
+        <w:pStyle w:val="7"/>
+        <w:rPr>
+          <w:rFonts w:hint="default"/>
+          <w:lang w:val="en-NZ"/>
+        </w:rPr>
+      </w:pPr>
+      <w:r>
+        <w:rPr>
+          <w:rFonts w:hint="default"/>
+          <w:lang w:val="en-NZ"/>
+        </w:rPr>
+        <w:t>Overall, the findings demonstrate how combining descriptive analytics, association rule mining, and predictive modelling provides complementary perspectives that support both operational decision-making and long-term business planning.</w:t>
+      </w:r>
+    </w:p>
+    <w:p>
+      <w:pPr>
+        <w:pStyle w:val="2"/>
+      </w:pPr>
+      <w:r>
+        <w:rPr>
+          <w:rFonts w:hint="eastAsia"/>
+          <w:lang w:val="en-US" w:eastAsia="zh-CN"/>
+        </w:rPr>
+        <w:t>Conclusion</w:t>
+      </w:r>
+    </w:p>
+    <w:p>
+      <w:pPr>
+        <w:pStyle w:val="7"/>
+        <w:rPr>
+          <w:rFonts w:hint="default"/>
+        </w:rPr>
+      </w:pPr>
+      <w:r>
+        <w:rPr>
+          <w:rFonts w:hint="default"/>
+        </w:rPr>
+        <w:t>This study analysed a retail sales dataset using exploratory data analysis, statistical analysis, association rule mining, and supervised machine learning techniques to investigate customer purchasing behaviour and predict sales revenue. The analysis identified clear temporal sales patterns, differences in product performance, and meaningful co-purchasing relationships. Among the three predictive models evaluated, XGBoost achieved the best overall performance, demonstrating excellent predictive accuracy while maintaining reasonable computational efficiency.</w:t>
+      </w:r>
+    </w:p>
+    <w:p>
+      <w:pPr>
+        <w:pStyle w:val="7"/>
+        <w:rPr>
+          <w:rFonts w:hint="default"/>
+        </w:rPr>
+      </w:pPr>
+      <w:r>
+        <w:rPr>
+          <w:rFonts w:hint="default"/>
+        </w:rPr>
+        <w:t>The findings suggest that combining descriptive analytics with predictive modelling provides valuable support for business decision-making. Exploratory analysis and market basket analysis revealed insights into customer behaviour that can inform inventory management, marketing strategies, and cross-selling opportunities, while the machine learning models demonstrated the potential to accurately forecast sales using transaction-level information.</w:t>
+      </w:r>
+    </w:p>
+    <w:p>
+      <w:pPr>
+        <w:pStyle w:val="7"/>
+        <w:rPr>
+          <w:rFonts w:hint="default"/>
+        </w:rPr>
+      </w:pPr>
+      <w:r>
+        <w:rPr>
+          <w:rFonts w:hint="default"/>
+        </w:rPr>
+        <w:t>Several limitations should also be acknowledged. The dataset contains only one year of historical transactions and does not include external factors such as promotions, seasonality across multiple years, customer demographics, or competitor activities that may influence purchasing behaviour. Furthermore, because each product is associated with a fixed selling price in this dataset, product identity becomes the dominant predictor of sales revenue, limiting the generalisability of the predictive models. Future work could incorporate additional years of data, customer-level information, promotional events, and dynamic pricing variables to develop more robust forecasting models and further improve business insights.</w:t>
+      </w:r>
+    </w:p>
+    <w:p>
+      <w:pPr>
+        <w:pStyle w:val="7"/>
+        <w:rPr>
+          <w:rFonts w:hint="default"/>
+        </w:rPr>
+      </w:pPr>
+      <w:r>
+        <w:rPr>
+          <w:rFonts w:hint="default"/>
+        </w:rPr>
+        <w:t>Overall, this project demonstrates how integrating data exploration, association rule mining, and machine learning can transform retail transaction data into actionable business knowledge, supporting more informed operational and strategic decision-making.</w:t>
+      </w:r>
+    </w:p>
+    <w:p>
+      <w:pPr>
+        <w:pStyle w:val="6"/>
+        <w:rPr>
+          <w:rFonts w:hint="default"/>
+          <w:lang w:val="en-NZ"/>
+        </w:rPr>
+      </w:pPr>
     </w:p>
     <w:p>
       <w:pPr>
@@ -10914,8 +13508,8 @@
     <w:lsdException w:unhideWhenUsed="0" w:uiPriority="0" w:semiHidden="0" w:name="Normal Indent"/>
     <w:lsdException w:unhideWhenUsed="0" w:uiPriority="0" w:semiHidden="0" w:name="footnote text"/>
     <w:lsdException w:unhideWhenUsed="0" w:uiPriority="0" w:semiHidden="0" w:name="annotation text"/>
-    <w:lsdException w:unhideWhenUsed="0" w:uiPriority="0" w:semiHidden="0" w:name="header"/>
-    <w:lsdException w:unhideWhenUsed="0" w:uiPriority="0" w:semiHidden="0" w:name="footer"/>
+    <w:lsdException w:qFormat="1" w:unhideWhenUsed="0" w:uiPriority="0" w:semiHidden="0" w:name="header"/>
+    <w:lsdException w:qFormat="1" w:unhideWhenUsed="0" w:uiPriority="0" w:semiHidden="0" w:name="footer"/>
     <w:lsdException w:unhideWhenUsed="0" w:uiPriority="0" w:semiHidden="0" w:name="index heading"/>
     <w:lsdException w:qFormat="1" w:uiPriority="0" w:name="caption"/>
     <w:lsdException w:unhideWhenUsed="0" w:uiPriority="0" w:semiHidden="0" w:name="table of figures"/>
@@ -11301,6 +13895,7 @@
     <w:name w:val="footer"/>
     <w:basedOn w:val="1"/>
     <w:link w:val="33"/>
+    <w:qFormat/>
     <w:uiPriority w:val="0"/>
     <w:pPr>
       <w:tabs>
@@ -11313,6 +13908,7 @@
     <w:name w:val="header"/>
     <w:basedOn w:val="1"/>
     <w:link w:val="32"/>
+    <w:qFormat/>
     <w:uiPriority w:val="0"/>
     <w:pPr>
       <w:tabs>

</xml_diff>

<commit_message>
added reference; refined plot settings
</commit_message>
<xml_diff>
--- a/Part3/Report_JingshuTang.docx
+++ b/Part3/Report_JingshuTang.docx
@@ -14,39 +14,8 @@
         <w:rPr>
           <w:kern w:val="48"/>
         </w:rPr>
-        <w:t xml:space="preserve">Paper Title* (use style: </w:t>
-      </w:r>
-      <w:r>
-        <w:rPr>
-          <w:iCs/>
-          <w:kern w:val="48"/>
-        </w:rPr>
-        <w:t>paper title</w:t>
-      </w:r>
-      <w:r>
-        <w:rPr>
-          <w:kern w:val="48"/>
-        </w:rPr>
-        <w:t>)</w:t>
-      </w:r>
-    </w:p>
-    <w:p>
-      <w:pPr>
-        <w:pStyle w:val="16"/>
-        <w:spacing w:before="100" w:beforeAutospacing="1" w:after="100" w:afterAutospacing="1" w:line="120" w:lineRule="auto"/>
-        <w:rPr>
-          <w:sz w:val="16"/>
-          <w:szCs w:val="16"/>
-        </w:rPr>
-        <w:sectPr>
-          <w:footerReference r:id="rId3" w:type="first"/>
-          <w:pgSz w:w="11906" w:h="16838"/>
-          <w:pgMar w:top="540" w:right="893" w:bottom="1440" w:left="893" w:header="720" w:footer="720" w:gutter="0"/>
-          <w:cols w:space="720" w:num="1"/>
-          <w:titlePg/>
-          <w:docGrid w:linePitch="360" w:charSpace="0"/>
-        </w:sectPr>
-      </w:pPr>
+        <w:t>Retail Sales Analytics Using Exploratory Data Analysis, Association Rule Mining, and Machine Learning</w:t>
+      </w:r>
     </w:p>
     <w:p>
       <w:pPr>
@@ -157,8 +126,6 @@
         </w:rPr>
         <w:t>Retail sales transaction data provides valuable insights into customer purchasing behaviour and supports data-driven business decision-making. This study analyses a retail sales dataset containing 185,950 transactions recorded throughout 2019 to investigate sales patterns, identify frequently co-purchased products, and evaluate machine learning models for sales prediction. The analysis combines exploratory data analysis, Pearson correlation analysis, association rule mining using the Apriori algorithm, and three supervised machine learning models, including Linear Regression, Random Forest, and Extreme Gradient Boosting (XGBoost). Exploratory analysis revealed clear temporal purchasing patterns, substantial differences between sales volume and revenue contribution across products, and a negative relationship between product price and purchase frequency. Association rule mining identified strong purchasing relationships between smartphones and their compatible charging accessories, highlighting potential cross-selling opportunities. Among the predictive models evaluated, XGBoost achieved the best overall performance by providing the lowest prediction error while maintaining high computational efficiency. Feature importance analysis further demonstrated that product-related variables were the dominant predictors of sales revenue. Overall, the findings illustrate how integrating descriptive analytics, market basket analysis, and machine learning can transform retail transaction data into actionable business insights for inventory management, product recommendation, marketing strategy, and sales forecasting.</w:t>
       </w:r>
-      <w:bookmarkStart w:id="0" w:name="_GoBack"/>
-      <w:bookmarkEnd w:id="0"/>
     </w:p>
     <w:p>
       <w:pPr>
@@ -220,7 +187,33 @@
         <w:rPr>
           <w:rFonts w:hint="default"/>
         </w:rPr>
-        <w:t xml:space="preserve"> critical insights related to the consumer behavior, product sales, and company’s operation. Analyzing historical sales data allows organizations to learn about consumer behavior, discover demands of consumers, and make data-driven business decisions. Apart from the descriptive analysis, machine learning methods help businesses predict sales results in the future, and the market basket analysis allows companies to learn which products are often purchased together and apply cross-selling strategies.</w:t>
+        <w:t xml:space="preserve"> critical insights related to the product sales, consumer behavior</w:t>
+      </w:r>
+      <w:r>
+        <w:rPr>
+          <w:rFonts w:hint="eastAsia"/>
+          <w:lang w:val="en-US" w:eastAsia="zh-CN"/>
+        </w:rPr>
+        <w:t xml:space="preserve"> </w:t>
+      </w:r>
+      <w:r>
+        <w:rPr>
+          <w:rFonts w:hint="default"/>
+        </w:rPr>
+        <w:t>and company’s operation. Analyzing historical sales data allows organizations to learn about consumer behavior, discover demands of consumers, and make data-driven business decisions. Apart from the descriptive analysis, machine learning methods help businesses predict sales results in the future</w:t>
+      </w:r>
+      <w:r>
+        <w:rPr>
+          <w:rFonts w:hint="eastAsia"/>
+          <w:lang w:val="en-US" w:eastAsia="zh-CN"/>
+        </w:rPr>
+        <w:t xml:space="preserve"> [1]</w:t>
+      </w:r>
+      <w:r>
+        <w:rPr>
+          <w:rFonts w:hint="default"/>
+        </w:rPr>
+        <w:t>, and the market basket analysis allows companies to learn which products are often purchased together and apply cross-selling strategies.</w:t>
       </w:r>
     </w:p>
     <w:p>
@@ -356,7 +349,48 @@
         <w:rPr>
           <w:rFonts w:hint="default"/>
         </w:rPr>
-        <w:t>The dataset consists of 185,950 records of retail sales transactions for 2019. Each record refers to one sale, and it comprises details on the product, the quantity sold, the unit price, time of sale, revenue earned from the sale, purchase location, and the order ID.</w:t>
+        <w:t xml:space="preserve">The dataset consists of </w:t>
+      </w:r>
+      <w:r>
+        <w:rPr>
+          <w:rFonts w:hint="default"/>
+          <w:b/>
+          <w:bCs/>
+        </w:rPr>
+        <w:t xml:space="preserve">185,950 records </w:t>
+      </w:r>
+      <w:r>
+        <w:rPr>
+          <w:rFonts w:hint="default"/>
+        </w:rPr>
+        <w:t xml:space="preserve">of retail sales transactions for </w:t>
+      </w:r>
+      <w:r>
+        <w:rPr>
+          <w:rFonts w:hint="default"/>
+          <w:b/>
+          <w:bCs/>
+        </w:rPr>
+        <w:t>2019</w:t>
+      </w:r>
+      <w:r>
+        <w:rPr>
+          <w:rFonts w:hint="default"/>
+        </w:rPr>
+        <w:t xml:space="preserve">. Each record refers to one sale, and it comprises details on the product, the quantity sold, the unit price, time of sale, </w:t>
+      </w:r>
+      <w:r>
+        <w:rPr>
+          <w:rFonts w:hint="eastAsia"/>
+          <w:lang w:val="en-US" w:eastAsia="zh-CN"/>
+        </w:rPr>
+        <w:t>sales revenue</w:t>
+      </w:r>
+      <w:r>
+        <w:rPr>
+          <w:rFonts w:hint="default"/>
+        </w:rPr>
+        <w:t>, purchase location, and the order ID.</w:t>
       </w:r>
       <w:r>
         <w:rPr>
@@ -1624,14 +1658,31 @@
         <w:rPr>
           <w:rFonts w:hint="default"/>
         </w:rPr>
-        <w:t xml:space="preserve"> and there were no missing values</w:t>
-      </w:r>
-      <w:r>
-        <w:rPr>
-          <w:rFonts w:hint="default"/>
-          <w:lang w:val="en-NZ"/>
-        </w:rPr>
-        <w:t xml:space="preserve"> and duplicated records discovered.</w:t>
+        <w:t xml:space="preserve"> and there were </w:t>
+      </w:r>
+      <w:r>
+        <w:rPr>
+          <w:rFonts w:hint="default"/>
+          <w:b/>
+          <w:bCs/>
+        </w:rPr>
+        <w:t>no missing values</w:t>
+      </w:r>
+      <w:r>
+        <w:rPr>
+          <w:rFonts w:hint="default"/>
+          <w:b/>
+          <w:bCs/>
+          <w:lang w:val="en-NZ"/>
+        </w:rPr>
+        <w:t xml:space="preserve"> and duplicated records</w:t>
+      </w:r>
+      <w:r>
+        <w:rPr>
+          <w:rFonts w:hint="default"/>
+          <w:lang w:val="en-NZ"/>
+        </w:rPr>
+        <w:t xml:space="preserve"> discovered.</w:t>
       </w:r>
     </w:p>
     <w:p>
@@ -1914,7 +1965,7 @@
           <w:rFonts w:hint="default"/>
           <w:lang w:val="en-NZ" w:eastAsia="zh-CN"/>
         </w:rPr>
-        <w:t xml:space="preserve"> was removed to before model training </w:t>
+        <w:t xml:space="preserve"> was removed before model training </w:t>
       </w:r>
       <w:r>
         <w:rPr>
@@ -2006,21 +2057,28 @@
           <w:rFonts w:hint="default"/>
           <w:lang w:val="en-NZ"/>
         </w:rPr>
-        <w:t xml:space="preserve"> using one-hot encoding</w:t>
+        <w:t xml:space="preserve"> using </w:t>
       </w:r>
       <w:r>
         <w:rPr>
           <w:rFonts w:hint="eastAsia"/>
           <w:lang w:val="en-US" w:eastAsia="zh-CN"/>
         </w:rPr>
-        <w:t xml:space="preserve"> technique</w:t>
-      </w:r>
-      <w:r>
-        <w:rPr>
-          <w:rFonts w:hint="default"/>
-          <w:lang w:val="en-NZ"/>
-        </w:rPr>
-        <w:t>.</w:t>
+        <w:t>dummy</w:t>
+      </w:r>
+      <w:r>
+        <w:rPr>
+          <w:rFonts w:hint="default"/>
+          <w:lang w:val="en-NZ"/>
+        </w:rPr>
+        <w:t xml:space="preserve"> encoding</w:t>
+      </w:r>
+      <w:r>
+        <w:rPr>
+          <w:rFonts w:hint="eastAsia"/>
+          <w:lang w:val="en-US" w:eastAsia="zh-CN"/>
+        </w:rPr>
+        <w:t xml:space="preserve"> technique [2].</w:t>
       </w:r>
     </w:p>
     <w:p>
@@ -2096,7 +2154,7 @@
           <w:rFonts w:hint="eastAsia"/>
           <w:lang w:val="en-US" w:eastAsia="zh-CN"/>
         </w:rPr>
-        <w:t xml:space="preserve"> Tree-based models (Random Forest and XGBoost) were trained using the original feature scales, as standardisation is not required for these algorithms.</w:t>
+        <w:t xml:space="preserve"> Tree-based models (Random Forest and XGBoost) were trained using the original feature scales, as standardisation is not required for these algorithms [3].</w:t>
       </w:r>
     </w:p>
     <w:p>
@@ -2146,17 +2204,41 @@
         <w:pStyle w:val="7"/>
         <w:rPr>
           <w:rFonts w:hint="default"/>
-          <w:highlight w:val="yellow"/>
-          <w:lang w:val="en-NZ"/>
-        </w:rPr>
-      </w:pPr>
-      <w:r>
-        <w:rPr>
-          <w:rFonts w:hint="default"/>
-          <w:highlight w:val="yellow"/>
-          <w:lang w:val="en-NZ"/>
-        </w:rPr>
-        <w:t xml:space="preserve">An overview on data distribution </w:t>
+          <w:highlight w:val="none"/>
+          <w:lang w:val="en-NZ"/>
+        </w:rPr>
+      </w:pPr>
+      <w:r>
+        <w:rPr>
+          <w:rFonts w:hint="default"/>
+          <w:highlight w:val="none"/>
+          <w:lang w:val="en-NZ" w:eastAsia="zh-CN"/>
+        </w:rPr>
+        <w:t>In order t</w:t>
+      </w:r>
+      <w:r>
+        <w:rPr>
+          <w:rFonts w:hint="eastAsia"/>
+          <w:highlight w:val="none"/>
+          <w:lang w:val="en-US" w:eastAsia="zh-CN"/>
+        </w:rPr>
+        <w:t>o</w:t>
+      </w:r>
+      <w:r>
+        <w:rPr>
+          <w:rFonts w:hint="default"/>
+          <w:highlight w:val="none"/>
+          <w:lang w:val="en-NZ" w:eastAsia="zh-CN"/>
+        </w:rPr>
+        <w:t xml:space="preserve"> have an overview and better understanding on key sales patterns and customer purchasing behaviors, </w:t>
+      </w:r>
+      <w:r>
+        <w:rPr>
+          <w:rFonts w:hint="default"/>
+          <w:highlight w:val="none"/>
+          <w:lang w:val="en-NZ"/>
+        </w:rPr>
+        <w:t>the retail sales dataset was explored by exploratory data analysis (EDA) and statistical analysis. Visualisations and summary statistics are first used to examine data distributions, temporal sales trends, product performance, and the relationship between product price and purchase frequency. Pearson correlation analysis is then conducted to quantify relationships among numerical variables and support feature selection for the subsequent machine learning models. Together, these analyses provide both descriptive insights into historical sales performance and a statistical foundation for the market basket analysis and predictive modelling presented in the following sections.</w:t>
       </w:r>
     </w:p>
     <w:p>
@@ -2184,7 +2266,7 @@
           <w:rFonts w:hint="default"/>
           <w:lang w:val="en-NZ"/>
         </w:rPr>
-        <w:t xml:space="preserve">An overview on distribution and statistics of the numeric variables of the dataset was investigated by boxplots and statistical description.  </w:t>
+        <w:t xml:space="preserve">An overview on distribution and statistics of the numeric variables of the dataset was investigated by boxplots and statistical description. </w:t>
       </w:r>
       <w:r>
         <w:rPr>
@@ -2257,7 +2339,21 @@
           <w:rFonts w:hint="default"/>
           <w:lang w:val="en-NZ"/>
         </w:rPr>
-        <w:t xml:space="preserve"> are severely right skewed according to Fig. 1, while </w:t>
+        <w:t xml:space="preserve"> </w:t>
+      </w:r>
+      <w:r>
+        <w:rPr>
+          <w:rFonts w:hint="eastAsia"/>
+          <w:lang w:val="en-US" w:eastAsia="zh-CN"/>
+        </w:rPr>
+        <w:t>are</w:t>
+      </w:r>
+      <w:r>
+        <w:rPr>
+          <w:rFonts w:hint="default"/>
+          <w:lang w:val="en-NZ"/>
+        </w:rPr>
+        <w:t xml:space="preserve"> severely right skewed according to Fig. 1, while </w:t>
       </w:r>
       <w:r>
         <w:rPr>
@@ -2273,11 +2369,13 @@
           <w:rFonts w:hint="default"/>
           <w:lang w:val="en-NZ"/>
         </w:rPr>
-        <w:t xml:space="preserve"> mainly concentrated at 1. </w:t>
+        <w:t xml:space="preserve"> mainly concentrate at 1. </w:t>
       </w:r>
       <w:r>
         <w:rPr>
           <w:rFonts w:hint="eastAsia"/>
+          <w:b/>
+          <w:bCs/>
           <w:lang w:val="en-US" w:eastAsia="zh-CN"/>
         </w:rPr>
         <w:t>This means most customers purchase single product per order at lower prices.</w:t>
@@ -2286,31 +2384,6 @@
     <w:p>
       <w:pPr>
         <w:pStyle w:val="20"/>
-      </w:pPr>
-      <w:r>
-        <w:rPr>
-          <w:rFonts w:hint="default"/>
-          <w:lang w:val="en-NZ"/>
-        </w:rPr>
-        <w:t>Boxplots</w:t>
-      </w:r>
-      <w:r>
-        <w:rPr>
-          <w:rFonts w:hint="eastAsia"/>
-          <w:iCs/>
-          <w:lang w:val="en-US" w:eastAsia="zh-CN"/>
-        </w:rPr>
-        <w:t xml:space="preserve"> of Numerical Features in the Dataset</w:t>
-      </w:r>
-    </w:p>
-    <w:p>
-      <w:pPr>
-        <w:pStyle w:val="7"/>
-        <w:ind w:left="0" w:leftChars="0" w:firstLine="0" w:firstLineChars="0"/>
-        <w:rPr>
-          <w:rFonts w:hint="default"/>
-          <w:lang w:val="en-NZ"/>
-        </w:rPr>
       </w:pPr>
       <w:r>
         <w:rPr>
@@ -2320,13 +2393,13 @@
         <mc:AlternateContent>
           <mc:Choice Requires="wps">
             <w:drawing>
-              <wp:anchor distT="0" distB="0" distL="114300" distR="114300" simplePos="0" relativeHeight="251660288" behindDoc="1" locked="0" layoutInCell="1" allowOverlap="1">
+              <wp:anchor distT="0" distB="0" distL="114300" distR="114300" simplePos="0" relativeHeight="251659264" behindDoc="1" locked="0" layoutInCell="1" allowOverlap="1">
                 <wp:simplePos x="0" y="0"/>
                 <wp:positionH relativeFrom="margin">
-                  <wp:posOffset>-128270</wp:posOffset>
+                  <wp:posOffset>-121920</wp:posOffset>
                 </wp:positionH>
                 <wp:positionV relativeFrom="paragraph">
-                  <wp:posOffset>3175</wp:posOffset>
+                  <wp:posOffset>188595</wp:posOffset>
                 </wp:positionV>
                 <wp:extent cx="3265805" cy="1299845"/>
                 <wp:effectExtent l="0" t="0" r="3175" b="4445"/>
@@ -2393,9 +2466,9 @@
                               </w:rPr>
                               <w:drawing>
                                 <wp:inline distT="0" distB="0" distL="114300" distR="114300">
-                                  <wp:extent cx="3105150" cy="1177290"/>
-                                  <wp:effectExtent l="9525" t="9525" r="13970" b="10160"/>
-                                  <wp:docPr id="9" name="图片 9" descr="Figure1_Boxplots of Numerical Features             in the Dataset"/>
+                                  <wp:extent cx="2886710" cy="1171575"/>
+                                  <wp:effectExtent l="9525" t="9525" r="9525" b="15875"/>
+                                  <wp:docPr id="6" name="图片 6" descr="Figure1_Boxplots of Numerical Features             in the Dataset"/>
                                   <wp:cNvGraphicFramePr>
                                     <a:graphicFrameLocks xmlns:a="http://schemas.openxmlformats.org/drawingml/2006/main" noChangeAspect="1"/>
                                   </wp:cNvGraphicFramePr>
@@ -2403,13 +2476,13 @@
                                     <a:graphicData uri="http://schemas.openxmlformats.org/drawingml/2006/picture">
                                       <pic:pic xmlns:pic="http://schemas.openxmlformats.org/drawingml/2006/picture">
                                         <pic:nvPicPr>
-                                          <pic:cNvPr id="9" name="图片 9" descr="Figure1_Boxplots of Numerical Features             in the Dataset"/>
+                                          <pic:cNvPr id="6" name="图片 6" descr="Figure1_Boxplots of Numerical Features             in the Dataset"/>
                                           <pic:cNvPicPr>
                                             <a:picLocks noChangeAspect="1"/>
                                           </pic:cNvPicPr>
                                         </pic:nvPicPr>
                                         <pic:blipFill>
-                                          <a:blip r:embed="rId5"/>
+                                          <a:blip r:embed="rId4"/>
                                           <a:stretch>
                                             <a:fillRect/>
                                           </a:stretch>
@@ -2417,7 +2490,7 @@
                                         <pic:spPr>
                                           <a:xfrm>
                                             <a:off x="0" y="0"/>
-                                            <a:ext cx="3105150" cy="1177290"/>
+                                            <a:ext cx="2886710" cy="1171575"/>
                                           </a:xfrm>
                                           <a:prstGeom prst="rect">
                                             <a:avLst/>
@@ -2451,7 +2524,7 @@
           </mc:Choice>
           <mc:Fallback>
             <w:pict>
-              <v:rect id="Text Box 8" o:spid="_x0000_s1026" o:spt="1" style="position:absolute;left:0pt;margin-left:-10.1pt;margin-top:0.25pt;height:102.35pt;width:257.15pt;mso-position-horizontal-relative:margin;mso-wrap-distance-left:9pt;mso-wrap-distance-right:9pt;z-index:-251656192;mso-width-relative:page;mso-height-relative:page;" fillcolor="#FFFFFF" filled="t" stroked="f" coordsize="21600,21600" wrapcoords="0 0 0 20988 21020 20988 21020 0 0 0" o:gfxdata="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">
+              <v:rect id="Text Box 8" o:spid="_x0000_s1026" o:spt="1" style="position:absolute;left:0pt;margin-left:-9.6pt;margin-top:14.85pt;height:102.35pt;width:257.15pt;mso-position-horizontal-relative:margin;mso-wrap-distance-left:9pt;mso-wrap-distance-right:9pt;z-index:-251657216;mso-width-relative:page;mso-height-relative:page;" fillcolor="#FFFFFF" filled="t" stroked="f" coordsize="21600,21600" wrapcoords="0 0 0 20988 21020 20988 21020 0 0 0" o:gfxdata="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">
                 <v:fill on="t" focussize="0,0"/>
                 <v:stroke on="f" miterlimit="8" joinstyle="miter"/>
                 <v:imagedata o:title=""/>
@@ -2486,9 +2559,9 @@
                         </w:rPr>
                         <w:drawing>
                           <wp:inline distT="0" distB="0" distL="114300" distR="114300">
-                            <wp:extent cx="3105150" cy="1177290"/>
-                            <wp:effectExtent l="9525" t="9525" r="13970" b="10160"/>
-                            <wp:docPr id="9" name="图片 9" descr="Figure1_Boxplots of Numerical Features             in the Dataset"/>
+                            <wp:extent cx="2886710" cy="1171575"/>
+                            <wp:effectExtent l="9525" t="9525" r="9525" b="15875"/>
+                            <wp:docPr id="6" name="图片 6" descr="Figure1_Boxplots of Numerical Features             in the Dataset"/>
                             <wp:cNvGraphicFramePr>
                               <a:graphicFrameLocks xmlns:a="http://schemas.openxmlformats.org/drawingml/2006/main" noChangeAspect="1"/>
                             </wp:cNvGraphicFramePr>
@@ -2496,13 +2569,13 @@
                               <a:graphicData uri="http://schemas.openxmlformats.org/drawingml/2006/picture">
                                 <pic:pic xmlns:pic="http://schemas.openxmlformats.org/drawingml/2006/picture">
                                   <pic:nvPicPr>
-                                    <pic:cNvPr id="9" name="图片 9" descr="Figure1_Boxplots of Numerical Features             in the Dataset"/>
+                                    <pic:cNvPr id="6" name="图片 6" descr="Figure1_Boxplots of Numerical Features             in the Dataset"/>
                                     <pic:cNvPicPr>
                                       <a:picLocks noChangeAspect="1"/>
                                     </pic:cNvPicPr>
                                   </pic:nvPicPr>
                                   <pic:blipFill>
-                                    <a:blip r:embed="rId5"/>
+                                    <a:blip r:embed="rId4"/>
                                     <a:stretch>
                                       <a:fillRect/>
                                     </a:stretch>
@@ -2510,7 +2583,7 @@
                                   <pic:spPr>
                                     <a:xfrm>
                                       <a:off x="0" y="0"/>
-                                      <a:ext cx="3105150" cy="1177290"/>
+                                      <a:ext cx="2886710" cy="1171575"/>
                                     </a:xfrm>
                                     <a:prstGeom prst="rect">
                                       <a:avLst/>
@@ -2539,6 +2612,30 @@
           </mc:Fallback>
         </mc:AlternateContent>
       </w:r>
+      <w:r>
+        <w:rPr>
+          <w:rFonts w:hint="default"/>
+          <w:lang w:val="en-NZ"/>
+        </w:rPr>
+        <w:t>Boxplots</w:t>
+      </w:r>
+      <w:r>
+        <w:rPr>
+          <w:rFonts w:hint="eastAsia"/>
+          <w:iCs/>
+          <w:lang w:val="en-US" w:eastAsia="zh-CN"/>
+        </w:rPr>
+        <w:t xml:space="preserve"> of Numerical Features in the Dataset</w:t>
+      </w:r>
+    </w:p>
+    <w:p>
+      <w:pPr>
+        <w:pStyle w:val="7"/>
+        <w:rPr>
+          <w:rFonts w:hint="default"/>
+          <w:lang w:val="en-NZ"/>
+        </w:rPr>
+      </w:pPr>
       <w:r>
         <w:rPr>
           <w:rFonts w:hint="eastAsia"/>
@@ -3707,18 +3804,106 @@
       <w:r>
         <w:rPr>
           <w:rFonts w:hint="default"/>
+          <w:lang w:val="en-NZ"/>
+        </w:rPr>
+        <w:t xml:space="preserve">Monthly revenue: </w:t>
+      </w:r>
+      <w:r>
+        <w:rPr>
+          <w:rFonts w:hint="default"/>
+        </w:rPr>
+        <w:t>Fig</w:t>
+      </w:r>
+      <w:r>
+        <w:rPr>
+          <w:rFonts w:hint="default"/>
+          <w:lang w:val="en-NZ" w:eastAsia="zh-CN"/>
+        </w:rPr>
+        <w:t>. 2</w:t>
+      </w:r>
+      <w:r>
+        <w:rPr>
+          <w:rFonts w:hint="default"/>
+        </w:rPr>
+        <w:t xml:space="preserve"> </w:t>
+      </w:r>
+      <w:r>
+        <w:rPr>
+          <w:rFonts w:hint="default"/>
+          <w:lang w:val="en-NZ"/>
+        </w:rPr>
+        <w:t>indicates</w:t>
+      </w:r>
+      <w:r>
+        <w:rPr>
+          <w:rFonts w:hint="default"/>
+        </w:rPr>
+        <w:t xml:space="preserve"> that sales revenue </w:t>
+      </w:r>
+      <w:r>
+        <w:rPr>
+          <w:rFonts w:hint="default"/>
+          <w:lang w:val="en-NZ"/>
+        </w:rPr>
+        <w:t xml:space="preserve">fluctuated across </w:t>
+      </w:r>
+      <w:r>
+        <w:rPr>
+          <w:rFonts w:hint="default"/>
+        </w:rPr>
+        <w:t>the year, with</w:t>
+      </w:r>
+      <w:r>
+        <w:rPr>
+          <w:rFonts w:hint="default"/>
+          <w:b/>
+          <w:bCs/>
+        </w:rPr>
+        <w:t xml:space="preserve"> December generating the highest </w:t>
+      </w:r>
+      <w:r>
+        <w:rPr>
+          <w:rFonts w:hint="default"/>
+          <w:b/>
+          <w:bCs/>
+          <w:lang w:val="en-NZ"/>
+        </w:rPr>
+        <w:t xml:space="preserve">sales </w:t>
+      </w:r>
+      <w:r>
+        <w:rPr>
+          <w:rFonts w:hint="default"/>
+          <w:b/>
+          <w:bCs/>
+        </w:rPr>
+        <w:t>(USD 4.61 million)</w:t>
+      </w:r>
+      <w:r>
+        <w:rPr>
+          <w:rFonts w:hint="default"/>
+        </w:rPr>
+        <w:t>.</w:t>
+      </w:r>
+    </w:p>
+    <w:p>
+      <w:pPr>
+        <w:pStyle w:val="20"/>
+      </w:pPr>
+      <w:r>
+        <w:rPr>
+          <w:rFonts w:hint="default"/>
           <w:lang w:val="en-US"/>
         </w:rPr>
         <mc:AlternateContent>
           <mc:Choice Requires="wps">
             <w:drawing>
-              <wp:anchor distT="0" distB="0" distL="114300" distR="114300" simplePos="0" relativeHeight="251661312" behindDoc="1" locked="0" layoutInCell="1" allowOverlap="1">
+              <wp:anchor distT="0" distB="0" distL="114300" distR="114300" simplePos="0" relativeHeight="251660288" behindDoc="1" locked="0" layoutInCell="1" allowOverlap="1">
                 <wp:simplePos x="0" y="0"/>
                 <wp:positionH relativeFrom="margin">
-                  <wp:posOffset>-74295</wp:posOffset>
+                  <wp:posOffset>3308985</wp:posOffset>
                 </wp:positionH>
                 <wp:positionV relativeFrom="paragraph">
-                  <wp:posOffset>640080</wp:posOffset>
+                  <wp:posOffset>213995</wp:posOffset>
                 </wp:positionV>
                 <wp:extent cx="3265805" cy="1299845"/>
                 <wp:effectExtent l="0" t="0" r="3175" b="4445"/>
@@ -3787,7 +3972,7 @@
                                 <wp:inline distT="0" distB="0" distL="114300" distR="114300">
                                   <wp:extent cx="3067685" cy="1137920"/>
                                   <wp:effectExtent l="9525" t="9525" r="10160" b="16510"/>
-                                  <wp:docPr id="16" name="图片 16" descr="Figure2_Monthly Sales"/>
+                                  <wp:docPr id="8" name="图片 8" descr="Figure2_Monthly Sales"/>
                                   <wp:cNvGraphicFramePr>
                                     <a:graphicFrameLocks xmlns:a="http://schemas.openxmlformats.org/drawingml/2006/main" noChangeAspect="1"/>
                                   </wp:cNvGraphicFramePr>
@@ -3795,13 +3980,13 @@
                                     <a:graphicData uri="http://schemas.openxmlformats.org/drawingml/2006/picture">
                                       <pic:pic xmlns:pic="http://schemas.openxmlformats.org/drawingml/2006/picture">
                                         <pic:nvPicPr>
-                                          <pic:cNvPr id="16" name="图片 16" descr="Figure2_Monthly Sales"/>
+                                          <pic:cNvPr id="8" name="图片 8" descr="Figure2_Monthly Sales"/>
                                           <pic:cNvPicPr>
                                             <a:picLocks noChangeAspect="1"/>
                                           </pic:cNvPicPr>
                                         </pic:nvPicPr>
                                         <pic:blipFill>
-                                          <a:blip r:embed="rId6"/>
+                                          <a:blip r:embed="rId5"/>
                                           <a:stretch>
                                             <a:fillRect/>
                                           </a:stretch>
@@ -3843,7 +4028,7 @@
           </mc:Choice>
           <mc:Fallback>
             <w:pict>
-              <v:rect id="Text Box 8" o:spid="_x0000_s1026" o:spt="1" style="position:absolute;left:0pt;margin-left:-5.85pt;margin-top:50.4pt;height:102.35pt;width:257.15pt;mso-position-horizontal-relative:margin;mso-wrap-distance-left:9pt;mso-wrap-distance-right:9pt;z-index:-251655168;mso-width-relative:page;mso-height-relative:page;" fillcolor="#FFFFFF" filled="t" stroked="f" coordsize="21600,21600" wrapcoords="0 0 0 20988 21020 20988 21020 0 0 0" o:gfxdata="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">
+              <v:rect id="Text Box 8" o:spid="_x0000_s1026" o:spt="1" style="position:absolute;left:0pt;margin-left:260.55pt;margin-top:16.85pt;height:102.35pt;width:257.15pt;mso-position-horizontal-relative:margin;mso-wrap-distance-left:9pt;mso-wrap-distance-right:9pt;z-index:-251656192;mso-width-relative:page;mso-height-relative:page;" fillcolor="#FFFFFF" filled="t" stroked="f" coordsize="21600,21600" wrapcoords="0 0 0 20988 21020 20988 21020 0 0 0" o:gfxdata="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">
                 <v:fill on="t" focussize="0,0"/>
                 <v:stroke on="f" miterlimit="8" joinstyle="miter"/>
                 <v:imagedata o:title=""/>
@@ -3880,7 +4065,7 @@
                           <wp:inline distT="0" distB="0" distL="114300" distR="114300">
                             <wp:extent cx="3067685" cy="1137920"/>
                             <wp:effectExtent l="9525" t="9525" r="10160" b="16510"/>
-                            <wp:docPr id="16" name="图片 16" descr="Figure2_Monthly Sales"/>
+                            <wp:docPr id="8" name="图片 8" descr="Figure2_Monthly Sales"/>
                             <wp:cNvGraphicFramePr>
                               <a:graphicFrameLocks xmlns:a="http://schemas.openxmlformats.org/drawingml/2006/main" noChangeAspect="1"/>
                             </wp:cNvGraphicFramePr>
@@ -3888,13 +4073,13 @@
                               <a:graphicData uri="http://schemas.openxmlformats.org/drawingml/2006/picture">
                                 <pic:pic xmlns:pic="http://schemas.openxmlformats.org/drawingml/2006/picture">
                                   <pic:nvPicPr>
-                                    <pic:cNvPr id="16" name="图片 16" descr="Figure2_Monthly Sales"/>
+                                    <pic:cNvPr id="8" name="图片 8" descr="Figure2_Monthly Sales"/>
                                     <pic:cNvPicPr>
                                       <a:picLocks noChangeAspect="1"/>
                                     </pic:cNvPicPr>
                                   </pic:nvPicPr>
                                   <pic:blipFill>
-                                    <a:blip r:embed="rId6"/>
+                                    <a:blip r:embed="rId5"/>
                                     <a:stretch>
                                       <a:fillRect/>
                                     </a:stretch>
@@ -3933,94 +4118,6 @@
       </w:r>
       <w:r>
         <w:rPr>
-          <w:rFonts w:hint="default"/>
-          <w:lang w:val="en-NZ"/>
-        </w:rPr>
-        <w:t xml:space="preserve">Monthly revenue: </w:t>
-      </w:r>
-      <w:r>
-        <w:rPr>
-          <w:rFonts w:hint="default"/>
-        </w:rPr>
-        <w:t>Fig</w:t>
-      </w:r>
-      <w:r>
-        <w:rPr>
-          <w:rFonts w:hint="default"/>
-          <w:lang w:val="en-NZ" w:eastAsia="zh-CN"/>
-        </w:rPr>
-        <w:t>. 2</w:t>
-      </w:r>
-      <w:r>
-        <w:rPr>
-          <w:rFonts w:hint="default"/>
-        </w:rPr>
-        <w:t xml:space="preserve"> </w:t>
-      </w:r>
-      <w:r>
-        <w:rPr>
-          <w:rFonts w:hint="default"/>
-          <w:lang w:val="en-NZ"/>
-        </w:rPr>
-        <w:t>indicates</w:t>
-      </w:r>
-      <w:r>
-        <w:rPr>
-          <w:rFonts w:hint="default"/>
-        </w:rPr>
-        <w:t xml:space="preserve"> that sales revenue </w:t>
-      </w:r>
-      <w:r>
-        <w:rPr>
-          <w:rFonts w:hint="default"/>
-          <w:lang w:val="en-NZ"/>
-        </w:rPr>
-        <w:t xml:space="preserve">fluctuated across </w:t>
-      </w:r>
-      <w:r>
-        <w:rPr>
-          <w:rFonts w:hint="default"/>
-        </w:rPr>
-        <w:t>the year, with</w:t>
-      </w:r>
-      <w:r>
-        <w:rPr>
-          <w:rFonts w:hint="default"/>
-          <w:b/>
-          <w:bCs/>
-        </w:rPr>
-        <w:t xml:space="preserve"> December generating the highest </w:t>
-      </w:r>
-      <w:r>
-        <w:rPr>
-          <w:rFonts w:hint="default"/>
-          <w:b/>
-          <w:bCs/>
-          <w:lang w:val="en-NZ"/>
-        </w:rPr>
-        <w:t xml:space="preserve">sales </w:t>
-      </w:r>
-      <w:r>
-        <w:rPr>
-          <w:rFonts w:hint="default"/>
-          <w:b/>
-          <w:bCs/>
-        </w:rPr>
-        <w:t>(USD 4.61 million)</w:t>
-      </w:r>
-      <w:r>
-        <w:rPr>
-          <w:rFonts w:hint="default"/>
-        </w:rPr>
-        <w:t>.</w:t>
-      </w:r>
-    </w:p>
-    <w:p>
-      <w:pPr>
-        <w:pStyle w:val="20"/>
-      </w:pPr>
-      <w:r>
-        <w:rPr>
           <w:rFonts w:hint="eastAsia"/>
           <w:iCs/>
           <w:lang w:val="en-US" w:eastAsia="zh-CN"/>
@@ -4098,7 +4195,7 @@
           <w:bCs w:val="0"/>
           <w:lang w:val="en-US" w:eastAsia="zh-CN"/>
         </w:rPr>
-        <w:t xml:space="preserve"> as shown in Fig. 3.</w:t>
+        <w:t xml:space="preserve"> as presented by Fig. 3.</w:t>
       </w:r>
     </w:p>
     <w:p>
@@ -4113,7 +4210,7 @@
         <mc:AlternateContent>
           <mc:Choice Requires="wps">
             <w:drawing>
-              <wp:anchor distT="0" distB="0" distL="114300" distR="114300" simplePos="0" relativeHeight="251662336" behindDoc="1" locked="0" layoutInCell="1" allowOverlap="1">
+              <wp:anchor distT="0" distB="0" distL="114300" distR="114300" simplePos="0" relativeHeight="251661312" behindDoc="1" locked="0" layoutInCell="1" allowOverlap="1">
                 <wp:simplePos x="0" y="0"/>
                 <wp:positionH relativeFrom="margin">
                   <wp:posOffset>3379470</wp:posOffset>
@@ -4188,7 +4285,7 @@
                                 <wp:inline distT="0" distB="0" distL="114300" distR="114300">
                                   <wp:extent cx="3067685" cy="1137920"/>
                                   <wp:effectExtent l="9525" t="9525" r="10160" b="16510"/>
-                                  <wp:docPr id="19" name="图片 19" descr="Figure3_SalesByCity"/>
+                                  <wp:docPr id="11" name="图片 11" descr="Figure3_SalesByCity"/>
                                   <wp:cNvGraphicFramePr>
                                     <a:graphicFrameLocks xmlns:a="http://schemas.openxmlformats.org/drawingml/2006/main" noChangeAspect="1"/>
                                   </wp:cNvGraphicFramePr>
@@ -4196,13 +4293,13 @@
                                     <a:graphicData uri="http://schemas.openxmlformats.org/drawingml/2006/picture">
                                       <pic:pic xmlns:pic="http://schemas.openxmlformats.org/drawingml/2006/picture">
                                         <pic:nvPicPr>
-                                          <pic:cNvPr id="19" name="图片 19" descr="Figure3_SalesByCity"/>
+                                          <pic:cNvPr id="11" name="图片 11" descr="Figure3_SalesByCity"/>
                                           <pic:cNvPicPr>
                                             <a:picLocks noChangeAspect="1"/>
                                           </pic:cNvPicPr>
                                         </pic:nvPicPr>
                                         <pic:blipFill>
-                                          <a:blip r:embed="rId7"/>
+                                          <a:blip r:embed="rId6"/>
                                           <a:stretch>
                                             <a:fillRect/>
                                           </a:stretch>
@@ -4244,7 +4341,7 @@
           </mc:Choice>
           <mc:Fallback>
             <w:pict>
-              <v:rect id="Text Box 8" o:spid="_x0000_s1026" o:spt="1" style="position:absolute;left:0pt;margin-left:266.1pt;margin-top:11.3pt;height:102.35pt;width:257.15pt;mso-position-horizontal-relative:margin;mso-wrap-distance-left:9pt;mso-wrap-distance-right:9pt;z-index:-251654144;mso-width-relative:page;mso-height-relative:page;" fillcolor="#FFFFFF" filled="t" stroked="f" coordsize="21600,21600" wrapcoords="0 0 0 20988 21020 20988 21020 0 0 0" o:gfxdata="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">
+              <v:rect id="Text Box 8" o:spid="_x0000_s1026" o:spt="1" style="position:absolute;left:0pt;margin-left:266.1pt;margin-top:11.3pt;height:102.35pt;width:257.15pt;mso-position-horizontal-relative:margin;mso-wrap-distance-left:9pt;mso-wrap-distance-right:9pt;z-index:-251655168;mso-width-relative:page;mso-height-relative:page;" fillcolor="#FFFFFF" filled="t" stroked="f" coordsize="21600,21600" wrapcoords="0 0 0 20988 21020 20988 21020 0 0 0" o:gfxdata="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">
                 <v:fill on="t" focussize="0,0"/>
                 <v:stroke on="f" miterlimit="8" joinstyle="miter"/>
                 <v:imagedata o:title=""/>
@@ -4281,7 +4378,7 @@
                           <wp:inline distT="0" distB="0" distL="114300" distR="114300">
                             <wp:extent cx="3067685" cy="1137920"/>
                             <wp:effectExtent l="9525" t="9525" r="10160" b="16510"/>
-                            <wp:docPr id="19" name="图片 19" descr="Figure3_SalesByCity"/>
+                            <wp:docPr id="11" name="图片 11" descr="Figure3_SalesByCity"/>
                             <wp:cNvGraphicFramePr>
                               <a:graphicFrameLocks xmlns:a="http://schemas.openxmlformats.org/drawingml/2006/main" noChangeAspect="1"/>
                             </wp:cNvGraphicFramePr>
@@ -4289,13 +4386,13 @@
                               <a:graphicData uri="http://schemas.openxmlformats.org/drawingml/2006/picture">
                                 <pic:pic xmlns:pic="http://schemas.openxmlformats.org/drawingml/2006/picture">
                                   <pic:nvPicPr>
-                                    <pic:cNvPr id="19" name="图片 19" descr="Figure3_SalesByCity"/>
+                                    <pic:cNvPr id="11" name="图片 11" descr="Figure3_SalesByCity"/>
                                     <pic:cNvPicPr>
                                       <a:picLocks noChangeAspect="1"/>
                                     </pic:cNvPicPr>
                                   </pic:nvPicPr>
                                   <pic:blipFill>
-                                    <a:blip r:embed="rId7"/>
+                                    <a:blip r:embed="rId6"/>
                                     <a:stretch>
                                       <a:fillRect/>
                                     </a:stretch>
@@ -4348,6 +4445,8 @@
         </w:rPr>
         <w:t xml:space="preserve"> by City</w:t>
       </w:r>
+      <w:bookmarkStart w:id="0" w:name="_GoBack"/>
+      <w:bookmarkEnd w:id="0"/>
     </w:p>
     <w:p>
       <w:pPr>
@@ -4372,14 +4471,14 @@
           <w:rFonts w:hint="eastAsia"/>
           <w:lang w:val="en-US" w:eastAsia="zh-CN"/>
         </w:rPr>
-        <w:t xml:space="preserve"> </w:t>
+        <w:t xml:space="preserve"> O</w:t>
       </w:r>
       <w:r>
         <w:rPr>
           <w:rFonts w:hint="default"/>
           <w:lang w:val="en-NZ" w:eastAsia="zh-CN"/>
         </w:rPr>
-        <w:t xml:space="preserve">As presented by Fig. 4, order activity gradually increased throughout the morning time. </w:t>
+        <w:t xml:space="preserve">rder activity gradually increased throughout the morning time. </w:t>
       </w:r>
       <w:r>
         <w:rPr>
@@ -4401,6 +4500,24 @@
       </w:r>
       <w:r>
         <w:rPr>
+          <w:rFonts w:hint="eastAsia"/>
+          <w:b/>
+          <w:bCs/>
+          <w:lang w:val="en-US" w:eastAsia="zh-CN"/>
+        </w:rPr>
+        <w:t xml:space="preserve"> </w:t>
+      </w:r>
+      <w:r>
+        <w:rPr>
+          <w:rFonts w:hint="eastAsia"/>
+          <w:b w:val="0"/>
+          <w:bCs w:val="0"/>
+          <w:lang w:val="en-US" w:eastAsia="zh-CN"/>
+        </w:rPr>
+        <w:t>(Fig. 4)</w:t>
+      </w:r>
+      <w:r>
+        <w:rPr>
           <w:b/>
           <w:bCs/>
         </w:rPr>
@@ -4419,7 +4536,7 @@
         <mc:AlternateContent>
           <mc:Choice Requires="wps">
             <w:drawing>
-              <wp:anchor distT="0" distB="0" distL="114300" distR="114300" simplePos="0" relativeHeight="251663360" behindDoc="1" locked="0" layoutInCell="1" allowOverlap="1">
+              <wp:anchor distT="0" distB="0" distL="114300" distR="114300" simplePos="0" relativeHeight="251662336" behindDoc="1" locked="0" layoutInCell="1" allowOverlap="1">
                 <wp:simplePos x="0" y="0"/>
                 <wp:positionH relativeFrom="margin">
                   <wp:posOffset>3379470</wp:posOffset>
@@ -4492,9 +4609,9 @@
                               </w:rPr>
                               <w:drawing>
                                 <wp:inline distT="0" distB="0" distL="114300" distR="114300">
-                                  <wp:extent cx="3067050" cy="1137920"/>
-                                  <wp:effectExtent l="9525" t="9525" r="10795" b="16510"/>
-                                  <wp:docPr id="22" name="图片 22" descr="Figure4_HourlyOrderActivity"/>
+                                  <wp:extent cx="3067050" cy="1153160"/>
+                                  <wp:effectExtent l="9525" t="9525" r="10795" b="9525"/>
+                                  <wp:docPr id="5" name="图片 5" descr="Figure4_HourlyOrderActivity"/>
                                   <wp:cNvGraphicFramePr>
                                     <a:graphicFrameLocks xmlns:a="http://schemas.openxmlformats.org/drawingml/2006/main" noChangeAspect="1"/>
                                   </wp:cNvGraphicFramePr>
@@ -4502,13 +4619,13 @@
                                     <a:graphicData uri="http://schemas.openxmlformats.org/drawingml/2006/picture">
                                       <pic:pic xmlns:pic="http://schemas.openxmlformats.org/drawingml/2006/picture">
                                         <pic:nvPicPr>
-                                          <pic:cNvPr id="22" name="图片 22" descr="Figure4_HourlyOrderActivity"/>
+                                          <pic:cNvPr id="5" name="图片 5" descr="Figure4_HourlyOrderActivity"/>
                                           <pic:cNvPicPr>
                                             <a:picLocks noChangeAspect="1"/>
                                           </pic:cNvPicPr>
                                         </pic:nvPicPr>
                                         <pic:blipFill>
-                                          <a:blip r:embed="rId8"/>
+                                          <a:blip r:embed="rId7"/>
                                           <a:stretch>
                                             <a:fillRect/>
                                           </a:stretch>
@@ -4516,7 +4633,7 @@
                                         <pic:spPr>
                                           <a:xfrm>
                                             <a:off x="0" y="0"/>
-                                            <a:ext cx="3067050" cy="1137920"/>
+                                            <a:ext cx="3067050" cy="1153160"/>
                                           </a:xfrm>
                                           <a:prstGeom prst="rect">
                                             <a:avLst/>
@@ -4550,7 +4667,7 @@
           </mc:Choice>
           <mc:Fallback>
             <w:pict>
-              <v:rect id="Text Box 8" o:spid="_x0000_s1026" o:spt="1" style="position:absolute;left:0pt;margin-left:266.1pt;margin-top:11.3pt;height:102.35pt;width:257.15pt;mso-position-horizontal-relative:margin;mso-wrap-distance-left:9pt;mso-wrap-distance-right:9pt;z-index:-251653120;mso-width-relative:page;mso-height-relative:page;" fillcolor="#FFFFFF" filled="t" stroked="f" coordsize="21600,21600" wrapcoords="0 0 0 20988 21020 20988 21020 0 0 0" o:gfxdata="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">
+              <v:rect id="Text Box 8" o:spid="_x0000_s1026" o:spt="1" style="position:absolute;left:0pt;margin-left:266.1pt;margin-top:11.3pt;height:102.35pt;width:257.15pt;mso-position-horizontal-relative:margin;mso-wrap-distance-left:9pt;mso-wrap-distance-right:9pt;z-index:-251654144;mso-width-relative:page;mso-height-relative:page;" fillcolor="#FFFFFF" filled="t" stroked="f" coordsize="21600,21600" wrapcoords="0 0 0 20988 21020 20988 21020 0 0 0" o:gfxdata="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">
                 <v:fill on="t" focussize="0,0"/>
                 <v:stroke on="f" miterlimit="8" joinstyle="miter"/>
                 <v:imagedata o:title=""/>
@@ -4585,9 +4702,9 @@
                         </w:rPr>
                         <w:drawing>
                           <wp:inline distT="0" distB="0" distL="114300" distR="114300">
-                            <wp:extent cx="3067050" cy="1137920"/>
-                            <wp:effectExtent l="9525" t="9525" r="10795" b="16510"/>
-                            <wp:docPr id="22" name="图片 22" descr="Figure4_HourlyOrderActivity"/>
+                            <wp:extent cx="3067050" cy="1153160"/>
+                            <wp:effectExtent l="9525" t="9525" r="10795" b="9525"/>
+                            <wp:docPr id="5" name="图片 5" descr="Figure4_HourlyOrderActivity"/>
                             <wp:cNvGraphicFramePr>
                               <a:graphicFrameLocks xmlns:a="http://schemas.openxmlformats.org/drawingml/2006/main" noChangeAspect="1"/>
                             </wp:cNvGraphicFramePr>
@@ -4595,13 +4712,13 @@
                               <a:graphicData uri="http://schemas.openxmlformats.org/drawingml/2006/picture">
                                 <pic:pic xmlns:pic="http://schemas.openxmlformats.org/drawingml/2006/picture">
                                   <pic:nvPicPr>
-                                    <pic:cNvPr id="22" name="图片 22" descr="Figure4_HourlyOrderActivity"/>
+                                    <pic:cNvPr id="5" name="图片 5" descr="Figure4_HourlyOrderActivity"/>
                                     <pic:cNvPicPr>
                                       <a:picLocks noChangeAspect="1"/>
                                     </pic:cNvPicPr>
                                   </pic:nvPicPr>
                                   <pic:blipFill>
-                                    <a:blip r:embed="rId8"/>
+                                    <a:blip r:embed="rId7"/>
                                     <a:stretch>
                                       <a:fillRect/>
                                     </a:stretch>
@@ -4609,7 +4726,7 @@
                                   <pic:spPr>
                                     <a:xfrm>
                                       <a:off x="0" y="0"/>
-                                      <a:ext cx="3067050" cy="1137920"/>
+                                      <a:ext cx="3067050" cy="1153160"/>
                                     </a:xfrm>
                                     <a:prstGeom prst="rect">
                                       <a:avLst/>
@@ -4703,14 +4820,14 @@
           <w:rFonts w:hint="default"/>
           <w:lang w:val="en-NZ"/>
         </w:rPr>
-        <w:t xml:space="preserve"> while AA Batteries (4-pack) and charging cables were the next. </w:t>
+        <w:t xml:space="preserve"> while AA Batteries (4-pack) and charging cables were the next.</w:t>
       </w:r>
       <w:r>
         <w:rPr>
           <w:rFonts w:hint="eastAsia"/>
           <w:lang w:val="en-US" w:eastAsia="zh-CN"/>
         </w:rPr>
-        <w:t>These</w:t>
+        <w:t xml:space="preserve"> These</w:t>
       </w:r>
       <w:r>
         <w:rPr>
@@ -4755,13 +4872,13 @@
         <mc:AlternateContent>
           <mc:Choice Requires="wps">
             <w:drawing>
-              <wp:anchor distT="0" distB="0" distL="114300" distR="114300" simplePos="0" relativeHeight="251664384" behindDoc="1" locked="0" layoutInCell="1" allowOverlap="1">
+              <wp:anchor distT="0" distB="0" distL="114300" distR="114300" simplePos="0" relativeHeight="251663360" behindDoc="1" locked="0" layoutInCell="1" allowOverlap="1">
                 <wp:simplePos x="0" y="0"/>
                 <wp:positionH relativeFrom="margin">
-                  <wp:posOffset>3379470</wp:posOffset>
+                  <wp:posOffset>-117475</wp:posOffset>
                 </wp:positionH>
                 <wp:positionV relativeFrom="paragraph">
-                  <wp:posOffset>250190</wp:posOffset>
+                  <wp:posOffset>321310</wp:posOffset>
                 </wp:positionV>
                 <wp:extent cx="3265805" cy="1299845"/>
                 <wp:effectExtent l="0" t="0" r="3175" b="4445"/>
@@ -4828,9 +4945,9 @@
                               </w:rPr>
                               <w:drawing>
                                 <wp:inline distT="0" distB="0" distL="114300" distR="114300">
-                                  <wp:extent cx="3114675" cy="1153160"/>
-                                  <wp:effectExtent l="9525" t="9525" r="12700" b="9525"/>
-                                  <wp:docPr id="6" name="图片 6" descr="Figure5_ProductPerformance"/>
+                                  <wp:extent cx="3122295" cy="1163955"/>
+                                  <wp:effectExtent l="9525" t="9525" r="13335" b="15240"/>
+                                  <wp:docPr id="4" name="图片 4" descr="Figure5_ProductPerformance"/>
                                   <wp:cNvGraphicFramePr>
                                     <a:graphicFrameLocks xmlns:a="http://schemas.openxmlformats.org/drawingml/2006/main" noChangeAspect="1"/>
                                   </wp:cNvGraphicFramePr>
@@ -4838,13 +4955,13 @@
                                     <a:graphicData uri="http://schemas.openxmlformats.org/drawingml/2006/picture">
                                       <pic:pic xmlns:pic="http://schemas.openxmlformats.org/drawingml/2006/picture">
                                         <pic:nvPicPr>
-                                          <pic:cNvPr id="6" name="图片 6" descr="Figure5_ProductPerformance"/>
+                                          <pic:cNvPr id="4" name="图片 4" descr="Figure5_ProductPerformance"/>
                                           <pic:cNvPicPr>
                                             <a:picLocks noChangeAspect="1"/>
                                           </pic:cNvPicPr>
                                         </pic:nvPicPr>
                                         <pic:blipFill>
-                                          <a:blip r:embed="rId9"/>
+                                          <a:blip r:embed="rId8"/>
                                           <a:stretch>
                                             <a:fillRect/>
                                           </a:stretch>
@@ -4852,7 +4969,7 @@
                                         <pic:spPr>
                                           <a:xfrm>
                                             <a:off x="0" y="0"/>
-                                            <a:ext cx="3114675" cy="1153160"/>
+                                            <a:ext cx="3122295" cy="1163955"/>
                                           </a:xfrm>
                                           <a:prstGeom prst="rect">
                                             <a:avLst/>
@@ -4886,7 +5003,7 @@
           </mc:Choice>
           <mc:Fallback>
             <w:pict>
-              <v:rect id="Text Box 8" o:spid="_x0000_s1026" o:spt="1" style="position:absolute;left:0pt;margin-left:266.1pt;margin-top:19.7pt;height:102.35pt;width:257.15pt;mso-position-horizontal-relative:margin;mso-wrap-distance-left:9pt;mso-wrap-distance-right:9pt;z-index:-251652096;mso-width-relative:page;mso-height-relative:page;" fillcolor="#FFFFFF" filled="t" stroked="f" coordsize="21600,21600" wrapcoords="0 0 0 20988 21020 20988 21020 0 0 0" o:gfxdata="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">
+              <v:rect id="Text Box 8" o:spid="_x0000_s1026" o:spt="1" style="position:absolute;left:0pt;margin-left:-9.25pt;margin-top:25.3pt;height:102.35pt;width:257.15pt;mso-position-horizontal-relative:margin;mso-wrap-distance-left:9pt;mso-wrap-distance-right:9pt;z-index:-251653120;mso-width-relative:page;mso-height-relative:page;" fillcolor="#FFFFFF" filled="t" stroked="f" coordsize="21600,21600" wrapcoords="0 0 0 20988 21020 20988 21020 0 0 0" o:gfxdata="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">
                 <v:fill on="t" focussize="0,0"/>
                 <v:stroke on="f" miterlimit="8" joinstyle="miter"/>
                 <v:imagedata o:title=""/>
@@ -4921,9 +5038,9 @@
                         </w:rPr>
                         <w:drawing>
                           <wp:inline distT="0" distB="0" distL="114300" distR="114300">
-                            <wp:extent cx="3114675" cy="1153160"/>
-                            <wp:effectExtent l="9525" t="9525" r="12700" b="9525"/>
-                            <wp:docPr id="6" name="图片 6" descr="Figure5_ProductPerformance"/>
+                            <wp:extent cx="3122295" cy="1163955"/>
+                            <wp:effectExtent l="9525" t="9525" r="13335" b="15240"/>
+                            <wp:docPr id="4" name="图片 4" descr="Figure5_ProductPerformance"/>
                             <wp:cNvGraphicFramePr>
                               <a:graphicFrameLocks xmlns:a="http://schemas.openxmlformats.org/drawingml/2006/main" noChangeAspect="1"/>
                             </wp:cNvGraphicFramePr>
@@ -4931,13 +5048,13 @@
                               <a:graphicData uri="http://schemas.openxmlformats.org/drawingml/2006/picture">
                                 <pic:pic xmlns:pic="http://schemas.openxmlformats.org/drawingml/2006/picture">
                                   <pic:nvPicPr>
-                                    <pic:cNvPr id="6" name="图片 6" descr="Figure5_ProductPerformance"/>
+                                    <pic:cNvPr id="4" name="图片 4" descr="Figure5_ProductPerformance"/>
                                     <pic:cNvPicPr>
                                       <a:picLocks noChangeAspect="1"/>
                                     </pic:cNvPicPr>
                                   </pic:nvPicPr>
                                   <pic:blipFill>
-                                    <a:blip r:embed="rId9"/>
+                                    <a:blip r:embed="rId8"/>
                                     <a:stretch>
                                       <a:fillRect/>
                                     </a:stretch>
@@ -4945,7 +5062,7 @@
                                   <pic:spPr>
                                     <a:xfrm>
                                       <a:off x="0" y="0"/>
-                                      <a:ext cx="3114675" cy="1153160"/>
+                                      <a:ext cx="3122295" cy="1163955"/>
                                     </a:xfrm>
                                     <a:prstGeom prst="rect">
                                       <a:avLst/>
@@ -5001,89 +5118,62 @@
     </w:p>
     <w:p>
       <w:pPr>
-        <w:pStyle w:val="20"/>
-        <w:numPr>
-          <w:ilvl w:val="0"/>
-          <w:numId w:val="0"/>
-        </w:numPr>
-        <w:ind w:leftChars="0"/>
-        <w:rPr>
-          <w:rFonts w:hint="default"/>
-          <w:iCs/>
+        <w:pStyle w:val="7"/>
+        <w:rPr>
+          <w:rFonts w:hint="default"/>
           <w:lang w:val="en-NZ" w:eastAsia="zh-CN"/>
         </w:rPr>
       </w:pPr>
       <w:r>
         <w:rPr>
-          <w:rFonts w:hint="default" w:cs="Times New Roman"/>
-          <w:spacing w:val="-1"/>
-          <w:sz w:val="20"/>
-          <w:szCs w:val="20"/>
-          <w:lang w:val="en-NZ" w:eastAsia="zh-CN" w:bidi="ar-SA"/>
+          <w:rFonts w:hint="default"/>
+          <w:lang w:val="en-NZ" w:eastAsia="zh-CN"/>
         </w:rPr>
         <w:t>Examination on relationship between product price and quantity ordered through scatter plot (</w:t>
       </w:r>
       <w:r>
         <w:rPr>
-          <w:rFonts w:hint="default" w:ascii="Times New Roman" w:hAnsi="Times New Roman" w:eastAsia="SimSun" w:cs="Times New Roman"/>
-          <w:spacing w:val="-1"/>
-          <w:sz w:val="20"/>
-          <w:szCs w:val="20"/>
-          <w:lang w:val="zh-CN" w:eastAsia="zh-CN" w:bidi="ar-SA"/>
+          <w:rFonts w:hint="default"/>
+          <w:lang w:val="zh-CN" w:eastAsia="zh-CN"/>
         </w:rPr>
         <w:t>Fig</w:t>
       </w:r>
       <w:r>
         <w:rPr>
-          <w:rFonts w:hint="default" w:ascii="Times New Roman" w:hAnsi="Times New Roman" w:eastAsia="SimSun" w:cs="Times New Roman"/>
-          <w:spacing w:val="-1"/>
-          <w:sz w:val="20"/>
-          <w:szCs w:val="20"/>
-          <w:lang w:val="en-NZ" w:eastAsia="zh-CN" w:bidi="ar-SA"/>
+          <w:rFonts w:hint="default"/>
+          <w:lang w:val="en-NZ" w:eastAsia="zh-CN"/>
         </w:rPr>
         <w:t>.</w:t>
       </w:r>
       <w:r>
         <w:rPr>
-          <w:rFonts w:hint="default" w:ascii="Times New Roman" w:hAnsi="Times New Roman" w:eastAsia="SimSun" w:cs="Times New Roman"/>
-          <w:spacing w:val="-1"/>
-          <w:sz w:val="20"/>
-          <w:szCs w:val="20"/>
-          <w:lang w:val="zh-CN" w:eastAsia="zh-CN" w:bidi="ar-SA"/>
+          <w:rFonts w:hint="default"/>
+          <w:lang w:val="zh-CN" w:eastAsia="zh-CN"/>
         </w:rPr>
         <w:t xml:space="preserve"> </w:t>
       </w:r>
       <w:r>
         <w:rPr>
-          <w:rFonts w:hint="default" w:cs="Times New Roman"/>
-          <w:spacing w:val="-1"/>
-          <w:sz w:val="20"/>
-          <w:szCs w:val="20"/>
-          <w:lang w:val="en-NZ" w:eastAsia="zh-CN" w:bidi="ar-SA"/>
+          <w:rFonts w:hint="default"/>
+          <w:lang w:val="en-NZ" w:eastAsia="zh-CN"/>
         </w:rPr>
         <w:t xml:space="preserve">6) revealed that </w:t>
       </w:r>
       <w:r>
         <w:rPr>
-          <w:rFonts w:hint="default" w:cs="Times New Roman"/>
+          <w:rFonts w:hint="default"/>
           <w:b/>
           <w:bCs/>
-          <w:spacing w:val="-1"/>
-          <w:sz w:val="20"/>
-          <w:szCs w:val="20"/>
-          <w:lang w:val="en-NZ" w:eastAsia="zh-CN" w:bidi="ar-SA"/>
-        </w:rPr>
-        <w:t>lower-priced products generally achieve higher sales volumes,</w:t>
-      </w:r>
-      <w:r>
-        <w:rPr>
-          <w:rFonts w:hint="default" w:cs="Times New Roman"/>
-          <w:spacing w:val="-1"/>
-          <w:sz w:val="20"/>
-          <w:szCs w:val="20"/>
-          <w:lang w:val="en-NZ" w:eastAsia="zh-CN" w:bidi="ar-SA"/>
-        </w:rPr>
-        <w:t xml:space="preserve"> whereas higher-priced products tend to sell in smaller quantities. Though a few products deviate from this overall pattern, these exceptions likely reflect differences in product category and customer demand rather than contradicting the general trend.</w:t>
+          <w:lang w:val="en-NZ" w:eastAsia="zh-CN"/>
+        </w:rPr>
+        <w:t xml:space="preserve">lower-priced products generally achieve higher sales volumes, whereas higher-priced products tend to sell in smaller quantities. </w:t>
+      </w:r>
+      <w:r>
+        <w:rPr>
+          <w:rFonts w:hint="default"/>
+          <w:lang w:val="en-NZ" w:eastAsia="zh-CN"/>
+        </w:rPr>
+        <w:t>Though a few products deviate from this overall pattern, these exceptions likely reflect differences in product category and customer demand rather than contradicting the general trend.</w:t>
       </w:r>
     </w:p>
     <w:p>
@@ -5098,13 +5188,13 @@
         <mc:AlternateContent>
           <mc:Choice Requires="wps">
             <w:drawing>
-              <wp:anchor distT="0" distB="0" distL="114300" distR="114300" simplePos="0" relativeHeight="251665408" behindDoc="1" locked="0" layoutInCell="1" allowOverlap="1">
+              <wp:anchor distT="0" distB="0" distL="114300" distR="114300" simplePos="0" relativeHeight="251664384" behindDoc="1" locked="0" layoutInCell="1" allowOverlap="1">
                 <wp:simplePos x="0" y="0"/>
                 <wp:positionH relativeFrom="margin">
-                  <wp:posOffset>-61595</wp:posOffset>
+                  <wp:posOffset>-74295</wp:posOffset>
                 </wp:positionH>
                 <wp:positionV relativeFrom="paragraph">
-                  <wp:posOffset>280670</wp:posOffset>
+                  <wp:posOffset>202565</wp:posOffset>
                 </wp:positionV>
                 <wp:extent cx="3265805" cy="1299845"/>
                 <wp:effectExtent l="0" t="0" r="3175" b="4445"/>
@@ -5187,7 +5277,7 @@
                                           </pic:cNvPicPr>
                                         </pic:nvPicPr>
                                         <pic:blipFill>
-                                          <a:blip r:embed="rId10"/>
+                                          <a:blip r:embed="rId9"/>
                                           <a:stretch>
                                             <a:fillRect/>
                                           </a:stretch>
@@ -5229,7 +5319,7 @@
           </mc:Choice>
           <mc:Fallback>
             <w:pict>
-              <v:rect id="Text Box 8" o:spid="_x0000_s1026" o:spt="1" style="position:absolute;left:0pt;margin-left:-4.85pt;margin-top:22.1pt;height:102.35pt;width:257.15pt;mso-position-horizontal-relative:margin;mso-wrap-distance-left:9pt;mso-wrap-distance-right:9pt;z-index:-251651072;mso-width-relative:page;mso-height-relative:page;" fillcolor="#FFFFFF" filled="t" stroked="f" coordsize="21600,21600" wrapcoords="0 0 0 20988 21020 20988 21020 0 0 0" o:gfxdata="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">
+              <v:rect id="Text Box 8" o:spid="_x0000_s1026" o:spt="1" style="position:absolute;left:0pt;margin-left:-5.85pt;margin-top:15.95pt;height:102.35pt;width:257.15pt;mso-position-horizontal-relative:margin;mso-wrap-distance-left:9pt;mso-wrap-distance-right:9pt;z-index:-251652096;mso-width-relative:page;mso-height-relative:page;" fillcolor="#FFFFFF" filled="t" stroked="f" coordsize="21600,21600" wrapcoords="0 0 0 20988 21020 20988 21020 0 0 0" o:gfxdata="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">
                 <v:fill on="t" focussize="0,0"/>
                 <v:stroke on="f" miterlimit="8" joinstyle="miter"/>
                 <v:imagedata o:title=""/>
@@ -5280,7 +5370,7 @@
                                     </pic:cNvPicPr>
                                   </pic:nvPicPr>
                                   <pic:blipFill>
-                                    <a:blip r:embed="rId10"/>
+                                    <a:blip r:embed="rId9"/>
                                     <a:stretch>
                                       <a:fillRect/>
                                     </a:stretch>
@@ -5319,27 +5409,11 @@
       </w:r>
       <w:r>
         <w:rPr>
-          <w:rFonts w:hint="default"/>
-          <w:iCs/>
-          <w:lang w:val="en-NZ" w:eastAsia="zh-CN"/>
-        </w:rPr>
-        <w:t>Hourly Order Activity</w:t>
-      </w:r>
-      <w:r>
-        <w:rPr>
           <w:rFonts w:hint="eastAsia"/>
           <w:iCs/>
           <w:lang w:val="en-US" w:eastAsia="zh-CN"/>
         </w:rPr>
-        <w:t>Top</w:t>
-      </w:r>
-      <w:r>
-        <w:rPr>
-          <w:rFonts w:hint="default"/>
-          <w:iCs/>
-          <w:lang w:val="en-NZ" w:eastAsia="zh-CN"/>
-        </w:rPr>
-        <w:t>10 Products by Quantity Ordered and Revenue</w:t>
+        <w:t>Relationship Between Product Price and Quantity Sold</w:t>
       </w:r>
     </w:p>
     <w:p>
@@ -5444,6 +5518,78 @@
         </w:rPr>
         <w:t xml:space="preserve"> below. </w:t>
       </w:r>
+    </w:p>
+    <w:p>
+      <w:pPr>
+        <w:pStyle w:val="7"/>
+        <w:rPr>
+          <w:rFonts w:hint="default"/>
+          <w:lang w:val="en-US"/>
+        </w:rPr>
+      </w:pPr>
+    </w:p>
+    <w:p>
+      <w:pPr>
+        <w:pStyle w:val="7"/>
+        <w:rPr>
+          <w:rFonts w:hint="default"/>
+          <w:lang w:val="en-US"/>
+        </w:rPr>
+      </w:pPr>
+    </w:p>
+    <w:p>
+      <w:pPr>
+        <w:pStyle w:val="7"/>
+        <w:rPr>
+          <w:rFonts w:hint="default"/>
+          <w:lang w:val="en-US"/>
+        </w:rPr>
+      </w:pPr>
+    </w:p>
+    <w:p>
+      <w:pPr>
+        <w:pStyle w:val="7"/>
+        <w:rPr>
+          <w:rFonts w:hint="default"/>
+          <w:lang w:val="en-US"/>
+        </w:rPr>
+      </w:pPr>
+    </w:p>
+    <w:p>
+      <w:pPr>
+        <w:pStyle w:val="7"/>
+        <w:rPr>
+          <w:rFonts w:hint="default"/>
+          <w:lang w:val="en-US"/>
+        </w:rPr>
+      </w:pPr>
+    </w:p>
+    <w:p>
+      <w:pPr>
+        <w:pStyle w:val="7"/>
+        <w:rPr>
+          <w:rFonts w:hint="default"/>
+          <w:lang w:val="en-US"/>
+        </w:rPr>
+      </w:pPr>
+    </w:p>
+    <w:p>
+      <w:pPr>
+        <w:pStyle w:val="7"/>
+        <w:rPr>
+          <w:rFonts w:hint="default"/>
+          <w:lang w:val="en-US"/>
+        </w:rPr>
+      </w:pPr>
+    </w:p>
+    <w:p>
+      <w:pPr>
+        <w:pStyle w:val="7"/>
+        <w:rPr>
+          <w:rFonts w:hint="default"/>
+          <w:lang w:val="en-US"/>
+        </w:rPr>
+      </w:pPr>
     </w:p>
     <w:p>
       <w:pPr>
@@ -5480,7 +5626,7 @@
                     </pic:cNvPicPr>
                   </pic:nvPicPr>
                   <pic:blipFill>
-                    <a:blip r:embed="rId11"/>
+                    <a:blip r:embed="rId10"/>
                     <a:srcRect t="600" b="600"/>
                     <a:stretch>
                       <a:fillRect/>
@@ -5769,7 +5915,21 @@
           <w:rFonts w:hint="default"/>
           <w:lang w:val="en-US" w:eastAsia="zh-CN"/>
         </w:rPr>
-        <w:t>hich items are often bought together, transaction-level data were created by</w:t>
+        <w:t xml:space="preserve">hich items </w:t>
+      </w:r>
+      <w:r>
+        <w:rPr>
+          <w:rFonts w:hint="eastAsia"/>
+          <w:lang w:val="en-US" w:eastAsia="zh-CN"/>
+        </w:rPr>
+        <w:t>were</w:t>
+      </w:r>
+      <w:r>
+        <w:rPr>
+          <w:rFonts w:hint="default"/>
+          <w:lang w:val="en-US" w:eastAsia="zh-CN"/>
+        </w:rPr>
+        <w:t xml:space="preserve"> often bought together, transaction-level data were created by</w:t>
       </w:r>
       <w:r>
         <w:rPr>
@@ -5852,7 +6012,7 @@
     <w:tbl>
       <w:tblPr>
         <w:tblStyle w:val="11"/>
-        <w:tblW w:w="5158" w:type="dxa"/>
+        <w:tblW w:w="4774" w:type="dxa"/>
         <w:jc w:val="center"/>
         <w:tblBorders>
           <w:top w:val="single" w:color="auto" w:sz="2" w:space="0"/>
@@ -5871,8 +6031,8 @@
         </w:tblCellMar>
       </w:tblPr>
       <w:tblGrid>
-        <w:gridCol w:w="2190"/>
-        <w:gridCol w:w="1509"/>
+        <w:gridCol w:w="1569"/>
+        <w:gridCol w:w="1746"/>
         <w:gridCol w:w="1459"/>
       </w:tblGrid>
       <w:tr>
@@ -5894,13 +6054,42 @@
         </w:tblPrEx>
         <w:trPr>
           <w:cantSplit/>
-          <w:trHeight w:val="327" w:hRule="atLeast"/>
+          <w:trHeight w:val="354" w:hRule="atLeast"/>
           <w:tblHeader/>
           <w:jc w:val="center"/>
         </w:trPr>
         <w:tc>
           <w:tcPr>
-            <w:tcW w:w="2190" w:type="dxa"/>
+            <w:tcW w:w="1569" w:type="dxa"/>
+            <w:vAlign w:val="center"/>
+          </w:tcPr>
+          <w:p>
+            <w:pPr>
+              <w:pStyle w:val="27"/>
+              <w:rPr>
+                <w:rFonts w:hint="default" w:eastAsia="SimSun"/>
+                <w:lang w:val="en-US" w:eastAsia="zh-CN"/>
+              </w:rPr>
+            </w:pPr>
+            <w:r>
+              <w:rPr>
+                <w:rFonts w:hint="default"/>
+                <w:lang w:val="en-US" w:eastAsia="zh-CN"/>
+              </w:rPr>
+              <w:t>Numb</w:t>
+            </w:r>
+            <w:r>
+              <w:rPr>
+                <w:rFonts w:hint="eastAsia"/>
+                <w:lang w:val="en-US" w:eastAsia="zh-CN"/>
+              </w:rPr>
+              <w:t>er of Products in combination</w:t>
+            </w:r>
+          </w:p>
+        </w:tc>
+        <w:tc>
+          <w:tcPr>
+            <w:tcW w:w="1746" w:type="dxa"/>
             <w:vAlign w:val="center"/>
           </w:tcPr>
           <w:p>
@@ -5916,29 +6105,35 @@
                 <w:rFonts w:hint="default"/>
                 <w:lang w:val="en-US" w:eastAsia="zh-CN"/>
               </w:rPr>
-              <w:t>Numb_of_Prodt_in_Comb</w:t>
-            </w:r>
-          </w:p>
-        </w:tc>
-        <w:tc>
-          <w:tcPr>
-            <w:tcW w:w="1509" w:type="dxa"/>
-            <w:vAlign w:val="center"/>
-          </w:tcPr>
-          <w:p>
-            <w:pPr>
-              <w:pStyle w:val="27"/>
-              <w:rPr>
-                <w:rFonts w:hint="default" w:eastAsia="SimSun"/>
-                <w:lang w:val="en-NZ" w:eastAsia="zh-CN"/>
-              </w:rPr>
-            </w:pPr>
-            <w:r>
-              <w:rPr>
-                <w:rFonts w:hint="default"/>
-                <w:lang w:val="en-US" w:eastAsia="zh-CN"/>
-              </w:rPr>
-              <w:t>Number_of_Orders</w:t>
+              <w:t>Number</w:t>
+            </w:r>
+            <w:r>
+              <w:rPr>
+                <w:rFonts w:hint="eastAsia"/>
+                <w:lang w:val="en-US" w:eastAsia="zh-CN"/>
+              </w:rPr>
+              <w:t xml:space="preserve"> </w:t>
+            </w:r>
+            <w:r>
+              <w:rPr>
+                <w:rFonts w:hint="default"/>
+                <w:lang w:val="en-US" w:eastAsia="zh-CN"/>
+              </w:rPr>
+              <w:t>of</w:t>
+            </w:r>
+            <w:r>
+              <w:rPr>
+                <w:rFonts w:hint="eastAsia"/>
+                <w:lang w:val="en-US" w:eastAsia="zh-CN"/>
+              </w:rPr>
+              <w:t xml:space="preserve"> </w:t>
+            </w:r>
+            <w:r>
+              <w:rPr>
+                <w:rFonts w:hint="default"/>
+                <w:lang w:val="en-US" w:eastAsia="zh-CN"/>
+              </w:rPr>
+              <w:t>Orders</w:t>
             </w:r>
           </w:p>
         </w:tc>
@@ -5988,7 +6183,7 @@
         </w:trPr>
         <w:tc>
           <w:tcPr>
-            <w:tcW w:w="2190" w:type="dxa"/>
+            <w:tcW w:w="1569" w:type="dxa"/>
             <w:vAlign w:val="center"/>
           </w:tcPr>
           <w:p>
@@ -6010,7 +6205,7 @@
         </w:tc>
         <w:tc>
           <w:tcPr>
-            <w:tcW w:w="1509" w:type="dxa"/>
+            <w:tcW w:w="1746" w:type="dxa"/>
             <w:vAlign w:val="center"/>
           </w:tcPr>
           <w:p>
@@ -6076,7 +6271,7 @@
         </w:trPr>
         <w:tc>
           <w:tcPr>
-            <w:tcW w:w="2190" w:type="dxa"/>
+            <w:tcW w:w="1569" w:type="dxa"/>
             <w:vAlign w:val="center"/>
           </w:tcPr>
           <w:p>
@@ -6098,7 +6293,7 @@
         </w:tc>
         <w:tc>
           <w:tcPr>
-            <w:tcW w:w="1509" w:type="dxa"/>
+            <w:tcW w:w="1746" w:type="dxa"/>
             <w:vAlign w:val="center"/>
           </w:tcPr>
           <w:p>
@@ -6164,7 +6359,7 @@
         </w:trPr>
         <w:tc>
           <w:tcPr>
-            <w:tcW w:w="2190" w:type="dxa"/>
+            <w:tcW w:w="1569" w:type="dxa"/>
             <w:vAlign w:val="center"/>
           </w:tcPr>
           <w:p>
@@ -6186,7 +6381,7 @@
         </w:tc>
         <w:tc>
           <w:tcPr>
-            <w:tcW w:w="1509" w:type="dxa"/>
+            <w:tcW w:w="1746" w:type="dxa"/>
             <w:vAlign w:val="center"/>
           </w:tcPr>
           <w:p>
@@ -6252,7 +6447,7 @@
         </w:trPr>
         <w:tc>
           <w:tcPr>
-            <w:tcW w:w="2190" w:type="dxa"/>
+            <w:tcW w:w="1569" w:type="dxa"/>
             <w:vAlign w:val="center"/>
           </w:tcPr>
           <w:p>
@@ -6274,7 +6469,7 @@
         </w:tc>
         <w:tc>
           <w:tcPr>
-            <w:tcW w:w="1509" w:type="dxa"/>
+            <w:tcW w:w="1746" w:type="dxa"/>
             <w:vAlign w:val="center"/>
           </w:tcPr>
           <w:p>
@@ -6340,7 +6535,7 @@
         </w:trPr>
         <w:tc>
           <w:tcPr>
-            <w:tcW w:w="2190" w:type="dxa"/>
+            <w:tcW w:w="1569" w:type="dxa"/>
             <w:vAlign w:val="center"/>
           </w:tcPr>
           <w:p>
@@ -6362,7 +6557,7 @@
         </w:tc>
         <w:tc>
           <w:tcPr>
-            <w:tcW w:w="1509" w:type="dxa"/>
+            <w:tcW w:w="1746" w:type="dxa"/>
             <w:vAlign w:val="center"/>
           </w:tcPr>
           <w:p>
@@ -6431,7 +6626,14 @@
           <w:rFonts w:hint="default"/>
           <w:lang w:val="en-NZ"/>
         </w:rPr>
-        <w:t>demonstrated by</w:t>
+        <w:t xml:space="preserve">demonstrated </w:t>
+      </w:r>
+      <w:r>
+        <w:rPr>
+          <w:rFonts w:hint="eastAsia"/>
+          <w:lang w:val="en-US" w:eastAsia="zh-CN"/>
+        </w:rPr>
+        <w:t>in</w:t>
       </w:r>
       <w:r>
         <w:t xml:space="preserve"> </w:t>
@@ -6449,32 +6651,72 @@
       <w:r>
         <w:rPr>
           <w:rFonts w:hint="default"/>
+          <w:b/>
+          <w:bCs/>
           <w:lang w:val="en-NZ"/>
         </w:rPr>
         <w:t xml:space="preserve">single-product purchase dominated the orders with a percentage </w:t>
       </w:r>
       <w:r>
+        <w:rPr>
+          <w:rFonts w:hint="eastAsia"/>
+          <w:b/>
+          <w:bCs/>
+          <w:lang w:val="en-US" w:eastAsia="zh-CN"/>
+        </w:rPr>
+        <w:t xml:space="preserve">of </w:t>
+      </w:r>
+      <w:r>
+        <w:rPr>
+          <w:b/>
+          <w:bCs/>
+        </w:rPr>
         <w:t xml:space="preserve">96.17% of </w:t>
       </w:r>
       <w:r>
         <w:rPr>
           <w:rFonts w:hint="default"/>
+          <w:b/>
+          <w:bCs/>
           <w:lang w:val="en-NZ"/>
         </w:rPr>
         <w:t xml:space="preserve">the total </w:t>
       </w:r>
       <w:r>
+        <w:rPr>
+          <w:b/>
+          <w:bCs/>
+        </w:rPr>
         <w:t>transactions</w:t>
       </w:r>
       <w:r>
         <w:rPr>
           <w:rFonts w:hint="default"/>
-          <w:lang w:val="en-NZ"/>
-        </w:rPr>
-        <w:t>. O</w:t>
-      </w:r>
-      <w:r>
-        <w:t xml:space="preserve">nly 3.83% included two or more products. </w:t>
+          <w:b/>
+          <w:bCs/>
+          <w:lang w:val="en-NZ"/>
+        </w:rPr>
+        <w:t>.</w:t>
+      </w:r>
+      <w:r>
+        <w:rPr>
+          <w:rFonts w:hint="default"/>
+          <w:lang w:val="en-NZ"/>
+        </w:rPr>
+        <w:t xml:space="preserve"> O</w:t>
+      </w:r>
+      <w:r>
+        <w:t xml:space="preserve">nly 3.83% </w:t>
+      </w:r>
+      <w:r>
+        <w:rPr>
+          <w:rFonts w:hint="eastAsia"/>
+          <w:lang w:val="en-US" w:eastAsia="zh-CN"/>
+        </w:rPr>
+        <w:t xml:space="preserve">orders </w:t>
+      </w:r>
+      <w:r>
+        <w:t xml:space="preserve">included two or more products. </w:t>
       </w:r>
       <w:r>
         <w:rPr>
@@ -6514,11 +6756,34 @@
         <w:rPr>
           <w:rFonts w:hint="default"/>
         </w:rPr>
-        <w:t xml:space="preserve">association rule mining is based on the presence of items within the same transaction, the limited presence of transactions with more than one item makes it hard to find frequent itemsets. In order to solve this problem, a very low minimum support </w:t>
-      </w:r>
-      <w:r>
-        <w:rPr>
-          <w:rFonts w:hint="default"/>
+        <w:t>association rule mining is based on the presence of items within the same transaction, the limited presence of transactions with more than one item makes it hard to find frequent itemsets.</w:t>
+      </w:r>
+      <w:r>
+        <w:rPr>
+          <w:rFonts w:hint="eastAsia"/>
+          <w:lang w:val="en-US" w:eastAsia="zh-CN"/>
+        </w:rPr>
+        <w:t xml:space="preserve"> [4]</w:t>
+      </w:r>
+      <w:r>
+        <w:rPr>
+          <w:rFonts w:hint="default"/>
+        </w:rPr>
+        <w:t xml:space="preserve"> In order to solve this problem, </w:t>
+      </w:r>
+      <w:r>
+        <w:rPr>
+          <w:rFonts w:hint="default"/>
+          <w:b/>
+          <w:bCs/>
+        </w:rPr>
+        <w:t xml:space="preserve">a very low minimum support </w:t>
+      </w:r>
+      <w:r>
+        <w:rPr>
+          <w:rFonts w:hint="default"/>
+          <w:b/>
+          <w:bCs/>
           <w:lang w:val="en-NZ"/>
         </w:rPr>
         <w:t>threshold</w:t>
@@ -6526,12 +6791,16 @@
       <w:r>
         <w:rPr>
           <w:rFonts w:hint="default"/>
+          <w:b/>
+          <w:bCs/>
         </w:rPr>
         <w:t xml:space="preserve"> </w:t>
       </w:r>
       <w:r>
         <w:rPr>
           <w:rFonts w:hint="default"/>
+          <w:b/>
+          <w:bCs/>
           <w:lang w:val="en-NZ"/>
         </w:rPr>
         <w:t>shall be adopted later in the application of</w:t>
@@ -6539,6 +6808,8 @@
       <w:r>
         <w:rPr>
           <w:rFonts w:hint="default"/>
+          <w:b/>
+          <w:bCs/>
         </w:rPr>
         <w:t xml:space="preserve"> the Apriori algorithm.</w:t>
       </w:r>
@@ -6554,6 +6825,10 @@
     <w:p>
       <w:pPr>
         <w:pStyle w:val="7"/>
+        <w:rPr>
+          <w:rFonts w:hint="default" w:eastAsia="SimSun"/>
+          <w:lang w:val="en-US" w:eastAsia="zh-CN"/>
+        </w:rPr>
       </w:pPr>
       <w:r>
         <w:rPr>
@@ -6663,7 +6938,14 @@
         <w:rPr>
           <w:rFonts w:hint="default"/>
         </w:rPr>
-        <w:t xml:space="preserve"> share of transactions that include a specific combination of products.</w:t>
+        <w:t xml:space="preserve"> share of transactions that include a specific combination of products</w:t>
+      </w:r>
+      <w:r>
+        <w:rPr>
+          <w:rFonts w:hint="eastAsia"/>
+          <w:lang w:val="en-US" w:eastAsia="zh-CN"/>
+        </w:rPr>
+        <w:t xml:space="preserve"> [4].</w:t>
       </w:r>
     </w:p>
     <w:p>
@@ -6705,7 +6987,21 @@
           <w:rFonts w:hint="default"/>
           <w:lang w:val="en-NZ" w:eastAsia="zh-CN"/>
         </w:rPr>
-        <w:t>Comparison of Different Minimum Support Thresholds</w:t>
+        <w:t xml:space="preserve">Comparison of </w:t>
+      </w:r>
+      <w:r>
+        <w:rPr>
+          <w:rFonts w:hint="eastAsia"/>
+          <w:lang w:val="en-US" w:eastAsia="zh-CN"/>
+        </w:rPr>
+        <w:t xml:space="preserve">Frequent Itemset Outputs by </w:t>
+      </w:r>
+      <w:r>
+        <w:rPr>
+          <w:rFonts w:hint="default"/>
+          <w:lang w:val="en-NZ" w:eastAsia="zh-CN"/>
+        </w:rPr>
+        <w:t>Different Minimum Support Thresholds</w:t>
       </w:r>
     </w:p>
     <w:tbl>
@@ -7610,7 +7906,20 @@
         <w:rPr>
           <w:rFonts w:hint="default"/>
         </w:rPr>
-        <w:t xml:space="preserve">As Table </w:t>
+        <w:t xml:space="preserve">As </w:t>
+      </w:r>
+      <w:r>
+        <w:rPr>
+          <w:rFonts w:hint="eastAsia"/>
+          <w:lang w:val="en-US" w:eastAsia="zh-CN"/>
+        </w:rPr>
+        <w:t xml:space="preserve">indicated in </w:t>
+      </w:r>
+      <w:r>
+        <w:rPr>
+          <w:rFonts w:hint="default"/>
+        </w:rPr>
+        <w:t xml:space="preserve">Table </w:t>
       </w:r>
       <w:r>
         <w:rPr>
@@ -7623,7 +7932,7 @@
         <w:rPr>
           <w:rFonts w:hint="default"/>
         </w:rPr>
-        <w:t xml:space="preserve"> shows, support thresholds above 0.005 </w:t>
+        <w:t xml:space="preserve">, support thresholds above 0.005 </w:t>
       </w:r>
       <w:r>
         <w:rPr>
@@ -7918,7 +8227,14 @@
         <w:rPr>
           <w:rFonts w:hint="default"/>
         </w:rPr>
-        <w:t>ift is an indication of the occurrence of two products together more often than randomly expected.</w:t>
+        <w:t>ift is an indication of the occurrence of two products together more often than randomly expected</w:t>
+      </w:r>
+      <w:r>
+        <w:rPr>
+          <w:rFonts w:hint="eastAsia"/>
+          <w:lang w:val="en-US" w:eastAsia="zh-CN"/>
+        </w:rPr>
+        <w:t xml:space="preserve"> [4].</w:t>
       </w:r>
       <w:r>
         <w:rPr>
@@ -7927,6 +8243,24 @@
         </w:rPr>
         <w:t xml:space="preserve"> A Lift value greater than one indicates a positive association between products.</w:t>
       </w:r>
+    </w:p>
+    <w:p>
+      <w:pPr>
+        <w:pStyle w:val="7"/>
+        <w:rPr>
+          <w:rFonts w:hint="default"/>
+          <w:lang w:val="en-NZ"/>
+        </w:rPr>
+      </w:pPr>
+    </w:p>
+    <w:p>
+      <w:pPr>
+        <w:pStyle w:val="7"/>
+        <w:rPr>
+          <w:rFonts w:hint="default"/>
+          <w:lang w:val="en-NZ"/>
+        </w:rPr>
+      </w:pPr>
     </w:p>
     <w:p>
       <w:pPr>
@@ -7978,6 +8312,12 @@
             <w:insideH w:val="single" w:color="auto" w:sz="2" w:space="0"/>
             <w:insideV w:val="single" w:color="auto" w:sz="2" w:space="0"/>
           </w:tblBorders>
+          <w:tblCellMar>
+            <w:top w:w="0" w:type="dxa"/>
+            <w:left w:w="108" w:type="dxa"/>
+            <w:bottom w:w="0" w:type="dxa"/>
+            <w:right w:w="108" w:type="dxa"/>
+          </w:tblCellMar>
         </w:tblPrEx>
         <w:trPr>
           <w:cantSplit/>
@@ -8960,7 +9300,23 @@
           <w:rFonts w:hint="default"/>
           <w:lang w:val="en-NZ" w:eastAsia="zh-CN"/>
         </w:rPr>
-        <w:t>Overall, the results suggested that customers commonly purchase compatible charging accessories together with smartphones, highlighting a clear cross-selling opportunity for accessory recommendations.</w:t>
+        <w:t>Overall, the results suggested that</w:t>
+      </w:r>
+      <w:r>
+        <w:rPr>
+          <w:rFonts w:hint="default"/>
+          <w:b/>
+          <w:bCs/>
+          <w:lang w:val="en-NZ" w:eastAsia="zh-CN"/>
+        </w:rPr>
+        <w:t xml:space="preserve"> customers commonly purchase compatible charging accessories together with smartphones,</w:t>
+      </w:r>
+      <w:r>
+        <w:rPr>
+          <w:rFonts w:hint="default"/>
+          <w:lang w:val="en-NZ" w:eastAsia="zh-CN"/>
+        </w:rPr>
+        <w:t xml:space="preserve"> highlighting a clear cross-selling opportunity for accessory recommendations.</w:t>
       </w:r>
     </w:p>
     <w:p>
@@ -9088,27 +9444,49 @@
         <w:rPr>
           <w:rFonts w:hint="default"/>
         </w:rPr>
-        <w:t xml:space="preserve">), which were encoded using one-hot encoding. </w:t>
-      </w:r>
-      <w:r>
-        <w:rPr>
-          <w:rFonts w:hint="default"/>
+        <w:t xml:space="preserve">), which were encoded using </w:t>
+      </w:r>
+      <w:r>
+        <w:rPr>
+          <w:rFonts w:hint="eastAsia"/>
           <w:i/>
           <w:iCs/>
-        </w:rPr>
-        <w:t xml:space="preserve">Sales </w:t>
-      </w:r>
-      <w:r>
-        <w:rPr>
-          <w:rFonts w:hint="default"/>
-        </w:rPr>
-        <w:t>was used as the prediction target</w:t>
+          <w:lang w:val="en-US" w:eastAsia="zh-CN"/>
+        </w:rPr>
+        <w:t>Pandas</w:t>
       </w:r>
       <w:r>
         <w:rPr>
           <w:rFonts w:hint="eastAsia"/>
           <w:lang w:val="en-US" w:eastAsia="zh-CN"/>
         </w:rPr>
+        <w:t xml:space="preserve"> dummy</w:t>
+      </w:r>
+      <w:r>
+        <w:rPr>
+          <w:rFonts w:hint="default"/>
+        </w:rPr>
+        <w:t xml:space="preserve"> encoding. </w:t>
+      </w:r>
+      <w:r>
+        <w:rPr>
+          <w:rFonts w:hint="default"/>
+          <w:i/>
+          <w:iCs/>
+        </w:rPr>
+        <w:t xml:space="preserve">Sales </w:t>
+      </w:r>
+      <w:r>
+        <w:rPr>
+          <w:rFonts w:hint="default"/>
+        </w:rPr>
+        <w:t>was used as the prediction target</w:t>
+      </w:r>
+      <w:r>
+        <w:rPr>
+          <w:rFonts w:hint="eastAsia"/>
+          <w:lang w:val="en-US" w:eastAsia="zh-CN"/>
+        </w:rPr>
         <w:t xml:space="preserve"> (see Table VI.)</w:t>
       </w:r>
       <w:r>
@@ -9117,6 +9495,54 @@
         </w:rPr>
         <w:t>.</w:t>
       </w:r>
+    </w:p>
+    <w:p>
+      <w:pPr>
+        <w:pStyle w:val="7"/>
+        <w:rPr>
+          <w:rFonts w:hint="default"/>
+        </w:rPr>
+      </w:pPr>
+    </w:p>
+    <w:p>
+      <w:pPr>
+        <w:pStyle w:val="7"/>
+        <w:rPr>
+          <w:rFonts w:hint="default"/>
+        </w:rPr>
+      </w:pPr>
+    </w:p>
+    <w:p>
+      <w:pPr>
+        <w:pStyle w:val="7"/>
+        <w:rPr>
+          <w:rFonts w:hint="default"/>
+        </w:rPr>
+      </w:pPr>
+    </w:p>
+    <w:p>
+      <w:pPr>
+        <w:pStyle w:val="7"/>
+        <w:rPr>
+          <w:rFonts w:hint="default"/>
+        </w:rPr>
+      </w:pPr>
+    </w:p>
+    <w:p>
+      <w:pPr>
+        <w:pStyle w:val="7"/>
+        <w:rPr>
+          <w:rFonts w:hint="default"/>
+        </w:rPr>
+      </w:pPr>
+    </w:p>
+    <w:p>
+      <w:pPr>
+        <w:pStyle w:val="7"/>
+        <w:rPr>
+          <w:rFonts w:hint="default"/>
+        </w:rPr>
+      </w:pPr>
     </w:p>
     <w:p>
       <w:pPr>
@@ -9154,8 +9580,8 @@
       <w:tblGrid>
         <w:gridCol w:w="823"/>
         <w:gridCol w:w="959"/>
-        <w:gridCol w:w="1372"/>
-        <w:gridCol w:w="1684"/>
+        <w:gridCol w:w="1478"/>
+        <w:gridCol w:w="1578"/>
       </w:tblGrid>
       <w:tr>
         <w:tblPrEx>
@@ -9226,7 +9652,7 @@
         </w:tc>
         <w:tc>
           <w:tcPr>
-            <w:tcW w:w="1372" w:type="dxa"/>
+            <w:tcW w:w="1478" w:type="dxa"/>
             <w:vAlign w:val="center"/>
           </w:tcPr>
           <w:p>
@@ -9248,7 +9674,7 @@
         </w:tc>
         <w:tc>
           <w:tcPr>
-            <w:tcW w:w="1684" w:type="dxa"/>
+            <w:tcW w:w="1578" w:type="dxa"/>
             <w:vAlign w:val="center"/>
           </w:tcPr>
           <w:p>
@@ -9337,7 +9763,7 @@
         </w:tc>
         <w:tc>
           <w:tcPr>
-            <w:tcW w:w="1372" w:type="dxa"/>
+            <w:tcW w:w="1478" w:type="dxa"/>
             <w:vAlign w:val="center"/>
           </w:tcPr>
           <w:p>
@@ -9359,7 +9785,7 @@
         </w:tc>
         <w:tc>
           <w:tcPr>
-            <w:tcW w:w="1684" w:type="dxa"/>
+            <w:tcW w:w="1578" w:type="dxa"/>
             <w:vAlign w:val="center"/>
           </w:tcPr>
           <w:p>
@@ -9405,7 +9831,6 @@
           <w:tcPr>
             <w:tcW w:w="823" w:type="dxa"/>
             <w:vMerge w:val="continue"/>
-            <w:tcBorders/>
             <w:vAlign w:val="center"/>
           </w:tcPr>
           <w:p>
@@ -9442,7 +9867,7 @@
         </w:tc>
         <w:tc>
           <w:tcPr>
-            <w:tcW w:w="1372" w:type="dxa"/>
+            <w:tcW w:w="1478" w:type="dxa"/>
             <w:vAlign w:val="center"/>
           </w:tcPr>
           <w:p>
@@ -9464,7 +9889,7 @@
         </w:tc>
         <w:tc>
           <w:tcPr>
-            <w:tcW w:w="1684" w:type="dxa"/>
+            <w:tcW w:w="1578" w:type="dxa"/>
             <w:vAlign w:val="center"/>
           </w:tcPr>
           <w:p>
@@ -9514,7 +9939,6 @@
           <w:tcPr>
             <w:tcW w:w="823" w:type="dxa"/>
             <w:vMerge w:val="continue"/>
-            <w:tcBorders/>
             <w:vAlign w:val="center"/>
           </w:tcPr>
           <w:p>
@@ -9551,7 +9975,7 @@
         </w:tc>
         <w:tc>
           <w:tcPr>
-            <w:tcW w:w="1372" w:type="dxa"/>
+            <w:tcW w:w="1478" w:type="dxa"/>
             <w:vAlign w:val="center"/>
           </w:tcPr>
           <w:p>
@@ -9573,7 +9997,7 @@
         </w:tc>
         <w:tc>
           <w:tcPr>
-            <w:tcW w:w="1684" w:type="dxa"/>
+            <w:tcW w:w="1578" w:type="dxa"/>
             <w:vAlign w:val="center"/>
           </w:tcPr>
           <w:p>
@@ -9623,7 +10047,6 @@
           <w:tcPr>
             <w:tcW w:w="823" w:type="dxa"/>
             <w:vMerge w:val="continue"/>
-            <w:tcBorders/>
             <w:vAlign w:val="center"/>
           </w:tcPr>
           <w:p>
@@ -9660,7 +10083,7 @@
         </w:tc>
         <w:tc>
           <w:tcPr>
-            <w:tcW w:w="1372" w:type="dxa"/>
+            <w:tcW w:w="1478" w:type="dxa"/>
             <w:vAlign w:val="center"/>
           </w:tcPr>
           <w:p>
@@ -9692,13 +10115,13 @@
                 <w:rFonts w:hint="eastAsia"/>
                 <w:lang w:val="en-US" w:eastAsia="zh-CN"/>
               </w:rPr>
-              <w:t>(One-hot)</w:t>
-            </w:r>
-          </w:p>
-        </w:tc>
-        <w:tc>
-          <w:tcPr>
-            <w:tcW w:w="1684" w:type="dxa"/>
+              <w:t>Dummy encoded)</w:t>
+            </w:r>
+          </w:p>
+        </w:tc>
+        <w:tc>
+          <w:tcPr>
+            <w:tcW w:w="1578" w:type="dxa"/>
             <w:vAlign w:val="center"/>
           </w:tcPr>
           <w:p>
@@ -9744,7 +10167,6 @@
           <w:tcPr>
             <w:tcW w:w="823" w:type="dxa"/>
             <w:vMerge w:val="continue"/>
-            <w:tcBorders/>
             <w:vAlign w:val="center"/>
           </w:tcPr>
           <w:p>
@@ -9781,7 +10203,7 @@
         </w:tc>
         <w:tc>
           <w:tcPr>
-            <w:tcW w:w="1372" w:type="dxa"/>
+            <w:tcW w:w="1478" w:type="dxa"/>
             <w:vAlign w:val="center"/>
           </w:tcPr>
           <w:p>
@@ -9813,13 +10235,13 @@
                 <w:rFonts w:hint="eastAsia"/>
                 <w:lang w:val="en-US" w:eastAsia="zh-CN"/>
               </w:rPr>
-              <w:t>(One-hot)</w:t>
-            </w:r>
-          </w:p>
-        </w:tc>
-        <w:tc>
-          <w:tcPr>
-            <w:tcW w:w="1684" w:type="dxa"/>
+              <w:t>(Dummy encoded)</w:t>
+            </w:r>
+          </w:p>
+        </w:tc>
+        <w:tc>
+          <w:tcPr>
+            <w:tcW w:w="1578" w:type="dxa"/>
             <w:vAlign w:val="center"/>
           </w:tcPr>
           <w:p>
@@ -9893,30 +10315,36 @@
       </w:r>
       <w:r>
         <w:rPr>
+          <w:rFonts w:hint="default"/>
+          <w:lang w:val="en-US" w:eastAsia="zh-CN"/>
+        </w:rPr>
+        <w:t xml:space="preserve"> [1]</w:t>
+      </w:r>
+      <w:r>
+        <w:rPr>
+          <w:rFonts w:hint="default"/>
+        </w:rPr>
+        <w:t>. In contrast, Random Forest and XGBoost were trained using the original feature values, as tree-based models are insensitive to feature scaling</w:t>
+      </w:r>
+      <w:r>
+        <w:rPr>
           <w:rFonts w:hint="eastAsia"/>
-          <w:highlight w:val="yellow"/>
+          <w:highlight w:val="none"/>
           <w:lang w:val="en-US" w:eastAsia="zh-CN"/>
         </w:rPr>
-        <w:t xml:space="preserve"> (ref)</w:t>
-      </w:r>
-      <w:r>
-        <w:rPr>
-          <w:rFonts w:hint="default"/>
-        </w:rPr>
-        <w:t>. In contrast, Random Forest and XGBoost were trained using the original feature values, as tree-based models are insensitive to feature scaling</w:t>
-      </w:r>
-      <w:r>
-        <w:rPr>
-          <w:rFonts w:hint="eastAsia"/>
-          <w:highlight w:val="yellow"/>
+        <w:t xml:space="preserve"> </w:t>
+      </w:r>
+      <w:r>
+        <w:rPr>
+          <w:rFonts w:hint="default"/>
           <w:lang w:val="en-US" w:eastAsia="zh-CN"/>
         </w:rPr>
-        <w:t xml:space="preserve"> (ref)</w:t>
-      </w:r>
-      <w:r>
-        <w:rPr>
-          <w:rFonts w:hint="default"/>
-          <w:highlight w:val="yellow"/>
+        <w:t>[1]</w:t>
+      </w:r>
+      <w:r>
+        <w:rPr>
+          <w:rFonts w:hint="default"/>
+          <w:highlight w:val="none"/>
         </w:rPr>
         <w:t>.</w:t>
       </w:r>
@@ -9978,20 +10406,32 @@
         <w:rPr>
           <w:rFonts w:hint="default"/>
         </w:rPr>
-        <w:t>to illustrate various modelling techniques used in prediction of sales revenue. Linear Regression was chosen as an easily understandable baseline model. The Random Forest algorithm has been used as an example of bagging technique for modelling nonlinear relationships, while XGBoost was selected as a gradient boosting algorithm due to its strong predictive performance and widespread use in structured tabular data</w:t>
-      </w:r>
-      <w:r>
-        <w:rPr>
-          <w:rFonts w:hint="default"/>
-          <w:highlight w:val="yellow"/>
-          <w:lang w:val="en-NZ"/>
-        </w:rPr>
-        <w:t xml:space="preserve"> (ref)</w:t>
-      </w:r>
-      <w:r>
-        <w:rPr>
-          <w:rFonts w:hint="default"/>
-          <w:highlight w:val="yellow"/>
+        <w:t>to illustrate various modelling techniques used in prediction of sales revenue. Linear Regression was chosen as an easily understandable baseline model. The Random Forest algorithm has been used as an example of bagging technique for modelling nonlinear relationships</w:t>
+      </w:r>
+      <w:r>
+        <w:rPr>
+          <w:rFonts w:hint="eastAsia"/>
+          <w:lang w:val="en-US" w:eastAsia="zh-CN"/>
+        </w:rPr>
+        <w:t xml:space="preserve"> [5]</w:t>
+      </w:r>
+      <w:r>
+        <w:rPr>
+          <w:rFonts w:hint="default"/>
+        </w:rPr>
+        <w:t>, while XGBoost was selected as a gradient boosting algorithm due to its strong predictive performance and widespread use in structured tabular data</w:t>
+      </w:r>
+      <w:r>
+        <w:rPr>
+          <w:rFonts w:hint="eastAsia"/>
+          <w:lang w:val="en-US" w:eastAsia="zh-CN"/>
+        </w:rPr>
+        <w:t xml:space="preserve"> [6]</w:t>
+      </w:r>
+      <w:r>
+        <w:rPr>
+          <w:rFonts w:hint="default"/>
+          <w:highlight w:val="none"/>
         </w:rPr>
         <w:t>.</w:t>
       </w:r>
@@ -10687,6 +11127,11 @@
         </w:rPr>
         <w:t>Model Performance Comparison - Predicted v.s. Actual</w:t>
       </w:r>
+    </w:p>
+    <w:p>
+      <w:pPr>
+        <w:pStyle w:val="7"/>
+      </w:pPr>
       <w:r>
         <w:rPr>
           <w:rFonts w:hint="default"/>
@@ -10695,13 +11140,13 @@
         <mc:AlternateContent>
           <mc:Choice Requires="wps">
             <w:drawing>
-              <wp:anchor distT="0" distB="0" distL="114300" distR="114300" simplePos="0" relativeHeight="251666432" behindDoc="1" locked="0" layoutInCell="1" allowOverlap="1">
+              <wp:anchor distT="0" distB="0" distL="114300" distR="114300" simplePos="0" relativeHeight="251665408" behindDoc="1" locked="0" layoutInCell="1" allowOverlap="1">
                 <wp:simplePos x="0" y="0"/>
                 <wp:positionH relativeFrom="margin">
-                  <wp:posOffset>-61595</wp:posOffset>
+                  <wp:posOffset>3286125</wp:posOffset>
                 </wp:positionH>
                 <wp:positionV relativeFrom="paragraph">
-                  <wp:posOffset>280670</wp:posOffset>
+                  <wp:posOffset>18415</wp:posOffset>
                 </wp:positionV>
                 <wp:extent cx="3265805" cy="1299845"/>
                 <wp:effectExtent l="0" t="0" r="3175" b="4445"/>
@@ -10769,7 +11214,7 @@
                               <w:drawing>
                                 <wp:inline distT="0" distB="0" distL="114300" distR="114300">
                                   <wp:extent cx="3095625" cy="1110615"/>
-                                  <wp:effectExtent l="0" t="0" r="0" b="3810"/>
+                                  <wp:effectExtent l="9525" t="9525" r="15240" b="10795"/>
                                   <wp:docPr id="24" name="图片 24" descr="Figure8_predicted_vs_actual_model_comparison"/>
                                   <wp:cNvGraphicFramePr>
                                     <a:graphicFrameLocks xmlns:a="http://schemas.openxmlformats.org/drawingml/2006/main" noChangeAspect="1"/>
@@ -10784,7 +11229,7 @@
                                           </pic:cNvPicPr>
                                         </pic:nvPicPr>
                                         <pic:blipFill>
-                                          <a:blip r:embed="rId12"/>
+                                          <a:blip r:embed="rId11"/>
                                           <a:stretch>
                                             <a:fillRect/>
                                           </a:stretch>
@@ -10797,6 +11242,14 @@
                                           <a:prstGeom prst="rect">
                                             <a:avLst/>
                                           </a:prstGeom>
+                                          <a:ln w="6350">
+                                            <a:solidFill>
+                                              <a:schemeClr val="tx1">
+                                                <a:lumMod val="50000"/>
+                                                <a:lumOff val="50000"/>
+                                              </a:schemeClr>
+                                            </a:solidFill>
+                                          </a:ln>
                                         </pic:spPr>
                                       </pic:pic>
                                     </a:graphicData>
@@ -10818,7 +11271,7 @@
           </mc:Choice>
           <mc:Fallback>
             <w:pict>
-              <v:rect id="Text Box 8" o:spid="_x0000_s1026" o:spt="1" style="position:absolute;left:0pt;margin-left:-4.85pt;margin-top:22.1pt;height:102.35pt;width:257.15pt;mso-position-horizontal-relative:margin;mso-wrap-distance-left:9pt;mso-wrap-distance-right:9pt;z-index:-251650048;mso-width-relative:page;mso-height-relative:page;" fillcolor="#FFFFFF" filled="t" stroked="f" coordsize="21600,21600" wrapcoords="0 0 0 20988 21020 20988 21020 0 0 0" o:gfxdata="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">
+              <v:rect id="Text Box 8" o:spid="_x0000_s1026" o:spt="1" style="position:absolute;left:0pt;margin-left:258.75pt;margin-top:1.45pt;height:102.35pt;width:257.15pt;mso-position-horizontal-relative:margin;mso-wrap-distance-left:9pt;mso-wrap-distance-right:9pt;z-index:-251651072;mso-width-relative:page;mso-height-relative:page;" fillcolor="#FFFFFF" filled="t" stroked="f" coordsize="21600,21600" wrapcoords="0 0 0 20988 21020 20988 21020 0 0 0" o:gfxdata="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">
                 <v:fill on="t" focussize="0,0"/>
                 <v:stroke on="f" miterlimit="8" joinstyle="miter"/>
                 <v:imagedata o:title=""/>
@@ -10854,7 +11307,7 @@
                         <w:drawing>
                           <wp:inline distT="0" distB="0" distL="114300" distR="114300">
                             <wp:extent cx="3095625" cy="1110615"/>
-                            <wp:effectExtent l="0" t="0" r="0" b="3810"/>
+                            <wp:effectExtent l="9525" t="9525" r="15240" b="10795"/>
                             <wp:docPr id="24" name="图片 24" descr="Figure8_predicted_vs_actual_model_comparison"/>
                             <wp:cNvGraphicFramePr>
                               <a:graphicFrameLocks xmlns:a="http://schemas.openxmlformats.org/drawingml/2006/main" noChangeAspect="1"/>
@@ -10869,7 +11322,7 @@
                                     </pic:cNvPicPr>
                                   </pic:nvPicPr>
                                   <pic:blipFill>
-                                    <a:blip r:embed="rId12"/>
+                                    <a:blip r:embed="rId11"/>
                                     <a:stretch>
                                       <a:fillRect/>
                                     </a:stretch>
@@ -10882,6 +11335,14 @@
                                     <a:prstGeom prst="rect">
                                       <a:avLst/>
                                     </a:prstGeom>
+                                    <a:ln w="6350">
+                                      <a:solidFill>
+                                        <a:schemeClr val="tx1">
+                                          <a:lumMod val="50000"/>
+                                          <a:lumOff val="50000"/>
+                                        </a:schemeClr>
+                                      </a:solidFill>
+                                    </a:ln>
                                   </pic:spPr>
                                 </pic:pic>
                               </a:graphicData>
@@ -10898,11 +11359,6 @@
           </mc:Fallback>
         </mc:AlternateContent>
       </w:r>
-    </w:p>
-    <w:p>
-      <w:pPr>
-        <w:pStyle w:val="7"/>
-      </w:pPr>
       <w:r>
         <w:t>Fig</w:t>
       </w:r>
@@ -10954,9 +11410,32 @@
       <w:r>
         <w:rPr>
           <w:rFonts w:hint="default"/>
+          <w:b/>
+          <w:bCs/>
           <w:lang w:val="zh-CN" w:eastAsia="zh-CN"/>
         </w:rPr>
-        <w:t>Since XGBoost achieved the best predictive performance among the three models, its feature importance was used as the primary basis for interpreting which variables contributed most to sales prediction. Feature importance from Linear Regression and Random Forest is presented for comparison to evaluate the consistency of the findings across different modelling approaches.</w:t>
+        <w:t xml:space="preserve">Since XGBoost achieved the best predictive performance among the three models, its feature importance was used as the primary basis </w:t>
+      </w:r>
+      <w:r>
+        <w:rPr>
+          <w:rFonts w:hint="default"/>
+          <w:lang w:val="zh-CN" w:eastAsia="zh-CN"/>
+        </w:rPr>
+        <w:t xml:space="preserve">for interpreting which variables contributed most to sales prediction. Feature importance from Linear Regression and Random Forest </w:t>
+      </w:r>
+      <w:r>
+        <w:rPr>
+          <w:rFonts w:hint="eastAsia"/>
+          <w:lang w:val="en-US" w:eastAsia="zh-CN"/>
+        </w:rPr>
+        <w:t>was also</w:t>
+      </w:r>
+      <w:r>
+        <w:rPr>
+          <w:rFonts w:hint="default"/>
+          <w:lang w:val="zh-CN" w:eastAsia="zh-CN"/>
+        </w:rPr>
+        <w:t xml:space="preserve"> presented for comparison to evaluate the consistency of the findings across different modelling approaches.</w:t>
       </w:r>
     </w:p>
     <w:p>
@@ -10971,7 +11450,16 @@
           <w:rFonts w:hint="default"/>
           <w:lang w:val="en-NZ" w:eastAsia="zh-CN"/>
         </w:rPr>
-        <w:t>Although there were differences in the algorithms, all three models consistently identified product-related variables as the dominant predictors of sales revenue</w:t>
+        <w:t xml:space="preserve">Although there were differences in the algorithms, all three models consistently identified </w:t>
+      </w:r>
+      <w:r>
+        <w:rPr>
+          <w:rFonts w:hint="default"/>
+          <w:b/>
+          <w:bCs/>
+          <w:lang w:val="en-NZ" w:eastAsia="zh-CN"/>
+        </w:rPr>
+        <w:t>product-related variables as the dominant predictors of sales revenue</w:t>
       </w:r>
       <w:r>
         <w:rPr>
@@ -11000,13 +11488,13 @@
         <mc:AlternateContent>
           <mc:Choice Requires="wps">
             <w:drawing>
-              <wp:anchor distT="0" distB="0" distL="114300" distR="114300" simplePos="0" relativeHeight="251667456" behindDoc="1" locked="0" layoutInCell="1" allowOverlap="1">
+              <wp:anchor distT="0" distB="0" distL="114300" distR="114300" simplePos="0" relativeHeight="251666432" behindDoc="1" locked="0" layoutInCell="1" allowOverlap="1">
                 <wp:simplePos x="0" y="0"/>
                 <wp:positionH relativeFrom="margin">
-                  <wp:posOffset>-61595</wp:posOffset>
+                  <wp:posOffset>3332480</wp:posOffset>
                 </wp:positionH>
                 <wp:positionV relativeFrom="paragraph">
-                  <wp:posOffset>280670</wp:posOffset>
+                  <wp:posOffset>154940</wp:posOffset>
                 </wp:positionV>
                 <wp:extent cx="3265805" cy="1299845"/>
                 <wp:effectExtent l="0" t="0" r="3175" b="4445"/>
@@ -11073,8 +11561,8 @@
                               </w:rPr>
                               <w:drawing>
                                 <wp:inline distT="0" distB="0" distL="114300" distR="114300">
-                                  <wp:extent cx="3060700" cy="1207770"/>
-                                  <wp:effectExtent l="0" t="0" r="1905" b="5715"/>
+                                  <wp:extent cx="3060700" cy="1178560"/>
+                                  <wp:effectExtent l="9525" t="9525" r="17145" b="17145"/>
                                   <wp:docPr id="27" name="图片 27" descr="Figure9_Top10LinearRegressionCoeefficients"/>
                                   <wp:cNvGraphicFramePr>
                                     <a:graphicFrameLocks xmlns:a="http://schemas.openxmlformats.org/drawingml/2006/main" noChangeAspect="1"/>
@@ -11089,7 +11577,7 @@
                                           </pic:cNvPicPr>
                                         </pic:nvPicPr>
                                         <pic:blipFill>
-                                          <a:blip r:embed="rId13"/>
+                                          <a:blip r:embed="rId12"/>
                                           <a:stretch>
                                             <a:fillRect/>
                                           </a:stretch>
@@ -11097,11 +11585,19 @@
                                         <pic:spPr>
                                           <a:xfrm>
                                             <a:off x="0" y="0"/>
-                                            <a:ext cx="3060700" cy="1207770"/>
+                                            <a:ext cx="3060700" cy="1178560"/>
                                           </a:xfrm>
                                           <a:prstGeom prst="rect">
                                             <a:avLst/>
                                           </a:prstGeom>
+                                          <a:ln w="6350">
+                                            <a:solidFill>
+                                              <a:schemeClr val="tx1">
+                                                <a:lumMod val="50000"/>
+                                                <a:lumOff val="50000"/>
+                                              </a:schemeClr>
+                                            </a:solidFill>
+                                          </a:ln>
                                         </pic:spPr>
                                       </pic:pic>
                                     </a:graphicData>
@@ -11123,7 +11619,7 @@
           </mc:Choice>
           <mc:Fallback>
             <w:pict>
-              <v:rect id="Text Box 8" o:spid="_x0000_s1026" o:spt="1" style="position:absolute;left:0pt;margin-left:-4.85pt;margin-top:22.1pt;height:102.35pt;width:257.15pt;mso-position-horizontal-relative:margin;mso-wrap-distance-left:9pt;mso-wrap-distance-right:9pt;z-index:-251649024;mso-width-relative:page;mso-height-relative:page;" fillcolor="#FFFFFF" filled="t" stroked="f" coordsize="21600,21600" wrapcoords="0 0 0 20988 21020 20988 21020 0 0 0" o:gfxdata="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">
+              <v:rect id="Text Box 8" o:spid="_x0000_s1026" o:spt="1" style="position:absolute;left:0pt;margin-left:262.4pt;margin-top:12.2pt;height:102.35pt;width:257.15pt;mso-position-horizontal-relative:margin;mso-wrap-distance-left:9pt;mso-wrap-distance-right:9pt;z-index:-251650048;mso-width-relative:page;mso-height-relative:page;" fillcolor="#FFFFFF" filled="t" stroked="f" coordsize="21600,21600" wrapcoords="0 0 0 20988 21020 20988 21020 0 0 0" o:gfxdata="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">
                 <v:fill on="t" focussize="0,0"/>
                 <v:stroke on="f" miterlimit="8" joinstyle="miter"/>
                 <v:imagedata o:title=""/>
@@ -11158,8 +11654,8 @@
                         </w:rPr>
                         <w:drawing>
                           <wp:inline distT="0" distB="0" distL="114300" distR="114300">
-                            <wp:extent cx="3060700" cy="1207770"/>
-                            <wp:effectExtent l="0" t="0" r="1905" b="5715"/>
+                            <wp:extent cx="3060700" cy="1178560"/>
+                            <wp:effectExtent l="9525" t="9525" r="17145" b="17145"/>
                             <wp:docPr id="27" name="图片 27" descr="Figure9_Top10LinearRegressionCoeefficients"/>
                             <wp:cNvGraphicFramePr>
                               <a:graphicFrameLocks xmlns:a="http://schemas.openxmlformats.org/drawingml/2006/main" noChangeAspect="1"/>
@@ -11174,7 +11670,7 @@
                                     </pic:cNvPicPr>
                                   </pic:nvPicPr>
                                   <pic:blipFill>
-                                    <a:blip r:embed="rId13"/>
+                                    <a:blip r:embed="rId12"/>
                                     <a:stretch>
                                       <a:fillRect/>
                                     </a:stretch>
@@ -11182,11 +11678,19 @@
                                   <pic:spPr>
                                     <a:xfrm>
                                       <a:off x="0" y="0"/>
-                                      <a:ext cx="3060700" cy="1207770"/>
+                                      <a:ext cx="3060700" cy="1178560"/>
                                     </a:xfrm>
                                     <a:prstGeom prst="rect">
                                       <a:avLst/>
                                     </a:prstGeom>
+                                    <a:ln w="6350">
+                                      <a:solidFill>
+                                        <a:schemeClr val="tx1">
+                                          <a:lumMod val="50000"/>
+                                          <a:lumOff val="50000"/>
+                                        </a:schemeClr>
+                                      </a:solidFill>
+                                    </a:ln>
                                   </pic:spPr>
                                 </pic:pic>
                               </a:graphicData>
@@ -11217,16 +11721,23 @@
       </w:pPr>
       <w:r>
         <w:rPr>
-          <w:rFonts w:hint="default"/>
-          <w:lang w:val="zh-CN" w:eastAsia="zh-CN"/>
-        </w:rPr>
-        <w:t>As shown in Fig</w:t>
-      </w:r>
-      <w:r>
-        <w:rPr>
           <w:rFonts w:hint="eastAsia"/>
           <w:lang w:val="en-US" w:eastAsia="zh-CN"/>
         </w:rPr>
+        <w:t xml:space="preserve">According to </w:t>
+      </w:r>
+      <w:r>
+        <w:rPr>
+          <w:rFonts w:hint="default"/>
+          <w:lang w:val="zh-CN" w:eastAsia="zh-CN"/>
+        </w:rPr>
+        <w:t>Fig</w:t>
+      </w:r>
+      <w:r>
+        <w:rPr>
+          <w:rFonts w:hint="eastAsia"/>
+          <w:lang w:val="en-US" w:eastAsia="zh-CN"/>
+        </w:rPr>
         <w:t xml:space="preserve">. </w:t>
       </w:r>
       <w:r>
@@ -11234,7 +11745,14 @@
           <w:rFonts w:hint="default"/>
           <w:lang w:val="zh-CN" w:eastAsia="zh-CN"/>
         </w:rPr>
-        <w:t xml:space="preserve">11, </w:t>
+        <w:t>11</w:t>
+      </w:r>
+      <w:r>
+        <w:rPr>
+          <w:rFonts w:hint="eastAsia"/>
+          <w:lang w:val="en-US" w:eastAsia="zh-CN"/>
+        </w:rPr>
+        <w:t xml:space="preserve">, </w:t>
       </w:r>
       <w:r>
         <w:rPr>
@@ -11370,14 +11888,14 @@
           <w:rFonts w:hint="default"/>
           <w:lang w:val="zh-CN" w:eastAsia="zh-CN"/>
         </w:rPr>
-        <w:t>and place</w:t>
+        <w:t xml:space="preserve">and </w:t>
       </w:r>
       <w:r>
         <w:rPr>
           <w:rFonts w:hint="eastAsia"/>
           <w:lang w:val="en-US" w:eastAsia="zh-CN"/>
         </w:rPr>
-        <w:t xml:space="preserve"> (</w:t>
+        <w:t>location (</w:t>
       </w:r>
       <w:r>
         <w:rPr>
@@ -11415,13 +11933,13 @@
         <mc:AlternateContent>
           <mc:Choice Requires="wps">
             <w:drawing>
-              <wp:anchor distT="0" distB="0" distL="114300" distR="114300" simplePos="0" relativeHeight="251668480" behindDoc="1" locked="0" layoutInCell="1" allowOverlap="1">
+              <wp:anchor distT="0" distB="0" distL="114300" distR="114300" simplePos="0" relativeHeight="251667456" behindDoc="1" locked="0" layoutInCell="1" allowOverlap="1">
                 <wp:simplePos x="0" y="0"/>
                 <wp:positionH relativeFrom="margin">
-                  <wp:posOffset>3376295</wp:posOffset>
+                  <wp:posOffset>-154305</wp:posOffset>
                 </wp:positionH>
                 <wp:positionV relativeFrom="paragraph">
-                  <wp:posOffset>224155</wp:posOffset>
+                  <wp:posOffset>151130</wp:posOffset>
                 </wp:positionV>
                 <wp:extent cx="3265805" cy="1299845"/>
                 <wp:effectExtent l="0" t="0" r="3175" b="4445"/>
@@ -11488,8 +12006,8 @@
                               </w:rPr>
                               <w:drawing>
                                 <wp:inline distT="0" distB="0" distL="114300" distR="114300">
-                                  <wp:extent cx="3089910" cy="1197610"/>
-                                  <wp:effectExtent l="0" t="0" r="5715" b="7620"/>
+                                  <wp:extent cx="3089910" cy="1179195"/>
+                                  <wp:effectExtent l="9525" t="9525" r="12700" b="16510"/>
                                   <wp:docPr id="30" name="图片 30" descr="Figure10_Top10ImportantFeatures-RF"/>
                                   <wp:cNvGraphicFramePr>
                                     <a:graphicFrameLocks xmlns:a="http://schemas.openxmlformats.org/drawingml/2006/main" noChangeAspect="1"/>
@@ -11504,7 +12022,7 @@
                                           </pic:cNvPicPr>
                                         </pic:nvPicPr>
                                         <pic:blipFill>
-                                          <a:blip r:embed="rId14"/>
+                                          <a:blip r:embed="rId13"/>
                                           <a:stretch>
                                             <a:fillRect/>
                                           </a:stretch>
@@ -11512,11 +12030,16 @@
                                         <pic:spPr>
                                           <a:xfrm>
                                             <a:off x="0" y="0"/>
-                                            <a:ext cx="3089910" cy="1197610"/>
+                                            <a:ext cx="3089910" cy="1179195"/>
                                           </a:xfrm>
                                           <a:prstGeom prst="rect">
                                             <a:avLst/>
                                           </a:prstGeom>
+                                          <a:ln w="6350">
+                                            <a:solidFill>
+                                              <a:schemeClr val="tx1"/>
+                                            </a:solidFill>
+                                          </a:ln>
                                         </pic:spPr>
                                       </pic:pic>
                                     </a:graphicData>
@@ -11538,7 +12061,7 @@
           </mc:Choice>
           <mc:Fallback>
             <w:pict>
-              <v:rect id="Text Box 8" o:spid="_x0000_s1026" o:spt="1" style="position:absolute;left:0pt;margin-left:265.85pt;margin-top:17.65pt;height:102.35pt;width:257.15pt;mso-position-horizontal-relative:margin;mso-wrap-distance-left:9pt;mso-wrap-distance-right:9pt;z-index:-251648000;mso-width-relative:page;mso-height-relative:page;" fillcolor="#FFFFFF" filled="t" stroked="f" coordsize="21600,21600" wrapcoords="0 0 0 20988 21020 20988 21020 0 0 0" o:gfxdata="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">
+              <v:rect id="Text Box 8" o:spid="_x0000_s1026" o:spt="1" style="position:absolute;left:0pt;margin-left:-12.15pt;margin-top:11.9pt;height:102.35pt;width:257.15pt;mso-position-horizontal-relative:margin;mso-wrap-distance-left:9pt;mso-wrap-distance-right:9pt;z-index:-251649024;mso-width-relative:page;mso-height-relative:page;" fillcolor="#FFFFFF" filled="t" stroked="f" coordsize="21600,21600" wrapcoords="0 0 0 20988 21020 20988 21020 0 0 0" o:gfxdata="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">
                 <v:fill on="t" focussize="0,0"/>
                 <v:stroke on="f" miterlimit="8" joinstyle="miter"/>
                 <v:imagedata o:title=""/>
@@ -11573,8 +12096,8 @@
                         </w:rPr>
                         <w:drawing>
                           <wp:inline distT="0" distB="0" distL="114300" distR="114300">
-                            <wp:extent cx="3089910" cy="1197610"/>
-                            <wp:effectExtent l="0" t="0" r="5715" b="7620"/>
+                            <wp:extent cx="3089910" cy="1179195"/>
+                            <wp:effectExtent l="9525" t="9525" r="12700" b="16510"/>
                             <wp:docPr id="30" name="图片 30" descr="Figure10_Top10ImportantFeatures-RF"/>
                             <wp:cNvGraphicFramePr>
                               <a:graphicFrameLocks xmlns:a="http://schemas.openxmlformats.org/drawingml/2006/main" noChangeAspect="1"/>
@@ -11589,7 +12112,7 @@
                                     </pic:cNvPicPr>
                                   </pic:nvPicPr>
                                   <pic:blipFill>
-                                    <a:blip r:embed="rId14"/>
+                                    <a:blip r:embed="rId13"/>
                                     <a:stretch>
                                       <a:fillRect/>
                                     </a:stretch>
@@ -11597,11 +12120,16 @@
                                   <pic:spPr>
                                     <a:xfrm>
                                       <a:off x="0" y="0"/>
-                                      <a:ext cx="3089910" cy="1197610"/>
+                                      <a:ext cx="3089910" cy="1179195"/>
                                     </a:xfrm>
                                     <a:prstGeom prst="rect">
                                       <a:avLst/>
                                     </a:prstGeom>
+                                    <a:ln w="6350">
+                                      <a:solidFill>
+                                        <a:schemeClr val="tx1"/>
+                                      </a:solidFill>
+                                    </a:ln>
                                   </pic:spPr>
                                 </pic:pic>
                               </a:graphicData>
@@ -11628,44 +12156,6 @@
     </w:p>
     <w:p>
       <w:pPr>
-        <w:pStyle w:val="7"/>
-      </w:pPr>
-      <w:r>
-        <w:t xml:space="preserve">Similar </w:t>
-      </w:r>
-      <w:r>
-        <w:rPr>
-          <w:rFonts w:hint="eastAsia"/>
-          <w:lang w:val="en-US" w:eastAsia="zh-CN"/>
-        </w:rPr>
-        <w:t>patterns</w:t>
-      </w:r>
-      <w:r>
-        <w:t xml:space="preserve"> were observed in both Linear Regression coefficients (Fig</w:t>
-      </w:r>
-      <w:r>
-        <w:rPr>
-          <w:rFonts w:hint="eastAsia"/>
-          <w:lang w:val="en-US" w:eastAsia="zh-CN"/>
-        </w:rPr>
-        <w:t>.</w:t>
-      </w:r>
-      <w:r>
-        <w:t xml:space="preserve"> 9) and Random Forest feature importance (Fi</w:t>
-      </w:r>
-      <w:r>
-        <w:rPr>
-          <w:rFonts w:hint="eastAsia"/>
-          <w:lang w:val="en-US" w:eastAsia="zh-CN"/>
-        </w:rPr>
-        <w:t>g.</w:t>
-      </w:r>
-      <w:r>
-        <w:t xml:space="preserve"> 10), where premium laptop and smartphone products consistently appeared among the most influential variables. This consistency increases confidence that the identified features genuinely contribute to sales prediction rather than being artefacts of a particular modelling algorithm.</w:t>
-      </w:r>
-    </w:p>
-    <w:p>
-      <w:pPr>
         <w:pStyle w:val="20"/>
       </w:pPr>
       <w:r>
@@ -11676,13 +12166,13 @@
         <mc:AlternateContent>
           <mc:Choice Requires="wps">
             <w:drawing>
-              <wp:anchor distT="0" distB="0" distL="114300" distR="114300" simplePos="0" relativeHeight="251669504" behindDoc="1" locked="0" layoutInCell="1" allowOverlap="1">
+              <wp:anchor distT="0" distB="0" distL="114300" distR="114300" simplePos="0" relativeHeight="251668480" behindDoc="1" locked="0" layoutInCell="1" allowOverlap="1">
                 <wp:simplePos x="0" y="0"/>
                 <wp:positionH relativeFrom="margin">
-                  <wp:posOffset>3376295</wp:posOffset>
+                  <wp:posOffset>-120650</wp:posOffset>
                 </wp:positionH>
                 <wp:positionV relativeFrom="paragraph">
-                  <wp:posOffset>224155</wp:posOffset>
+                  <wp:posOffset>1470660</wp:posOffset>
                 </wp:positionV>
                 <wp:extent cx="3265805" cy="1299845"/>
                 <wp:effectExtent l="0" t="0" r="3175" b="4445"/>
@@ -11749,8 +12239,8 @@
                               </w:rPr>
                               <w:drawing>
                                 <wp:inline distT="0" distB="0" distL="114300" distR="114300">
-                                  <wp:extent cx="3093720" cy="1195705"/>
-                                  <wp:effectExtent l="0" t="0" r="1905" b="1270"/>
+                                  <wp:extent cx="3093720" cy="1163320"/>
+                                  <wp:effectExtent l="9525" t="9525" r="17145" b="15875"/>
                                   <wp:docPr id="33" name="图片 33" descr="Figure11_Top10ImportantFeatures-XGB"/>
                                   <wp:cNvGraphicFramePr>
                                     <a:graphicFrameLocks xmlns:a="http://schemas.openxmlformats.org/drawingml/2006/main" noChangeAspect="1"/>
@@ -11765,7 +12255,7 @@
                                           </pic:cNvPicPr>
                                         </pic:nvPicPr>
                                         <pic:blipFill>
-                                          <a:blip r:embed="rId15"/>
+                                          <a:blip r:embed="rId14"/>
                                           <a:stretch>
                                             <a:fillRect/>
                                           </a:stretch>
@@ -11773,11 +12263,19 @@
                                         <pic:spPr>
                                           <a:xfrm>
                                             <a:off x="0" y="0"/>
-                                            <a:ext cx="3093720" cy="1195705"/>
+                                            <a:ext cx="3093720" cy="1163320"/>
                                           </a:xfrm>
                                           <a:prstGeom prst="rect">
                                             <a:avLst/>
                                           </a:prstGeom>
+                                          <a:ln w="6350">
+                                            <a:solidFill>
+                                              <a:schemeClr val="tx1">
+                                                <a:lumMod val="50000"/>
+                                                <a:lumOff val="50000"/>
+                                              </a:schemeClr>
+                                            </a:solidFill>
+                                          </a:ln>
                                         </pic:spPr>
                                       </pic:pic>
                                     </a:graphicData>
@@ -11799,7 +12297,7 @@
           </mc:Choice>
           <mc:Fallback>
             <w:pict>
-              <v:rect id="Text Box 8" o:spid="_x0000_s1026" o:spt="1" style="position:absolute;left:0pt;margin-left:265.85pt;margin-top:17.65pt;height:102.35pt;width:257.15pt;mso-position-horizontal-relative:margin;mso-wrap-distance-left:9pt;mso-wrap-distance-right:9pt;z-index:-251646976;mso-width-relative:page;mso-height-relative:page;" fillcolor="#FFFFFF" filled="t" stroked="f" coordsize="21600,21600" wrapcoords="0 0 0 20988 21020 20988 21020 0 0 0" o:gfxdata="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">
+              <v:rect id="Text Box 8" o:spid="_x0000_s1026" o:spt="1" style="position:absolute;left:0pt;margin-left:-9.5pt;margin-top:115.8pt;height:102.35pt;width:257.15pt;mso-position-horizontal-relative:margin;mso-wrap-distance-left:9pt;mso-wrap-distance-right:9pt;z-index:-251648000;mso-width-relative:page;mso-height-relative:page;" fillcolor="#FFFFFF" filled="t" stroked="f" coordsize="21600,21600" wrapcoords="0 0 0 20988 21020 20988 21020 0 0 0" o:gfxdata="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">
                 <v:fill on="t" focussize="0,0"/>
                 <v:stroke on="f" miterlimit="8" joinstyle="miter"/>
                 <v:imagedata o:title=""/>
@@ -11834,8 +12332,8 @@
                         </w:rPr>
                         <w:drawing>
                           <wp:inline distT="0" distB="0" distL="114300" distR="114300">
-                            <wp:extent cx="3093720" cy="1195705"/>
-                            <wp:effectExtent l="0" t="0" r="1905" b="1270"/>
+                            <wp:extent cx="3093720" cy="1163320"/>
+                            <wp:effectExtent l="9525" t="9525" r="17145" b="15875"/>
                             <wp:docPr id="33" name="图片 33" descr="Figure11_Top10ImportantFeatures-XGB"/>
                             <wp:cNvGraphicFramePr>
                               <a:graphicFrameLocks xmlns:a="http://schemas.openxmlformats.org/drawingml/2006/main" noChangeAspect="1"/>
@@ -11850,7 +12348,7 @@
                                     </pic:cNvPicPr>
                                   </pic:nvPicPr>
                                   <pic:blipFill>
-                                    <a:blip r:embed="rId15"/>
+                                    <a:blip r:embed="rId14"/>
                                     <a:stretch>
                                       <a:fillRect/>
                                     </a:stretch>
@@ -11858,11 +12356,19 @@
                                   <pic:spPr>
                                     <a:xfrm>
                                       <a:off x="0" y="0"/>
-                                      <a:ext cx="3093720" cy="1195705"/>
+                                      <a:ext cx="3093720" cy="1163320"/>
                                     </a:xfrm>
                                     <a:prstGeom prst="rect">
                                       <a:avLst/>
                                     </a:prstGeom>
+                                    <a:ln w="6350">
+                                      <a:solidFill>
+                                        <a:schemeClr val="tx1">
+                                          <a:lumMod val="50000"/>
+                                          <a:lumOff val="50000"/>
+                                        </a:schemeClr>
+                                      </a:solidFill>
+                                    </a:ln>
                                   </pic:spPr>
                                 </pic:pic>
                               </a:graphicData>
@@ -11892,34 +12398,37 @@
         <w:pStyle w:val="7"/>
       </w:pPr>
       <w:r>
+        <w:t xml:space="preserve">Similar </w:t>
+      </w:r>
+      <w:r>
         <w:rPr>
           <w:rFonts w:hint="eastAsia"/>
           <w:lang w:val="en-US" w:eastAsia="zh-CN"/>
         </w:rPr>
-        <w:t>By referring to the EDA, t</w:t>
-      </w:r>
-      <w:r>
-        <w:t xml:space="preserve">he dominance of product-related variables is </w:t>
+        <w:t>patterns</w:t>
+      </w:r>
+      <w:r>
+        <w:t xml:space="preserve"> were observed in both Linear Regression coefficients (Fig</w:t>
       </w:r>
       <w:r>
         <w:rPr>
           <w:rFonts w:hint="eastAsia"/>
           <w:lang w:val="en-US" w:eastAsia="zh-CN"/>
         </w:rPr>
-        <w:t xml:space="preserve">actually </w:t>
-      </w:r>
-      <w:r>
-        <w:t xml:space="preserve">expected </w:t>
+        <w:t>.</w:t>
+      </w:r>
+      <w:r>
+        <w:t xml:space="preserve"> 9) and Random Forest feature importance (Fi</w:t>
       </w:r>
       <w:r>
         <w:rPr>
           <w:rFonts w:hint="eastAsia"/>
           <w:lang w:val="en-US" w:eastAsia="zh-CN"/>
         </w:rPr>
-        <w:t>as</w:t>
-      </w:r>
-      <w:r>
-        <w:t xml:space="preserve"> each product has a fixed selling price. Consequently, product identity implicitly captures much of the pricing information, making it the strongest predictor of sales revenue.</w:t>
+        <w:t>g.</w:t>
+      </w:r>
+      <w:r>
+        <w:t xml:space="preserve"> 10), where premium laptop and smartphone products consistently appeared among the most influential variables. This consistency increases confidence that the identified features genuinely contribute to sales prediction rather than being artefacts of a particular modelling algorithm.</w:t>
       </w:r>
     </w:p>
     <w:p>
@@ -11931,65 +12440,87 @@
           <w:rFonts w:hint="eastAsia"/>
           <w:lang w:val="en-US" w:eastAsia="zh-CN"/>
         </w:rPr>
-        <w:t>Overall, t</w:t>
-      </w:r>
-      <w:r>
-        <w:rPr>
-          <w:rFonts w:hint="default"/>
-        </w:rPr>
-        <w:t>hese findings suggest that businesses should prioritise inventory planning and promotional activities for high-value products. Combined with the association rule analysis, the results also highlight opportunities for cross-selling complementary accessories with premium electronic devices.</w:t>
+        <w:t>By referring to the EDA, t</w:t>
+      </w:r>
+      <w:r>
+        <w:t xml:space="preserve">he dominance of product-related variables is </w:t>
+      </w:r>
+      <w:r>
+        <w:rPr>
+          <w:rFonts w:hint="eastAsia"/>
+          <w:lang w:val="en-US" w:eastAsia="zh-CN"/>
+        </w:rPr>
+        <w:t xml:space="preserve">actually </w:t>
+      </w:r>
+      <w:r>
+        <w:t xml:space="preserve">expected </w:t>
+      </w:r>
+      <w:r>
+        <w:rPr>
+          <w:rFonts w:hint="eastAsia"/>
+          <w:lang w:val="en-US" w:eastAsia="zh-CN"/>
+        </w:rPr>
+        <w:t>as</w:t>
+      </w:r>
+      <w:r>
+        <w:t xml:space="preserve"> each product has a fixed selling price. Consequently, product identity implicitly captures much of the pricing information, making it the strongest predictor of sales revenue.</w:t>
       </w:r>
     </w:p>
     <w:p>
       <w:pPr>
-        <w:pStyle w:val="2"/>
+        <w:pStyle w:val="7"/>
       </w:pPr>
       <w:r>
         <w:rPr>
           <w:rFonts w:hint="eastAsia"/>
           <w:lang w:val="en-US" w:eastAsia="zh-CN"/>
         </w:rPr>
-        <w:t>Discussion</w:t>
+        <w:t>Overall, t</w:t>
+      </w:r>
+      <w:r>
+        <w:rPr>
+          <w:rFonts w:hint="default"/>
+        </w:rPr>
+        <w:t xml:space="preserve">hese findings </w:t>
+      </w:r>
+      <w:r>
+        <w:rPr>
+          <w:rFonts w:hint="default"/>
+          <w:b/>
+          <w:bCs/>
+        </w:rPr>
+        <w:t>suggest that businesses should prioritise inventory planning and promotional activities for high-value products.</w:t>
+      </w:r>
+      <w:r>
+        <w:rPr>
+          <w:rFonts w:hint="default"/>
+        </w:rPr>
+        <w:t xml:space="preserve"> Combined with the association rule analysis, the results also highlight</w:t>
+      </w:r>
+      <w:r>
+        <w:rPr>
+          <w:rFonts w:hint="eastAsia"/>
+          <w:lang w:val="en-US" w:eastAsia="zh-CN"/>
+        </w:rPr>
+        <w:t>ed</w:t>
+      </w:r>
+      <w:r>
+        <w:rPr>
+          <w:rFonts w:hint="default"/>
+        </w:rPr>
+        <w:t xml:space="preserve"> opportunities for cross-selling complementary accessories with premium electronic devices.</w:t>
       </w:r>
     </w:p>
     <w:p>
       <w:pPr>
-        <w:pStyle w:val="7"/>
-        <w:rPr>
-          <w:rFonts w:hint="default"/>
-        </w:rPr>
-      </w:pPr>
-      <w:r>
-        <w:rPr>
-          <w:rFonts w:hint="default"/>
-        </w:rPr>
-        <w:t xml:space="preserve">This </w:t>
-      </w:r>
+        <w:pStyle w:val="2"/>
+      </w:pPr>
       <w:r>
         <w:rPr>
           <w:rFonts w:hint="eastAsia"/>
           <w:lang w:val="en-US" w:eastAsia="zh-CN"/>
         </w:rPr>
-        <w:t>study</w:t>
-      </w:r>
-      <w:r>
-        <w:rPr>
-          <w:rFonts w:hint="default"/>
-        </w:rPr>
-        <w:t xml:space="preserve"> employed exploratory data analysis, association rule mining, and machine learning methods to analyze sales trends and make predictions for sales revenue.</w:t>
-      </w:r>
-      <w:r>
-        <w:rPr>
-          <w:rFonts w:hint="default"/>
-          <w:lang w:val="en-NZ"/>
-        </w:rPr>
-        <w:t xml:space="preserve"> </w:t>
-      </w:r>
-      <w:r>
-        <w:rPr>
-          <w:rFonts w:hint="default"/>
-        </w:rPr>
-        <w:t>The EDA revealed clear temporal purchasing patterns, product performance differences, and pricing characteristics across the dataset. Association rule analysis further identified several meaningful co-purchasing relationships, while the machine learning models demonstrated that sales revenue could be predicted with very high accuracy. Together, these findings provide a comprehensive understanding of customer purchasing behaviour and the key drivers of sales performance.</w:t>
+        <w:t>Discussion</w:t>
       </w:r>
     </w:p>
     <w:p>
@@ -12003,46 +12534,46 @@
         <w:rPr>
           <w:rFonts w:hint="default"/>
         </w:rPr>
-        <w:t xml:space="preserve">One important </w:t>
-      </w:r>
-      <w:r>
-        <w:rPr>
-          <w:rFonts w:hint="default"/>
-          <w:lang w:val="en-NZ"/>
-        </w:rPr>
-        <w:t>price-wise</w:t>
-      </w:r>
-      <w:r>
-        <w:rPr>
-          <w:rFonts w:hint="default"/>
+        <w:t xml:space="preserve">This </w:t>
+      </w:r>
+      <w:r>
+        <w:rPr>
+          <w:rFonts w:hint="eastAsia"/>
+          <w:lang w:val="en-US" w:eastAsia="zh-CN"/>
+        </w:rPr>
+        <w:t>study</w:t>
+      </w:r>
+      <w:r>
+        <w:rPr>
+          <w:rFonts w:hint="default"/>
+        </w:rPr>
+        <w:t xml:space="preserve"> employed exploratory data analysis, association rule mining, and machine learning methods to analyze sales trends and make predictions for sales revenue.</w:t>
+      </w:r>
+      <w:r>
+        <w:rPr>
+          <w:rFonts w:hint="default"/>
+          <w:lang w:val="en-NZ"/>
         </w:rPr>
         <w:t xml:space="preserve"> </w:t>
       </w:r>
       <w:r>
         <w:rPr>
           <w:rFonts w:hint="default"/>
-          <w:lang w:val="en-NZ"/>
-        </w:rPr>
-        <w:t xml:space="preserve">insight </w:t>
-      </w:r>
-      <w:r>
-        <w:rPr>
-          <w:rFonts w:hint="default"/>
-        </w:rPr>
-        <w:t xml:space="preserve">is that high-value electronic products, particularly laptops and smartphones, contribute disproportionately to total revenue despite selling in lower quantities than inexpensive accessories. This </w:t>
-      </w:r>
-      <w:r>
-        <w:rPr>
-          <w:rFonts w:hint="default"/>
-          <w:lang w:val="en-NZ"/>
-        </w:rPr>
-        <w:t>advises</w:t>
-      </w:r>
-      <w:r>
-        <w:rPr>
-          <w:rFonts w:hint="default"/>
-        </w:rPr>
-        <w:t xml:space="preserve"> that revenue growth depends more on maintaining sales of premium products than simply increasing the volume of low-priced items.</w:t>
+        </w:rPr>
+        <w:t>The EDA revealed clear temporal purchasing patterns, product performance differences, and pricing characteristics across the dataset. Association rule analysis further identified several meaningful co-purchasing relationships, while the machine learning models demonstrated that sales revenue could be predicted with very high accuracy. Together, these findings provide</w:t>
+      </w:r>
+      <w:r>
+        <w:rPr>
+          <w:rFonts w:hint="eastAsia"/>
+          <w:lang w:val="en-US" w:eastAsia="zh-CN"/>
+        </w:rPr>
+        <w:t>d</w:t>
+      </w:r>
+      <w:r>
+        <w:rPr>
+          <w:rFonts w:hint="default"/>
+        </w:rPr>
+        <w:t xml:space="preserve"> a comprehensive understanding of customer purchasing behaviour and the key drivers of sales performance.</w:t>
       </w:r>
     </w:p>
     <w:p>
@@ -12055,35 +12586,74 @@
       <w:r>
         <w:rPr>
           <w:rFonts w:hint="default"/>
-          <w:lang w:val="en-NZ"/>
-        </w:rPr>
-        <w:t>On the other hand</w:t>
-      </w:r>
-      <w:r>
-        <w:rPr>
-          <w:rFonts w:hint="default"/>
-        </w:rPr>
-        <w:t>, inexpensive accessories such as batteries and charging cables dominate total sales volume. These products generate frequent transactions and may serve as entry-point purchases</w:t>
-      </w:r>
-      <w:r>
-        <w:rPr>
-          <w:rFonts w:hint="default"/>
-          <w:lang w:val="en-NZ"/>
-        </w:rPr>
-        <w:t xml:space="preserve"> at the entrance or </w:t>
+        </w:rPr>
+        <w:t xml:space="preserve">One important </w:t>
+      </w:r>
+      <w:r>
+        <w:rPr>
+          <w:rFonts w:hint="default"/>
+          <w:lang w:val="en-NZ"/>
+        </w:rPr>
+        <w:t>price-wise</w:t>
+      </w:r>
+      <w:r>
+        <w:rPr>
+          <w:rFonts w:hint="default"/>
+        </w:rPr>
+        <w:t xml:space="preserve"> </w:t>
+      </w:r>
+      <w:r>
+        <w:rPr>
+          <w:rFonts w:hint="default"/>
+          <w:lang w:val="en-NZ"/>
+        </w:rPr>
+        <w:t xml:space="preserve">insight </w:t>
+      </w:r>
+      <w:r>
+        <w:rPr>
+          <w:rFonts w:hint="default"/>
+        </w:rPr>
+        <w:t xml:space="preserve">is that </w:t>
+      </w:r>
+      <w:r>
+        <w:rPr>
+          <w:rFonts w:hint="default"/>
+          <w:b/>
+          <w:bCs/>
+        </w:rPr>
+        <w:t>high-value electronic products, particularly laptops and smartphones, contribute disproportionately to total revenue</w:t>
+      </w:r>
+      <w:r>
+        <w:rPr>
+          <w:rFonts w:hint="default"/>
+        </w:rPr>
+        <w:t xml:space="preserve"> despite selling in lower </w:t>
       </w:r>
       <w:r>
         <w:rPr>
           <w:rFonts w:hint="eastAsia"/>
           <w:lang w:val="en-US" w:eastAsia="zh-CN"/>
         </w:rPr>
-        <w:t>check-out display</w:t>
-      </w:r>
-      <w:r>
-        <w:rPr>
-          <w:rFonts w:hint="default"/>
-        </w:rPr>
-        <w:t xml:space="preserve"> that encourage customer engagement.</w:t>
+        <w:t>volumes</w:t>
+      </w:r>
+      <w:r>
+        <w:rPr>
+          <w:rFonts w:hint="default"/>
+        </w:rPr>
+        <w:t xml:space="preserve"> than inexpensive accessories. This </w:t>
+      </w:r>
+      <w:r>
+        <w:rPr>
+          <w:rFonts w:hint="default"/>
+          <w:lang w:val="en-NZ"/>
+        </w:rPr>
+        <w:t>advises</w:t>
+      </w:r>
+      <w:r>
+        <w:rPr>
+          <w:rFonts w:hint="default"/>
+        </w:rPr>
+        <w:t xml:space="preserve"> that revenue growth depends more on maintaining sales of premium products than simply increasing the volume of low-priced items.</w:t>
       </w:r>
     </w:p>
     <w:p>
@@ -12096,41 +12666,75 @@
       <w:r>
         <w:rPr>
           <w:rFonts w:hint="default"/>
-          <w:lang w:val="en-NZ" w:eastAsia="zh-CN"/>
-        </w:rPr>
-        <w:t>In terms of temporal patterns, c</w:t>
-      </w:r>
-      <w:r>
-        <w:rPr>
-          <w:rFonts w:hint="default"/>
-        </w:rPr>
-        <w:t>ustomer purchasing activity</w:t>
-      </w:r>
-      <w:r>
-        <w:rPr>
-          <w:rFonts w:hint="default"/>
-          <w:lang w:val="en-NZ"/>
-        </w:rPr>
-        <w:t xml:space="preserve"> </w:t>
-      </w:r>
-      <w:r>
-        <w:rPr>
-          <w:rFonts w:hint="default"/>
-        </w:rPr>
-        <w:t>follows a clear daily</w:t>
-      </w:r>
-      <w:r>
-        <w:rPr>
-          <w:rFonts w:hint="default"/>
-          <w:lang w:val="en-NZ"/>
-        </w:rPr>
-        <w:t xml:space="preserve"> trend</w:t>
-      </w:r>
-      <w:r>
-        <w:rPr>
-          <w:rFonts w:hint="default"/>
-        </w:rPr>
-        <w:t>, with order volumes peaking during the evening. This information could assist businesses in scheduling promotional campaigns, customer support resources, and inventory replenishment more effectively.</w:t>
+          <w:lang w:val="en-NZ"/>
+        </w:rPr>
+        <w:t>On the other hand</w:t>
+      </w:r>
+      <w:r>
+        <w:rPr>
+          <w:rFonts w:hint="default"/>
+        </w:rPr>
+        <w:t xml:space="preserve">, </w:t>
+      </w:r>
+      <w:r>
+        <w:rPr>
+          <w:rFonts w:hint="default"/>
+          <w:b/>
+          <w:bCs/>
+        </w:rPr>
+        <w:t xml:space="preserve">inexpensive accessories such as batteries and charging cables dominate total sales volume. </w:t>
+      </w:r>
+      <w:r>
+        <w:rPr>
+          <w:rFonts w:hint="default"/>
+        </w:rPr>
+        <w:t>These products generate</w:t>
+      </w:r>
+      <w:r>
+        <w:rPr>
+          <w:rFonts w:hint="eastAsia"/>
+          <w:lang w:val="en-US" w:eastAsia="zh-CN"/>
+        </w:rPr>
+        <w:t>d</w:t>
+      </w:r>
+      <w:r>
+        <w:rPr>
+          <w:rFonts w:hint="default"/>
+        </w:rPr>
+        <w:t xml:space="preserve"> frequent transactions and may serve as entry-point purchases</w:t>
+      </w:r>
+      <w:r>
+        <w:rPr>
+          <w:rFonts w:hint="default"/>
+          <w:lang w:val="en-NZ"/>
+        </w:rPr>
+        <w:t xml:space="preserve"> at the entrance or </w:t>
+      </w:r>
+      <w:r>
+        <w:rPr>
+          <w:rFonts w:hint="eastAsia"/>
+          <w:lang w:val="en-US" w:eastAsia="zh-CN"/>
+        </w:rPr>
+        <w:t>check-out display</w:t>
+      </w:r>
+      <w:r>
+        <w:rPr>
+          <w:rFonts w:hint="default"/>
+        </w:rPr>
+        <w:t xml:space="preserve"> that encourage</w:t>
+      </w:r>
+      <w:r>
+        <w:rPr>
+          <w:rFonts w:hint="eastAsia"/>
+          <w:lang w:val="en-US" w:eastAsia="zh-CN"/>
+        </w:rPr>
+        <w:t>s</w:t>
+      </w:r>
+      <w:r>
+        <w:rPr>
+          <w:rFonts w:hint="default"/>
+        </w:rPr>
+        <w:t xml:space="preserve"> customer engagement.</w:t>
       </w:r>
     </w:p>
     <w:p>
@@ -12143,28 +12747,64 @@
       <w:r>
         <w:rPr>
           <w:rFonts w:hint="default"/>
-          <w:lang w:val="en-NZ"/>
-        </w:rPr>
-        <w:t>In product dimension, t</w:t>
-      </w:r>
-      <w:r>
-        <w:rPr>
-          <w:rFonts w:hint="default"/>
-        </w:rPr>
-        <w:t xml:space="preserve">he association rule analysis further </w:t>
-      </w:r>
-      <w:r>
-        <w:rPr>
-          <w:rFonts w:hint="default"/>
-          <w:lang w:val="en-NZ"/>
-        </w:rPr>
-        <w:t xml:space="preserve">revealed </w:t>
-      </w:r>
-      <w:r>
-        <w:rPr>
-          <w:rFonts w:hint="default"/>
-        </w:rPr>
-        <w:t>that smartphones are frequently purchased together with compatible charging accessories. This confirms the existence of complementary purchasing behaviour and provides opportunities for product bundling and cross-selling strategies.</w:t>
+          <w:b/>
+          <w:bCs/>
+          <w:lang w:val="en-NZ" w:eastAsia="zh-CN"/>
+        </w:rPr>
+        <w:t>In terms of temporal patterns,</w:t>
+      </w:r>
+      <w:r>
+        <w:rPr>
+          <w:rFonts w:hint="default"/>
+          <w:lang w:val="en-NZ" w:eastAsia="zh-CN"/>
+        </w:rPr>
+        <w:t xml:space="preserve"> c</w:t>
+      </w:r>
+      <w:r>
+        <w:rPr>
+          <w:rFonts w:hint="default"/>
+        </w:rPr>
+        <w:t>ustomer purchasing activity</w:t>
+      </w:r>
+      <w:r>
+        <w:rPr>
+          <w:rFonts w:hint="default"/>
+          <w:lang w:val="en-NZ"/>
+        </w:rPr>
+        <w:t xml:space="preserve"> </w:t>
+      </w:r>
+      <w:r>
+        <w:rPr>
+          <w:rFonts w:hint="default"/>
+        </w:rPr>
+        <w:t>follows a clear daily</w:t>
+      </w:r>
+      <w:r>
+        <w:rPr>
+          <w:rFonts w:hint="default"/>
+          <w:lang w:val="en-NZ"/>
+        </w:rPr>
+        <w:t xml:space="preserve"> trend</w:t>
+      </w:r>
+      <w:r>
+        <w:rPr>
+          <w:rFonts w:hint="default"/>
+        </w:rPr>
+        <w:t xml:space="preserve">, with </w:t>
+      </w:r>
+      <w:r>
+        <w:rPr>
+          <w:rFonts w:hint="default"/>
+          <w:b/>
+          <w:bCs/>
+        </w:rPr>
+        <w:t xml:space="preserve">order volumes peaking during the evening. </w:t>
+      </w:r>
+      <w:r>
+        <w:rPr>
+          <w:rFonts w:hint="default"/>
+        </w:rPr>
+        <w:t>This information could assist business in scheduling promotional campaigns, customer support resources, and inventory replenishment more effectively.</w:t>
       </w:r>
     </w:p>
     <w:p>
@@ -12172,15 +12812,68 @@
         <w:pStyle w:val="7"/>
         <w:rPr>
           <w:rFonts w:hint="default"/>
-          <w:lang w:val="en-NZ"/>
-        </w:rPr>
-      </w:pPr>
-      <w:r>
-        <w:rPr>
-          <w:rFonts w:hint="default"/>
-          <w:lang w:val="en-NZ"/>
-        </w:rPr>
-        <w:t>Based on the findings above, it is recommended for business to prioritise inventory management for premium products, as stock shortages of these items would have a critical impact on total revenue; bundle promotions pairing smartphones with compatible charging accessories could increase average transaction value while improving customer convenience; marketing campaigns could be scheduled during peak purchasing periods to maximise customer reach and conversion rates; for companies with sufficient computational investment, it is also suggested that machine learning could be an effective decision-support tool to help predict revenue and plan on inventory management.</w:t>
+        </w:rPr>
+      </w:pPr>
+      <w:r>
+        <w:rPr>
+          <w:rFonts w:hint="eastAsia"/>
+          <w:lang w:val="en-US" w:eastAsia="zh-CN"/>
+        </w:rPr>
+        <w:t>From</w:t>
+      </w:r>
+      <w:r>
+        <w:rPr>
+          <w:rFonts w:hint="default"/>
+          <w:lang w:val="en-NZ"/>
+        </w:rPr>
+        <w:t xml:space="preserve"> product </w:t>
+      </w:r>
+      <w:r>
+        <w:rPr>
+          <w:rFonts w:hint="eastAsia"/>
+          <w:lang w:val="en-US" w:eastAsia="zh-CN"/>
+        </w:rPr>
+        <w:t>perspective</w:t>
+      </w:r>
+      <w:r>
+        <w:rPr>
+          <w:rFonts w:hint="default"/>
+          <w:lang w:val="en-NZ"/>
+        </w:rPr>
+        <w:t>, t</w:t>
+      </w:r>
+      <w:r>
+        <w:rPr>
+          <w:rFonts w:hint="default"/>
+        </w:rPr>
+        <w:t xml:space="preserve">he association rule analysis further </w:t>
+      </w:r>
+      <w:r>
+        <w:rPr>
+          <w:rFonts w:hint="default"/>
+          <w:lang w:val="en-NZ"/>
+        </w:rPr>
+        <w:t xml:space="preserve">revealed </w:t>
+      </w:r>
+      <w:r>
+        <w:rPr>
+          <w:rFonts w:hint="default"/>
+        </w:rPr>
+        <w:t xml:space="preserve">that </w:t>
+      </w:r>
+      <w:r>
+        <w:rPr>
+          <w:rFonts w:hint="default"/>
+          <w:b/>
+          <w:bCs/>
+        </w:rPr>
+        <w:t>smartphones are frequently purchased together with compatible charging accessories.</w:t>
+      </w:r>
+      <w:r>
+        <w:rPr>
+          <w:rFonts w:hint="default"/>
+        </w:rPr>
+        <w:t xml:space="preserve"> This confirms the existence of complementary purchasing behaviour and provides opportunities for product bundling and cross-selling strategies.</w:t>
       </w:r>
     </w:p>
     <w:p>
@@ -12188,41 +12881,137 @@
         <w:pStyle w:val="7"/>
         <w:rPr>
           <w:rFonts w:hint="default"/>
-          <w:lang w:val="en-NZ"/>
-        </w:rPr>
-      </w:pPr>
-      <w:r>
-        <w:rPr>
-          <w:rFonts w:hint="default"/>
-          <w:lang w:val="en-NZ"/>
-        </w:rPr>
-        <w:t>Overall, the findings demonstrate how combining descriptive analytics, association rule mining, and predictive modelling provides complementary perspectives that support both operational decision-making and long-term business planning.</w:t>
+          <w:b/>
+          <w:bCs/>
+          <w:lang w:val="en-NZ"/>
+        </w:rPr>
+      </w:pPr>
+      <w:r>
+        <w:rPr>
+          <w:rFonts w:hint="default"/>
+          <w:lang w:val="en-NZ"/>
+        </w:rPr>
+        <w:t xml:space="preserve">Based on the findings above, </w:t>
+      </w:r>
+      <w:r>
+        <w:rPr>
+          <w:rFonts w:hint="default"/>
+          <w:b/>
+          <w:bCs/>
+          <w:lang w:val="en-NZ"/>
+        </w:rPr>
+        <w:t xml:space="preserve">it is recommended for business to prioritise inventory management for premium products, </w:t>
+      </w:r>
+      <w:r>
+        <w:rPr>
+          <w:rFonts w:hint="default"/>
+          <w:lang w:val="en-NZ"/>
+        </w:rPr>
+        <w:t xml:space="preserve">as stock shortages of these items would have a critical impact on total revenue; </w:t>
+      </w:r>
+      <w:r>
+        <w:rPr>
+          <w:rFonts w:hint="default"/>
+          <w:b/>
+          <w:bCs/>
+          <w:lang w:val="en-NZ"/>
+        </w:rPr>
+        <w:t xml:space="preserve">bundle promotions pairing smartphones with compatible charging accessories </w:t>
+      </w:r>
+      <w:r>
+        <w:rPr>
+          <w:rFonts w:hint="default"/>
+          <w:lang w:val="en-NZ"/>
+        </w:rPr>
+        <w:t xml:space="preserve">could increase average transaction value while improving customer convenience; </w:t>
+      </w:r>
+      <w:r>
+        <w:rPr>
+          <w:rFonts w:hint="default"/>
+          <w:b/>
+          <w:bCs/>
+          <w:lang w:val="en-NZ"/>
+        </w:rPr>
+        <w:t>marketing campaigns could be scheduled during peak purchasing periods</w:t>
+      </w:r>
+      <w:r>
+        <w:rPr>
+          <w:rFonts w:hint="default"/>
+          <w:lang w:val="en-NZ"/>
+        </w:rPr>
+        <w:t xml:space="preserve"> to maximise customer reach and conversion rates; for companies with sufficient computational investment, it is also suggested that </w:t>
+      </w:r>
+      <w:r>
+        <w:rPr>
+          <w:rFonts w:hint="default"/>
+          <w:b/>
+          <w:bCs/>
+          <w:lang w:val="en-NZ"/>
+        </w:rPr>
+        <w:t>machine learning could be an effective decision-support tool to help predict revenue and plan on inventory management.</w:t>
       </w:r>
     </w:p>
     <w:p>
       <w:pPr>
-        <w:pStyle w:val="2"/>
+        <w:pStyle w:val="7"/>
+        <w:rPr>
+          <w:rFonts w:hint="default"/>
+          <w:lang w:val="en-NZ"/>
+        </w:rPr>
       </w:pPr>
       <w:r>
         <w:rPr>
           <w:rFonts w:hint="eastAsia"/>
           <w:lang w:val="en-US" w:eastAsia="zh-CN"/>
         </w:rPr>
-        <w:t>Conclusion</w:t>
+        <w:t>To summarise</w:t>
+      </w:r>
+      <w:r>
+        <w:rPr>
+          <w:rFonts w:hint="default"/>
+          <w:lang w:val="en-NZ"/>
+        </w:rPr>
+        <w:t>, the findings</w:t>
+      </w:r>
+      <w:r>
+        <w:rPr>
+          <w:rFonts w:hint="eastAsia"/>
+          <w:lang w:val="en-US" w:eastAsia="zh-CN"/>
+        </w:rPr>
+        <w:t xml:space="preserve"> in this report</w:t>
+      </w:r>
+      <w:r>
+        <w:rPr>
+          <w:rFonts w:hint="default"/>
+          <w:lang w:val="en-NZ"/>
+        </w:rPr>
+        <w:t xml:space="preserve"> demonstrate</w:t>
+      </w:r>
+      <w:r>
+        <w:rPr>
+          <w:rFonts w:hint="eastAsia"/>
+          <w:lang w:val="en-US" w:eastAsia="zh-CN"/>
+        </w:rPr>
+        <w:t>d</w:t>
+      </w:r>
+      <w:r>
+        <w:rPr>
+          <w:rFonts w:hint="default"/>
+          <w:lang w:val="en-NZ"/>
+        </w:rPr>
+        <w:t xml:space="preserve"> how combining descriptive analytics, association rule mining, and predictive modelling provides complementary perspectives that support both operational decision-making and long-term business planning.</w:t>
       </w:r>
     </w:p>
     <w:p>
       <w:pPr>
-        <w:pStyle w:val="7"/>
-        <w:rPr>
-          <w:rFonts w:hint="default"/>
-        </w:rPr>
-      </w:pPr>
-      <w:r>
-        <w:rPr>
-          <w:rFonts w:hint="default"/>
-        </w:rPr>
-        <w:t>This study analysed a retail sales dataset using exploratory data analysis, statistical analysis, association rule mining, and supervised machine learning techniques to investigate customer purchasing behaviour and predict sales revenue. The analysis identified clear temporal sales patterns, differences in product performance, and meaningful co-purchasing relationships. Among the three predictive models evaluated, XGBoost achieved the best overall performance, demonstrating excellent predictive accuracy while maintaining reasonable computational efficiency.</w:t>
+        <w:pStyle w:val="2"/>
+      </w:pPr>
+      <w:r>
+        <w:rPr>
+          <w:rFonts w:hint="eastAsia"/>
+          <w:lang w:val="en-US" w:eastAsia="zh-CN"/>
+        </w:rPr>
+        <w:t>Conclusion</w:t>
       </w:r>
     </w:p>
     <w:p>
@@ -12236,7 +13025,15 @@
         <w:rPr>
           <w:rFonts w:hint="default"/>
         </w:rPr>
-        <w:t>The findings suggest that combining descriptive analytics with predictive modelling provides valuable support for business decision-making. Exploratory analysis and market basket analysis revealed insights into customer behaviour that can inform inventory management, marketing strategies, and cross-selling opportunities, while the machine learning models demonstrated the potential to accurately forecast sales using transaction-level information.</w:t>
+        <w:t xml:space="preserve">This study analysed a retail sales dataset using exploratory data analysis, statistical analysis, association rule mining, and supervised machine learning techniques to investigate customer purchasing behaviour and predict sales revenue. The analysis identified clear temporal sales patterns, differences in product performance, and meaningful co-purchasing relationships. </w:t>
+      </w:r>
+      <w:r>
+        <w:rPr>
+          <w:rFonts w:hint="default"/>
+          <w:b/>
+          <w:bCs/>
+        </w:rPr>
+        <w:t>Among the three predictive models evaluated, XGBoost achieved the best overall performance, demonstrating excellent predictive accuracy while maintaining reasonable computational efficiency.</w:t>
       </w:r>
     </w:p>
     <w:p>
@@ -12250,7 +13047,20 @@
         <w:rPr>
           <w:rFonts w:hint="default"/>
         </w:rPr>
-        <w:t>Several limitations should also be acknowledged. The dataset contains only one year of historical transactions and does not include external factors such as promotions, seasonality across multiple years, customer demographics, or competitor activities that may influence purchasing behaviour. Furthermore, because each product is associated with a fixed selling price in this dataset, product identity becomes the dominant predictor of sales revenue, limiting the generalisability of the predictive models. Future work could incorporate additional years of data, customer-level information, promotional events, and dynamic pricing variables to develop more robust forecasting models and further improve business insights.</w:t>
+        <w:t>The findings suggest</w:t>
+      </w:r>
+      <w:r>
+        <w:rPr>
+          <w:rFonts w:hint="eastAsia"/>
+          <w:lang w:val="en-US" w:eastAsia="zh-CN"/>
+        </w:rPr>
+        <w:t>ed</w:t>
+      </w:r>
+      <w:r>
+        <w:rPr>
+          <w:rFonts w:hint="default"/>
+        </w:rPr>
+        <w:t xml:space="preserve"> that combining descriptive analytics with predictive modelling provides valuable support for business decision-making. Exploratory analysis and market basket analysis revealed insights into customer behaviour that can inform inventory management, marketing strategies, and cross-selling opportunities, while the machine learning models demonstrated the potential to accurately forecast sales using transaction-level information.</w:t>
       </w:r>
     </w:p>
     <w:p>
@@ -12263,101 +13073,109 @@
       <w:r>
         <w:rPr>
           <w:rFonts w:hint="default"/>
-        </w:rPr>
-        <w:t>Overall, this project demonstrates how integrating data exploration, association rule mining, and machine learning can transform retail transaction data into actionable business knowledge, supporting more informed operational and strategic decision-making.</w:t>
+          <w:b/>
+          <w:bCs/>
+        </w:rPr>
+        <w:t xml:space="preserve">Several limitations should also be acknowledged. </w:t>
+      </w:r>
+      <w:r>
+        <w:rPr>
+          <w:rFonts w:hint="default"/>
+        </w:rPr>
+        <w:t>The dataset contains only one year of historical transactions and does not include external factors such as promotions, seasonality across multiple years, customer demographics, or competitor activities that may influence purchasing behaviour. Furthermore, because each product is associated with a fixed selling price in this dataset, product identity becomes the dominant predictor of sales revenue, limiting the generalisability of the predictive models. Future work could incorporate additional years of data, customer-level information, promotional events, and dynamic pricing variables to develop more robust forecasting models and further improve business insights.</w:t>
       </w:r>
     </w:p>
     <w:p>
       <w:pPr>
-        <w:pStyle w:val="6"/>
-        <w:rPr>
-          <w:rFonts w:hint="default"/>
-          <w:lang w:val="en-NZ"/>
-        </w:rPr>
-      </w:pPr>
+        <w:pStyle w:val="7"/>
+        <w:rPr>
+          <w:rFonts w:hint="default"/>
+        </w:rPr>
+      </w:pPr>
+      <w:r>
+        <w:rPr>
+          <w:rFonts w:hint="default"/>
+        </w:rPr>
+        <w:t>Overall, this project demonstrate</w:t>
+      </w:r>
+      <w:r>
+        <w:rPr>
+          <w:rFonts w:hint="eastAsia"/>
+          <w:lang w:val="en-US" w:eastAsia="zh-CN"/>
+        </w:rPr>
+        <w:t>d</w:t>
+      </w:r>
+      <w:r>
+        <w:rPr>
+          <w:rFonts w:hint="default"/>
+        </w:rPr>
+        <w:t xml:space="preserve"> how integrating data exploration, association rule mining, and machine learning can transform retail transaction data into actionable business knowledge, supporting more informed operational and strategic decision-making.</w:t>
+      </w:r>
     </w:p>
     <w:p>
       <w:pPr>
         <w:pStyle w:val="6"/>
-      </w:pPr>
-      <w:r>
-        <w:t>References</w:t>
-      </w:r>
+        <w:rPr>
+          <w:rFonts w:hint="default"/>
+          <w:lang w:val="en-NZ"/>
+        </w:rPr>
+      </w:pPr>
     </w:p>
     <w:p>
       <w:pPr>
-        <w:pStyle w:val="7"/>
-      </w:pPr>
-      <w:r>
-        <w:t>The template will number citations consecutively within brackets [1]. The sentence punctuation follows the bracket [2]. Refer simply to the reference number, as in [3]—do not use “Ref. [3]” or “reference [3]” except at the beginning of a sentence: “Reference [3] was the first</w:t>
-      </w:r>
-      <w:r>
-        <w:rPr>
-          <w:lang w:val="en-US"/>
-        </w:rPr>
-        <w:t xml:space="preserve"> </w:t>
-      </w:r>
-      <w:r>
-        <w:t>...”</w:t>
+        <w:pStyle w:val="6"/>
+      </w:pPr>
+      <w:r>
+        <w:t>References</w:t>
       </w:r>
     </w:p>
     <w:p>
       <w:pPr>
-        <w:pStyle w:val="7"/>
-      </w:pPr>
-      <w:r>
-        <w:t>Number footnotes separately in superscripts. Place the actual footnote at the bottom of the column in which it was cited. Do not put footnotes in the</w:t>
-      </w:r>
-      <w:r>
-        <w:rPr>
-          <w:lang w:val="en-US"/>
-        </w:rPr>
-        <w:t xml:space="preserve"> abstract or</w:t>
-      </w:r>
-      <w:r>
-        <w:t xml:space="preserve"> reference list. Use letters for table footnotes.</w:t>
+        <w:pStyle w:val="24"/>
+        <w:ind w:left="354" w:hanging="354"/>
+      </w:pPr>
+      <w:r>
+        <w:rPr>
+          <w:rFonts w:hint="default"/>
+        </w:rPr>
+        <w:t>S. F. Ahamed, A. Vijayasankar, M. Thenmozhi, S. Rajendar, P. Bindu, and T. S. M. Rao, "Machine learning models for forecasting and estimation of business operations," J. High Technol. Manag. Res., vol. 34, no. 1, Art. no. 100455, 2023, doi: 10.1016/j.hitech.2023.100455.</w:t>
       </w:r>
     </w:p>
     <w:p>
       <w:pPr>
-        <w:pStyle w:val="7"/>
-      </w:pPr>
-      <w:r>
-        <w:t>Unless there are six authors or more give all authors</w:t>
-      </w:r>
-      <w:r>
-        <w:rPr>
-          <w:lang w:val="en-US"/>
-        </w:rPr>
-        <w:t xml:space="preserve">’ </w:t>
-      </w:r>
-      <w:r>
-        <w:t>names; do not use “et al.”. Papers that have not been published, even if they have been submitted for publication, should be cited as “unpublished” [4]. Papers that have been accepted for publication should be cited as “in press” [5]. Capitalize only the first word in a paper title, except for proper nouns and element symbols.</w:t>
+        <w:pStyle w:val="24"/>
+        <w:ind w:left="354" w:hanging="354"/>
+      </w:pPr>
+      <w:r>
+        <w:rPr>
+          <w:rFonts w:hint="default"/>
+        </w:rPr>
+        <w:t>The pandas development team, "pandas.get_dummies</w:t>
+      </w:r>
+      <w:r>
+        <w:rPr>
+          <w:rFonts w:hint="eastAsia" w:eastAsia="SimSun"/>
+          <w:lang w:val="en-US" w:eastAsia="zh-CN"/>
+        </w:rPr>
+        <w:t xml:space="preserve"> - </w:t>
+      </w:r>
+      <w:r>
+        <w:rPr>
+          <w:rFonts w:hint="default"/>
+        </w:rPr>
+        <w:t>pandas documentation," Pandas Documentation. [Online]. Available: https://pandas.pydata.org/docs/reference/api/pandas.get_dummies.html. [Accessed: Jul. 28, 2026].</w:t>
       </w:r>
     </w:p>
     <w:p>
       <w:pPr>
-        <w:pStyle w:val="7"/>
-      </w:pPr>
-      <w:r>
-        <w:t>For papers published in translation journals, please give the English citation first, followed by the original foreign-language citation [6].</w:t>
-      </w:r>
-    </w:p>
-    <w:p/>
-    <w:p>
-      <w:pPr>
         <w:pStyle w:val="24"/>
         <w:ind w:left="354" w:hanging="354"/>
       </w:pPr>
       <w:r>
-        <w:t xml:space="preserve">G. Eason, B. Noble, and I. N. Sneddon, “On certain integrals of Lipschitz-Hankel type involving products of Bessel functions,” Phil. Trans. Roy. Soc. London, vol. A247, pp. 529–551, April 1955. </w:t>
-      </w:r>
-      <w:r>
-        <w:rPr>
-          <w:i/>
-          <w:iCs/>
-        </w:rPr>
-        <w:t>(references)</w:t>
+        <w:rPr>
+          <w:rFonts w:hint="default"/>
+        </w:rPr>
+        <w:t>A. Géron, Hands-On Machine Learning with Scikit-Learn, Keras, and TensorFlow: Concepts, Tools, and Techniques to Build Intelligent Systems, 3rd ed. Sebastopol, CA, USA: O'Reilly Media, 2022.</w:t>
       </w:r>
     </w:p>
     <w:p>
@@ -12366,7 +13184,10 @@
         <w:ind w:left="354" w:hanging="354"/>
       </w:pPr>
       <w:r>
-        <w:t>J. Clerk Maxwell, A Treatise on Electricity and Magnetism, 3rd ed., vol. 2. Oxford: Clarendon, 1892, pp.68–73.</w:t>
+        <w:rPr>
+          <w:rFonts w:hint="default"/>
+        </w:rPr>
+        <w:t>Oracle, "Apriori," Oracle Data Mining Concepts 11g Release 2 (11.2), Oracle Corporation. [Online]. Available: https://docs.oracle.com/cd/E11882_01/datamine.112/e16808/algo_apriori.htm. [Accessed: Jul. 28, 2026].</w:t>
       </w:r>
     </w:p>
     <w:p>
@@ -12375,69 +13196,20 @@
         <w:ind w:left="354" w:hanging="354"/>
       </w:pPr>
       <w:r>
-        <w:t>I. S. Jacobs and C. P. Bean, “Fine particles, thin films and exchange anisotropy,” in Magnetism, vol. III, G. T. Rado and H. Suhl, Eds. New York: Academic, 1963, pp. 271–350.</w:t>
+        <w:rPr>
+          <w:rFonts w:hint="default"/>
+        </w:rPr>
+        <w:t>The scikit-learn developers, "Random Forests," Scikit-learn User Guide. [Online]. Available: https://scikit-learn.org/stable/modules/ensemble.html#forest. [Accessed: Jul. 28, 2026].</w:t>
       </w:r>
     </w:p>
     <w:p>
       <w:pPr>
         <w:pStyle w:val="24"/>
         <w:ind w:left="354" w:hanging="354"/>
-      </w:pPr>
-      <w:r>
-        <w:t>K. Elissa, “Title of paper if known,” unpublished.</w:t>
-      </w:r>
-    </w:p>
-    <w:p>
-      <w:pPr>
-        <w:pStyle w:val="24"/>
-        <w:ind w:left="354" w:hanging="354"/>
-      </w:pPr>
-      <w:r>
-        <w:t>R. Nicole, “Title of paper with only first word capitalized,” J. Name Stand. Abbrev., in press.</w:t>
-      </w:r>
-    </w:p>
-    <w:p>
-      <w:pPr>
-        <w:pStyle w:val="24"/>
-        <w:ind w:left="354" w:hanging="354"/>
-      </w:pPr>
-      <w:r>
-        <w:t>Y. Yorozu, M. Hirano, K. Oka, and Y. Tagawa, “Electron spectroscopy studies on magneto-optical media and plastic substrate interface,” IEEE Transl. J. Magn. Japan, vol. 2, pp. 740–741, August 1987 [Digests 9th Annual Conf. Magnetics Japan, p. 301, 1982].</w:t>
-      </w:r>
-    </w:p>
-    <w:p>
-      <w:pPr>
-        <w:pStyle w:val="24"/>
-        <w:ind w:left="354" w:hanging="354"/>
-      </w:pPr>
-      <w:r>
-        <w:t>M. Young, The Technical Writer’s Handbook. Mill Valley, CA: University Science, 1989.</w:t>
-      </w:r>
-    </w:p>
-    <w:p>
-      <w:pPr>
-        <w:pStyle w:val="24"/>
-        <w:numPr>
-          <w:ilvl w:val="0"/>
-          <w:numId w:val="0"/>
-        </w:numPr>
-        <w:ind w:left="360" w:hanging="360"/>
-      </w:pPr>
-    </w:p>
-    <w:p>
-      <w:pPr>
-        <w:pStyle w:val="24"/>
-        <w:numPr>
-          <w:ilvl w:val="0"/>
-          <w:numId w:val="0"/>
-        </w:numPr>
-        <w:spacing w:line="240" w:lineRule="auto"/>
-        <w:ind w:left="360" w:hanging="360"/>
-        <w:jc w:val="center"/>
         <w:rPr>
           <w:rFonts w:eastAsia="SimSun"/>
           <w:b/>
-          <w:color w:val="FF0000"/>
+          <w:color w:val="auto"/>
           <w:spacing w:val="-1"/>
           <w:sz w:val="20"/>
           <w:szCs w:val="20"/>
@@ -12453,166 +13225,22 @@
       </w:pPr>
       <w:r>
         <w:rPr>
-          <w:rFonts w:eastAsia="SimSun"/>
-          <w:b/>
-          <w:color w:val="FF0000"/>
-          <w:spacing w:val="-1"/>
-          <w:sz w:val="20"/>
-          <w:szCs w:val="20"/>
-          <w:lang w:val="zh-CN" w:eastAsia="zh-CN"/>
-        </w:rPr>
-        <w:t xml:space="preserve">IEEE conference templates contain guidance text for composing and formatting conference papers. Please ensure that all template text is removed from your conference paper prior to submission to the conference. Failure to remove template text from your paper </w:t>
-      </w:r>
-      <w:r>
-        <w:rPr>
-          <w:rFonts w:eastAsia="SimSun"/>
-          <w:b/>
-          <w:color w:val="FF0000"/>
-          <w:spacing w:val="-1"/>
-          <w:sz w:val="20"/>
-          <w:szCs w:val="20"/>
-          <w:lang w:eastAsia="zh-CN"/>
-        </w:rPr>
-        <w:t>may</w:t>
-      </w:r>
-      <w:r>
-        <w:rPr>
-          <w:rFonts w:eastAsia="SimSun"/>
-          <w:b/>
-          <w:color w:val="FF0000"/>
-          <w:spacing w:val="-1"/>
-          <w:sz w:val="20"/>
-          <w:szCs w:val="20"/>
-          <w:lang w:val="zh-CN" w:eastAsia="zh-CN"/>
-        </w:rPr>
-        <w:t xml:space="preserve"> result in your paper not being published.</w:t>
+          <w:rFonts w:hint="default"/>
+          <w:color w:val="auto"/>
+        </w:rPr>
+        <w:t>The XGBoost Contributors, "XGBoost Documentation," XGBoost Documentation. [Online]. Available: https://xgboost.readthedocs.io/. [Accessed: Jul. 28, 2026].</w:t>
+      </w:r>
+      <w:r>
+        <w:rPr>
+          <w:color w:val="auto"/>
+        </w:rPr>
+        <w:t xml:space="preserve"> </w:t>
       </w:r>
     </w:p>
     <w:p>
-      <w:r>
-        <w:br w:type="page"/>
-      </w:r>
-    </w:p>
-    <w:p>
-      <w:r>
-        <w:rPr>
-          <w:rFonts w:ascii="SimSun" w:hAnsi="SimSun" w:eastAsia="SimSun" w:cs="SimSun"/>
-          <w:sz w:val="24"/>
-          <w:szCs w:val="24"/>
-        </w:rPr>
-        <w:t>I. Introduction II. Dataset Understanding and Preprocessing III. Exploratory Data Analysis and Statistical Analysis IV. Association Rule / Market Basket Analysis V. Machine Learning Modelling A. Data Preparation B. Model Performance Comparison C. Feature Importance Analysis VI. Discussion VII. Conclusion</w:t>
-      </w:r>
-      <w:r>
-        <mc:AlternateContent>
-          <mc:Choice Requires="wps">
-            <w:drawing>
-              <wp:anchor distT="0" distB="0" distL="114300" distR="114300" simplePos="0" relativeHeight="251659264" behindDoc="1" locked="0" layoutInCell="1" allowOverlap="1">
-                <wp:simplePos x="0" y="0"/>
-                <wp:positionH relativeFrom="margin">
-                  <wp:align>left</wp:align>
-                </wp:positionH>
-                <wp:positionV relativeFrom="paragraph">
-                  <wp:posOffset>251460</wp:posOffset>
-                </wp:positionV>
-                <wp:extent cx="3200400" cy="1143000"/>
-                <wp:effectExtent l="10795" t="5080" r="8255" b="13970"/>
-                <wp:wrapTight wrapText="bothSides">
-                  <wp:wrapPolygon>
-                    <wp:start x="-64" y="0"/>
-                    <wp:lineTo x="-64" y="21600"/>
-                    <wp:lineTo x="21664" y="21600"/>
-                    <wp:lineTo x="21664" y="0"/>
-                    <wp:lineTo x="-64" y="0"/>
-                  </wp:wrapPolygon>
-                </wp:wrapTight>
-                <wp:docPr id="1" name="Text Box 8"/>
-                <wp:cNvGraphicFramePr/>
-                <a:graphic xmlns:a="http://schemas.openxmlformats.org/drawingml/2006/main">
-                  <a:graphicData uri="http://schemas.microsoft.com/office/word/2010/wordprocessingShape">
-                    <wps:wsp>
-                      <wps:cNvSpPr>
-                        <a:spLocks noChangeArrowheads="1"/>
-                      </wps:cNvSpPr>
-                      <wps:spPr>
-                        <a:xfrm>
-                          <a:off x="0" y="0"/>
-                          <a:ext cx="3200400" cy="1143000"/>
-                        </a:xfrm>
-                        <a:prstGeom prst="rect">
-                          <a:avLst/>
-                        </a:prstGeom>
-                        <a:solidFill>
-                          <a:srgbClr val="FFFFFF"/>
-                        </a:solidFill>
-                        <a:ln w="9525">
-                          <a:solidFill>
-                            <a:srgbClr val="000000"/>
-                          </a:solidFill>
-                          <a:miter lim="800000"/>
-                        </a:ln>
-                      </wps:spPr>
-                      <wps:txbx>
-                        <w:txbxContent>
-                          <w:p>
-                            <w:pPr>
-                              <w:pStyle w:val="7"/>
-                            </w:pPr>
-                            <w:r>
-                              <w:t>We suggest that you use a text box to insert a graphic (which is ideally a 300 dpi TIFF or EPS file, with all fonts embedded) because, in an MSW document, this method is somewhat more stable than directly inserting a picture.</w:t>
-                            </w:r>
-                          </w:p>
-                          <w:p>
-                            <w:pPr>
-                              <w:pStyle w:val="7"/>
-                            </w:pPr>
-                            <w:r>
-                              <w:t>To have non-visible rules on your frame, use the MSWord “Format” pull-down menu, select Text Box &gt; Colors and Lines to choose No Fill and No Line.</w:t>
-                            </w:r>
-                          </w:p>
-                        </w:txbxContent>
-                      </wps:txbx>
-                      <wps:bodyPr rot="0" vert="horz" wrap="square" lIns="91440" tIns="45720" rIns="91440" bIns="45720" anchor="t" anchorCtr="0" upright="1">
-                        <a:noAutofit/>
-                      </wps:bodyPr>
-                    </wps:wsp>
-                  </a:graphicData>
-                </a:graphic>
-              </wp:anchor>
-            </w:drawing>
-          </mc:Choice>
-          <mc:Fallback>
-            <w:pict>
-              <v:rect id="Text Box 8" o:spid="_x0000_s1026" o:spt="1" style="position:absolute;left:0pt;margin-top:19.8pt;height:90pt;width:252pt;mso-position-horizontal:left;mso-position-horizontal-relative:margin;mso-wrap-distance-left:9pt;mso-wrap-distance-right:9pt;z-index:-251657216;mso-width-relative:page;mso-height-relative:page;" fillcolor="#FFFFFF" filled="t" stroked="t" coordsize="21600,21600" wrapcoords="-64 0 -64 21600 21664 21600 21664 0 -64 0" o:gfxdata="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">
-                <v:fill on="t" focussize="0,0"/>
-                <v:stroke color="#000000" miterlimit="8" joinstyle="miter"/>
-                <v:imagedata o:title=""/>
-                <o:lock v:ext="edit" aspectratio="f"/>
-                <v:textbox>
-                  <w:txbxContent>
-                    <w:p>
-                      <w:pPr>
-                        <w:pStyle w:val="7"/>
-                      </w:pPr>
-                      <w:r>
-                        <w:t>We suggest that you use a text box to insert a graphic (which is ideally a 300 dpi TIFF or EPS file, with all fonts embedded) because, in an MSW document, this method is somewhat more stable than directly inserting a picture.</w:t>
-                      </w:r>
-                    </w:p>
-                    <w:p>
-                      <w:pPr>
-                        <w:pStyle w:val="7"/>
-                      </w:pPr>
-                      <w:r>
-                        <w:t>To have non-visible rules on your frame, use the MSWord “Format” pull-down menu, select Text Box &gt; Colors and Lines to choose No Fill and No Line.</w:t>
-                      </w:r>
-                    </w:p>
-                  </w:txbxContent>
-                </v:textbox>
-                <w10:wrap type="tight"/>
-              </v:rect>
-            </w:pict>
-          </mc:Fallback>
-        </mc:AlternateContent>
-      </w:r>
+      <w:pPr>
+        <w:jc w:val="both"/>
+      </w:pPr>
     </w:p>
     <w:sectPr>
       <w:type w:val="continuous"/>
@@ -12623,28 +13251,6 @@
     </w:sectPr>
   </w:body>
 </w:document>
-</file>
-
-<file path=word/footer1.xml><?xml version="1.0" encoding="utf-8"?>
-<w:ftr xmlns:wpc="http://schemas.microsoft.com/office/word/2010/wordprocessingCanvas" xmlns:mc="http://schemas.openxmlformats.org/markup-compatibility/2006" xmlns:o="urn:schemas-microsoft-com:office:office" xmlns:r="http://schemas.openxmlformats.org/officeDocument/2006/relationships" xmlns:m="http://schemas.openxmlformats.org/officeDocument/2006/math" xmlns:v="urn:schemas-microsoft-com:vml" xmlns:wp14="http://schemas.microsoft.com/office/word/2010/wordprocessingDrawing" xmlns:wp="http://schemas.openxmlformats.org/drawingml/2006/wordprocessingDrawing" xmlns:w10="urn:schemas-microsoft-com:office:word" xmlns:w="http://schemas.openxmlformats.org/wordprocessingml/2006/main" xmlns:w14="http://schemas.microsoft.com/office/word/2010/wordml" xmlns:w15="http://schemas.microsoft.com/office/word/2012/wordml" xmlns:wpg="http://schemas.microsoft.com/office/word/2010/wordprocessingGroup" xmlns:wpi="http://schemas.microsoft.com/office/word/2010/wordprocessingInk" xmlns:wne="http://schemas.microsoft.com/office/word/2006/wordml" xmlns:wps="http://schemas.microsoft.com/office/word/2010/wordprocessingShape" xmlns:wpsCustomData="http://www.wps.cn/officeDocument/2013/wpsCustomData" mc:Ignorable="w14 w15 wp14">
-  <w:p>
-    <w:pPr>
-      <w:pStyle w:val="8"/>
-      <w:jc w:val="left"/>
-      <w:rPr>
-        <w:sz w:val="16"/>
-        <w:szCs w:val="16"/>
-      </w:rPr>
-    </w:pPr>
-    <w:r>
-      <w:rPr>
-        <w:sz w:val="16"/>
-        <w:szCs w:val="16"/>
-      </w:rPr>
-      <w:t>XXX-X-XXXX-XXXX-X/XX/$XX.00 ©20XX IEEE</w:t>
-    </w:r>
-  </w:p>
-</w:ftr>
 </file>
 
 <file path=word/numbering.xml><?xml version="1.0" encoding="utf-8"?>
@@ -14164,6 +14770,7 @@
   </w:style>
   <w:style w:type="paragraph" w:customStyle="1" w:styleId="28">
     <w:name w:val="table copy"/>
+    <w:qFormat/>
     <w:uiPriority w:val="0"/>
     <w:pPr>
       <w:jc w:val="both"/>
@@ -14506,7 +15113,6 @@
     <customSectPr/>
     <customSectPr/>
     <customSectPr/>
-    <customSectPr/>
   </customSectProps>
   <customShpExts>
     <customShpInfo spid="_x0000_s1026"/>

</xml_diff>